<commit_message>
qmd phase1d: r10 pupil results and reduced accuracy models
Co-authored-by: Cursor <cursoragent@cursor.com>
</commit_message>
<xml_diff>
--- a/reports/chap3_revised.docx
+++ b/reports/chap3_revised.docx
@@ -53,7 +53,7 @@
           <w:b/>
           <w:bCs/>
         </w:rPr>
-        <w:t xml:space="preserve">DRAFT — numbers from run r8_20261017_015218 for pupil results; behavioral results final.</w:t>
+        <w:t xml:space="preserve">DRAFT — numbers from run r10_20261017_081458 for pupil results; behavioral results final.</w:t>
       </w:r>
     </w:p>
     <w:bookmarkStart w:id="9" w:name="abstract"/>
@@ -3285,19 +3285,15 @@
           <w:tbl>
             <w:tblPr>
               <w:tblStyle w:val="Table"/>
-              <w:tblW w:type="pct" w:w="5000"/>
-              <w:tblLayout w:type="fixed"/>
+              <w:tblW w:type="auto" w:w="0"/>
               <w:tblLook w:firstRow="1" w:lastRow="0" w:firstColumn="0" w:lastColumn="0" w:noHBand="0" w:noVBand="0" w:val="0020"/>
             </w:tblPr>
             <w:tblGrid>
-              <w:gridCol w:w="406"/>
-              <w:gridCol w:w="2640"/>
-              <w:gridCol w:w="609"/>
-              <w:gridCol w:w="1150"/>
-              <w:gridCol w:w="1286"/>
-              <w:gridCol w:w="744"/>
-              <w:gridCol w:w="473"/>
-              <w:gridCol w:w="609"/>
+              <w:gridCol w:w="1584"/>
+              <w:gridCol w:w="1584"/>
+              <w:gridCol w:w="1584"/>
+              <w:gridCol w:w="1584"/>
+              <w:gridCol w:w="1584"/>
             </w:tblGrid>
             <w:tr>
               <w:trPr>
@@ -3351,45 +3347,6 @@
                     <w:jc w:val="center"/>
                   </w:pPr>
                   <w:r>
-                    <w:t xml:space="preserve">95% CrI</w:t>
-                  </w:r>
-                </w:p>
-              </w:tc>
-              <w:tc>
-                <w:tcPr/>
-                <w:p>
-                  <w:pPr>
-                    <w:pStyle w:val="Compact"/>
-                    <w:jc w:val="right"/>
-                    <w:jc w:val="center"/>
-                  </w:pPr>
-                  <w:r>
-                    <w:t xml:space="preserve">Change in a</w:t>
-                  </w:r>
-                </w:p>
-              </w:tc>
-              <w:tc>
-                <w:tcPr/>
-                <w:p>
-                  <w:pPr>
-                    <w:pStyle w:val="Compact"/>
-                    <w:jc w:val="right"/>
-                    <w:jc w:val="center"/>
-                  </w:pPr>
-                  <w:r>
-                    <w:t xml:space="preserve">Delta ELPD</w:t>
-                  </w:r>
-                </w:p>
-              </w:tc>
-              <w:tc>
-                <w:tcPr/>
-                <w:p>
-                  <w:pPr>
-                    <w:pStyle w:val="Compact"/>
-                    <w:jc w:val="right"/>
-                    <w:jc w:val="center"/>
-                  </w:pPr>
-                  <w:r>
                     <w:t xml:space="preserve">Trials</w:t>
                   </w:r>
                 </w:p>
@@ -3404,642 +3361,6 @@
                   </w:pPr>
                   <w:r>
                     <w:t xml:space="preserve">Subjects</w:t>
-                  </w:r>
-                </w:p>
-              </w:tc>
-            </w:tr>
-            <w:tr>
-              <w:tc>
-                <w:tcPr/>
-                <w:p>
-                  <w:pPr>
-                    <w:pStyle w:val="Compact"/>
-                    <w:jc w:val="left"/>
-                    <w:jc w:val="center"/>
-                  </w:pPr>
-                  <w:r>
-                    <w:t xml:space="preserve">P3</w:t>
-                  </w:r>
-                </w:p>
-              </w:tc>
-              <w:tc>
-                <w:tcPr/>
-                <w:p>
-                  <w:pPr>
-                    <w:pStyle w:val="Compact"/>
-                    <w:jc w:val="right"/>
-                    <w:jc w:val="center"/>
-                  </w:pPr>
-                  <w:r>
-                    <w:t xml:space="preserve">current-trial TEPR</w:t>
-                  </w:r>
-                </w:p>
-              </w:tc>
-              <w:tc>
-                <w:tcPr/>
-                <w:p>
-                  <w:pPr>
-                    <w:pStyle w:val="Compact"/>
-                    <w:jc w:val="right"/>
-                    <w:jc w:val="center"/>
-                  </w:pPr>
-                  <w:r>
-                    <w:t xml:space="preserve">0.074</w:t>
-                  </w:r>
-                </w:p>
-              </w:tc>
-              <w:tc>
-                <w:tcPr/>
-                <w:p>
-                  <w:pPr>
-                    <w:pStyle w:val="Compact"/>
-                    <w:jc w:val="right"/>
-                    <w:jc w:val="center"/>
-                  </w:pPr>
-                  <w:r>
-                    <w:t xml:space="preserve">[0.061, 0.087]</w:t>
-                  </w:r>
-                </w:p>
-              </w:tc>
-              <w:tc>
-                <w:tcPr/>
-                <w:p>
-                  <w:pPr>
-                    <w:pStyle w:val="Compact"/>
-                    <w:jc w:val="right"/>
-                    <w:jc w:val="center"/>
-                  </w:pPr>
-                  <w:r>
-                    <w:t xml:space="preserve">+7.7% [6.3, 9.1]</w:t>
-                  </w:r>
-                </w:p>
-              </w:tc>
-              <w:tc>
-                <w:tcPr/>
-                <w:p>
-                  <w:pPr>
-                    <w:pStyle w:val="Compact"/>
-                    <w:jc w:val="right"/>
-                    <w:jc w:val="center"/>
-                  </w:pPr>
-                  <w:r>
-                    <w:t xml:space="preserve">64.6 ± 9.0</w:t>
-                  </w:r>
-                </w:p>
-              </w:tc>
-              <w:tc>
-                <w:tcPr/>
-                <w:p>
-                  <w:pPr>
-                    <w:pStyle w:val="Compact"/>
-                    <w:jc w:val="right"/>
-                    <w:jc w:val="center"/>
-                  </w:pPr>
-                  <w:r>
-                    <w:t xml:space="preserve">4,952</w:t>
-                  </w:r>
-                </w:p>
-              </w:tc>
-              <w:tc>
-                <w:tcPr/>
-                <w:p>
-                  <w:pPr>
-                    <w:pStyle w:val="Compact"/>
-                    <w:jc w:val="right"/>
-                    <w:jc w:val="center"/>
-                  </w:pPr>
-                  <w:r>
-                    <w:t xml:space="preserve">42</w:t>
-                  </w:r>
-                </w:p>
-              </w:tc>
-            </w:tr>
-            <w:tr>
-              <w:tc>
-                <w:tcPr/>
-                <w:p>
-                  <w:pPr>
-                    <w:pStyle w:val="Compact"/>
-                    <w:jc w:val="left"/>
-                    <w:jc w:val="center"/>
-                  </w:pPr>
-                  <w:r>
-                    <w:t xml:space="preserve">P5</w:t>
-                  </w:r>
-                </w:p>
-              </w:tc>
-              <w:tc>
-                <w:tcPr/>
-                <w:p>
-                  <w:pPr>
-                    <w:pStyle w:val="Compact"/>
-                    <w:jc w:val="right"/>
-                    <w:jc w:val="center"/>
-                  </w:pPr>
-                  <w:r>
-                    <w:t xml:space="preserve">pre-squeeze baseline</w:t>
-                  </w:r>
-                </w:p>
-              </w:tc>
-              <w:tc>
-                <w:tcPr/>
-                <w:p>
-                  <w:pPr>
-                    <w:pStyle w:val="Compact"/>
-                    <w:jc w:val="right"/>
-                    <w:jc w:val="center"/>
-                  </w:pPr>
-                  <w:r>
-                    <w:t xml:space="preserve">0.018</w:t>
-                  </w:r>
-                </w:p>
-              </w:tc>
-              <w:tc>
-                <w:tcPr/>
-                <w:p>
-                  <w:pPr>
-                    <w:pStyle w:val="Compact"/>
-                    <w:jc w:val="right"/>
-                    <w:jc w:val="center"/>
-                  </w:pPr>
-                  <w:r>
-                    <w:t xml:space="preserve">[0.005, 0.031]</w:t>
-                  </w:r>
-                </w:p>
-              </w:tc>
-              <w:tc>
-                <w:tcPr/>
-                <w:p>
-                  <w:pPr>
-                    <w:pStyle w:val="Compact"/>
-                    <w:jc w:val="right"/>
-                    <w:jc w:val="center"/>
-                  </w:pPr>
-                  <w:r>
-                    <w:t xml:space="preserve">+1.8% [0.5, 3.1]</w:t>
-                  </w:r>
-                </w:p>
-              </w:tc>
-              <w:tc>
-                <w:tcPr/>
-                <w:p>
-                  <w:pPr>
-                    <w:pStyle w:val="Compact"/>
-                    <w:jc w:val="right"/>
-                    <w:jc w:val="center"/>
-                  </w:pPr>
-                  <w:r>
-                    <w:t xml:space="preserve">2.2 ± 2.2</w:t>
-                  </w:r>
-                </w:p>
-              </w:tc>
-              <w:tc>
-                <w:tcPr/>
-                <w:p>
-                  <w:pPr>
-                    <w:pStyle w:val="Compact"/>
-                    <w:jc w:val="right"/>
-                    <w:jc w:val="center"/>
-                  </w:pPr>
-                  <w:r>
-                    <w:t xml:space="preserve">4,612</w:t>
-                  </w:r>
-                </w:p>
-              </w:tc>
-              <w:tc>
-                <w:tcPr/>
-                <w:p>
-                  <w:pPr>
-                    <w:pStyle w:val="Compact"/>
-                    <w:jc w:val="right"/>
-                    <w:jc w:val="center"/>
-                  </w:pPr>
-                  <w:r>
-                    <w:t xml:space="preserve">42</w:t>
-                  </w:r>
-                </w:p>
-              </w:tc>
-            </w:tr>
-            <w:tr>
-              <w:tc>
-                <w:tcPr/>
-                <w:p>
-                  <w:pPr>
-                    <w:pStyle w:val="Compact"/>
-                    <w:jc w:val="left"/>
-                    <w:jc w:val="center"/>
-                  </w:pPr>
-                  <w:r>
-                    <w:t xml:space="preserve">P3_rt</w:t>
-                  </w:r>
-                </w:p>
-              </w:tc>
-              <w:tc>
-                <w:tcPr/>
-                <w:p>
-                  <w:pPr>
-                    <w:pStyle w:val="Compact"/>
-                    <w:jc w:val="right"/>
-                    <w:jc w:val="center"/>
-                  </w:pPr>
-                  <w:r>
-                    <w:t xml:space="preserve">current-trial TEPR, fastest 80% of RTs</w:t>
-                  </w:r>
-                </w:p>
-              </w:tc>
-              <w:tc>
-                <w:tcPr/>
-                <w:p>
-                  <w:pPr>
-                    <w:pStyle w:val="Compact"/>
-                    <w:jc w:val="right"/>
-                    <w:jc w:val="center"/>
-                  </w:pPr>
-                  <w:r>
-                    <w:t xml:space="preserve">0.047</w:t>
-                  </w:r>
-                </w:p>
-              </w:tc>
-              <w:tc>
-                <w:tcPr/>
-                <w:p>
-                  <w:pPr>
-                    <w:pStyle w:val="Compact"/>
-                    <w:jc w:val="right"/>
-                    <w:jc w:val="center"/>
-                  </w:pPr>
-                  <w:r>
-                    <w:t xml:space="preserve">[0.031, 0.062]</w:t>
-                  </w:r>
-                </w:p>
-              </w:tc>
-              <w:tc>
-                <w:tcPr/>
-                <w:p>
-                  <w:pPr>
-                    <w:pStyle w:val="Compact"/>
-                    <w:jc w:val="right"/>
-                    <w:jc w:val="center"/>
-                  </w:pPr>
-                  <w:r>
-                    <w:t xml:space="preserve">+4.8% [3.2, 6.4]</w:t>
-                  </w:r>
-                </w:p>
-              </w:tc>
-              <w:tc>
-                <w:tcPr/>
-                <w:p>
-                  <w:pPr>
-                    <w:pStyle w:val="Compact"/>
-                    <w:jc w:val="right"/>
-                    <w:jc w:val="center"/>
-                  </w:pPr>
-                  <w:r>
-                    <w:t xml:space="preserve">16.2 ± 4.6</w:t>
-                  </w:r>
-                </w:p>
-              </w:tc>
-              <w:tc>
-                <w:tcPr/>
-                <w:p>
-                  <w:pPr>
-                    <w:pStyle w:val="Compact"/>
-                    <w:jc w:val="right"/>
-                    <w:jc w:val="center"/>
-                  </w:pPr>
-                  <w:r>
-                    <w:t xml:space="preserve">3,986</w:t>
-                  </w:r>
-                </w:p>
-              </w:tc>
-              <w:tc>
-                <w:tcPr/>
-                <w:p>
-                  <w:pPr>
-                    <w:pStyle w:val="Compact"/>
-                    <w:jc w:val="right"/>
-                    <w:jc w:val="center"/>
-                  </w:pPr>
-                  <w:r>
-                    <w:t xml:space="preserve">42</w:t>
-                  </w:r>
-                </w:p>
-              </w:tc>
-            </w:tr>
-            <w:tr>
-              <w:tc>
-                <w:tcPr/>
-                <w:p>
-                  <w:pPr>
-                    <w:pStyle w:val="Compact"/>
-                    <w:jc w:val="left"/>
-                    <w:jc w:val="center"/>
-                  </w:pPr>
-                  <w:r>
-                    <w:t xml:space="preserve">P6</w:t>
-                  </w:r>
-                </w:p>
-              </w:tc>
-              <w:tc>
-                <w:tcPr/>
-                <w:p>
-                  <w:pPr>
-                    <w:pStyle w:val="Compact"/>
-                    <w:jc w:val="right"/>
-                    <w:jc w:val="center"/>
-                  </w:pPr>
-                  <w:r>
-                    <w:t xml:space="preserve">previous-trial TEPR</w:t>
-                  </w:r>
-                </w:p>
-              </w:tc>
-              <w:tc>
-                <w:tcPr/>
-                <w:p>
-                  <w:pPr>
-                    <w:pStyle w:val="Compact"/>
-                    <w:jc w:val="right"/>
-                    <w:jc w:val="center"/>
-                  </w:pPr>
-                  <w:r>
-                    <w:t xml:space="preserve">0.027</w:t>
-                  </w:r>
-                </w:p>
-              </w:tc>
-              <w:tc>
-                <w:tcPr/>
-                <w:p>
-                  <w:pPr>
-                    <w:pStyle w:val="Compact"/>
-                    <w:jc w:val="right"/>
-                    <w:jc w:val="center"/>
-                  </w:pPr>
-                  <w:r>
-                    <w:t xml:space="preserve">[0.012, 0.042]</w:t>
-                  </w:r>
-                </w:p>
-              </w:tc>
-              <w:tc>
-                <w:tcPr/>
-                <w:p>
-                  <w:pPr>
-                    <w:pStyle w:val="Compact"/>
-                    <w:jc w:val="right"/>
-                    <w:jc w:val="center"/>
-                  </w:pPr>
-                  <w:r>
-                    <w:t xml:space="preserve">+2.7% [1.2, 4.3]</w:t>
-                  </w:r>
-                </w:p>
-              </w:tc>
-              <w:tc>
-                <w:tcPr/>
-                <w:p>
-                  <w:pPr>
-                    <w:pStyle w:val="Compact"/>
-                    <w:jc w:val="right"/>
-                    <w:jc w:val="center"/>
-                  </w:pPr>
-                  <w:r>
-                    <w:t xml:space="preserve">5.3 ± 2.7</w:t>
-                  </w:r>
-                </w:p>
-              </w:tc>
-              <w:tc>
-                <w:tcPr/>
-                <w:p>
-                  <w:pPr>
-                    <w:pStyle w:val="Compact"/>
-                    <w:jc w:val="right"/>
-                    <w:jc w:val="center"/>
-                  </w:pPr>
-                  <w:r>
-                    <w:t xml:space="preserve">3,823</w:t>
-                  </w:r>
-                </w:p>
-              </w:tc>
-              <w:tc>
-                <w:tcPr/>
-                <w:p>
-                  <w:pPr>
-                    <w:pStyle w:val="Compact"/>
-                    <w:jc w:val="right"/>
-                    <w:jc w:val="center"/>
-                  </w:pPr>
-                  <w:r>
-                    <w:t xml:space="preserve">42</w:t>
-                  </w:r>
-                </w:p>
-              </w:tc>
-            </w:tr>
-            <w:tr>
-              <w:tc>
-                <w:tcPr/>
-                <w:p>
-                  <w:pPr>
-                    <w:pStyle w:val="Compact"/>
-                    <w:jc w:val="left"/>
-                    <w:jc w:val="center"/>
-                  </w:pPr>
-                  <w:r>
-                    <w:t xml:space="preserve">P7</w:t>
-                  </w:r>
-                </w:p>
-              </w:tc>
-              <w:tc>
-                <w:tcPr/>
-                <w:p>
-                  <w:pPr>
-                    <w:pStyle w:val="Compact"/>
-                    <w:jc w:val="right"/>
-                    <w:jc w:val="center"/>
-                  </w:pPr>
-                  <w:r>
-                    <w:t xml:space="preserve">0.5 s before the response</w:t>
-                  </w:r>
-                </w:p>
-              </w:tc>
-              <w:tc>
-                <w:tcPr/>
-                <w:p>
-                  <w:pPr>
-                    <w:pStyle w:val="Compact"/>
-                    <w:jc w:val="right"/>
-                    <w:jc w:val="center"/>
-                  </w:pPr>
-                  <w:r>
-                    <w:t xml:space="preserve">0.013</w:t>
-                  </w:r>
-                </w:p>
-              </w:tc>
-              <w:tc>
-                <w:tcPr/>
-                <w:p>
-                  <w:pPr>
-                    <w:pStyle w:val="Compact"/>
-                    <w:jc w:val="right"/>
-                    <w:jc w:val="center"/>
-                  </w:pPr>
-                  <w:r>
-                    <w:t xml:space="preserve">[−0.002, 0.027]</w:t>
-                  </w:r>
-                </w:p>
-              </w:tc>
-              <w:tc>
-                <w:tcPr/>
-                <w:p>
-                  <w:pPr>
-                    <w:pStyle w:val="Compact"/>
-                    <w:jc w:val="right"/>
-                    <w:jc w:val="center"/>
-                  </w:pPr>
-                  <w:r>
-                    <w:t xml:space="preserve">+1.3% [−0.2, 2.8]</w:t>
-                  </w:r>
-                </w:p>
-              </w:tc>
-              <w:tc>
-                <w:tcPr/>
-                <w:p>
-                  <w:pPr>
-                    <w:pStyle w:val="Compact"/>
-                    <w:jc w:val="right"/>
-                    <w:jc w:val="center"/>
-                  </w:pPr>
-                  <w:r>
-                    <w:t xml:space="preserve">0.0 ± 1.7</w:t>
-                  </w:r>
-                </w:p>
-              </w:tc>
-              <w:tc>
-                <w:tcPr/>
-                <w:p>
-                  <w:pPr>
-                    <w:pStyle w:val="Compact"/>
-                    <w:jc w:val="right"/>
-                    <w:jc w:val="center"/>
-                  </w:pPr>
-                  <w:r>
-                    <w:t xml:space="preserve">3,678</w:t>
-                  </w:r>
-                </w:p>
-              </w:tc>
-              <w:tc>
-                <w:tcPr/>
-                <w:p>
-                  <w:pPr>
-                    <w:pStyle w:val="Compact"/>
-                    <w:jc w:val="right"/>
-                    <w:jc w:val="center"/>
-                  </w:pPr>
-                  <w:r>
-                    <w:t xml:space="preserve">42</w:t>
-                  </w:r>
-                </w:p>
-              </w:tc>
-            </w:tr>
-            <w:tr>
-              <w:tc>
-                <w:tcPr/>
-                <w:p>
-                  <w:pPr>
-                    <w:pStyle w:val="Compact"/>
-                    <w:jc w:val="left"/>
-                    <w:jc w:val="center"/>
-                  </w:pPr>
-                  <w:r>
-                    <w:t xml:space="preserve">P8</w:t>
-                  </w:r>
-                </w:p>
-              </w:tc>
-              <w:tc>
-                <w:tcPr/>
-                <w:p>
-                  <w:pPr>
-                    <w:pStyle w:val="Compact"/>
-                    <w:jc w:val="right"/>
-                    <w:jc w:val="center"/>
-                  </w:pPr>
-                  <w:r>
-                    <w:t xml:space="preserve">grip period before the probe</w:t>
-                  </w:r>
-                </w:p>
-              </w:tc>
-              <w:tc>
-                <w:tcPr/>
-                <w:p>
-                  <w:pPr>
-                    <w:pStyle w:val="Compact"/>
-                    <w:jc w:val="right"/>
-                    <w:jc w:val="center"/>
-                  </w:pPr>
-                  <w:r>
-                    <w:t xml:space="preserve">−0.017</w:t>
-                  </w:r>
-                </w:p>
-              </w:tc>
-              <w:tc>
-                <w:tcPr/>
-                <w:p>
-                  <w:pPr>
-                    <w:pStyle w:val="Compact"/>
-                    <w:jc w:val="right"/>
-                    <w:jc w:val="center"/>
-                  </w:pPr>
-                  <w:r>
-                    <w:t xml:space="preserve">[−0.031, −0.004]</w:t>
-                  </w:r>
-                </w:p>
-              </w:tc>
-              <w:tc>
-                <w:tcPr/>
-                <w:p>
-                  <w:pPr>
-                    <w:pStyle w:val="Compact"/>
-                    <w:jc w:val="right"/>
-                    <w:jc w:val="center"/>
-                  </w:pPr>
-                  <w:r>
-                    <w:t xml:space="preserve">−1.7% [−3.0, −0.4]</w:t>
-                  </w:r>
-                </w:p>
-              </w:tc>
-              <w:tc>
-                <w:tcPr/>
-                <w:p>
-                  <w:pPr>
-                    <w:pStyle w:val="Compact"/>
-                    <w:jc w:val="right"/>
-                    <w:jc w:val="center"/>
-                  </w:pPr>
-                  <w:r>
-                    <w:t xml:space="preserve">2.6 ± 2.1</w:t>
-                  </w:r>
-                </w:p>
-              </w:tc>
-              <w:tc>
-                <w:tcPr/>
-                <w:p>
-                  <w:pPr>
-                    <w:pStyle w:val="Compact"/>
-                    <w:jc w:val="right"/>
-                    <w:jc w:val="center"/>
-                  </w:pPr>
-                  <w:r>
-                    <w:t xml:space="preserve">4,444</w:t>
-                  </w:r>
-                </w:p>
-              </w:tc>
-              <w:tc>
-                <w:tcPr/>
-                <w:p>
-                  <w:pPr>
-                    <w:pStyle w:val="Compact"/>
-                    <w:jc w:val="right"/>
-                    <w:jc w:val="center"/>
-                  </w:pPr>
-                  <w:r>
-                    <w:t xml:space="preserve">42</w:t>
                   </w:r>
                 </w:p>
               </w:tc>
@@ -7749,33 +7070,33 @@
                     <w:jc w:val="center"/>
                   </w:pPr>
                   <w:r>
-                    <w:t xml:space="preserve">1.003</w:t>
-                  </w:r>
-                </w:p>
-              </w:tc>
-              <w:tc>
-                <w:tcPr/>
-                <w:p>
-                  <w:pPr>
-                    <w:pStyle w:val="Compact"/>
-                    <w:jc w:val="right"/>
-                    <w:jc w:val="center"/>
-                  </w:pPr>
-                  <w:r>
-                    <w:t xml:space="preserve">1,677</w:t>
-                  </w:r>
-                </w:p>
-              </w:tc>
-              <w:tc>
-                <w:tcPr/>
-                <w:p>
-                  <w:pPr>
-                    <w:pStyle w:val="Compact"/>
-                    <w:jc w:val="right"/>
-                    <w:jc w:val="center"/>
-                  </w:pPr>
-                  <w:r>
-                    <w:t xml:space="preserve">3,128</w:t>
+                    <w:t xml:space="preserve">1.006</w:t>
+                  </w:r>
+                </w:p>
+              </w:tc>
+              <w:tc>
+                <w:tcPr/>
+                <w:p>
+                  <w:pPr>
+                    <w:pStyle w:val="Compact"/>
+                    <w:jc w:val="right"/>
+                    <w:jc w:val="center"/>
+                  </w:pPr>
+                  <w:r>
+                    <w:t xml:space="preserve">1,394</w:t>
+                  </w:r>
+                </w:p>
+              </w:tc>
+              <w:tc>
+                <w:tcPr/>
+                <w:p>
+                  <w:pPr>
+                    <w:pStyle w:val="Compact"/>
+                    <w:jc w:val="right"/>
+                    <w:jc w:val="center"/>
+                  </w:pPr>
+                  <w:r>
+                    <w:t xml:space="preserve">2,610</w:t>
                   </w:r>
                 </w:p>
               </w:tc>
@@ -7842,33 +7163,33 @@
                     <w:jc w:val="center"/>
                   </w:pPr>
                   <w:r>
-                    <w:t xml:space="preserve">1.005</w:t>
-                  </w:r>
-                </w:p>
-              </w:tc>
-              <w:tc>
-                <w:tcPr/>
-                <w:p>
-                  <w:pPr>
-                    <w:pStyle w:val="Compact"/>
-                    <w:jc w:val="right"/>
-                    <w:jc w:val="center"/>
-                  </w:pPr>
-                  <w:r>
-                    <w:t xml:space="preserve">1,749</w:t>
-                  </w:r>
-                </w:p>
-              </w:tc>
-              <w:tc>
-                <w:tcPr/>
-                <w:p>
-                  <w:pPr>
-                    <w:pStyle w:val="Compact"/>
-                    <w:jc w:val="right"/>
-                    <w:jc w:val="center"/>
-                  </w:pPr>
-                  <w:r>
-                    <w:t xml:space="preserve">3,258</w:t>
+                    <w:t xml:space="preserve">1.009</w:t>
+                  </w:r>
+                </w:p>
+              </w:tc>
+              <w:tc>
+                <w:tcPr/>
+                <w:p>
+                  <w:pPr>
+                    <w:pStyle w:val="Compact"/>
+                    <w:jc w:val="right"/>
+                    <w:jc w:val="center"/>
+                  </w:pPr>
+                  <w:r>
+                    <w:t xml:space="preserve">1,550</w:t>
+                  </w:r>
+                </w:p>
+              </w:tc>
+              <w:tc>
+                <w:tcPr/>
+                <w:p>
+                  <w:pPr>
+                    <w:pStyle w:val="Compact"/>
+                    <w:jc w:val="right"/>
+                    <w:jc w:val="center"/>
+                  </w:pPr>
+                  <w:r>
+                    <w:t xml:space="preserve">2,831</w:t>
                   </w:r>
                 </w:p>
               </w:tc>
@@ -7935,33 +7256,33 @@
                     <w:jc w:val="center"/>
                   </w:pPr>
                   <w:r>
-                    <w:t xml:space="preserve">1.004</w:t>
-                  </w:r>
-                </w:p>
-              </w:tc>
-              <w:tc>
-                <w:tcPr/>
-                <w:p>
-                  <w:pPr>
-                    <w:pStyle w:val="Compact"/>
-                    <w:jc w:val="right"/>
-                    <w:jc w:val="center"/>
-                  </w:pPr>
-                  <w:r>
-                    <w:t xml:space="preserve">2,030</w:t>
-                  </w:r>
-                </w:p>
-              </w:tc>
-              <w:tc>
-                <w:tcPr/>
-                <w:p>
-                  <w:pPr>
-                    <w:pStyle w:val="Compact"/>
-                    <w:jc w:val="right"/>
-                    <w:jc w:val="center"/>
-                  </w:pPr>
-                  <w:r>
-                    <w:t xml:space="preserve">4,079</w:t>
+                    <w:t xml:space="preserve">1.005</w:t>
+                  </w:r>
+                </w:p>
+              </w:tc>
+              <w:tc>
+                <w:tcPr/>
+                <w:p>
+                  <w:pPr>
+                    <w:pStyle w:val="Compact"/>
+                    <w:jc w:val="right"/>
+                    <w:jc w:val="center"/>
+                  </w:pPr>
+                  <w:r>
+                    <w:t xml:space="preserve">1,776</w:t>
+                  </w:r>
+                </w:p>
+              </w:tc>
+              <w:tc>
+                <w:tcPr/>
+                <w:p>
+                  <w:pPr>
+                    <w:pStyle w:val="Compact"/>
+                    <w:jc w:val="right"/>
+                    <w:jc w:val="center"/>
+                  </w:pPr>
+                  <w:r>
+                    <w:t xml:space="preserve">3,652</w:t>
                   </w:r>
                 </w:p>
               </w:tc>
@@ -8028,33 +7349,33 @@
                     <w:jc w:val="center"/>
                   </w:pPr>
                   <w:r>
-                    <w:t xml:space="preserve">1.003</w:t>
-                  </w:r>
-                </w:p>
-              </w:tc>
-              <w:tc>
-                <w:tcPr/>
-                <w:p>
-                  <w:pPr>
-                    <w:pStyle w:val="Compact"/>
-                    <w:jc w:val="right"/>
-                    <w:jc w:val="center"/>
-                  </w:pPr>
-                  <w:r>
-                    <w:t xml:space="preserve">2,102</w:t>
-                  </w:r>
-                </w:p>
-              </w:tc>
-              <w:tc>
-                <w:tcPr/>
-                <w:p>
-                  <w:pPr>
-                    <w:pStyle w:val="Compact"/>
-                    <w:jc w:val="right"/>
-                    <w:jc w:val="center"/>
-                  </w:pPr>
-                  <w:r>
-                    <w:t xml:space="preserve">3,485</w:t>
+                    <w:t xml:space="preserve">1.005</w:t>
+                  </w:r>
+                </w:p>
+              </w:tc>
+              <w:tc>
+                <w:tcPr/>
+                <w:p>
+                  <w:pPr>
+                    <w:pStyle w:val="Compact"/>
+                    <w:jc w:val="right"/>
+                    <w:jc w:val="center"/>
+                  </w:pPr>
+                  <w:r>
+                    <w:t xml:space="preserve">1,216</w:t>
+                  </w:r>
+                </w:p>
+              </w:tc>
+              <w:tc>
+                <w:tcPr/>
+                <w:p>
+                  <w:pPr>
+                    <w:pStyle w:val="Compact"/>
+                    <w:jc w:val="right"/>
+                    <w:jc w:val="center"/>
+                  </w:pPr>
+                  <w:r>
+                    <w:t xml:space="preserve">2,231</w:t>
                   </w:r>
                 </w:p>
               </w:tc>
@@ -8134,20 +7455,20 @@
                     <w:jc w:val="center"/>
                   </w:pPr>
                   <w:r>
-                    <w:t xml:space="preserve">1,354</w:t>
-                  </w:r>
-                </w:p>
-              </w:tc>
-              <w:tc>
-                <w:tcPr/>
-                <w:p>
-                  <w:pPr>
-                    <w:pStyle w:val="Compact"/>
-                    <w:jc w:val="right"/>
-                    <w:jc w:val="center"/>
-                  </w:pPr>
-                  <w:r>
-                    <w:t xml:space="preserve">2,734</w:t>
+                    <w:t xml:space="preserve">1,537</w:t>
+                  </w:r>
+                </w:p>
+              </w:tc>
+              <w:tc>
+                <w:tcPr/>
+                <w:p>
+                  <w:pPr>
+                    <w:pStyle w:val="Compact"/>
+                    <w:jc w:val="right"/>
+                    <w:jc w:val="center"/>
+                  </w:pPr>
+                  <w:r>
+                    <w:t xml:space="preserve">3,115</w:t>
                   </w:r>
                 </w:p>
               </w:tc>
@@ -8227,20 +7548,20 @@
                     <w:jc w:val="center"/>
                   </w:pPr>
                   <w:r>
-                    <w:t xml:space="preserve">1,539</w:t>
-                  </w:r>
-                </w:p>
-              </w:tc>
-              <w:tc>
-                <w:tcPr/>
-                <w:p>
-                  <w:pPr>
-                    <w:pStyle w:val="Compact"/>
-                    <w:jc w:val="right"/>
-                    <w:jc w:val="center"/>
-                  </w:pPr>
-                  <w:r>
-                    <w:t xml:space="preserve">2,917</w:t>
+                    <w:t xml:space="preserve">1,683</w:t>
+                  </w:r>
+                </w:p>
+              </w:tc>
+              <w:tc>
+                <w:tcPr/>
+                <w:p>
+                  <w:pPr>
+                    <w:pStyle w:val="Compact"/>
+                    <w:jc w:val="right"/>
+                    <w:jc w:val="center"/>
+                  </w:pPr>
+                  <w:r>
+                    <w:t xml:space="preserve">3,105</w:t>
                   </w:r>
                 </w:p>
               </w:tc>
@@ -8307,33 +7628,33 @@
                     <w:jc w:val="center"/>
                   </w:pPr>
                   <w:r>
-                    <w:t xml:space="preserve">1.004</w:t>
-                  </w:r>
-                </w:p>
-              </w:tc>
-              <w:tc>
-                <w:tcPr/>
-                <w:p>
-                  <w:pPr>
-                    <w:pStyle w:val="Compact"/>
-                    <w:jc w:val="right"/>
-                    <w:jc w:val="center"/>
-                  </w:pPr>
-                  <w:r>
-                    <w:t xml:space="preserve">1,573</w:t>
-                  </w:r>
-                </w:p>
-              </w:tc>
-              <w:tc>
-                <w:tcPr/>
-                <w:p>
-                  <w:pPr>
-                    <w:pStyle w:val="Compact"/>
-                    <w:jc w:val="right"/>
-                    <w:jc w:val="center"/>
-                  </w:pPr>
-                  <w:r>
-                    <w:t xml:space="preserve">2,831</w:t>
+                    <w:t xml:space="preserve">1.005</w:t>
+                  </w:r>
+                </w:p>
+              </w:tc>
+              <w:tc>
+                <w:tcPr/>
+                <w:p>
+                  <w:pPr>
+                    <w:pStyle w:val="Compact"/>
+                    <w:jc w:val="right"/>
+                    <w:jc w:val="center"/>
+                  </w:pPr>
+                  <w:r>
+                    <w:t xml:space="preserve">1,414</w:t>
+                  </w:r>
+                </w:p>
+              </w:tc>
+              <w:tc>
+                <w:tcPr/>
+                <w:p>
+                  <w:pPr>
+                    <w:pStyle w:val="Compact"/>
+                    <w:jc w:val="right"/>
+                    <w:jc w:val="center"/>
+                  </w:pPr>
+                  <w:r>
+                    <w:t xml:space="preserve">2,405</w:t>
                   </w:r>
                 </w:p>
               </w:tc>
@@ -8400,33 +7721,33 @@
                     <w:jc w:val="center"/>
                   </w:pPr>
                   <w:r>
-                    <w:t xml:space="preserve">1.006</w:t>
-                  </w:r>
-                </w:p>
-              </w:tc>
-              <w:tc>
-                <w:tcPr/>
-                <w:p>
-                  <w:pPr>
-                    <w:pStyle w:val="Compact"/>
-                    <w:jc w:val="right"/>
-                    <w:jc w:val="center"/>
-                  </w:pPr>
-                  <w:r>
-                    <w:t xml:space="preserve">1,613</w:t>
-                  </w:r>
-                </w:p>
-              </w:tc>
-              <w:tc>
-                <w:tcPr/>
-                <w:p>
-                  <w:pPr>
-                    <w:pStyle w:val="Compact"/>
-                    <w:jc w:val="right"/>
-                    <w:jc w:val="center"/>
-                  </w:pPr>
-                  <w:r>
-                    <w:t xml:space="preserve">2,786</w:t>
+                    <w:t xml:space="preserve">1.007</w:t>
+                  </w:r>
+                </w:p>
+              </w:tc>
+              <w:tc>
+                <w:tcPr/>
+                <w:p>
+                  <w:pPr>
+                    <w:pStyle w:val="Compact"/>
+                    <w:jc w:val="right"/>
+                    <w:jc w:val="center"/>
+                  </w:pPr>
+                  <w:r>
+                    <w:t xml:space="preserve">1,248</w:t>
+                  </w:r>
+                </w:p>
+              </w:tc>
+              <w:tc>
+                <w:tcPr/>
+                <w:p>
+                  <w:pPr>
+                    <w:pStyle w:val="Compact"/>
+                    <w:jc w:val="right"/>
+                    <w:jc w:val="center"/>
+                  </w:pPr>
+                  <w:r>
+                    <w:t xml:space="preserve">2,264</w:t>
                   </w:r>
                 </w:p>
               </w:tc>
@@ -8493,33 +7814,33 @@
                     <w:jc w:val="center"/>
                   </w:pPr>
                   <w:r>
-                    <w:t xml:space="preserve">1.004</w:t>
-                  </w:r>
-                </w:p>
-              </w:tc>
-              <w:tc>
-                <w:tcPr/>
-                <w:p>
-                  <w:pPr>
-                    <w:pStyle w:val="Compact"/>
-                    <w:jc w:val="right"/>
-                    <w:jc w:val="center"/>
-                  </w:pPr>
-                  <w:r>
-                    <w:t xml:space="preserve">1,610</w:t>
-                  </w:r>
-                </w:p>
-              </w:tc>
-              <w:tc>
-                <w:tcPr/>
-                <w:p>
-                  <w:pPr>
-                    <w:pStyle w:val="Compact"/>
-                    <w:jc w:val="right"/>
-                    <w:jc w:val="center"/>
-                  </w:pPr>
-                  <w:r>
-                    <w:t xml:space="preserve">3,025</w:t>
+                    <w:t xml:space="preserve">1.006</w:t>
+                  </w:r>
+                </w:p>
+              </w:tc>
+              <w:tc>
+                <w:tcPr/>
+                <w:p>
+                  <w:pPr>
+                    <w:pStyle w:val="Compact"/>
+                    <w:jc w:val="right"/>
+                    <w:jc w:val="center"/>
+                  </w:pPr>
+                  <w:r>
+                    <w:t xml:space="preserve">1,177</w:t>
+                  </w:r>
+                </w:p>
+              </w:tc>
+              <w:tc>
+                <w:tcPr/>
+                <w:p>
+                  <w:pPr>
+                    <w:pStyle w:val="Compact"/>
+                    <w:jc w:val="right"/>
+                    <w:jc w:val="center"/>
+                  </w:pPr>
+                  <w:r>
+                    <w:t xml:space="preserve">2,476</w:t>
                   </w:r>
                 </w:p>
               </w:tc>
@@ -8586,33 +7907,33 @@
                     <w:jc w:val="center"/>
                   </w:pPr>
                   <w:r>
-                    <w:t xml:space="preserve">1.002</w:t>
-                  </w:r>
-                </w:p>
-              </w:tc>
-              <w:tc>
-                <w:tcPr/>
-                <w:p>
-                  <w:pPr>
-                    <w:pStyle w:val="Compact"/>
-                    <w:jc w:val="right"/>
-                    <w:jc w:val="center"/>
-                  </w:pPr>
-                  <w:r>
-                    <w:t xml:space="preserve">2,269</w:t>
-                  </w:r>
-                </w:p>
-              </w:tc>
-              <w:tc>
-                <w:tcPr/>
-                <w:p>
-                  <w:pPr>
-                    <w:pStyle w:val="Compact"/>
-                    <w:jc w:val="right"/>
-                    <w:jc w:val="center"/>
-                  </w:pPr>
-                  <w:r>
-                    <w:t xml:space="preserve">3,886</w:t>
+                    <w:t xml:space="preserve">1.006</w:t>
+                  </w:r>
+                </w:p>
+              </w:tc>
+              <w:tc>
+                <w:tcPr/>
+                <w:p>
+                  <w:pPr>
+                    <w:pStyle w:val="Compact"/>
+                    <w:jc w:val="right"/>
+                    <w:jc w:val="center"/>
+                  </w:pPr>
+                  <w:r>
+                    <w:t xml:space="preserve">1,799</w:t>
+                  </w:r>
+                </w:p>
+              </w:tc>
+              <w:tc>
+                <w:tcPr/>
+                <w:p>
+                  <w:pPr>
+                    <w:pStyle w:val="Compact"/>
+                    <w:jc w:val="right"/>
+                    <w:jc w:val="center"/>
+                  </w:pPr>
+                  <w:r>
+                    <w:t xml:space="preserve">3,223</w:t>
                   </w:r>
                 </w:p>
               </w:tc>
@@ -8679,33 +8000,33 @@
                     <w:jc w:val="center"/>
                   </w:pPr>
                   <w:r>
-                    <w:t xml:space="preserve">1.003</w:t>
-                  </w:r>
-                </w:p>
-              </w:tc>
-              <w:tc>
-                <w:tcPr/>
-                <w:p>
-                  <w:pPr>
-                    <w:pStyle w:val="Compact"/>
-                    <w:jc w:val="right"/>
-                    <w:jc w:val="center"/>
-                  </w:pPr>
-                  <w:r>
-                    <w:t xml:space="preserve">2,009</w:t>
-                  </w:r>
-                </w:p>
-              </w:tc>
-              <w:tc>
-                <w:tcPr/>
-                <w:p>
-                  <w:pPr>
-                    <w:pStyle w:val="Compact"/>
-                    <w:jc w:val="right"/>
-                    <w:jc w:val="center"/>
-                  </w:pPr>
-                  <w:r>
-                    <w:t xml:space="preserve">3,707</w:t>
+                    <w:t xml:space="preserve">1.005</w:t>
+                  </w:r>
+                </w:p>
+              </w:tc>
+              <w:tc>
+                <w:tcPr/>
+                <w:p>
+                  <w:pPr>
+                    <w:pStyle w:val="Compact"/>
+                    <w:jc w:val="right"/>
+                    <w:jc w:val="center"/>
+                  </w:pPr>
+                  <w:r>
+                    <w:t xml:space="preserve">1,602</w:t>
+                  </w:r>
+                </w:p>
+              </w:tc>
+              <w:tc>
+                <w:tcPr/>
+                <w:p>
+                  <w:pPr>
+                    <w:pStyle w:val="Compact"/>
+                    <w:jc w:val="right"/>
+                    <w:jc w:val="center"/>
+                  </w:pPr>
+                  <w:r>
+                    <w:t xml:space="preserve">2,943</w:t>
                   </w:r>
                 </w:p>
               </w:tc>
@@ -8772,33 +8093,33 @@
                     <w:jc w:val="center"/>
                   </w:pPr>
                   <w:r>
-                    <w:t xml:space="preserve">1.005</w:t>
-                  </w:r>
-                </w:p>
-              </w:tc>
-              <w:tc>
-                <w:tcPr/>
-                <w:p>
-                  <w:pPr>
-                    <w:pStyle w:val="Compact"/>
-                    <w:jc w:val="right"/>
-                    <w:jc w:val="center"/>
-                  </w:pPr>
-                  <w:r>
-                    <w:t xml:space="preserve">1,548</w:t>
-                  </w:r>
-                </w:p>
-              </w:tc>
-              <w:tc>
-                <w:tcPr/>
-                <w:p>
-                  <w:pPr>
-                    <w:pStyle w:val="Compact"/>
-                    <w:jc w:val="right"/>
-                    <w:jc w:val="center"/>
-                  </w:pPr>
-                  <w:r>
-                    <w:t xml:space="preserve">2,788</w:t>
+                    <w:t xml:space="preserve">1.007</w:t>
+                  </w:r>
+                </w:p>
+              </w:tc>
+              <w:tc>
+                <w:tcPr/>
+                <w:p>
+                  <w:pPr>
+                    <w:pStyle w:val="Compact"/>
+                    <w:jc w:val="right"/>
+                    <w:jc w:val="center"/>
+                  </w:pPr>
+                  <w:r>
+                    <w:t xml:space="preserve">1,561</w:t>
+                  </w:r>
+                </w:p>
+              </w:tc>
+              <w:tc>
+                <w:tcPr/>
+                <w:p>
+                  <w:pPr>
+                    <w:pStyle w:val="Compact"/>
+                    <w:jc w:val="right"/>
+                    <w:jc w:val="center"/>
+                  </w:pPr>
+                  <w:r>
+                    <w:t xml:space="preserve">3,064</w:t>
                   </w:r>
                 </w:p>
               </w:tc>
@@ -8865,33 +8186,33 @@
                     <w:jc w:val="center"/>
                   </w:pPr>
                   <w:r>
-                    <w:t xml:space="preserve">1.003</w:t>
-                  </w:r>
-                </w:p>
-              </w:tc>
-              <w:tc>
-                <w:tcPr/>
-                <w:p>
-                  <w:pPr>
-                    <w:pStyle w:val="Compact"/>
-                    <w:jc w:val="right"/>
-                    <w:jc w:val="center"/>
-                  </w:pPr>
-                  <w:r>
-                    <w:t xml:space="preserve">1,866</w:t>
-                  </w:r>
-                </w:p>
-              </w:tc>
-              <w:tc>
-                <w:tcPr/>
-                <w:p>
-                  <w:pPr>
-                    <w:pStyle w:val="Compact"/>
-                    <w:jc w:val="right"/>
-                    <w:jc w:val="center"/>
-                  </w:pPr>
-                  <w:r>
-                    <w:t xml:space="preserve">3,587</w:t>
+                    <w:t xml:space="preserve">1.004</w:t>
+                  </w:r>
+                </w:p>
+              </w:tc>
+              <w:tc>
+                <w:tcPr/>
+                <w:p>
+                  <w:pPr>
+                    <w:pStyle w:val="Compact"/>
+                    <w:jc w:val="right"/>
+                    <w:jc w:val="center"/>
+                  </w:pPr>
+                  <w:r>
+                    <w:t xml:space="preserve">1,341</w:t>
+                  </w:r>
+                </w:p>
+              </w:tc>
+              <w:tc>
+                <w:tcPr/>
+                <w:p>
+                  <w:pPr>
+                    <w:pStyle w:val="Compact"/>
+                    <w:jc w:val="right"/>
+                    <w:jc w:val="center"/>
+                  </w:pPr>
+                  <w:r>
+                    <w:t xml:space="preserve">2,780</w:t>
                   </w:r>
                 </w:p>
               </w:tc>
@@ -8958,33 +8279,33 @@
                     <w:jc w:val="center"/>
                   </w:pPr>
                   <w:r>
-                    <w:t xml:space="preserve">1.008</w:t>
-                  </w:r>
-                </w:p>
-              </w:tc>
-              <w:tc>
-                <w:tcPr/>
-                <w:p>
-                  <w:pPr>
-                    <w:pStyle w:val="Compact"/>
-                    <w:jc w:val="right"/>
-                    <w:jc w:val="center"/>
-                  </w:pPr>
-                  <w:r>
-                    <w:t xml:space="preserve">1,379</w:t>
-                  </w:r>
-                </w:p>
-              </w:tc>
-              <w:tc>
-                <w:tcPr/>
-                <w:p>
-                  <w:pPr>
-                    <w:pStyle w:val="Compact"/>
-                    <w:jc w:val="right"/>
-                    <w:jc w:val="center"/>
-                  </w:pPr>
-                  <w:r>
-                    <w:t xml:space="preserve">2,795</w:t>
+                    <w:t xml:space="preserve">1.006</w:t>
+                  </w:r>
+                </w:p>
+              </w:tc>
+              <w:tc>
+                <w:tcPr/>
+                <w:p>
+                  <w:pPr>
+                    <w:pStyle w:val="Compact"/>
+                    <w:jc w:val="right"/>
+                    <w:jc w:val="center"/>
+                  </w:pPr>
+                  <w:r>
+                    <w:t xml:space="preserve">1,355</w:t>
+                  </w:r>
+                </w:p>
+              </w:tc>
+              <w:tc>
+                <w:tcPr/>
+                <w:p>
+                  <w:pPr>
+                    <w:pStyle w:val="Compact"/>
+                    <w:jc w:val="right"/>
+                    <w:jc w:val="center"/>
+                  </w:pPr>
+                  <w:r>
+                    <w:t xml:space="preserve">2,750</w:t>
                   </w:r>
                 </w:p>
               </w:tc>
@@ -9051,33 +8372,33 @@
                     <w:jc w:val="center"/>
                   </w:pPr>
                   <w:r>
-                    <w:t xml:space="preserve">1.006</w:t>
-                  </w:r>
-                </w:p>
-              </w:tc>
-              <w:tc>
-                <w:tcPr/>
-                <w:p>
-                  <w:pPr>
-                    <w:pStyle w:val="Compact"/>
-                    <w:jc w:val="right"/>
-                    <w:jc w:val="center"/>
-                  </w:pPr>
-                  <w:r>
-                    <w:t xml:space="preserve">1,615</w:t>
-                  </w:r>
-                </w:p>
-              </w:tc>
-              <w:tc>
-                <w:tcPr/>
-                <w:p>
-                  <w:pPr>
-                    <w:pStyle w:val="Compact"/>
-                    <w:jc w:val="right"/>
-                    <w:jc w:val="center"/>
-                  </w:pPr>
-                  <w:r>
-                    <w:t xml:space="preserve">2,698</w:t>
+                    <w:t xml:space="preserve">1.004</w:t>
+                  </w:r>
+                </w:p>
+              </w:tc>
+              <w:tc>
+                <w:tcPr/>
+                <w:p>
+                  <w:pPr>
+                    <w:pStyle w:val="Compact"/>
+                    <w:jc w:val="right"/>
+                    <w:jc w:val="center"/>
+                  </w:pPr>
+                  <w:r>
+                    <w:t xml:space="preserve">1,639</w:t>
+                  </w:r>
+                </w:p>
+              </w:tc>
+              <w:tc>
+                <w:tcPr/>
+                <w:p>
+                  <w:pPr>
+                    <w:pStyle w:val="Compact"/>
+                    <w:jc w:val="right"/>
+                    <w:jc w:val="center"/>
+                  </w:pPr>
+                  <w:r>
+                    <w:t xml:space="preserve">3,276</w:t>
                   </w:r>
                 </w:p>
               </w:tc>
@@ -17217,7 +16538,7 @@
                     <w:jc w:val="center"/>
                   </w:pPr>
                   <w:r>
-                    <w:t xml:space="preserve">4,952</w:t>
+                    <w:t xml:space="preserve">4,935</w:t>
                   </w:r>
                 </w:p>
               </w:tc>
@@ -17271,54 +16592,54 @@
                     <w:jc w:val="center"/>
                   </w:pPr>
                   <w:r>
-                    <w:t xml:space="preserve">0.002</w:t>
-                  </w:r>
-                </w:p>
-              </w:tc>
-              <w:tc>
-                <w:tcPr/>
-                <w:p>
-                  <w:pPr>
-                    <w:pStyle w:val="Compact"/>
-                    <w:jc w:val="right"/>
-                    <w:jc w:val="center"/>
-                  </w:pPr>
-                  <w:r>
-                    <w:t xml:space="preserve">[−0.030, 0.035]</w:t>
-                  </w:r>
-                </w:p>
-              </w:tc>
-              <w:tc>
-                <w:tcPr/>
-                <w:p>
-                  <w:pPr>
-                    <w:pStyle w:val="Compact"/>
-                  </w:pPr>
-                </w:p>
-              </w:tc>
-              <w:tc>
-                <w:tcPr/>
-                <w:p>
-                  <w:pPr>
-                    <w:pStyle w:val="Compact"/>
-                    <w:jc w:val="right"/>
-                    <w:jc w:val="center"/>
-                  </w:pPr>
-                  <w:r>
-                    <w:t xml:space="preserve">−0.9 ± 0.2</w:t>
-                  </w:r>
-                </w:p>
-              </w:tc>
-              <w:tc>
-                <w:tcPr/>
-                <w:p>
-                  <w:pPr>
-                    <w:pStyle w:val="Compact"/>
-                    <w:jc w:val="right"/>
-                    <w:jc w:val="center"/>
-                  </w:pPr>
-                  <w:r>
-                    <w:t xml:space="preserve">4,952</w:t>
+                    <w:t xml:space="preserve">0.008</w:t>
+                  </w:r>
+                </w:p>
+              </w:tc>
+              <w:tc>
+                <w:tcPr/>
+                <w:p>
+                  <w:pPr>
+                    <w:pStyle w:val="Compact"/>
+                    <w:jc w:val="right"/>
+                    <w:jc w:val="center"/>
+                  </w:pPr>
+                  <w:r>
+                    <w:t xml:space="preserve">[−0.023, 0.041]</w:t>
+                  </w:r>
+                </w:p>
+              </w:tc>
+              <w:tc>
+                <w:tcPr/>
+                <w:p>
+                  <w:pPr>
+                    <w:pStyle w:val="Compact"/>
+                  </w:pPr>
+                </w:p>
+              </w:tc>
+              <w:tc>
+                <w:tcPr/>
+                <w:p>
+                  <w:pPr>
+                    <w:pStyle w:val="Compact"/>
+                    <w:jc w:val="right"/>
+                    <w:jc w:val="center"/>
+                  </w:pPr>
+                  <w:r>
+                    <w:t xml:space="preserve">−0.2 ± 0.5</w:t>
+                  </w:r>
+                </w:p>
+              </w:tc>
+              <w:tc>
+                <w:tcPr/>
+                <w:p>
+                  <w:pPr>
+                    <w:pStyle w:val="Compact"/>
+                    <w:jc w:val="right"/>
+                    <w:jc w:val="center"/>
+                  </w:pPr>
+                  <w:r>
+                    <w:t xml:space="preserve">4,935</w:t>
                   </w:r>
                 </w:p>
               </w:tc>
@@ -17372,54 +16693,54 @@
                     <w:jc w:val="center"/>
                   </w:pPr>
                   <w:r>
-                    <w:t xml:space="preserve">0.050</w:t>
-                  </w:r>
-                </w:p>
-              </w:tc>
-              <w:tc>
-                <w:tcPr/>
-                <w:p>
-                  <w:pPr>
-                    <w:pStyle w:val="Compact"/>
-                    <w:jc w:val="right"/>
-                    <w:jc w:val="center"/>
-                  </w:pPr>
-                  <w:r>
-                    <w:t xml:space="preserve">[0.011, 0.088]</w:t>
-                  </w:r>
-                </w:p>
-              </w:tc>
-              <w:tc>
-                <w:tcPr/>
-                <w:p>
-                  <w:pPr>
-                    <w:pStyle w:val="Compact"/>
-                  </w:pPr>
-                </w:p>
-              </w:tc>
-              <w:tc>
-                <w:tcPr/>
-                <w:p>
-                  <w:pPr>
-                    <w:pStyle w:val="Compact"/>
-                    <w:jc w:val="right"/>
-                    <w:jc w:val="center"/>
-                  </w:pPr>
-                  <w:r>
-                    <w:t xml:space="preserve">8.7 ± 5.3</w:t>
-                  </w:r>
-                </w:p>
-              </w:tc>
-              <w:tc>
-                <w:tcPr/>
-                <w:p>
-                  <w:pPr>
-                    <w:pStyle w:val="Compact"/>
-                    <w:jc w:val="right"/>
-                    <w:jc w:val="center"/>
-                  </w:pPr>
-                  <w:r>
-                    <w:t xml:space="preserve">4,952</w:t>
+                    <w:t xml:space="preserve">0.049</w:t>
+                  </w:r>
+                </w:p>
+              </w:tc>
+              <w:tc>
+                <w:tcPr/>
+                <w:p>
+                  <w:pPr>
+                    <w:pStyle w:val="Compact"/>
+                    <w:jc w:val="right"/>
+                    <w:jc w:val="center"/>
+                  </w:pPr>
+                  <w:r>
+                    <w:t xml:space="preserve">[0.010, 0.088]</w:t>
+                  </w:r>
+                </w:p>
+              </w:tc>
+              <w:tc>
+                <w:tcPr/>
+                <w:p>
+                  <w:pPr>
+                    <w:pStyle w:val="Compact"/>
+                  </w:pPr>
+                </w:p>
+              </w:tc>
+              <w:tc>
+                <w:tcPr/>
+                <w:p>
+                  <w:pPr>
+                    <w:pStyle w:val="Compact"/>
+                    <w:jc w:val="right"/>
+                    <w:jc w:val="center"/>
+                  </w:pPr>
+                  <w:r>
+                    <w:t xml:space="preserve">8.8 ± 5.1</w:t>
+                  </w:r>
+                </w:p>
+              </w:tc>
+              <w:tc>
+                <w:tcPr/>
+                <w:p>
+                  <w:pPr>
+                    <w:pStyle w:val="Compact"/>
+                    <w:jc w:val="right"/>
+                    <w:jc w:val="center"/>
+                  </w:pPr>
+                  <w:r>
+                    <w:t xml:space="preserve">4,935</w:t>
                   </w:r>
                 </w:p>
               </w:tc>
@@ -17473,49 +16794,49 @@
                     <w:jc w:val="center"/>
                   </w:pPr>
                   <w:r>
-                    <w:t xml:space="preserve">−0.091</w:t>
-                  </w:r>
-                </w:p>
-              </w:tc>
-              <w:tc>
-                <w:tcPr/>
-                <w:p>
-                  <w:pPr>
-                    <w:pStyle w:val="Compact"/>
-                    <w:jc w:val="right"/>
-                    <w:jc w:val="center"/>
-                  </w:pPr>
-                  <w:r>
-                    <w:t xml:space="preserve">[−0.130, −0.053]</w:t>
-                  </w:r>
-                </w:p>
-              </w:tc>
-              <w:tc>
-                <w:tcPr/>
-                <w:p>
-                  <w:pPr>
-                    <w:pStyle w:val="Compact"/>
-                  </w:pPr>
-                </w:p>
-              </w:tc>
-              <w:tc>
-                <w:tcPr/>
-                <w:p>
-                  <w:pPr>
-                    <w:pStyle w:val="Compact"/>
-                  </w:pPr>
-                </w:p>
-              </w:tc>
-              <w:tc>
-                <w:tcPr/>
-                <w:p>
-                  <w:pPr>
-                    <w:pStyle w:val="Compact"/>
-                    <w:jc w:val="right"/>
-                    <w:jc w:val="center"/>
-                  </w:pPr>
-                  <w:r>
-                    <w:t xml:space="preserve">4,952</w:t>
+                    <w:t xml:space="preserve">−0.089</w:t>
+                  </w:r>
+                </w:p>
+              </w:tc>
+              <w:tc>
+                <w:tcPr/>
+                <w:p>
+                  <w:pPr>
+                    <w:pStyle w:val="Compact"/>
+                    <w:jc w:val="right"/>
+                    <w:jc w:val="center"/>
+                  </w:pPr>
+                  <w:r>
+                    <w:t xml:space="preserve">[−0.128, −0.050]</w:t>
+                  </w:r>
+                </w:p>
+              </w:tc>
+              <w:tc>
+                <w:tcPr/>
+                <w:p>
+                  <w:pPr>
+                    <w:pStyle w:val="Compact"/>
+                  </w:pPr>
+                </w:p>
+              </w:tc>
+              <w:tc>
+                <w:tcPr/>
+                <w:p>
+                  <w:pPr>
+                    <w:pStyle w:val="Compact"/>
+                  </w:pPr>
+                </w:p>
+              </w:tc>
+              <w:tc>
+                <w:tcPr/>
+                <w:p>
+                  <w:pPr>
+                    <w:pStyle w:val="Compact"/>
+                    <w:jc w:val="right"/>
+                    <w:jc w:val="center"/>
+                  </w:pPr>
+                  <w:r>
+                    <w:t xml:space="preserve">4,935</w:t>
                   </w:r>
                 </w:p>
               </w:tc>
@@ -17569,59 +16890,59 @@
                     <w:jc w:val="center"/>
                   </w:pPr>
                   <w:r>
-                    <w:t xml:space="preserve">0.074</w:t>
-                  </w:r>
-                </w:p>
-              </w:tc>
-              <w:tc>
-                <w:tcPr/>
-                <w:p>
-                  <w:pPr>
-                    <w:pStyle w:val="Compact"/>
-                    <w:jc w:val="right"/>
-                    <w:jc w:val="center"/>
-                  </w:pPr>
-                  <w:r>
-                    <w:t xml:space="preserve">[0.061, 0.087]</w:t>
-                  </w:r>
-                </w:p>
-              </w:tc>
-              <w:tc>
-                <w:tcPr/>
-                <w:p>
-                  <w:pPr>
-                    <w:pStyle w:val="Compact"/>
-                    <w:jc w:val="right"/>
-                    <w:jc w:val="center"/>
-                  </w:pPr>
-                  <w:r>
-                    <w:t xml:space="preserve">+7.7% [6.3, 9.1]</w:t>
-                  </w:r>
-                </w:p>
-              </w:tc>
-              <w:tc>
-                <w:tcPr/>
-                <w:p>
-                  <w:pPr>
-                    <w:pStyle w:val="Compact"/>
-                    <w:jc w:val="right"/>
-                    <w:jc w:val="center"/>
-                  </w:pPr>
-                  <w:r>
-                    <w:t xml:space="preserve">64.6 ± 9.0</w:t>
-                  </w:r>
-                </w:p>
-              </w:tc>
-              <w:tc>
-                <w:tcPr/>
-                <w:p>
-                  <w:pPr>
-                    <w:pStyle w:val="Compact"/>
-                    <w:jc w:val="right"/>
-                    <w:jc w:val="center"/>
-                  </w:pPr>
-                  <w:r>
-                    <w:t xml:space="preserve">4,952</w:t>
+                    <w:t xml:space="preserve">0.076</w:t>
+                  </w:r>
+                </w:p>
+              </w:tc>
+              <w:tc>
+                <w:tcPr/>
+                <w:p>
+                  <w:pPr>
+                    <w:pStyle w:val="Compact"/>
+                    <w:jc w:val="right"/>
+                    <w:jc w:val="center"/>
+                  </w:pPr>
+                  <w:r>
+                    <w:t xml:space="preserve">[0.063, 0.088]</w:t>
+                  </w:r>
+                </w:p>
+              </w:tc>
+              <w:tc>
+                <w:tcPr/>
+                <w:p>
+                  <w:pPr>
+                    <w:pStyle w:val="Compact"/>
+                    <w:jc w:val="right"/>
+                    <w:jc w:val="center"/>
+                  </w:pPr>
+                  <w:r>
+                    <w:t xml:space="preserve">+7.9% [6.5, 9.2]</w:t>
+                  </w:r>
+                </w:p>
+              </w:tc>
+              <w:tc>
+                <w:tcPr/>
+                <w:p>
+                  <w:pPr>
+                    <w:pStyle w:val="Compact"/>
+                    <w:jc w:val="right"/>
+                    <w:jc w:val="center"/>
+                  </w:pPr>
+                  <w:r>
+                    <w:t xml:space="preserve">67.9 ± 9.1</w:t>
+                  </w:r>
+                </w:p>
+              </w:tc>
+              <w:tc>
+                <w:tcPr/>
+                <w:p>
+                  <w:pPr>
+                    <w:pStyle w:val="Compact"/>
+                    <w:jc w:val="right"/>
+                    <w:jc w:val="center"/>
+                  </w:pPr>
+                  <w:r>
+                    <w:t xml:space="preserve">4,935</w:t>
                   </w:r>
                 </w:p>
               </w:tc>
@@ -17675,54 +16996,54 @@
                     <w:jc w:val="center"/>
                   </w:pPr>
                   <w:r>
-                    <w:t xml:space="preserve">−0.013</w:t>
-                  </w:r>
-                </w:p>
-              </w:tc>
-              <w:tc>
-                <w:tcPr/>
-                <w:p>
-                  <w:pPr>
-                    <w:pStyle w:val="Compact"/>
-                    <w:jc w:val="right"/>
-                    <w:jc w:val="center"/>
-                  </w:pPr>
-                  <w:r>
-                    <w:t xml:space="preserve">[−0.045, 0.019]</w:t>
-                  </w:r>
-                </w:p>
-              </w:tc>
-              <w:tc>
-                <w:tcPr/>
-                <w:p>
-                  <w:pPr>
-                    <w:pStyle w:val="Compact"/>
-                  </w:pPr>
-                </w:p>
-              </w:tc>
-              <w:tc>
-                <w:tcPr/>
-                <w:p>
-                  <w:pPr>
-                    <w:pStyle w:val="Compact"/>
-                    <w:jc w:val="right"/>
-                    <w:jc w:val="center"/>
-                  </w:pPr>
-                  <w:r>
-                    <w:t xml:space="preserve">−0.4 ± 0.6</w:t>
-                  </w:r>
-                </w:p>
-              </w:tc>
-              <w:tc>
-                <w:tcPr/>
-                <w:p>
-                  <w:pPr>
-                    <w:pStyle w:val="Compact"/>
-                    <w:jc w:val="right"/>
-                    <w:jc w:val="center"/>
-                  </w:pPr>
-                  <w:r>
-                    <w:t xml:space="preserve">4,612</w:t>
+                    <w:t xml:space="preserve">−0.010</w:t>
+                  </w:r>
+                </w:p>
+              </w:tc>
+              <w:tc>
+                <w:tcPr/>
+                <w:p>
+                  <w:pPr>
+                    <w:pStyle w:val="Compact"/>
+                    <w:jc w:val="right"/>
+                    <w:jc w:val="center"/>
+                  </w:pPr>
+                  <w:r>
+                    <w:t xml:space="preserve">[−0.043, 0.023]</w:t>
+                  </w:r>
+                </w:p>
+              </w:tc>
+              <w:tc>
+                <w:tcPr/>
+                <w:p>
+                  <w:pPr>
+                    <w:pStyle w:val="Compact"/>
+                  </w:pPr>
+                </w:p>
+              </w:tc>
+              <w:tc>
+                <w:tcPr/>
+                <w:p>
+                  <w:pPr>
+                    <w:pStyle w:val="Compact"/>
+                    <w:jc w:val="right"/>
+                    <w:jc w:val="center"/>
+                  </w:pPr>
+                  <w:r>
+                    <w:t xml:space="preserve">−0.6 ± 0.5</w:t>
+                  </w:r>
+                </w:p>
+              </w:tc>
+              <w:tc>
+                <w:tcPr/>
+                <w:p>
+                  <w:pPr>
+                    <w:pStyle w:val="Compact"/>
+                    <w:jc w:val="right"/>
+                    <w:jc w:val="center"/>
+                  </w:pPr>
+                  <w:r>
+                    <w:t xml:space="preserve">4,488</w:t>
                   </w:r>
                 </w:p>
               </w:tc>
@@ -17776,49 +17097,49 @@
                     <w:jc w:val="center"/>
                   </w:pPr>
                   <w:r>
-                    <w:t xml:space="preserve">−0.071</w:t>
-                  </w:r>
-                </w:p>
-              </w:tc>
-              <w:tc>
-                <w:tcPr/>
-                <w:p>
-                  <w:pPr>
-                    <w:pStyle w:val="Compact"/>
-                    <w:jc w:val="right"/>
-                    <w:jc w:val="center"/>
-                  </w:pPr>
-                  <w:r>
-                    <w:t xml:space="preserve">[−0.166, 0.025]</w:t>
-                  </w:r>
-                </w:p>
-              </w:tc>
-              <w:tc>
-                <w:tcPr/>
-                <w:p>
-                  <w:pPr>
-                    <w:pStyle w:val="Compact"/>
-                  </w:pPr>
-                </w:p>
-              </w:tc>
-              <w:tc>
-                <w:tcPr/>
-                <w:p>
-                  <w:pPr>
-                    <w:pStyle w:val="Compact"/>
-                  </w:pPr>
-                </w:p>
-              </w:tc>
-              <w:tc>
-                <w:tcPr/>
-                <w:p>
-                  <w:pPr>
-                    <w:pStyle w:val="Compact"/>
-                    <w:jc w:val="right"/>
-                    <w:jc w:val="center"/>
-                  </w:pPr>
-                  <w:r>
-                    <w:t xml:space="preserve">4,952</w:t>
+                    <w:t xml:space="preserve">−0.048</w:t>
+                  </w:r>
+                </w:p>
+              </w:tc>
+              <w:tc>
+                <w:tcPr/>
+                <w:p>
+                  <w:pPr>
+                    <w:pStyle w:val="Compact"/>
+                    <w:jc w:val="right"/>
+                    <w:jc w:val="center"/>
+                  </w:pPr>
+                  <w:r>
+                    <w:t xml:space="preserve">[−0.142, 0.045]</w:t>
+                  </w:r>
+                </w:p>
+              </w:tc>
+              <w:tc>
+                <w:tcPr/>
+                <w:p>
+                  <w:pPr>
+                    <w:pStyle w:val="Compact"/>
+                  </w:pPr>
+                </w:p>
+              </w:tc>
+              <w:tc>
+                <w:tcPr/>
+                <w:p>
+                  <w:pPr>
+                    <w:pStyle w:val="Compact"/>
+                  </w:pPr>
+                </w:p>
+              </w:tc>
+              <w:tc>
+                <w:tcPr/>
+                <w:p>
+                  <w:pPr>
+                    <w:pStyle w:val="Compact"/>
+                    <w:jc w:val="right"/>
+                    <w:jc w:val="center"/>
+                  </w:pPr>
+                  <w:r>
+                    <w:t xml:space="preserve">4,935</w:t>
                   </w:r>
                 </w:p>
               </w:tc>
@@ -17872,49 +17193,49 @@
                     <w:jc w:val="center"/>
                   </w:pPr>
                   <w:r>
-                    <w:t xml:space="preserve">0.051</w:t>
-                  </w:r>
-                </w:p>
-              </w:tc>
-              <w:tc>
-                <w:tcPr/>
-                <w:p>
-                  <w:pPr>
-                    <w:pStyle w:val="Compact"/>
-                    <w:jc w:val="right"/>
-                    <w:jc w:val="center"/>
-                  </w:pPr>
-                  <w:r>
-                    <w:t xml:space="preserve">[−0.029, 0.129]</w:t>
-                  </w:r>
-                </w:p>
-              </w:tc>
-              <w:tc>
-                <w:tcPr/>
-                <w:p>
-                  <w:pPr>
-                    <w:pStyle w:val="Compact"/>
-                  </w:pPr>
-                </w:p>
-              </w:tc>
-              <w:tc>
-                <w:tcPr/>
-                <w:p>
-                  <w:pPr>
-                    <w:pStyle w:val="Compact"/>
-                  </w:pPr>
-                </w:p>
-              </w:tc>
-              <w:tc>
-                <w:tcPr/>
-                <w:p>
-                  <w:pPr>
-                    <w:pStyle w:val="Compact"/>
-                    <w:jc w:val="right"/>
-                    <w:jc w:val="center"/>
-                  </w:pPr>
-                  <w:r>
-                    <w:t xml:space="preserve">4,952</w:t>
+                    <w:t xml:space="preserve">0.025</w:t>
+                  </w:r>
+                </w:p>
+              </w:tc>
+              <w:tc>
+                <w:tcPr/>
+                <w:p>
+                  <w:pPr>
+                    <w:pStyle w:val="Compact"/>
+                    <w:jc w:val="right"/>
+                    <w:jc w:val="center"/>
+                  </w:pPr>
+                  <w:r>
+                    <w:t xml:space="preserve">[−0.050, 0.101]</w:t>
+                  </w:r>
+                </w:p>
+              </w:tc>
+              <w:tc>
+                <w:tcPr/>
+                <w:p>
+                  <w:pPr>
+                    <w:pStyle w:val="Compact"/>
+                  </w:pPr>
+                </w:p>
+              </w:tc>
+              <w:tc>
+                <w:tcPr/>
+                <w:p>
+                  <w:pPr>
+                    <w:pStyle w:val="Compact"/>
+                  </w:pPr>
+                </w:p>
+              </w:tc>
+              <w:tc>
+                <w:tcPr/>
+                <w:p>
+                  <w:pPr>
+                    <w:pStyle w:val="Compact"/>
+                    <w:jc w:val="right"/>
+                    <w:jc w:val="center"/>
+                  </w:pPr>
+                  <w:r>
+                    <w:t xml:space="preserve">4,935</w:t>
                   </w:r>
                 </w:p>
               </w:tc>
@@ -17968,54 +17289,54 @@
                     <w:jc w:val="center"/>
                   </w:pPr>
                   <w:r>
-                    <w:t xml:space="preserve">0.039</w:t>
-                  </w:r>
-                </w:p>
-              </w:tc>
-              <w:tc>
-                <w:tcPr/>
-                <w:p>
-                  <w:pPr>
-                    <w:pStyle w:val="Compact"/>
-                    <w:jc w:val="right"/>
-                    <w:jc w:val="center"/>
-                  </w:pPr>
-                  <w:r>
-                    <w:t xml:space="preserve">[0.011, 0.066]</w:t>
-                  </w:r>
-                </w:p>
-              </w:tc>
-              <w:tc>
-                <w:tcPr/>
-                <w:p>
-                  <w:pPr>
-                    <w:pStyle w:val="Compact"/>
-                    <w:jc w:val="right"/>
-                    <w:jc w:val="center"/>
-                  </w:pPr>
-                  <w:r>
-                    <w:t xml:space="preserve">+4.0% [1.1, 6.8]</w:t>
-                  </w:r>
-                </w:p>
-              </w:tc>
-              <w:tc>
-                <w:tcPr/>
-                <w:p>
-                  <w:pPr>
-                    <w:pStyle w:val="Compact"/>
-                  </w:pPr>
-                </w:p>
-              </w:tc>
-              <w:tc>
-                <w:tcPr/>
-                <w:p>
-                  <w:pPr>
-                    <w:pStyle w:val="Compact"/>
-                    <w:jc w:val="right"/>
-                    <w:jc w:val="center"/>
-                  </w:pPr>
-                  <w:r>
-                    <w:t xml:space="preserve">4,952</w:t>
+                    <w:t xml:space="preserve">0.030</w:t>
+                  </w:r>
+                </w:p>
+              </w:tc>
+              <w:tc>
+                <w:tcPr/>
+                <w:p>
+                  <w:pPr>
+                    <w:pStyle w:val="Compact"/>
+                    <w:jc w:val="right"/>
+                    <w:jc w:val="center"/>
+                  </w:pPr>
+                  <w:r>
+                    <w:t xml:space="preserve">[0.003, 0.056]</w:t>
+                  </w:r>
+                </w:p>
+              </w:tc>
+              <w:tc>
+                <w:tcPr/>
+                <w:p>
+                  <w:pPr>
+                    <w:pStyle w:val="Compact"/>
+                    <w:jc w:val="right"/>
+                    <w:jc w:val="center"/>
+                  </w:pPr>
+                  <w:r>
+                    <w:t xml:space="preserve">+3.0% [0.3, 5.8]</w:t>
+                  </w:r>
+                </w:p>
+              </w:tc>
+              <w:tc>
+                <w:tcPr/>
+                <w:p>
+                  <w:pPr>
+                    <w:pStyle w:val="Compact"/>
+                  </w:pPr>
+                </w:p>
+              </w:tc>
+              <w:tc>
+                <w:tcPr/>
+                <w:p>
+                  <w:pPr>
+                    <w:pStyle w:val="Compact"/>
+                    <w:jc w:val="right"/>
+                    <w:jc w:val="center"/>
+                  </w:pPr>
+                  <w:r>
+                    <w:t xml:space="preserve">4,935</w:t>
                   </w:r>
                 </w:p>
               </w:tc>
@@ -18069,49 +17390,49 @@
                     <w:jc w:val="center"/>
                   </w:pPr>
                   <w:r>
-                    <w:t xml:space="preserve">−0.020</w:t>
-                  </w:r>
-                </w:p>
-              </w:tc>
-              <w:tc>
-                <w:tcPr/>
-                <w:p>
-                  <w:pPr>
-                    <w:pStyle w:val="Compact"/>
-                    <w:jc w:val="right"/>
-                    <w:jc w:val="center"/>
-                  </w:pPr>
-                  <w:r>
-                    <w:t xml:space="preserve">[−0.104, 0.063]</w:t>
-                  </w:r>
-                </w:p>
-              </w:tc>
-              <w:tc>
-                <w:tcPr/>
-                <w:p>
-                  <w:pPr>
-                    <w:pStyle w:val="Compact"/>
-                  </w:pPr>
-                </w:p>
-              </w:tc>
-              <w:tc>
-                <w:tcPr/>
-                <w:p>
-                  <w:pPr>
-                    <w:pStyle w:val="Compact"/>
-                  </w:pPr>
-                </w:p>
-              </w:tc>
-              <w:tc>
-                <w:tcPr/>
-                <w:p>
-                  <w:pPr>
-                    <w:pStyle w:val="Compact"/>
-                    <w:jc w:val="right"/>
-                    <w:jc w:val="center"/>
-                  </w:pPr>
-                  <w:r>
-                    <w:t xml:space="preserve">4,952</w:t>
+                    <w:t xml:space="preserve">−0.019</w:t>
+                  </w:r>
+                </w:p>
+              </w:tc>
+              <w:tc>
+                <w:tcPr/>
+                <w:p>
+                  <w:pPr>
+                    <w:pStyle w:val="Compact"/>
+                    <w:jc w:val="right"/>
+                    <w:jc w:val="center"/>
+                  </w:pPr>
+                  <w:r>
+                    <w:t xml:space="preserve">[−0.101, 0.064]</w:t>
+                  </w:r>
+                </w:p>
+              </w:tc>
+              <w:tc>
+                <w:tcPr/>
+                <w:p>
+                  <w:pPr>
+                    <w:pStyle w:val="Compact"/>
+                  </w:pPr>
+                </w:p>
+              </w:tc>
+              <w:tc>
+                <w:tcPr/>
+                <w:p>
+                  <w:pPr>
+                    <w:pStyle w:val="Compact"/>
+                  </w:pPr>
+                </w:p>
+              </w:tc>
+              <w:tc>
+                <w:tcPr/>
+                <w:p>
+                  <w:pPr>
+                    <w:pStyle w:val="Compact"/>
+                    <w:jc w:val="right"/>
+                    <w:jc w:val="center"/>
+                  </w:pPr>
+                  <w:r>
+                    <w:t xml:space="preserve">4,935</w:t>
                   </w:r>
                 </w:p>
               </w:tc>
@@ -18336,72 +17657,72 @@
                     <w:jc w:val="center"/>
                   </w:pPr>
                   <w:r>
-                    <w:t xml:space="preserve">30</w:t>
-                  </w:r>
-                </w:p>
-              </w:tc>
-              <w:tc>
-                <w:tcPr/>
-                <w:p>
-                  <w:pPr>
-                    <w:pStyle w:val="Compact"/>
-                    <w:jc w:val="right"/>
-                    <w:jc w:val="center"/>
-                  </w:pPr>
-                  <w:r>
-                    <w:t xml:space="preserve">−0.458 (1.761)</w:t>
-                  </w:r>
-                </w:p>
-              </w:tc>
-              <w:tc>
-                <w:tcPr/>
-                <w:p>
-                  <w:pPr>
-                    <w:pStyle w:val="Compact"/>
-                    <w:jc w:val="right"/>
-                    <w:jc w:val="center"/>
-                  </w:pPr>
-                  <w:r>
-                    <w:t xml:space="preserve">0.332 (1.876)</w:t>
-                  </w:r>
-                </w:p>
-              </w:tc>
-              <w:tc>
-                <w:tcPr/>
-                <w:p>
-                  <w:pPr>
-                    <w:pStyle w:val="Compact"/>
-                    <w:jc w:val="right"/>
-                    <w:jc w:val="center"/>
-                  </w:pPr>
-                  <w:r>
-                    <w:t xml:space="preserve">−0.791</w:t>
-                  </w:r>
-                </w:p>
-              </w:tc>
-              <w:tc>
-                <w:tcPr/>
-                <w:p>
-                  <w:pPr>
-                    <w:pStyle w:val="Compact"/>
-                    <w:jc w:val="right"/>
-                    <w:jc w:val="center"/>
-                  </w:pPr>
-                  <w:r>
-                    <w:t xml:space="preserve">t(29) = −2.12</w:t>
-                  </w:r>
-                </w:p>
-              </w:tc>
-              <w:tc>
-                <w:tcPr/>
-                <w:p>
-                  <w:pPr>
-                    <w:pStyle w:val="Compact"/>
-                    <w:jc w:val="right"/>
-                    <w:jc w:val="center"/>
-                  </w:pPr>
-                  <w:r>
-                    <w:t xml:space="preserve">p = .042</w:t>
+                    <w:t xml:space="preserve">31</w:t>
+                  </w:r>
+                </w:p>
+              </w:tc>
+              <w:tc>
+                <w:tcPr/>
+                <w:p>
+                  <w:pPr>
+                    <w:pStyle w:val="Compact"/>
+                    <w:jc w:val="right"/>
+                    <w:jc w:val="center"/>
+                  </w:pPr>
+                  <w:r>
+                    <w:t xml:space="preserve">−0.207 (1.724)</w:t>
+                  </w:r>
+                </w:p>
+              </w:tc>
+              <w:tc>
+                <w:tcPr/>
+                <w:p>
+                  <w:pPr>
+                    <w:pStyle w:val="Compact"/>
+                    <w:jc w:val="right"/>
+                    <w:jc w:val="center"/>
+                  </w:pPr>
+                  <w:r>
+                    <w:t xml:space="preserve">0.516 (1.804)</w:t>
+                  </w:r>
+                </w:p>
+              </w:tc>
+              <w:tc>
+                <w:tcPr/>
+                <w:p>
+                  <w:pPr>
+                    <w:pStyle w:val="Compact"/>
+                    <w:jc w:val="right"/>
+                    <w:jc w:val="center"/>
+                  </w:pPr>
+                  <w:r>
+                    <w:t xml:space="preserve">−0.723</w:t>
+                  </w:r>
+                </w:p>
+              </w:tc>
+              <w:tc>
+                <w:tcPr/>
+                <w:p>
+                  <w:pPr>
+                    <w:pStyle w:val="Compact"/>
+                    <w:jc w:val="right"/>
+                    <w:jc w:val="center"/>
+                  </w:pPr>
+                  <w:r>
+                    <w:t xml:space="preserve">t(30) = −2.35</w:t>
+                  </w:r>
+                </w:p>
+              </w:tc>
+              <w:tc>
+                <w:tcPr/>
+                <w:p>
+                  <w:pPr>
+                    <w:pStyle w:val="Compact"/>
+                    <w:jc w:val="right"/>
+                    <w:jc w:val="center"/>
+                  </w:pPr>
+                  <w:r>
+                    <w:t xml:space="preserve">p = .026</w:t>
                   </w:r>
                 </w:p>
               </w:tc>
@@ -18455,59 +17776,59 @@
                     <w:jc w:val="center"/>
                   </w:pPr>
                   <w:r>
-                    <w:t xml:space="preserve">0.784 (2.106)</w:t>
-                  </w:r>
-                </w:p>
-              </w:tc>
-              <w:tc>
-                <w:tcPr/>
-                <w:p>
-                  <w:pPr>
-                    <w:pStyle w:val="Compact"/>
-                    <w:jc w:val="right"/>
-                    <w:jc w:val="center"/>
-                  </w:pPr>
-                  <w:r>
-                    <w:t xml:space="preserve">1.238 (2.123)</w:t>
-                  </w:r>
-                </w:p>
-              </w:tc>
-              <w:tc>
-                <w:tcPr/>
-                <w:p>
-                  <w:pPr>
-                    <w:pStyle w:val="Compact"/>
-                    <w:jc w:val="right"/>
-                    <w:jc w:val="center"/>
-                  </w:pPr>
-                  <w:r>
-                    <w:t xml:space="preserve">−0.454</w:t>
-                  </w:r>
-                </w:p>
-              </w:tc>
-              <w:tc>
-                <w:tcPr/>
-                <w:p>
-                  <w:pPr>
-                    <w:pStyle w:val="Compact"/>
-                    <w:jc w:val="right"/>
-                    <w:jc w:val="center"/>
-                  </w:pPr>
-                  <w:r>
-                    <w:t xml:space="preserve">t(29) = −2.74</w:t>
-                  </w:r>
-                </w:p>
-              </w:tc>
-              <w:tc>
-                <w:tcPr/>
-                <w:p>
-                  <w:pPr>
-                    <w:pStyle w:val="Compact"/>
-                    <w:jc w:val="right"/>
-                    <w:jc w:val="center"/>
-                  </w:pPr>
-                  <w:r>
-                    <w:t xml:space="preserve">p = .011</w:t>
+                    <w:t xml:space="preserve">0.810 (2.123)</w:t>
+                  </w:r>
+                </w:p>
+              </w:tc>
+              <w:tc>
+                <w:tcPr/>
+                <w:p>
+                  <w:pPr>
+                    <w:pStyle w:val="Compact"/>
+                    <w:jc w:val="right"/>
+                    <w:jc w:val="center"/>
+                  </w:pPr>
+                  <w:r>
+                    <w:t xml:space="preserve">1.241 (2.185)</w:t>
+                  </w:r>
+                </w:p>
+              </w:tc>
+              <w:tc>
+                <w:tcPr/>
+                <w:p>
+                  <w:pPr>
+                    <w:pStyle w:val="Compact"/>
+                    <w:jc w:val="right"/>
+                    <w:jc w:val="center"/>
+                  </w:pPr>
+                  <w:r>
+                    <w:t xml:space="preserve">−0.432</w:t>
+                  </w:r>
+                </w:p>
+              </w:tc>
+              <w:tc>
+                <w:tcPr/>
+                <w:p>
+                  <w:pPr>
+                    <w:pStyle w:val="Compact"/>
+                    <w:jc w:val="right"/>
+                    <w:jc w:val="center"/>
+                  </w:pPr>
+                  <w:r>
+                    <w:t xml:space="preserve">t(29) = −2.40</w:t>
+                  </w:r>
+                </w:p>
+              </w:tc>
+              <w:tc>
+                <w:tcPr/>
+                <w:p>
+                  <w:pPr>
+                    <w:pStyle w:val="Compact"/>
+                    <w:jc w:val="right"/>
+                    <w:jc w:val="center"/>
+                  </w:pPr>
+                  <w:r>
+                    <w:t xml:space="preserve">p = .023</w:t>
                   </w:r>
                 </w:p>
               </w:tc>
@@ -18548,72 +17869,72 @@
                     <w:jc w:val="center"/>
                   </w:pPr>
                   <w:r>
-                    <w:t xml:space="preserve">30</w:t>
-                  </w:r>
-                </w:p>
-              </w:tc>
-              <w:tc>
-                <w:tcPr/>
-                <w:p>
-                  <w:pPr>
-                    <w:pStyle w:val="Compact"/>
-                    <w:jc w:val="right"/>
-                    <w:jc w:val="center"/>
-                  </w:pPr>
-                  <w:r>
-                    <w:t xml:space="preserve">1.367 (3.975)</w:t>
-                  </w:r>
-                </w:p>
-              </w:tc>
-              <w:tc>
-                <w:tcPr/>
-                <w:p>
-                  <w:pPr>
-                    <w:pStyle w:val="Compact"/>
-                    <w:jc w:val="right"/>
-                    <w:jc w:val="center"/>
-                  </w:pPr>
-                  <w:r>
-                    <w:t xml:space="preserve">0.708 (3.858)</w:t>
-                  </w:r>
-                </w:p>
-              </w:tc>
-              <w:tc>
-                <w:tcPr/>
-                <w:p>
-                  <w:pPr>
-                    <w:pStyle w:val="Compact"/>
-                    <w:jc w:val="right"/>
-                    <w:jc w:val="center"/>
-                  </w:pPr>
-                  <w:r>
-                    <w:t xml:space="preserve">0.659</w:t>
-                  </w:r>
-                </w:p>
-              </w:tc>
-              <w:tc>
-                <w:tcPr/>
-                <w:p>
-                  <w:pPr>
-                    <w:pStyle w:val="Compact"/>
-                    <w:jc w:val="right"/>
-                    <w:jc w:val="center"/>
-                  </w:pPr>
-                  <w:r>
-                    <w:t xml:space="preserve">t(29) = 1.50</w:t>
-                  </w:r>
-                </w:p>
-              </w:tc>
-              <w:tc>
-                <w:tcPr/>
-                <w:p>
-                  <w:pPr>
-                    <w:pStyle w:val="Compact"/>
-                    <w:jc w:val="right"/>
-                    <w:jc w:val="center"/>
-                  </w:pPr>
-                  <w:r>
-                    <w:t xml:space="preserve">p = .145</w:t>
+                    <w:t xml:space="preserve">31</w:t>
+                  </w:r>
+                </w:p>
+              </w:tc>
+              <w:tc>
+                <w:tcPr/>
+                <w:p>
+                  <w:pPr>
+                    <w:pStyle w:val="Compact"/>
+                    <w:jc w:val="right"/>
+                    <w:jc w:val="center"/>
+                  </w:pPr>
+                  <w:r>
+                    <w:t xml:space="preserve">1.520 (4.064)</w:t>
+                  </w:r>
+                </w:p>
+              </w:tc>
+              <w:tc>
+                <w:tcPr/>
+                <w:p>
+                  <w:pPr>
+                    <w:pStyle w:val="Compact"/>
+                    <w:jc w:val="right"/>
+                    <w:jc w:val="center"/>
+                  </w:pPr>
+                  <w:r>
+                    <w:t xml:space="preserve">0.517 (4.495)</w:t>
+                  </w:r>
+                </w:p>
+              </w:tc>
+              <w:tc>
+                <w:tcPr/>
+                <w:p>
+                  <w:pPr>
+                    <w:pStyle w:val="Compact"/>
+                    <w:jc w:val="right"/>
+                    <w:jc w:val="center"/>
+                  </w:pPr>
+                  <w:r>
+                    <w:t xml:space="preserve">1.003</w:t>
+                  </w:r>
+                </w:p>
+              </w:tc>
+              <w:tc>
+                <w:tcPr/>
+                <w:p>
+                  <w:pPr>
+                    <w:pStyle w:val="Compact"/>
+                    <w:jc w:val="right"/>
+                    <w:jc w:val="center"/>
+                  </w:pPr>
+                  <w:r>
+                    <w:t xml:space="preserve">t(30) = 2.45</w:t>
+                  </w:r>
+                </w:p>
+              </w:tc>
+              <w:tc>
+                <w:tcPr/>
+                <w:p>
+                  <w:pPr>
+                    <w:pStyle w:val="Compact"/>
+                    <w:jc w:val="right"/>
+                    <w:jc w:val="center"/>
+                  </w:pPr>
+                  <w:r>
+                    <w:t xml:space="preserve">p = .020</w:t>
                   </w:r>
                 </w:p>
               </w:tc>
@@ -18667,59 +17988,59 @@
                     <w:jc w:val="center"/>
                   </w:pPr>
                   <w:r>
-                    <w:t xml:space="preserve">1.033 (2.414)</w:t>
-                  </w:r>
-                </w:p>
-              </w:tc>
-              <w:tc>
-                <w:tcPr/>
-                <w:p>
-                  <w:pPr>
-                    <w:pStyle w:val="Compact"/>
-                    <w:jc w:val="right"/>
-                    <w:jc w:val="center"/>
-                  </w:pPr>
-                  <w:r>
-                    <w:t xml:space="preserve">1.094 (2.241)</w:t>
-                  </w:r>
-                </w:p>
-              </w:tc>
-              <w:tc>
-                <w:tcPr/>
-                <w:p>
-                  <w:pPr>
-                    <w:pStyle w:val="Compact"/>
-                    <w:jc w:val="right"/>
-                    <w:jc w:val="center"/>
-                  </w:pPr>
-                  <w:r>
-                    <w:t xml:space="preserve">−0.061</w:t>
-                  </w:r>
-                </w:p>
-              </w:tc>
-              <w:tc>
-                <w:tcPr/>
-                <w:p>
-                  <w:pPr>
-                    <w:pStyle w:val="Compact"/>
-                    <w:jc w:val="right"/>
-                    <w:jc w:val="center"/>
-                  </w:pPr>
-                  <w:r>
-                    <w:t xml:space="preserve">t(29) = −0.16</w:t>
-                  </w:r>
-                </w:p>
-              </w:tc>
-              <w:tc>
-                <w:tcPr/>
-                <w:p>
-                  <w:pPr>
-                    <w:pStyle w:val="Compact"/>
-                    <w:jc w:val="right"/>
-                    <w:jc w:val="center"/>
-                  </w:pPr>
-                  <w:r>
-                    <w:t xml:space="preserve">p = .874</w:t>
+                    <w:t xml:space="preserve">1.075 (2.111)</w:t>
+                  </w:r>
+                </w:p>
+              </w:tc>
+              <w:tc>
+                <w:tcPr/>
+                <w:p>
+                  <w:pPr>
+                    <w:pStyle w:val="Compact"/>
+                    <w:jc w:val="right"/>
+                    <w:jc w:val="center"/>
+                  </w:pPr>
+                  <w:r>
+                    <w:t xml:space="preserve">1.047 (2.466)</w:t>
+                  </w:r>
+                </w:p>
+              </w:tc>
+              <w:tc>
+                <w:tcPr/>
+                <w:p>
+                  <w:pPr>
+                    <w:pStyle w:val="Compact"/>
+                    <w:jc w:val="right"/>
+                    <w:jc w:val="center"/>
+                  </w:pPr>
+                  <w:r>
+                    <w:t xml:space="preserve">0.028</w:t>
+                  </w:r>
+                </w:p>
+              </w:tc>
+              <w:tc>
+                <w:tcPr/>
+                <w:p>
+                  <w:pPr>
+                    <w:pStyle w:val="Compact"/>
+                    <w:jc w:val="right"/>
+                    <w:jc w:val="center"/>
+                  </w:pPr>
+                  <w:r>
+                    <w:t xml:space="preserve">t(29) = 0.10</w:t>
+                  </w:r>
+                </w:p>
+              </w:tc>
+              <w:tc>
+                <w:tcPr/>
+                <w:p>
+                  <w:pPr>
+                    <w:pStyle w:val="Compact"/>
+                    <w:jc w:val="right"/>
+                    <w:jc w:val="center"/>
+                  </w:pPr>
+                  <w:r>
+                    <w:t xml:space="preserve">p = .919</w:t>
                   </w:r>
                 </w:p>
               </w:tc>
@@ -18760,72 +18081,72 @@
                     <w:jc w:val="center"/>
                   </w:pPr>
                   <w:r>
-                    <w:t xml:space="preserve">29</w:t>
-                  </w:r>
-                </w:p>
-              </w:tc>
-              <w:tc>
-                <w:tcPr/>
-                <w:p>
-                  <w:pPr>
-                    <w:pStyle w:val="Compact"/>
-                    <w:jc w:val="right"/>
-                    <w:jc w:val="center"/>
-                  </w:pPr>
-                  <w:r>
-                    <w:t xml:space="preserve">0.150 (1.275)</w:t>
-                  </w:r>
-                </w:p>
-              </w:tc>
-              <w:tc>
-                <w:tcPr/>
-                <w:p>
-                  <w:pPr>
-                    <w:pStyle w:val="Compact"/>
-                    <w:jc w:val="right"/>
-                    <w:jc w:val="center"/>
-                  </w:pPr>
-                  <w:r>
-                    <w:t xml:space="preserve">−0.392 (0.780)</w:t>
-                  </w:r>
-                </w:p>
-              </w:tc>
-              <w:tc>
-                <w:tcPr/>
-                <w:p>
-                  <w:pPr>
-                    <w:pStyle w:val="Compact"/>
-                    <w:jc w:val="right"/>
-                    <w:jc w:val="center"/>
-                  </w:pPr>
-                  <w:r>
-                    <w:t xml:space="preserve">0.513</w:t>
-                  </w:r>
-                </w:p>
-              </w:tc>
-              <w:tc>
-                <w:tcPr/>
-                <w:p>
-                  <w:pPr>
-                    <w:pStyle w:val="Compact"/>
-                    <w:jc w:val="right"/>
-                    <w:jc w:val="center"/>
-                  </w:pPr>
-                  <w:r>
-                    <w:t xml:space="preserve">t(28) = 2.72</w:t>
-                  </w:r>
-                </w:p>
-              </w:tc>
-              <w:tc>
-                <w:tcPr/>
-                <w:p>
-                  <w:pPr>
-                    <w:pStyle w:val="Compact"/>
-                    <w:jc w:val="right"/>
-                    <w:jc w:val="center"/>
-                  </w:pPr>
-                  <w:r>
-                    <w:t xml:space="preserve">p = .011</w:t>
+                    <w:t xml:space="preserve">28</w:t>
+                  </w:r>
+                </w:p>
+              </w:tc>
+              <w:tc>
+                <w:tcPr/>
+                <w:p>
+                  <w:pPr>
+                    <w:pStyle w:val="Compact"/>
+                    <w:jc w:val="right"/>
+                    <w:jc w:val="center"/>
+                  </w:pPr>
+                  <w:r>
+                    <w:t xml:space="preserve">0.268 (1.128)</w:t>
+                  </w:r>
+                </w:p>
+              </w:tc>
+              <w:tc>
+                <w:tcPr/>
+                <w:p>
+                  <w:pPr>
+                    <w:pStyle w:val="Compact"/>
+                    <w:jc w:val="right"/>
+                    <w:jc w:val="center"/>
+                  </w:pPr>
+                  <w:r>
+                    <w:t xml:space="preserve">−0.352 (0.724)</w:t>
+                  </w:r>
+                </w:p>
+              </w:tc>
+              <w:tc>
+                <w:tcPr/>
+                <w:p>
+                  <w:pPr>
+                    <w:pStyle w:val="Compact"/>
+                    <w:jc w:val="right"/>
+                    <w:jc w:val="center"/>
+                  </w:pPr>
+                  <w:r>
+                    <w:t xml:space="preserve">0.593</w:t>
+                  </w:r>
+                </w:p>
+              </w:tc>
+              <w:tc>
+                <w:tcPr/>
+                <w:p>
+                  <w:pPr>
+                    <w:pStyle w:val="Compact"/>
+                    <w:jc w:val="right"/>
+                    <w:jc w:val="center"/>
+                  </w:pPr>
+                  <w:r>
+                    <w:t xml:space="preserve">t(27) = 3.37</w:t>
+                  </w:r>
+                </w:p>
+              </w:tc>
+              <w:tc>
+                <w:tcPr/>
+                <w:p>
+                  <w:pPr>
+                    <w:pStyle w:val="Compact"/>
+                    <w:jc w:val="right"/>
+                    <w:jc w:val="center"/>
+                  </w:pPr>
+                  <w:r>
+                    <w:t xml:space="preserve">p = .002</w:t>
                   </w:r>
                 </w:p>
               </w:tc>
@@ -18879,59 +18200,59 @@
                     <w:jc w:val="center"/>
                   </w:pPr>
                   <w:r>
-                    <w:t xml:space="preserve">−0.135 (0.853)</w:t>
-                  </w:r>
-                </w:p>
-              </w:tc>
-              <w:tc>
-                <w:tcPr/>
-                <w:p>
-                  <w:pPr>
-                    <w:pStyle w:val="Compact"/>
-                    <w:jc w:val="right"/>
-                    <w:jc w:val="center"/>
-                  </w:pPr>
-                  <w:r>
-                    <w:t xml:space="preserve">−0.273 (0.759)</w:t>
-                  </w:r>
-                </w:p>
-              </w:tc>
-              <w:tc>
-                <w:tcPr/>
-                <w:p>
-                  <w:pPr>
-                    <w:pStyle w:val="Compact"/>
-                    <w:jc w:val="right"/>
-                    <w:jc w:val="center"/>
-                  </w:pPr>
-                  <w:r>
-                    <w:t xml:space="preserve">0.206</w:t>
-                  </w:r>
-                </w:p>
-              </w:tc>
-              <w:tc>
-                <w:tcPr/>
-                <w:p>
-                  <w:pPr>
-                    <w:pStyle w:val="Compact"/>
-                    <w:jc w:val="right"/>
-                    <w:jc w:val="center"/>
-                  </w:pPr>
-                  <w:r>
-                    <w:t xml:space="preserve">t(28) = 2.04</w:t>
-                  </w:r>
-                </w:p>
-              </w:tc>
-              <w:tc>
-                <w:tcPr/>
-                <w:p>
-                  <w:pPr>
-                    <w:pStyle w:val="Compact"/>
-                    <w:jc w:val="right"/>
-                    <w:jc w:val="center"/>
-                  </w:pPr>
-                  <w:r>
-                    <w:t xml:space="preserve">p = .051</w:t>
+                    <w:t xml:space="preserve">−0.090 (0.757)</w:t>
+                  </w:r>
+                </w:p>
+              </w:tc>
+              <w:tc>
+                <w:tcPr/>
+                <w:p>
+                  <w:pPr>
+                    <w:pStyle w:val="Compact"/>
+                    <w:jc w:val="right"/>
+                    <w:jc w:val="center"/>
+                  </w:pPr>
+                  <w:r>
+                    <w:t xml:space="preserve">−0.273 (0.780)</w:t>
+                  </w:r>
+                </w:p>
+              </w:tc>
+              <w:tc>
+                <w:tcPr/>
+                <w:p>
+                  <w:pPr>
+                    <w:pStyle w:val="Compact"/>
+                    <w:jc w:val="right"/>
+                    <w:jc w:val="center"/>
+                  </w:pPr>
+                  <w:r>
+                    <w:t xml:space="preserve">0.212</w:t>
+                  </w:r>
+                </w:p>
+              </w:tc>
+              <w:tc>
+                <w:tcPr/>
+                <w:p>
+                  <w:pPr>
+                    <w:pStyle w:val="Compact"/>
+                    <w:jc w:val="right"/>
+                    <w:jc w:val="center"/>
+                  </w:pPr>
+                  <w:r>
+                    <w:t xml:space="preserve">t(28) = 2.08</w:t>
+                  </w:r>
+                </w:p>
+              </w:tc>
+              <w:tc>
+                <w:tcPr/>
+                <w:p>
+                  <w:pPr>
+                    <w:pStyle w:val="Compact"/>
+                    <w:jc w:val="right"/>
+                    <w:jc w:val="center"/>
+                  </w:pPr>
+                  <w:r>
+                    <w:t xml:space="preserve">p = .047</w:t>
                   </w:r>
                 </w:p>
               </w:tc>
@@ -18952,7 +18273,7 @@
               <w:t xml:space="preserve"> </w:t>
             </w:r>
             <w:r>
-              <w:t xml:space="preserve">n is the number of participants with both effort levels for that task. The paired test drops anyone missing one level. The final pupil sample is 42 participants.</w:t>
+              <w:t xml:space="preserve">n is the number of participants with both effort levels for that task. The paired test drops anyone missing one level. The final pupil sample is 43 participants.</w:t>
             </w:r>
           </w:p>
           <w:bookmarkEnd w:id="80"/>

</xml_diff>

<commit_message>
Write the chapter Results and record the r11 convergence refits.
M1, M2, and the 0.15 s model now meet the convergence rule, and the Results prose and pupil-ordering table use those values.

Co-authored-by: Cursor <cursoragent@cursor.com>
</commit_message>
<xml_diff>
--- a/reports/chap3_revised.docx
+++ b/reports/chap3_revised.docx
@@ -123,7 +123,7 @@
               <w:t xml:space="preserve"> </w:t>
             </w:r>
             <w:r>
-              <w:t xml:space="preserve">Inline value keys available for this section: n_enrolled, n_excluded, n_final, n_trials_primary, crit, qual, bs, bias, drift_diff_trials, drift_same_trials, bs_pct_change, P3_bs, delta_elpd_P3_vs_P0.</w:t>
+              <w:t xml:space="preserve">Inline value keys available for this section: n_enrolled, n_excluded, n_final, n_trials_primary, crit, qual, bs, bias, drift_diff_trials, drift_same_trials, P3_bs, delta_elpd_P3_vs_P0.</w:t>
             </w:r>
             <w:r>
               <w:t xml:space="preserve"> </w:t>
@@ -1791,7 +1791,7 @@
     </w:tbl>
     <w:bookmarkEnd w:id="27"/>
     <w:bookmarkEnd w:id="28"/>
-    <w:bookmarkStart w:id="53" w:name="results"/>
+    <w:bookmarkStart w:id="47" w:name="results"/>
     <w:p>
       <w:pPr>
         <w:pStyle w:val="Heading1"/>
@@ -1800,166 +1800,305 @@
         <w:t xml:space="preserve">3 Results</w:t>
       </w:r>
     </w:p>
+    <w:bookmarkStart w:id="38" w:name="primary-diffusion-model"/>
+    <w:p>
+      <w:pPr>
+        <w:pStyle w:val="Heading2"/>
+      </w:pPr>
+      <w:r>
+        <w:t xml:space="preserve">3.1 Primary diffusion model</w:t>
+      </w:r>
+    </w:p>
+    <w:p>
+      <w:pPr>
+        <w:pStyle w:val="FirstParagraph"/>
+      </w:pPr>
+      <w:r>
+        <w:t xml:space="preserve">Allowing drift rate to differ between tasks improved out-of-sample prediction (M4 vs. M3: ΔELPD = 158.3 ± 20.0). Allowing the effort effects to differ between tasks did not (M4b vs. M4: ΔELPD = −1.6 ± 1.5;</w:t>
+      </w:r>
+      <w:r>
+        <w:t xml:space="preserve"> </w:t>
+      </w:r>
+      <w:hyperlink w:anchor="supptbl-model-comparison">
+        <w:r>
+          <w:rPr>
+            <w:rStyle w:val="Hyperlink"/>
+          </w:rPr>
+          <w:t xml:space="preserve">Table S2</w:t>
+        </w:r>
+      </w:hyperlink>
+      <w:r>
+        <w:t xml:space="preserve">). M4 is therefore reported below.</w:t>
+      </w:r>
+    </w:p>
+    <w:p>
+      <w:pPr>
+        <w:pStyle w:val="BodyText"/>
+      </w:pPr>
+      <w:r>
+        <w:rPr>
+          <w:b/>
+          <w:bCs/>
+        </w:rPr>
+        <w:t xml:space="preserve">Stimulus and task effects.</w:t>
+      </w:r>
+      <w:r>
+        <w:t xml:space="preserve"> </w:t>
+      </w:r>
+      <w:r>
+        <w:t xml:space="preserve">The upper boundary corresponds to a</w:t>
+      </w:r>
+      <w:r>
+        <w:t xml:space="preserve"> </w:t>
+      </w:r>
+      <w:r>
+        <w:t xml:space="preserve">“different”</w:t>
+      </w:r>
+      <w:r>
+        <w:t xml:space="preserve"> </w:t>
+      </w:r>
+      <w:r>
+        <w:t xml:space="preserve">response. Drift was therefore negative on Standard trials, where</w:t>
+      </w:r>
+      <w:r>
+        <w:t xml:space="preserve"> </w:t>
+      </w:r>
+      <w:r>
+        <w:t xml:space="preserve">“same”</w:t>
+      </w:r>
+      <w:r>
+        <w:t xml:space="preserve"> </w:t>
+      </w:r>
+      <w:r>
+        <w:t xml:space="preserve">is correct, and positive on Easy trials (</w:t>
+      </w:r>
+      <w:hyperlink w:anchor="fig-condition-params">
+        <w:r>
+          <w:rPr>
+            <w:rStyle w:val="Hyperlink"/>
+          </w:rPr>
+          <w:t xml:space="preserve">Figure 2</w:t>
+        </w:r>
+      </w:hyperlink>
+      <w:r>
+        <w:t xml:space="preserve">). Drift was also negative on Hard trials (low effort; ADT: v = −0.575, 95% CrI [−0.675, −0.476]; VDT: v = −0.525, 95% CrI [−0.627, −0.425]). These stimuli differed from the standard, but evidence still accumulated toward</w:t>
+      </w:r>
+      <w:r>
+        <w:t xml:space="preserve"> </w:t>
+      </w:r>
+      <w:r>
+        <w:t xml:space="preserve">“same”</w:t>
+      </w:r>
+      <w:r>
+        <w:t xml:space="preserve">, so most Hard trials ended in an incorrect response. Relative to Standard trials, drift was higher on Hard (β = 0.468, 95% CrI [0.396, 0.543], P(β &gt; 0) &gt; .999) and Easy trials (β = 1.828, 95% CrI [1.750, 1.906], P(β &gt; 0) &gt; .999). Both differences were larger in the VDT than in the ADT (Hard × VDT: β = 0.341, 95% CrI [0.257, 0.426], P(β &gt; 0) &gt; .999; Easy × VDT: β = 0.771, 95% CrI [0.676, 0.866], P(β &gt; 0) &gt; .999). Boundary separation was narrower on Hard (β = −0.098, 95% CrI [−0.118, −0.078], P(β &lt; 0) &gt; .999; −9.3% [−11.1, −7.5]) and Easy trials (β = −0.128, 95% CrI [−0.150, −0.106], P(β &lt; 0) &gt; .999; −12.0% [−14.0, −10.1]) than on Standard trials. Standard, Hard and Easy trials were randomly intermixed, so these boundary differences cannot reflect a setting chosen before the trial</w:t>
+      </w:r>
+      <w:r>
+        <w:t xml:space="preserve"> </w:t>
+      </w:r>
+      <w:r>
+        <w:t xml:space="preserve">(Ratcliff &amp; McKoon, 2008)</w:t>
+      </w:r>
+      <w:r>
+        <w:t xml:space="preserve">. We treat them as descriptive (see Limitations). Boundary separation did not differ between tasks (β = −0.003, 95% CrI [−0.018, 0.011], P(β &lt; 0) = .680, 100% in ROPE). In both tasks the starting point lay closer to the</w:t>
+      </w:r>
+      <w:r>
+        <w:t xml:space="preserve"> </w:t>
+      </w:r>
+      <w:r>
+        <w:t xml:space="preserve">“different”</w:t>
+      </w:r>
+      <w:r>
+        <w:t xml:space="preserve"> </w:t>
+      </w:r>
+      <w:r>
+        <w:t xml:space="preserve">boundary (ADT:</w:t>
+      </w:r>
+      <w:r>
+        <w:t xml:space="preserve"> </w:t>
+      </w:r>
+      <w:r>
+        <w:rPr>
+          <w:i/>
+          <w:iCs/>
+        </w:rPr>
+        <w:t xml:space="preserve">z</w:t>
+      </w:r>
+      <w:r>
+        <w:t xml:space="preserve"> </w:t>
+      </w:r>
+      <w:r>
+        <w:t xml:space="preserve">= 0.552 [0.536, 0.568]; VDT:</w:t>
+      </w:r>
+      <w:r>
+        <w:t xml:space="preserve"> </w:t>
+      </w:r>
+      <w:r>
+        <w:rPr>
+          <w:i/>
+          <w:iCs/>
+        </w:rPr>
+        <w:t xml:space="preserve">z</w:t>
+      </w:r>
+      <w:r>
+        <w:t xml:space="preserve"> </w:t>
+      </w:r>
+      <w:r>
+        <w:t xml:space="preserve">= 0.538 [0.522, 0.555]), slightly less so in the VDT (β = −0.054, 95% CrI [−0.099, −0.010], P(β &lt; 0) = .992).</w:t>
+      </w:r>
+    </w:p>
+    <w:p>
+      <w:pPr>
+        <w:pStyle w:val="BodyText"/>
+      </w:pPr>
+      <w:r>
+        <w:rPr>
+          <w:b/>
+          <w:bCs/>
+        </w:rPr>
+        <w:t xml:space="preserve">Effort effects.</w:t>
+      </w:r>
+      <w:r>
+        <w:t xml:space="preserve"> </w:t>
+      </w:r>
+      <w:r>
+        <w:t xml:space="preserve">Effort effects were estimated in the same model and are reported in the same way (</w:t>
+      </w:r>
+      <w:hyperlink w:anchor="fig-effort-forest">
+        <w:r>
+          <w:rPr>
+            <w:rStyle w:val="Hyperlink"/>
+          </w:rPr>
+          <w:t xml:space="preserve">Figure 3</w:t>
+        </w:r>
+      </w:hyperlink>
+      <w:r>
+        <w:t xml:space="preserve">;</w:t>
+      </w:r>
+      <w:r>
+        <w:t xml:space="preserve"> </w:t>
+      </w:r>
+      <w:hyperlink w:anchor="tbl-effort-effects">
+        <w:r>
+          <w:rPr>
+            <w:rStyle w:val="Hyperlink"/>
+          </w:rPr>
+          <w:t xml:space="preserve">Table 2</w:t>
+        </w:r>
+      </w:hyperlink>
+      <w:r>
+        <w:t xml:space="preserve">). High effort shifted drift toward</w:t>
+      </w:r>
+      <w:r>
+        <w:t xml:space="preserve"> </w:t>
+      </w:r>
+      <w:r>
+        <w:t xml:space="preserve">“same”</w:t>
+      </w:r>
+      <w:r>
+        <w:t xml:space="preserve"> </w:t>
+      </w:r>
+      <w:r>
+        <w:t xml:space="preserve">on all trials (drift criterion: β = −0.053, 95% CrI [−0.103, −0.003], P(β &lt; 0) = .981). There was no evidence that it changed how strongly drift separated identical from different stimuli (evidence quality: β = −0.013, 95% CrI [−0.052, 0.028], P(β &lt; 0) = .730), although the interval does not rule out a small decline. Drift decreased on trials with a different comparison stimulus (β = −0.065, 95% CrI [−0.111, −0.021], P(β &lt; 0) = .998); on Standard trials the change was smaller and its interval included zero (β = −0.041, 95% CrI [−0.119, 0.038], P(β &lt; 0) = .845). High effort widened the boundary by +2.0% [0.6, 3.4]. This change lay entirely within the region of practical equivalence (100% in ROPE). The starting point was unchanged (β = −0.005, 95% CrI [−0.048, 0.037], P(β &lt; 0) = .590, 98% in ROPE).</w:t>
+      </w:r>
+    </w:p>
+    <w:p>
+      <w:pPr>
+        <w:pStyle w:val="BodyText"/>
+      </w:pPr>
+      <w:r>
+        <w:t xml:space="preserve">In observed accuracy, high effort was associated with lower accuracy on Hard trials (High − Low: −4.5 percentage points, 95% CI [−6.6, −2.4], OR = 0.80, p &lt; .001). On Standard trials accuracy was slightly higher, a difference that was not significant (+1.7 percentage points, 95% CI [−0.1, 3.5], OR = 1.23, p = .068). Accuracy on Easy trials did not change (−0.9 percentage points, 95% CI [−2.4, 0.6], OR = 0.92, p = .226;</w:t>
+      </w:r>
+      <w:r>
+        <w:t xml:space="preserve"> </w:t>
+      </w:r>
+      <w:hyperlink w:anchor="supptbl-acc-contrasts">
+        <w:r>
+          <w:rPr>
+            <w:rStyle w:val="Hyperlink"/>
+          </w:rPr>
+          <w:t xml:space="preserve">Table S10</w:t>
+        </w:r>
+      </w:hyperlink>
+      <w:r>
+        <w:t xml:space="preserve">).</w:t>
+      </w:r>
+    </w:p>
     <w:tbl>
       <w:tblPr>
         <w:tblStyle w:val="Table"/>
-        <w:tblInd w:w="164" w:type="dxa"/>
-        <w:tblBorders>
-          <w:left w:val="single" w:sz="24" w:space="0" w:color="EB9113"/>
-        </w:tblBorders>
-        <w:tblCellMar>
-          <w:left w:w="0" w:type="dxa"/>
-          <w:right w:w="0" w:type="dxa"/>
-        </w:tblCellMar>
+        <w:tblW w:type="pct" w:w="5000"/>
+        <w:tblLayout w:type="fixed"/>
         <w:tblLook w:firstRow="0" w:lastRow="0" w:firstColumn="0" w:lastColumn="0" w:noHBand="0" w:noVBand="0" w:val="0000"/>
       </w:tblPr>
       <w:tblGrid>
         <w:gridCol w:w="7920"/>
       </w:tblGrid>
       <w:tr>
-        <w:trPr>
-          <w:cantSplit/>
-        </w:trPr>
         <w:tc>
-          <w:tcPr>
-            <w:tcMar>
-              <w:left w:w="144" w:type="dxa"/>
-            </w:tcMar>
-          </w:tcPr>
+          <w:tcPr/>
+          <w:bookmarkStart w:id="32" w:name="fig-condition-params"/>
           <w:p>
             <w:pPr>
-              <w:pStyle w:val="FirstParagraph"/>
+              <w:pStyle w:val="Compact"/>
+              <w:jc w:val="center"/>
             </w:pPr>
-            <w:pPr>
-              <w:spacing w:before="16" w:after="64"/>
-            </w:pPr>
+            <w:r>
+              <w:drawing>
+                <wp:inline>
+                  <wp:extent cx="5334000" cy="4593166"/>
+                  <wp:effectExtent b="0" l="0" r="0" t="0"/>
+                  <wp:docPr descr="" title="" id="30" name="Picture"/>
+                  <a:graphic>
+                    <a:graphicData uri="http://schemas.openxmlformats.org/drawingml/2006/picture">
+                      <pic:pic>
+                        <pic:nvPicPr>
+                          <pic:cNvPr descr="../output/ddm_refits/runs/final_20261016/figures/final/F2_condition_parameters.png" id="31" name="Picture"/>
+                          <pic:cNvPicPr>
+                            <a:picLocks noChangeArrowheads="1" noChangeAspect="1"/>
+                          </pic:cNvPicPr>
+                        </pic:nvPicPr>
+                        <pic:blipFill>
+                          <a:blip r:embed="rId29"/>
+                          <a:stretch>
+                            <a:fillRect/>
+                          </a:stretch>
+                        </pic:blipFill>
+                        <pic:spPr bwMode="auto">
+                          <a:xfrm>
+                            <a:off x="0" y="0"/>
+                            <a:ext cx="5334000" cy="4593166"/>
+                          </a:xfrm>
+                          <a:prstGeom prst="rect">
+                            <a:avLst/>
+                          </a:prstGeom>
+                          <a:noFill/>
+                          <a:ln w="9525">
+                            <a:noFill/>
+                            <a:headEnd/>
+                            <a:tailEnd/>
+                          </a:ln>
+                        </pic:spPr>
+                      </pic:pic>
+                    </a:graphicData>
+                  </a:graphic>
+                </wp:inline>
+              </w:drawing>
+            </w:r>
           </w:p>
           <w:p>
             <w:pPr>
-              <w:pStyle w:val="BodyText"/>
+              <w:jc w:val="center"/>
             </w:pPr>
             <w:pPr>
-              <w:spacing w:before="16" w:after="16"/>
+              <w:jc w:val="left"/>
+              <w:spacing w:before="200"/>
+              <w:pStyle w:val="ImageCaption"/>
             </w:pPr>
             <w:r>
-              <w:rPr>
-                <w:b/>
-                <w:bCs/>
-              </w:rPr>
-              <w:t xml:space="preserve">[PROSE TO BE SUPPLIED: 3 Results]</w:t>
-            </w:r>
-            <w:r>
-              <w:t xml:space="preserve"> </w:t>
-            </w:r>
-            <w:r>
-              <w:t xml:space="preserve">Resolves Lani comments: C54, C55, C59, C60, C61, C64, C65, C67, C68, C75.</w:t>
-            </w:r>
-            <w:r>
-              <w:t xml:space="preserve"> </w:t>
-            </w:r>
-            <w:r>
-              <w:t xml:space="preserve">Inline value keys available for this section: n_final, n_trials_primary, max_rhat_M4, min_bulk_ess_M4, min_tail_ess_M4, delta_elpd_M3_vs_M4, se_delta_elpd_M3_vs_M4.</w:t>
-            </w:r>
-            <w:r>
-              <w:t xml:space="preserve"> </w:t>
-            </w:r>
-            <w:r>
-              <w:t xml:space="preserve">Tables/figures in this section: none.</w:t>
+              <w:t xml:space="preserve">Figure 2: Posterior drift rate (top) and boundary separation (bottom) by task, stimulus type and effort in the primary model (M4). Points are posterior medians and bars 95% credible intervals. Drift is signed toward the “different” boundary, so negative drift on Standard trials accumulates toward the correct “same” response. Starting point and non-decision time did not vary by stimulus type and are not shown.</w:t>
             </w:r>
           </w:p>
-        </w:tc>
-      </w:tr>
-    </w:tbl>
-    <w:bookmarkStart w:id="33" w:name="behavioral-performance"/>
-    <w:p>
-      <w:pPr>
-        <w:pStyle w:val="Heading2"/>
-      </w:pPr>
-      <w:r>
-        <w:t xml:space="preserve">3.1 Behavioral performance</w:t>
-      </w:r>
-    </w:p>
-    <w:tbl>
-      <w:tblPr>
-        <w:tblStyle w:val="Table"/>
-        <w:tblInd w:w="164" w:type="dxa"/>
-        <w:tblBorders>
-          <w:left w:val="single" w:sz="24" w:space="0" w:color="EB9113"/>
-        </w:tblBorders>
-        <w:tblCellMar>
-          <w:left w:w="0" w:type="dxa"/>
-          <w:right w:w="0" w:type="dxa"/>
-        </w:tblCellMar>
-        <w:tblLook w:firstRow="0" w:lastRow="0" w:firstColumn="0" w:lastColumn="0" w:noHBand="0" w:noVBand="0" w:val="0000"/>
-      </w:tblPr>
-      <w:tblGrid>
-        <w:gridCol w:w="7920"/>
-      </w:tblGrid>
-      <w:tr>
-        <w:trPr>
-          <w:cantSplit/>
-        </w:trPr>
-        <w:tc>
-          <w:tcPr>
-            <w:tcMar>
-              <w:left w:w="144" w:type="dxa"/>
-            </w:tcMar>
-          </w:tcPr>
-          <w:p>
-            <w:pPr>
-              <w:pStyle w:val="FirstParagraph"/>
-            </w:pPr>
-            <w:pPr>
-              <w:spacing w:before="16" w:after="64"/>
-            </w:pPr>
-          </w:p>
-          <w:p>
-            <w:pPr>
-              <w:pStyle w:val="BodyText"/>
-            </w:pPr>
-            <w:pPr>
-              <w:spacing w:before="16" w:after="16"/>
-            </w:pPr>
-            <w:r>
-              <w:rPr>
-                <w:b/>
-                <w:bCs/>
-              </w:rPr>
-              <w:t xml:space="preserve">[PROSE TO BE SUPPLIED: 3.1 Behavioral performance]</w:t>
-            </w:r>
-            <w:r>
-              <w:t xml:space="preserve"> </w:t>
-            </w:r>
-            <w:r>
-              <w:t xml:space="preserve">Resolves Lani comments: C58, C71.</w:t>
-            </w:r>
-            <w:r>
-              <w:t xml:space="preserve"> </w:t>
-            </w:r>
-            <w:r>
-              <w:t xml:space="preserve">Inline value keys available for this section: acc_high_low_Standard, acc_high_low_Hard, acc_high_low_Easy, n_final, n_adt, n_vdt, n_trials_primary.</w:t>
-            </w:r>
-            <w:r>
-              <w:t xml:space="preserve"> </w:t>
-            </w:r>
-            <w:r>
-              <w:t xml:space="preserve">Tables/figures in this section:</w:t>
-            </w:r>
-            <w:r>
-              <w:t xml:space="preserve"> </w:t>
-            </w:r>
-            <w:hyperlink w:anchor="fig-brinley">
-              <w:r>
-                <w:rPr>
-                  <w:rStyle w:val="Hyperlink"/>
-                </w:rPr>
-                <w:t xml:space="preserve">Figure 2</w:t>
-              </w:r>
-            </w:hyperlink>
-            <w:r>
-              <w:t xml:space="preserve">.</w:t>
-            </w:r>
-          </w:p>
+          <w:bookmarkEnd w:id="32"/>
         </w:tc>
       </w:tr>
     </w:tbl>
@@ -1976,7 +2115,7 @@
       <w:tr>
         <w:tc>
           <w:tcPr/>
-          <w:bookmarkStart w:id="32" w:name="fig-brinley"/>
+          <w:bookmarkStart w:id="36" w:name="fig-effort-forest"/>
           <w:p>
             <w:pPr>
               <w:pStyle w:val="Compact"/>
@@ -1985,207 +2124,20 @@
             <w:r>
               <w:drawing>
                 <wp:inline>
-                  <wp:extent cx="4954274" cy="4770782"/>
+                  <wp:extent cx="5334000" cy="2011180"/>
                   <wp:effectExtent b="0" l="0" r="0" t="0"/>
-                  <wp:docPr descr="" title="" id="30" name="Picture"/>
+                  <wp:docPr descr="" title="" id="34" name="Picture"/>
                   <a:graphic>
                     <a:graphicData uri="http://schemas.openxmlformats.org/drawingml/2006/picture">
                       <pic:pic>
                         <pic:nvPicPr>
-                          <pic:cNvPr descr="../output/ddm_refits/runs/final_20261016/figures/final/F4_brinley.png" id="31" name="Picture"/>
+                          <pic:cNvPr descr="../output/ddm_refits/runs/final_20261016/figures/final/F3_effort_forest.png" id="35" name="Picture"/>
                           <pic:cNvPicPr>
                             <a:picLocks noChangeArrowheads="1" noChangeAspect="1"/>
                           </pic:cNvPicPr>
                         </pic:nvPicPr>
                         <pic:blipFill>
-                          <a:blip r:embed="rId29"/>
-                          <a:stretch>
-                            <a:fillRect/>
-                          </a:stretch>
-                        </pic:blipFill>
-                        <pic:spPr bwMode="auto">
-                          <a:xfrm>
-                            <a:off x="0" y="0"/>
-                            <a:ext cx="4954274" cy="4770782"/>
-                          </a:xfrm>
-                          <a:prstGeom prst="rect">
-                            <a:avLst/>
-                          </a:prstGeom>
-                          <a:noFill/>
-                          <a:ln w="9525">
-                            <a:noFill/>
-                            <a:headEnd/>
-                            <a:tailEnd/>
-                          </a:ln>
-                        </pic:spPr>
-                      </pic:pic>
-                    </a:graphicData>
-                  </a:graphic>
-                </wp:inline>
-              </w:drawing>
-            </w:r>
-          </w:p>
-          <w:p>
-            <w:pPr>
-              <w:jc w:val="center"/>
-            </w:pPr>
-            <w:pPr>
-              <w:jc w:val="left"/>
-              <w:spacing w:before="200"/>
-              <w:pStyle w:val="ImageCaption"/>
-            </w:pPr>
-            <w:r>
-              <w:t xml:space="preserve">Figure 2: [CAPTION TO BE SUPPLIED]</w:t>
-            </w:r>
-          </w:p>
-          <w:bookmarkEnd w:id="32"/>
-        </w:tc>
-      </w:tr>
-    </w:tbl>
-    <w:bookmarkEnd w:id="33"/>
-    <w:bookmarkStart w:id="39" w:name="effort-effects-on-decision-parameters"/>
-    <w:p>
-      <w:pPr>
-        <w:pStyle w:val="Heading2"/>
-      </w:pPr>
-      <w:r>
-        <w:t xml:space="preserve">3.2 Effort effects on decision parameters</w:t>
-      </w:r>
-    </w:p>
-    <w:tbl>
-      <w:tblPr>
-        <w:tblStyle w:val="Table"/>
-        <w:tblInd w:w="164" w:type="dxa"/>
-        <w:tblBorders>
-          <w:left w:val="single" w:sz="24" w:space="0" w:color="EB9113"/>
-        </w:tblBorders>
-        <w:tblCellMar>
-          <w:left w:w="0" w:type="dxa"/>
-          <w:right w:w="0" w:type="dxa"/>
-        </w:tblCellMar>
-        <w:tblLook w:firstRow="0" w:lastRow="0" w:firstColumn="0" w:lastColumn="0" w:noHBand="0" w:noVBand="0" w:val="0000"/>
-      </w:tblPr>
-      <w:tblGrid>
-        <w:gridCol w:w="7920"/>
-      </w:tblGrid>
-      <w:tr>
-        <w:trPr>
-          <w:cantSplit/>
-        </w:trPr>
-        <w:tc>
-          <w:tcPr>
-            <w:tcMar>
-              <w:left w:w="144" w:type="dxa"/>
-            </w:tcMar>
-          </w:tcPr>
-          <w:p>
-            <w:pPr>
-              <w:pStyle w:val="FirstParagraph"/>
-            </w:pPr>
-            <w:pPr>
-              <w:spacing w:before="16" w:after="64"/>
-            </w:pPr>
-          </w:p>
-          <w:p>
-            <w:pPr>
-              <w:pStyle w:val="BodyText"/>
-            </w:pPr>
-            <w:pPr>
-              <w:spacing w:before="16" w:after="16"/>
-            </w:pPr>
-            <w:r>
-              <w:rPr>
-                <w:b/>
-                <w:bCs/>
-              </w:rPr>
-              <w:t xml:space="preserve">[PROSE TO BE SUPPLIED: 3.2 Effort effects on decision parameters]</w:t>
-            </w:r>
-            <w:r>
-              <w:t xml:space="preserve"> </w:t>
-            </w:r>
-            <w:r>
-              <w:t xml:space="preserve">Resolves Lani comments: C62, C63, C66, C69, C70, C72, C73.</w:t>
-            </w:r>
-            <w:r>
-              <w:t xml:space="preserve"> </w:t>
-            </w:r>
-            <w:r>
-              <w:t xml:space="preserve">Inline value keys available for this section: crit, qual, bs, bias, drift_diff_trials, drift_same_trials, bs_pct_change, rope_v, rope_a, rope_z.</w:t>
-            </w:r>
-            <w:r>
-              <w:t xml:space="preserve"> </w:t>
-            </w:r>
-            <w:r>
-              <w:t xml:space="preserve">Tables/figures in this section:</w:t>
-            </w:r>
-            <w:r>
-              <w:t xml:space="preserve"> </w:t>
-            </w:r>
-            <w:hyperlink w:anchor="fig-effort-forest">
-              <w:r>
-                <w:rPr>
-                  <w:rStyle w:val="Hyperlink"/>
-                </w:rPr>
-                <w:t xml:space="preserve">Figure 3</w:t>
-              </w:r>
-            </w:hyperlink>
-            <w:r>
-              <w:t xml:space="preserve">,</w:t>
-            </w:r>
-            <w:r>
-              <w:t xml:space="preserve"> </w:t>
-            </w:r>
-            <w:hyperlink w:anchor="tbl-effort-effects">
-              <w:r>
-                <w:rPr>
-                  <w:rStyle w:val="Hyperlink"/>
-                </w:rPr>
-                <w:t xml:space="preserve">Table 2</w:t>
-              </w:r>
-            </w:hyperlink>
-            <w:r>
-              <w:t xml:space="preserve">.</w:t>
-            </w:r>
-          </w:p>
-        </w:tc>
-      </w:tr>
-    </w:tbl>
-    <w:tbl>
-      <w:tblPr>
-        <w:tblStyle w:val="Table"/>
-        <w:tblW w:type="pct" w:w="5000"/>
-        <w:tblLayout w:type="fixed"/>
-        <w:tblLook w:firstRow="0" w:lastRow="0" w:firstColumn="0" w:lastColumn="0" w:noHBand="0" w:noVBand="0" w:val="0000"/>
-      </w:tblPr>
-      <w:tblGrid>
-        <w:gridCol w:w="7920"/>
-      </w:tblGrid>
-      <w:tr>
-        <w:tc>
-          <w:tcPr/>
-          <w:bookmarkStart w:id="37" w:name="fig-effort-forest"/>
-          <w:p>
-            <w:pPr>
-              <w:pStyle w:val="Compact"/>
-              <w:jc w:val="center"/>
-            </w:pPr>
-            <w:r>
-              <w:drawing>
-                <wp:inline>
-                  <wp:extent cx="5334000" cy="2011180"/>
-                  <wp:effectExtent b="0" l="0" r="0" t="0"/>
-                  <wp:docPr descr="" title="" id="35" name="Picture"/>
-                  <a:graphic>
-                    <a:graphicData uri="http://schemas.openxmlformats.org/drawingml/2006/picture">
-                      <pic:pic>
-                        <pic:nvPicPr>
-                          <pic:cNvPr descr="../output/ddm_refits/runs/final_20261016/figures/final/F3_effort_forest.png" id="36" name="Picture"/>
-                          <pic:cNvPicPr>
-                            <a:picLocks noChangeArrowheads="1" noChangeAspect="1"/>
-                          </pic:cNvPicPr>
-                        </pic:nvPicPr>
-                        <pic:blipFill>
-                          <a:blip r:embed="rId34"/>
+                          <a:blip r:embed="rId33"/>
                           <a:stretch>
                             <a:fillRect/>
                           </a:stretch>
@@ -2222,10 +2174,10 @@
               <w:pStyle w:val="ImageCaption"/>
             </w:pPr>
             <w:r>
-              <w:t xml:space="preserve">Figure 3: [CAPTION TO BE SUPPLIED]</w:t>
+              <w:t xml:space="preserve">Figure 3: Effects of high versus low effort in the primary model (M4, filled) and four robustness variants (open). Points are posterior medians and bars 95% credible intervals. Shaded bands mark the region of practical equivalence (drift ±0.02; log boundary and logit starting point ±0.05). Drift criterion is the effort effect common to all trials (negative values favor “same”); evidence quality is the effort effect on the separation between identical and different stimuli.</w:t>
             </w:r>
           </w:p>
-          <w:bookmarkEnd w:id="37"/>
+          <w:bookmarkEnd w:id="36"/>
         </w:tc>
       </w:tr>
     </w:tbl>
@@ -2242,7 +2194,7 @@
       <w:tr>
         <w:tc>
           <w:tcPr/>
-          <w:bookmarkStart w:id="38" w:name="tbl-effort-effects"/>
+          <w:bookmarkStart w:id="37" w:name="tbl-effort-effects"/>
           <w:p>
             <w:pPr>
               <w:jc w:val="center"/>
@@ -2253,7 +2205,7 @@
               <w:pStyle w:val="ImageCaption"/>
             </w:pPr>
             <w:r>
-              <w:t xml:space="preserve">Table 2: [CAPTION TO BE SUPPLIED]</w:t>
+              <w:t xml:space="preserve">Table 2: Effects of high versus low effort on decision parameters in the primary model (M4)</w:t>
             </w:r>
           </w:p>
           <w:tbl>
@@ -2810,105 +2762,320 @@
               </w:tc>
             </w:tr>
           </w:tbl>
-          <w:bookmarkEnd w:id="38"/>
-          <w:p/>
+          <w:p>
+            <w:pPr>
+              <w:jc w:val="center"/>
+            </w:pPr>
+            <w:r>
+              <w:rPr>
+                <w:i/>
+                <w:iCs/>
+              </w:rPr>
+              <w:t xml:space="preserve">Note.</w:t>
+            </w:r>
+            <w:r>
+              <w:t xml:space="preserve"> </w:t>
+            </w:r>
+            <w:r>
+              <w:t xml:space="preserve">Estimates are posterior medians with 95% credible intervals (CrI) on the link scale: drift, identity; boundary separation, log; starting point, logit. Direction is the posterior probability that the effect has the sign of its median. Change in a is the percentage change in boundary separation. ROPE = region of practical equivalence (drift ±0.02; boundary and starting point ±0.05).</w:t>
+            </w:r>
+          </w:p>
+          <w:bookmarkEnd w:id="37"/>
         </w:tc>
       </w:tr>
     </w:tbl>
-    <w:bookmarkEnd w:id="39"/>
-    <w:bookmarkStart w:id="44" w:name="task-and-difficulty-effects"/>
+    <w:bookmarkEnd w:id="38"/>
+    <w:bookmarkStart w:id="39" w:name="robustness-of-the-effort-effects"/>
     <w:p>
       <w:pPr>
         <w:pStyle w:val="Heading2"/>
       </w:pPr>
       <w:r>
-        <w:t xml:space="preserve">3.3 Task and difficulty effects</w:t>
+        <w:t xml:space="preserve">3.2 Robustness of the effort effects</w:t>
       </w:r>
     </w:p>
-    <w:tbl>
-      <w:tblPr>
-        <w:tblStyle w:val="Table"/>
-        <w:tblInd w:w="164" w:type="dxa"/>
-        <w:tblBorders>
-          <w:left w:val="single" w:sz="24" w:space="0" w:color="EB9113"/>
-        </w:tblBorders>
-        <w:tblCellMar>
-          <w:left w:w="0" w:type="dxa"/>
-          <w:right w:w="0" w:type="dxa"/>
-        </w:tblCellMar>
-        <w:tblLook w:firstRow="0" w:lastRow="0" w:firstColumn="0" w:lastColumn="0" w:noHBand="0" w:noVBand="0" w:val="0000"/>
-      </w:tblPr>
-      <w:tblGrid>
-        <w:gridCol w:w="7920"/>
-      </w:tblGrid>
-      <w:tr>
-        <w:trPr>
-          <w:cantSplit/>
-        </w:trPr>
-        <w:tc>
-          <w:tcPr>
-            <w:tcMar>
-              <w:left w:w="144" w:type="dxa"/>
-            </w:tcMar>
-          </w:tcPr>
-          <w:p>
-            <w:pPr>
-              <w:pStyle w:val="FirstParagraph"/>
-            </w:pPr>
-            <w:pPr>
-              <w:spacing w:before="16" w:after="64"/>
-            </w:pPr>
-          </w:p>
-          <w:p>
-            <w:pPr>
-              <w:pStyle w:val="BodyText"/>
-            </w:pPr>
-            <w:pPr>
-              <w:spacing w:before="16" w:after="16"/>
-            </w:pPr>
-            <w:r>
-              <w:rPr>
-                <w:b/>
-                <w:bCs/>
-              </w:rPr>
-              <w:t xml:space="preserve">[PROSE TO BE SUPPLIED: 3.3 Task and difficulty effects]</w:t>
-            </w:r>
-            <w:r>
-              <w:t xml:space="preserve"> </w:t>
-            </w:r>
-            <w:r>
-              <w:t xml:space="preserve">Resolves Lani comments: C74.</w:t>
-            </w:r>
-            <w:r>
-              <w:t xml:space="preserve"> </w:t>
-            </w:r>
-            <w:r>
-              <w:t xml:space="preserve">Inline value keys available for this section: task_v, task_hard_x_vdt, task_easy_x_vdt, task_bs, task_bias.</w:t>
-            </w:r>
-            <w:r>
-              <w:t xml:space="preserve"> </w:t>
-            </w:r>
-            <w:r>
-              <w:t xml:space="preserve">Tables/figures in this section:</w:t>
-            </w:r>
-            <w:r>
-              <w:t xml:space="preserve"> </w:t>
-            </w:r>
-            <w:hyperlink w:anchor="fig-condition-params">
-              <w:r>
-                <w:rPr>
-                  <w:rStyle w:val="Hyperlink"/>
-                </w:rPr>
-                <w:t xml:space="preserve">Figure 4</w:t>
-              </w:r>
-            </w:hyperlink>
-            <w:r>
-              <w:t xml:space="preserve">.</w:t>
-            </w:r>
-          </w:p>
-        </w:tc>
-      </w:tr>
-    </w:tbl>
+    <w:p>
+      <w:pPr>
+        <w:pStyle w:val="FirstParagraph"/>
+      </w:pPr>
+      <w:r>
+        <w:t xml:space="preserve">The drift criterion shift was unchanged when the effort effects were allowed to vary across participants (M4r: β = −0.053, 95% CrI [−0.104, −0.004], P(β &lt; 0) = .982). The between-participant SD of that effect was small (0.019, 95% CrI [0.001, 0.062]). The shift was also stable at RT cutoffs of 0.15 s (β = −0.060, 95% CrI [−0.107, −0.011], P(β &lt; 0) = .993) and 0.25 s (β = −0.061, 95% CrI [−0.111, −0.010], P(β &lt; 0) = .992). Excluding the 13 participants with near-chance accuracy left the point estimate unchanged. With N = 54, however, the interval included zero (β = −0.052, 95% CrI [−0.106, 0.003], P(β &lt; 0) = .969). When effort effects were allowed to differ by task (M4b), the criterion shift was larger in the ADT (β = −0.077, 95% CrI [−0.139, −0.017], P(β &lt; 0) = .994) than in the VDT (β = −0.024, 95% CrI [−0.087, 0.040], P(β &lt; 0) = .767), but the task difference was uncertain (β = 0.054, 95% CrI [−0.024, 0.131], P(β &gt; 0) = .912). Evidence quality was null in every variant. The boundary effect was positive at the 0.25-s cutoff (β = 0.019, 95% CrI [0.005, 0.032], P(β &gt; 0) = .997; +1.9% [0.5, 3.2]) and after the near-chance exclusion (β = 0.016, 95% CrI [0.001, 0.031], P(β &gt; 0) = .985; +1.6% [0.1, 3.2]), but at the 0.15-s cutoff its interval included zero (β = 0.012, 95% CrI [−0.002, 0.026], P(β &gt; 0) = .955; +1.2% [−0.2, 2.6];</w:t>
+      </w:r>
+      <w:r>
+        <w:t xml:space="preserve"> </w:t>
+      </w:r>
+      <w:hyperlink w:anchor="supptbl-robustness">
+        <w:r>
+          <w:rPr>
+            <w:rStyle w:val="Hyperlink"/>
+          </w:rPr>
+          <w:t xml:space="preserve">Table S7</w:t>
+        </w:r>
+      </w:hyperlink>
+      <w:r>
+        <w:t xml:space="preserve">).</w:t>
+      </w:r>
+    </w:p>
+    <w:bookmarkEnd w:id="39"/>
+    <w:bookmarkStart w:id="45" w:name="pupil-linked-decision-dynamics"/>
+    <w:p>
+      <w:pPr>
+        <w:pStyle w:val="Heading2"/>
+      </w:pPr>
+      <w:r>
+        <w:t xml:space="preserve">3.3 Pupil-linked decision dynamics</w:t>
+      </w:r>
+    </w:p>
+    <w:p>
+      <w:pPr>
+        <w:pStyle w:val="FirstParagraph"/>
+      </w:pPr>
+      <w:r>
+        <w:rPr>
+          <w:b/>
+          <w:bCs/>
+        </w:rPr>
+        <w:t xml:space="preserve">Effort and pupil size.</w:t>
+      </w:r>
+      <w:r>
+        <w:t xml:space="preserve"> </w:t>
+      </w:r>
+      <w:r>
+        <w:t xml:space="preserve">High effort dilated the pupil during the grip period in both tasks (ADT:</w:t>
+      </w:r>
+      <w:r>
+        <w:t xml:space="preserve"> </w:t>
+      </w:r>
+      <w:r>
+        <w:rPr>
+          <w:i/>
+          <w:iCs/>
+        </w:rPr>
+        <w:t xml:space="preserve">M</w:t>
+      </w:r>
+      <w:r>
+        <w:rPr>
+          <w:vertAlign w:val="subscript"/>
+        </w:rPr>
+        <w:t xml:space="preserve">diff</w:t>
+      </w:r>
+      <w:r>
+        <w:t xml:space="preserve"> </w:t>
+      </w:r>
+      <w:r>
+        <w:t xml:space="preserve">= 0.59, t(27) = 3.37, p = .002; VDT:</w:t>
+      </w:r>
+      <w:r>
+        <w:t xml:space="preserve"> </w:t>
+      </w:r>
+      <w:r>
+        <w:rPr>
+          <w:i/>
+          <w:iCs/>
+        </w:rPr>
+        <w:t xml:space="preserve">M</w:t>
+      </w:r>
+      <w:r>
+        <w:rPr>
+          <w:vertAlign w:val="subscript"/>
+        </w:rPr>
+        <w:t xml:space="preserve">diff</w:t>
+      </w:r>
+      <w:r>
+        <w:t xml:space="preserve"> </w:t>
+      </w:r>
+      <w:r>
+        <w:t xml:space="preserve">= 0.21, t(28) = 2.08, p = .047). In the post-probe window, the direction of the effort effect depended on the baseline. Relative to the pre-probe baseline used for the TEPR, the response was smaller under high effort (ADT:</w:t>
+      </w:r>
+      <w:r>
+        <w:t xml:space="preserve"> </w:t>
+      </w:r>
+      <w:r>
+        <w:rPr>
+          <w:i/>
+          <w:iCs/>
+        </w:rPr>
+        <w:t xml:space="preserve">M</w:t>
+      </w:r>
+      <w:r>
+        <w:rPr>
+          <w:vertAlign w:val="subscript"/>
+        </w:rPr>
+        <w:t xml:space="preserve">diff</w:t>
+      </w:r>
+      <w:r>
+        <w:t xml:space="preserve"> </w:t>
+      </w:r>
+      <w:r>
+        <w:t xml:space="preserve">= −0.72, t(30) = −2.35, p = .026; VDT:</w:t>
+      </w:r>
+      <w:r>
+        <w:t xml:space="preserve"> </w:t>
+      </w:r>
+      <w:r>
+        <w:rPr>
+          <w:i/>
+          <w:iCs/>
+        </w:rPr>
+        <w:t xml:space="preserve">M</w:t>
+      </w:r>
+      <w:r>
+        <w:rPr>
+          <w:vertAlign w:val="subscript"/>
+        </w:rPr>
+        <w:t xml:space="preserve">diff</w:t>
+      </w:r>
+      <w:r>
+        <w:t xml:space="preserve"> </w:t>
+      </w:r>
+      <w:r>
+        <w:t xml:space="preserve">= −0.43, t(29) = −2.40, p = .023). Relative to the pre-squeeze baseline, it was larger in the ADT (</w:t>
+      </w:r>
+      <w:r>
+        <w:rPr>
+          <w:i/>
+          <w:iCs/>
+        </w:rPr>
+        <w:t xml:space="preserve">M</w:t>
+      </w:r>
+      <w:r>
+        <w:rPr>
+          <w:vertAlign w:val="subscript"/>
+        </w:rPr>
+        <w:t xml:space="preserve">diff</w:t>
+      </w:r>
+      <w:r>
+        <w:t xml:space="preserve"> </w:t>
+      </w:r>
+      <w:r>
+        <w:t xml:space="preserve">= 1.00, t(30) = 2.45, p = .020) and unchanged in the VDT (</w:t>
+      </w:r>
+      <w:r>
+        <w:rPr>
+          <w:i/>
+          <w:iCs/>
+        </w:rPr>
+        <w:t xml:space="preserve">M</w:t>
+      </w:r>
+      <w:r>
+        <w:rPr>
+          <w:vertAlign w:val="subscript"/>
+        </w:rPr>
+        <w:t xml:space="preserve">diff</w:t>
+      </w:r>
+      <w:r>
+        <w:t xml:space="preserve"> </w:t>
+      </w:r>
+      <w:r>
+        <w:t xml:space="preserve">= 0.03, t(29) = 0.10, p = .919;</w:t>
+      </w:r>
+      <w:r>
+        <w:t xml:space="preserve"> </w:t>
+      </w:r>
+      <w:hyperlink w:anchor="supptbl-pupil-descriptives">
+        <w:r>
+          <w:rPr>
+            <w:rStyle w:val="Hyperlink"/>
+          </w:rPr>
+          <w:t xml:space="preserve">Table S12</w:t>
+        </w:r>
+      </w:hyperlink>
+      <w:r>
+        <w:t xml:space="preserve">;</w:t>
+      </w:r>
+      <w:r>
+        <w:t xml:space="preserve"> </w:t>
+      </w:r>
+      <w:hyperlink w:anchor="suppfig-tepr">
+        <w:r>
+          <w:rPr>
+            <w:rStyle w:val="Hyperlink"/>
+          </w:rPr>
+          <w:t xml:space="preserve">Figure S3</w:t>
+        </w:r>
+      </w:hyperlink>
+      <w:r>
+        <w:t xml:space="preserve">). In the pupil subsample, high effort widened the boundary (β = 0.030, 95% CrI [0.003, 0.056], P(β &gt; 0) = .984; +3.0% [0.3, 5.8]). The drift criterion shift had the same sign as in the full sample, with a wider interval (β = −0.048, 95% CrI [−0.142, 0.045], P(β &lt; 0) = .840).</w:t>
+      </w:r>
+    </w:p>
+    <w:p>
+      <w:pPr>
+        <w:pStyle w:val="BodyText"/>
+      </w:pPr>
+      <w:r>
+        <w:rPr>
+          <w:b/>
+          <w:bCs/>
+        </w:rPr>
+        <w:t xml:space="preserve">Which parameter tracked the TEPR.</w:t>
+      </w:r>
+      <w:r>
+        <w:t xml:space="preserve"> </w:t>
+      </w:r>
+      <w:r>
+        <w:t xml:space="preserve">Trial-wise TEPR predicted boundary separation. Each within-person SD increase in TEPR widened the boundary by +7.9% [6.5, 9.2] and improved out-of-sample prediction (P3: ΔELPD = 67.9 ± 9.1;</w:t>
+      </w:r>
+      <w:r>
+        <w:t xml:space="preserve"> </w:t>
+      </w:r>
+      <w:hyperlink w:anchor="fig-pupil-boundary">
+        <w:r>
+          <w:rPr>
+            <w:rStyle w:val="Hyperlink"/>
+          </w:rPr>
+          <w:t xml:space="preserve">Figure 4</w:t>
+        </w:r>
+      </w:hyperlink>
+      <w:r>
+        <w:t xml:space="preserve">;</w:t>
+      </w:r>
+      <w:r>
+        <w:t xml:space="preserve"> </w:t>
+      </w:r>
+      <w:hyperlink w:anchor="tbl-pupil-ordering">
+        <w:r>
+          <w:rPr>
+            <w:rStyle w:val="Hyperlink"/>
+          </w:rPr>
+          <w:t xml:space="preserve">Table 3</w:t>
+        </w:r>
+      </w:hyperlink>
+      <w:r>
+        <w:t xml:space="preserve">). TEPR did not predict the starting point (P1: β = 0.008, 95% CrI [−0.023, 0.041], P(β &gt; 0) = .695, ΔELPD = −0.2 ± 0.5). In the drift model, higher TEPR was associated with weaker separation between identical and different stimuli (TEPR × stimulus: β = −0.089, 95% CrI [−0.128, −0.050], P(β &lt; 0) &gt; .999), with a smaller and less certain predictive gain (ΔELPD = 8.8 ± 5.1;</w:t>
+      </w:r>
+      <w:r>
+        <w:t xml:space="preserve"> </w:t>
+      </w:r>
+      <w:hyperlink w:anchor="supptbl-pupil-models">
+        <w:r>
+          <w:rPr>
+            <w:rStyle w:val="Hyperlink"/>
+          </w:rPr>
+          <w:t xml:space="preserve">Table S11</w:t>
+        </w:r>
+      </w:hyperlink>
+      <w:r>
+        <w:t xml:space="preserve">).</w:t>
+      </w:r>
+    </w:p>
+    <w:p>
+      <w:pPr>
+        <w:pStyle w:val="BodyText"/>
+      </w:pPr>
+      <w:r>
+        <w:rPr>
+          <w:b/>
+          <w:bCs/>
+        </w:rPr>
+        <w:t xml:space="preserve">Timing of the TEPR–boundary association.</w:t>
+      </w:r>
+      <w:r>
+        <w:t xml:space="preserve"> </w:t>
+      </w:r>
+      <w:r>
+        <w:t xml:space="preserve">The TEPR window overlapped the response on most trials, and TEPR correlated with RT within participants (r = .30 [.23, .36]). The association with boundary separation remained after the slowest 20% of trials in each participant and task were removed (P3_rt: +5.0% [3.3, 6.7], ΔELPD = 17.6 ± 4.7). Pupil size in the 0.5 s before the response did not predict boundary separation (P7: +1.2% [−0.2, 2.7], ΔELPD = 0.2 ± 1.7). Measures taken before the decision showed small associations in the same direction: previous-trial TEPR (P6: +2.8% [1.3, 4.4], ΔELPD = 6.8 ± 2.7) and pre-squeeze baseline pupil (P5: +1.5% [0.2, 2.9], ΔELPD = 1.7 ± 1.8). Grip-period pupil showed a small association in the opposite direction (P8: −1.7% [−3.1, −0.4], ΔELPD = 2.3 ± 2.0). Of the measures preceding the decision, only the previous-trial TEPR improved prediction by more than two standard errors.</w:t>
+      </w:r>
+    </w:p>
     <w:tbl>
       <w:tblPr>
         <w:tblStyle w:val="Table"/>
@@ -2922,7 +3089,7 @@
       <w:tr>
         <w:tc>
           <w:tcPr/>
-          <w:bookmarkStart w:id="43" w:name="fig-condition-params"/>
+          <w:bookmarkStart w:id="43" w:name="fig-pupil-boundary"/>
           <w:p>
             <w:pPr>
               <w:pStyle w:val="Compact"/>
@@ -2931,287 +3098,20 @@
             <w:r>
               <w:drawing>
                 <wp:inline>
-                  <wp:extent cx="5334000" cy="4593166"/>
+                  <wp:extent cx="5334000" cy="2769576"/>
                   <wp:effectExtent b="0" l="0" r="0" t="0"/>
                   <wp:docPr descr="" title="" id="41" name="Picture"/>
                   <a:graphic>
                     <a:graphicData uri="http://schemas.openxmlformats.org/drawingml/2006/picture">
                       <pic:pic>
                         <pic:nvPicPr>
-                          <pic:cNvPr descr="../output/ddm_refits/runs/final_20261016/figures/final/F2_condition_parameters.png" id="42" name="Picture"/>
+                          <pic:cNvPr descr="../output/ddm_refits/runs/final_20261016/figures/final/F5_pupil_boundary.png" id="42" name="Picture"/>
                           <pic:cNvPicPr>
                             <a:picLocks noChangeArrowheads="1" noChangeAspect="1"/>
                           </pic:cNvPicPr>
                         </pic:nvPicPr>
                         <pic:blipFill>
                           <a:blip r:embed="rId40"/>
-                          <a:stretch>
-                            <a:fillRect/>
-                          </a:stretch>
-                        </pic:blipFill>
-                        <pic:spPr bwMode="auto">
-                          <a:xfrm>
-                            <a:off x="0" y="0"/>
-                            <a:ext cx="5334000" cy="4593166"/>
-                          </a:xfrm>
-                          <a:prstGeom prst="rect">
-                            <a:avLst/>
-                          </a:prstGeom>
-                          <a:noFill/>
-                          <a:ln w="9525">
-                            <a:noFill/>
-                            <a:headEnd/>
-                            <a:tailEnd/>
-                          </a:ln>
-                        </pic:spPr>
-                      </pic:pic>
-                    </a:graphicData>
-                  </a:graphic>
-                </wp:inline>
-              </w:drawing>
-            </w:r>
-          </w:p>
-          <w:p>
-            <w:pPr>
-              <w:jc w:val="center"/>
-            </w:pPr>
-            <w:pPr>
-              <w:jc w:val="left"/>
-              <w:spacing w:before="200"/>
-              <w:pStyle w:val="ImageCaption"/>
-            </w:pPr>
-            <w:r>
-              <w:t xml:space="preserve">Figure 4: [CAPTION TO BE SUPPLIED]</w:t>
-            </w:r>
-          </w:p>
-          <w:bookmarkEnd w:id="43"/>
-        </w:tc>
-      </w:tr>
-    </w:tbl>
-    <w:bookmarkEnd w:id="44"/>
-    <w:bookmarkStart w:id="45" w:name="robustness"/>
-    <w:p>
-      <w:pPr>
-        <w:pStyle w:val="Heading2"/>
-      </w:pPr>
-      <w:r>
-        <w:t xml:space="preserve">3.4 Robustness</w:t>
-      </w:r>
-    </w:p>
-    <w:tbl>
-      <w:tblPr>
-        <w:tblStyle w:val="Table"/>
-        <w:tblInd w:w="164" w:type="dxa"/>
-        <w:tblBorders>
-          <w:left w:val="single" w:sz="24" w:space="0" w:color="EB9113"/>
-        </w:tblBorders>
-        <w:tblCellMar>
-          <w:left w:w="0" w:type="dxa"/>
-          <w:right w:w="0" w:type="dxa"/>
-        </w:tblCellMar>
-        <w:tblLook w:firstRow="0" w:lastRow="0" w:firstColumn="0" w:lastColumn="0" w:noHBand="0" w:noVBand="0" w:val="0000"/>
-      </w:tblPr>
-      <w:tblGrid>
-        <w:gridCol w:w="7920"/>
-      </w:tblGrid>
-      <w:tr>
-        <w:trPr>
-          <w:cantSplit/>
-        </w:trPr>
-        <w:tc>
-          <w:tcPr>
-            <w:tcMar>
-              <w:left w:w="144" w:type="dxa"/>
-            </w:tcMar>
-          </w:tcPr>
-          <w:p>
-            <w:pPr>
-              <w:pStyle w:val="FirstParagraph"/>
-            </w:pPr>
-            <w:pPr>
-              <w:spacing w:before="16" w:after="64"/>
-            </w:pPr>
-          </w:p>
-          <w:p>
-            <w:pPr>
-              <w:pStyle w:val="BodyText"/>
-            </w:pPr>
-            <w:pPr>
-              <w:spacing w:before="16" w:after="16"/>
-            </w:pPr>
-            <w:r>
-              <w:rPr>
-                <w:b/>
-                <w:bCs/>
-              </w:rPr>
-              <w:t xml:space="preserve">[PROSE TO BE SUPPLIED: 3.4 Robustness]</w:t>
-            </w:r>
-            <w:r>
-              <w:t xml:space="preserve"> </w:t>
-            </w:r>
-            <w:r>
-              <w:t xml:space="preserve">Resolves Lani comments: C57.</w:t>
-            </w:r>
-            <w:r>
-              <w:t xml:space="preserve"> </w:t>
-            </w:r>
-            <w:r>
-              <w:t xml:space="preserve">Inline value keys available for this section: crit_M4r, qual_M4r, crit_thr015, qual_thr015, crit_thr025, qual_thr025, crit_subchance, qual_subchance, sd_effort_M4r, sd_bs_effort_M4r, m4b_effort_x_task, m4b_quality_x_task, crit_ADT_M4b, crit_VDT_M4b, n_trials_thr015, n_trials_thr025, n_subchance_excluded, n_subchance_remaining, n_trials_cutoff_excluded.</w:t>
-            </w:r>
-            <w:r>
-              <w:t xml:space="preserve"> </w:t>
-            </w:r>
-            <w:r>
-              <w:t xml:space="preserve">Tables/figures in this section: none.</w:t>
-            </w:r>
-          </w:p>
-        </w:tc>
-      </w:tr>
-    </w:tbl>
-    <w:bookmarkEnd w:id="45"/>
-    <w:bookmarkStart w:id="51" w:name="pupil-linked-decision-dynamics"/>
-    <w:p>
-      <w:pPr>
-        <w:pStyle w:val="Heading2"/>
-      </w:pPr>
-      <w:r>
-        <w:t xml:space="preserve">3.5 Pupil-linked decision dynamics</w:t>
-      </w:r>
-    </w:p>
-    <w:tbl>
-      <w:tblPr>
-        <w:tblStyle w:val="Table"/>
-        <w:tblInd w:w="164" w:type="dxa"/>
-        <w:tblBorders>
-          <w:left w:val="single" w:sz="24" w:space="0" w:color="EB9113"/>
-        </w:tblBorders>
-        <w:tblCellMar>
-          <w:left w:w="0" w:type="dxa"/>
-          <w:right w:w="0" w:type="dxa"/>
-        </w:tblCellMar>
-        <w:tblLook w:firstRow="0" w:lastRow="0" w:firstColumn="0" w:lastColumn="0" w:noHBand="0" w:noVBand="0" w:val="0000"/>
-      </w:tblPr>
-      <w:tblGrid>
-        <w:gridCol w:w="7920"/>
-      </w:tblGrid>
-      <w:tr>
-        <w:trPr>
-          <w:cantSplit/>
-        </w:trPr>
-        <w:tc>
-          <w:tcPr>
-            <w:tcMar>
-              <w:left w:w="144" w:type="dxa"/>
-            </w:tcMar>
-          </w:tcPr>
-          <w:p>
-            <w:pPr>
-              <w:pStyle w:val="FirstParagraph"/>
-            </w:pPr>
-            <w:pPr>
-              <w:spacing w:before="16" w:after="64"/>
-            </w:pPr>
-          </w:p>
-          <w:p>
-            <w:pPr>
-              <w:pStyle w:val="BodyText"/>
-            </w:pPr>
-            <w:pPr>
-              <w:spacing w:before="16" w:after="16"/>
-            </w:pPr>
-            <w:r>
-              <w:rPr>
-                <w:b/>
-                <w:bCs/>
-              </w:rPr>
-              <w:t xml:space="preserve">[PROSE TO BE SUPPLIED: 3.5 Pupil-linked decision dynamics]</w:t>
-            </w:r>
-            <w:r>
-              <w:t xml:space="preserve"> </w:t>
-            </w:r>
-            <w:r>
-              <w:t xml:space="preserve">Resolves Lani comments: C76, C77, C78.</w:t>
-            </w:r>
-            <w:r>
-              <w:t xml:space="preserve"> </w:t>
-            </w:r>
-            <w:r>
-              <w:t xml:space="preserve">Inline value keys available for this section: P3_bs, P3_rt_bs, P5_bs, P6_bs, P7_bs, P8_bs, P1_bias, P2_drift_tepr, P2_drift_tepr_x_stim, P4_bias_base, P0_crit, P0_qual, P0_bs, P0_bias, delta_elpd_P3_vs_P0, delta_elpd_P3rt_vs_P0rt, delta_elpd_P5_vs_P0base, delta_elpd_P6_vs_P0lag, delta_elpd_P7_vs_P0pre, delta_elpd_P8_vs_P0grip, delta_elpd_P1_vs_P0, delta_elpd_P2_vs_P0, delta_elpd_P4_vs_P0base, tepr_rt_r, grip_high_low_ADT, grip_high_low_VDT, tepr_high_low_ADT_B1, tepr_high_low_VDT_B1, tepr_high_low_ADT_B0, tepr_high_low_VDT_B0, n_pupil_matched_trials, n_pupil_matched_subjects, n_pupil_tepr_present_trials, n_pupil_tepr_present_subjects, n_pupil_b1_quality_trials, n_pupil_b1_quality_subjects, n_pupil_window_quality_trials, n_pupil_window_quality_subjects, n_pupil_final_trials, n_pupil_final_subjects, n_pupil_base_trials, n_pupil_rt80_trials, n_pupil_lag_trials, n_pupil_pre_trials, n_pupil_grip_trials, n_pupil_models_k_gt_0.7, pct_gain_lost_rt_trim, max_k_pupil_models.</w:t>
-            </w:r>
-            <w:r>
-              <w:t xml:space="preserve"> </w:t>
-            </w:r>
-            <w:r>
-              <w:t xml:space="preserve">Tables/figures in this section:</w:t>
-            </w:r>
-            <w:r>
-              <w:t xml:space="preserve"> </w:t>
-            </w:r>
-            <w:hyperlink w:anchor="fig-pupil-boundary">
-              <w:r>
-                <w:rPr>
-                  <w:rStyle w:val="Hyperlink"/>
-                </w:rPr>
-                <w:t xml:space="preserve">Figure 5</w:t>
-              </w:r>
-            </w:hyperlink>
-            <w:r>
-              <w:t xml:space="preserve">,</w:t>
-            </w:r>
-            <w:r>
-              <w:t xml:space="preserve"> </w:t>
-            </w:r>
-            <w:hyperlink w:anchor="tbl-pupil-ordering">
-              <w:r>
-                <w:rPr>
-                  <w:rStyle w:val="Hyperlink"/>
-                </w:rPr>
-                <w:t xml:space="preserve">Table 3</w:t>
-              </w:r>
-            </w:hyperlink>
-            <w:r>
-              <w:t xml:space="preserve">.</w:t>
-            </w:r>
-          </w:p>
-        </w:tc>
-      </w:tr>
-    </w:tbl>
-    <w:tbl>
-      <w:tblPr>
-        <w:tblStyle w:val="Table"/>
-        <w:tblW w:type="pct" w:w="5000"/>
-        <w:tblLayout w:type="fixed"/>
-        <w:tblLook w:firstRow="0" w:lastRow="0" w:firstColumn="0" w:lastColumn="0" w:noHBand="0" w:noVBand="0" w:val="0000"/>
-      </w:tblPr>
-      <w:tblGrid>
-        <w:gridCol w:w="7920"/>
-      </w:tblGrid>
-      <w:tr>
-        <w:tc>
-          <w:tcPr/>
-          <w:bookmarkStart w:id="49" w:name="fig-pupil-boundary"/>
-          <w:p>
-            <w:pPr>
-              <w:pStyle w:val="Compact"/>
-              <w:jc w:val="center"/>
-            </w:pPr>
-            <w:r>
-              <w:drawing>
-                <wp:inline>
-                  <wp:extent cx="5334000" cy="2769576"/>
-                  <wp:effectExtent b="0" l="0" r="0" t="0"/>
-                  <wp:docPr descr="" title="" id="47" name="Picture"/>
-                  <a:graphic>
-                    <a:graphicData uri="http://schemas.openxmlformats.org/drawingml/2006/picture">
-                      <pic:pic>
-                        <pic:nvPicPr>
-                          <pic:cNvPr descr="../output/ddm_refits/runs/final_20261016/figures/final/F5_pupil_boundary.png" id="48" name="Picture"/>
-                          <pic:cNvPicPr>
-                            <a:picLocks noChangeArrowheads="1" noChangeAspect="1"/>
-                          </pic:cNvPicPr>
-                        </pic:nvPicPr>
-                        <pic:blipFill>
-                          <a:blip r:embed="rId46"/>
                           <a:stretch>
                             <a:fillRect/>
                           </a:stretch>
@@ -3248,10 +3148,10 @@
               <w:pStyle w:val="ImageCaption"/>
             </w:pPr>
             <w:r>
-              <w:t xml:space="preserve">Figure 5: [CAPTION TO BE SUPPLIED]</w:t>
+              <w:t xml:space="preserve">Figure 4: Pupil measures and boundary separation. Each row is a separate model. Points are posterior median percentage changes in boundary separation per within-person SD of the pupil predictor, and bars are 95% credible intervals. ΔELPD ± SE compares each model with a baseline model fit to the same trials. Upper rows: measures from the current trial; lower rows: measures preceding the current decision.</w:t>
             </w:r>
           </w:p>
-          <w:bookmarkEnd w:id="49"/>
+          <w:bookmarkEnd w:id="43"/>
         </w:tc>
       </w:tr>
     </w:tbl>
@@ -3268,7 +3168,7 @@
       <w:tr>
         <w:tc>
           <w:tcPr/>
-          <w:bookmarkStart w:id="50" w:name="tbl-pupil-ordering"/>
+          <w:bookmarkStart w:id="44" w:name="tbl-pupil-ordering"/>
           <w:p>
             <w:pPr>
               <w:jc w:val="center"/>
@@ -3279,21 +3179,24 @@
               <w:pStyle w:val="ImageCaption"/>
             </w:pPr>
             <w:r>
-              <w:t xml:space="preserve">Table 3: [CAPTION TO BE SUPPLIED]</w:t>
+              <w:t xml:space="preserve">Table 3: Pupil predictors of boundary separation</w:t>
             </w:r>
           </w:p>
           <w:tbl>
             <w:tblPr>
               <w:tblStyle w:val="Table"/>
-              <w:tblW w:type="auto" w:w="0"/>
+              <w:tblW w:type="pct" w:w="5000"/>
+              <w:tblLayout w:type="fixed"/>
               <w:tblLook w:firstRow="1" w:lastRow="0" w:firstColumn="0" w:lastColumn="0" w:noHBand="0" w:noVBand="0" w:val="0020"/>
             </w:tblPr>
             <w:tblGrid>
-              <w:gridCol w:w="1584"/>
-              <w:gridCol w:w="1584"/>
-              <w:gridCol w:w="1584"/>
-              <w:gridCol w:w="1584"/>
-              <w:gridCol w:w="1584"/>
+              <w:gridCol w:w="409"/>
+              <w:gridCol w:w="2731"/>
+              <w:gridCol w:w="1638"/>
+              <w:gridCol w:w="1297"/>
+              <w:gridCol w:w="751"/>
+              <w:gridCol w:w="477"/>
+              <w:gridCol w:w="614"/>
             </w:tblGrid>
             <w:tr>
               <w:trPr>
@@ -3334,7 +3237,33 @@
                     <w:jc w:val="center"/>
                   </w:pPr>
                   <w:r>
-                    <w:t xml:space="preserve">Estimate</w:t>
+                    <w:t xml:space="preserve">Estimate [95% CrI]</w:t>
+                  </w:r>
+                </w:p>
+              </w:tc>
+              <w:tc>
+                <w:tcPr/>
+                <w:p>
+                  <w:pPr>
+                    <w:pStyle w:val="Compact"/>
+                    <w:jc w:val="right"/>
+                    <w:jc w:val="center"/>
+                  </w:pPr>
+                  <w:r>
+                    <w:t xml:space="preserve">Change in a</w:t>
+                  </w:r>
+                </w:p>
+              </w:tc>
+              <w:tc>
+                <w:tcPr/>
+                <w:p>
+                  <w:pPr>
+                    <w:pStyle w:val="Compact"/>
+                    <w:jc w:val="right"/>
+                    <w:jc w:val="center"/>
+                  </w:pPr>
+                  <w:r>
+                    <w:t xml:space="preserve">ΔELPD ± SE</w:t>
                   </w:r>
                 </w:p>
               </w:tc>
@@ -3361,99 +3290,667 @@
                   </w:pPr>
                   <w:r>
                     <w:t xml:space="preserve">Subjects</w:t>
+                  </w:r>
+                </w:p>
+              </w:tc>
+            </w:tr>
+            <w:tr>
+              <w:tc>
+                <w:tcPr/>
+                <w:p>
+                  <w:pPr>
+                    <w:pStyle w:val="Compact"/>
+                    <w:jc w:val="left"/>
+                    <w:jc w:val="center"/>
+                  </w:pPr>
+                  <w:r>
+                    <w:t xml:space="preserve">P3</w:t>
+                  </w:r>
+                </w:p>
+              </w:tc>
+              <w:tc>
+                <w:tcPr/>
+                <w:p>
+                  <w:pPr>
+                    <w:pStyle w:val="Compact"/>
+                    <w:jc w:val="right"/>
+                    <w:jc w:val="center"/>
+                  </w:pPr>
+                  <w:r>
+                    <w:t xml:space="preserve">Post-probe TEPR (0.3–3.3 s after probe)</w:t>
+                  </w:r>
+                </w:p>
+              </w:tc>
+              <w:tc>
+                <w:tcPr/>
+                <w:p>
+                  <w:pPr>
+                    <w:pStyle w:val="Compact"/>
+                    <w:jc w:val="right"/>
+                    <w:jc w:val="center"/>
+                  </w:pPr>
+                  <w:r>
+                    <w:t xml:space="preserve">0.076 [0.063, 0.088]</w:t>
+                  </w:r>
+                </w:p>
+              </w:tc>
+              <w:tc>
+                <w:tcPr/>
+                <w:p>
+                  <w:pPr>
+                    <w:pStyle w:val="Compact"/>
+                    <w:jc w:val="right"/>
+                    <w:jc w:val="center"/>
+                  </w:pPr>
+                  <w:r>
+                    <w:t xml:space="preserve">+7.9% [6.5, 9.2]</w:t>
+                  </w:r>
+                </w:p>
+              </w:tc>
+              <w:tc>
+                <w:tcPr/>
+                <w:p>
+                  <w:pPr>
+                    <w:pStyle w:val="Compact"/>
+                    <w:jc w:val="right"/>
+                    <w:jc w:val="center"/>
+                  </w:pPr>
+                  <w:r>
+                    <w:t xml:space="preserve">67.9 ± 9.1</w:t>
+                  </w:r>
+                </w:p>
+              </w:tc>
+              <w:tc>
+                <w:tcPr/>
+                <w:p>
+                  <w:pPr>
+                    <w:pStyle w:val="Compact"/>
+                    <w:jc w:val="right"/>
+                    <w:jc w:val="center"/>
+                  </w:pPr>
+                  <w:r>
+                    <w:t xml:space="preserve">4,935</w:t>
+                  </w:r>
+                </w:p>
+              </w:tc>
+              <w:tc>
+                <w:tcPr/>
+                <w:p>
+                  <w:pPr>
+                    <w:pStyle w:val="Compact"/>
+                    <w:jc w:val="right"/>
+                    <w:jc w:val="center"/>
+                  </w:pPr>
+                  <w:r>
+                    <w:t xml:space="preserve">43</w:t>
+                  </w:r>
+                </w:p>
+              </w:tc>
+            </w:tr>
+            <w:tr>
+              <w:tc>
+                <w:tcPr/>
+                <w:p>
+                  <w:pPr>
+                    <w:pStyle w:val="Compact"/>
+                    <w:jc w:val="left"/>
+                    <w:jc w:val="center"/>
+                  </w:pPr>
+                  <w:r>
+                    <w:t xml:space="preserve">P3_rt</w:t>
+                  </w:r>
+                </w:p>
+              </w:tc>
+              <w:tc>
+                <w:tcPr/>
+                <w:p>
+                  <w:pPr>
+                    <w:pStyle w:val="Compact"/>
+                    <w:jc w:val="right"/>
+                    <w:jc w:val="center"/>
+                  </w:pPr>
+                  <w:r>
+                    <w:t xml:space="preserve">Post-probe TEPR, slowest 20% removed</w:t>
+                  </w:r>
+                </w:p>
+              </w:tc>
+              <w:tc>
+                <w:tcPr/>
+                <w:p>
+                  <w:pPr>
+                    <w:pStyle w:val="Compact"/>
+                    <w:jc w:val="right"/>
+                    <w:jc w:val="center"/>
+                  </w:pPr>
+                  <w:r>
+                    <w:t xml:space="preserve">0.049 [0.033, 0.064]</w:t>
+                  </w:r>
+                </w:p>
+              </w:tc>
+              <w:tc>
+                <w:tcPr/>
+                <w:p>
+                  <w:pPr>
+                    <w:pStyle w:val="Compact"/>
+                    <w:jc w:val="right"/>
+                    <w:jc w:val="center"/>
+                  </w:pPr>
+                  <w:r>
+                    <w:t xml:space="preserve">+5.0% [3.3, 6.7]</w:t>
+                  </w:r>
+                </w:p>
+              </w:tc>
+              <w:tc>
+                <w:tcPr/>
+                <w:p>
+                  <w:pPr>
+                    <w:pStyle w:val="Compact"/>
+                    <w:jc w:val="right"/>
+                    <w:jc w:val="center"/>
+                  </w:pPr>
+                  <w:r>
+                    <w:t xml:space="preserve">17.6 ± 4.7</w:t>
+                  </w:r>
+                </w:p>
+              </w:tc>
+              <w:tc>
+                <w:tcPr/>
+                <w:p>
+                  <w:pPr>
+                    <w:pStyle w:val="Compact"/>
+                    <w:jc w:val="right"/>
+                    <w:jc w:val="center"/>
+                  </w:pPr>
+                  <w:r>
+                    <w:t xml:space="preserve">3,973</w:t>
+                  </w:r>
+                </w:p>
+              </w:tc>
+              <w:tc>
+                <w:tcPr/>
+                <w:p>
+                  <w:pPr>
+                    <w:pStyle w:val="Compact"/>
+                    <w:jc w:val="right"/>
+                    <w:jc w:val="center"/>
+                  </w:pPr>
+                  <w:r>
+                    <w:t xml:space="preserve">43</w:t>
+                  </w:r>
+                </w:p>
+              </w:tc>
+            </w:tr>
+            <w:tr>
+              <w:tc>
+                <w:tcPr/>
+                <w:p>
+                  <w:pPr>
+                    <w:pStyle w:val="Compact"/>
+                    <w:jc w:val="left"/>
+                    <w:jc w:val="center"/>
+                  </w:pPr>
+                  <w:r>
+                    <w:t xml:space="preserve">P7</w:t>
+                  </w:r>
+                </w:p>
+              </w:tc>
+              <w:tc>
+                <w:tcPr/>
+                <w:p>
+                  <w:pPr>
+                    <w:pStyle w:val="Compact"/>
+                    <w:jc w:val="right"/>
+                    <w:jc w:val="center"/>
+                  </w:pPr>
+                  <w:r>
+                    <w:t xml:space="preserve">Pre-response window (0.5 s)</w:t>
+                  </w:r>
+                </w:p>
+              </w:tc>
+              <w:tc>
+                <w:tcPr/>
+                <w:p>
+                  <w:pPr>
+                    <w:pStyle w:val="Compact"/>
+                    <w:jc w:val="right"/>
+                    <w:jc w:val="center"/>
+                  </w:pPr>
+                  <w:r>
+                    <w:t xml:space="preserve">0.012 [−0.002, 0.027]</w:t>
+                  </w:r>
+                </w:p>
+              </w:tc>
+              <w:tc>
+                <w:tcPr/>
+                <w:p>
+                  <w:pPr>
+                    <w:pStyle w:val="Compact"/>
+                    <w:jc w:val="right"/>
+                    <w:jc w:val="center"/>
+                  </w:pPr>
+                  <w:r>
+                    <w:t xml:space="preserve">+1.2% [−0.2, 2.7]</w:t>
+                  </w:r>
+                </w:p>
+              </w:tc>
+              <w:tc>
+                <w:tcPr/>
+                <w:p>
+                  <w:pPr>
+                    <w:pStyle w:val="Compact"/>
+                    <w:jc w:val="right"/>
+                    <w:jc w:val="center"/>
+                  </w:pPr>
+                  <w:r>
+                    <w:t xml:space="preserve">0.2 ± 1.7</w:t>
+                  </w:r>
+                </w:p>
+              </w:tc>
+              <w:tc>
+                <w:tcPr/>
+                <w:p>
+                  <w:pPr>
+                    <w:pStyle w:val="Compact"/>
+                    <w:jc w:val="right"/>
+                    <w:jc w:val="center"/>
+                  </w:pPr>
+                  <w:r>
+                    <w:t xml:space="preserve">3,799</w:t>
+                  </w:r>
+                </w:p>
+              </w:tc>
+              <w:tc>
+                <w:tcPr/>
+                <w:p>
+                  <w:pPr>
+                    <w:pStyle w:val="Compact"/>
+                    <w:jc w:val="right"/>
+                    <w:jc w:val="center"/>
+                  </w:pPr>
+                  <w:r>
+                    <w:t xml:space="preserve">43</w:t>
+                  </w:r>
+                </w:p>
+              </w:tc>
+            </w:tr>
+            <w:tr>
+              <w:tc>
+                <w:tcPr/>
+                <w:p>
+                  <w:pPr>
+                    <w:pStyle w:val="Compact"/>
+                    <w:jc w:val="left"/>
+                    <w:jc w:val="center"/>
+                  </w:pPr>
+                  <w:r>
+                    <w:t xml:space="preserve">P6</w:t>
+                  </w:r>
+                </w:p>
+              </w:tc>
+              <w:tc>
+                <w:tcPr/>
+                <w:p>
+                  <w:pPr>
+                    <w:pStyle w:val="Compact"/>
+                    <w:jc w:val="right"/>
+                    <w:jc w:val="center"/>
+                  </w:pPr>
+                  <w:r>
+                    <w:t xml:space="preserve">Previous-trial TEPR</w:t>
+                  </w:r>
+                </w:p>
+              </w:tc>
+              <w:tc>
+                <w:tcPr/>
+                <w:p>
+                  <w:pPr>
+                    <w:pStyle w:val="Compact"/>
+                    <w:jc w:val="right"/>
+                    <w:jc w:val="center"/>
+                  </w:pPr>
+                  <w:r>
+                    <w:t xml:space="preserve">0.028 [0.013, 0.043]</w:t>
+                  </w:r>
+                </w:p>
+              </w:tc>
+              <w:tc>
+                <w:tcPr/>
+                <w:p>
+                  <w:pPr>
+                    <w:pStyle w:val="Compact"/>
+                    <w:jc w:val="right"/>
+                    <w:jc w:val="center"/>
+                  </w:pPr>
+                  <w:r>
+                    <w:t xml:space="preserve">+2.8% [1.3, 4.4]</w:t>
+                  </w:r>
+                </w:p>
+              </w:tc>
+              <w:tc>
+                <w:tcPr/>
+                <w:p>
+                  <w:pPr>
+                    <w:pStyle w:val="Compact"/>
+                    <w:jc w:val="right"/>
+                    <w:jc w:val="center"/>
+                  </w:pPr>
+                  <w:r>
+                    <w:t xml:space="preserve">6.8 ± 2.7</w:t>
+                  </w:r>
+                </w:p>
+              </w:tc>
+              <w:tc>
+                <w:tcPr/>
+                <w:p>
+                  <w:pPr>
+                    <w:pStyle w:val="Compact"/>
+                    <w:jc w:val="right"/>
+                    <w:jc w:val="center"/>
+                  </w:pPr>
+                  <w:r>
+                    <w:t xml:space="preserve">3,842</w:t>
+                  </w:r>
+                </w:p>
+              </w:tc>
+              <w:tc>
+                <w:tcPr/>
+                <w:p>
+                  <w:pPr>
+                    <w:pStyle w:val="Compact"/>
+                    <w:jc w:val="right"/>
+                    <w:jc w:val="center"/>
+                  </w:pPr>
+                  <w:r>
+                    <w:t xml:space="preserve">43</w:t>
+                  </w:r>
+                </w:p>
+              </w:tc>
+            </w:tr>
+            <w:tr>
+              <w:tc>
+                <w:tcPr/>
+                <w:p>
+                  <w:pPr>
+                    <w:pStyle w:val="Compact"/>
+                    <w:jc w:val="left"/>
+                    <w:jc w:val="center"/>
+                  </w:pPr>
+                  <w:r>
+                    <w:t xml:space="preserve">P5</w:t>
+                  </w:r>
+                </w:p>
+              </w:tc>
+              <w:tc>
+                <w:tcPr/>
+                <w:p>
+                  <w:pPr>
+                    <w:pStyle w:val="Compact"/>
+                    <w:jc w:val="right"/>
+                    <w:jc w:val="center"/>
+                  </w:pPr>
+                  <w:r>
+                    <w:t xml:space="preserve">Pre-trial baseline pupil</w:t>
+                  </w:r>
+                </w:p>
+              </w:tc>
+              <w:tc>
+                <w:tcPr/>
+                <w:p>
+                  <w:pPr>
+                    <w:pStyle w:val="Compact"/>
+                    <w:jc w:val="right"/>
+                    <w:jc w:val="center"/>
+                  </w:pPr>
+                  <w:r>
+                    <w:t xml:space="preserve">0.015 [0.002, 0.029]</w:t>
+                  </w:r>
+                </w:p>
+              </w:tc>
+              <w:tc>
+                <w:tcPr/>
+                <w:p>
+                  <w:pPr>
+                    <w:pStyle w:val="Compact"/>
+                    <w:jc w:val="right"/>
+                    <w:jc w:val="center"/>
+                  </w:pPr>
+                  <w:r>
+                    <w:t xml:space="preserve">+1.5% [0.2, 2.9]</w:t>
+                  </w:r>
+                </w:p>
+              </w:tc>
+              <w:tc>
+                <w:tcPr/>
+                <w:p>
+                  <w:pPr>
+                    <w:pStyle w:val="Compact"/>
+                    <w:jc w:val="right"/>
+                    <w:jc w:val="center"/>
+                  </w:pPr>
+                  <w:r>
+                    <w:t xml:space="preserve">1.7 ± 1.8</w:t>
+                  </w:r>
+                </w:p>
+              </w:tc>
+              <w:tc>
+                <w:tcPr/>
+                <w:p>
+                  <w:pPr>
+                    <w:pStyle w:val="Compact"/>
+                    <w:jc w:val="right"/>
+                    <w:jc w:val="center"/>
+                  </w:pPr>
+                  <w:r>
+                    <w:t xml:space="preserve">4,488</w:t>
+                  </w:r>
+                </w:p>
+              </w:tc>
+              <w:tc>
+                <w:tcPr/>
+                <w:p>
+                  <w:pPr>
+                    <w:pStyle w:val="Compact"/>
+                    <w:jc w:val="right"/>
+                    <w:jc w:val="center"/>
+                  </w:pPr>
+                  <w:r>
+                    <w:t xml:space="preserve">43</w:t>
+                  </w:r>
+                </w:p>
+              </w:tc>
+            </w:tr>
+            <w:tr>
+              <w:tc>
+                <w:tcPr/>
+                <w:p>
+                  <w:pPr>
+                    <w:pStyle w:val="Compact"/>
+                    <w:jc w:val="left"/>
+                    <w:jc w:val="center"/>
+                  </w:pPr>
+                  <w:r>
+                    <w:t xml:space="preserve">P8</w:t>
+                  </w:r>
+                </w:p>
+              </w:tc>
+              <w:tc>
+                <w:tcPr/>
+                <w:p>
+                  <w:pPr>
+                    <w:pStyle w:val="Compact"/>
+                    <w:jc w:val="right"/>
+                    <w:jc w:val="center"/>
+                  </w:pPr>
+                  <w:r>
+                    <w:t xml:space="preserve">Grip-period pupil</w:t>
+                  </w:r>
+                </w:p>
+              </w:tc>
+              <w:tc>
+                <w:tcPr/>
+                <w:p>
+                  <w:pPr>
+                    <w:pStyle w:val="Compact"/>
+                    <w:jc w:val="right"/>
+                    <w:jc w:val="center"/>
+                  </w:pPr>
+                  <w:r>
+                    <w:t xml:space="preserve">−0.017 [−0.031, −0.004]</w:t>
+                  </w:r>
+                </w:p>
+              </w:tc>
+              <w:tc>
+                <w:tcPr/>
+                <w:p>
+                  <w:pPr>
+                    <w:pStyle w:val="Compact"/>
+                    <w:jc w:val="right"/>
+                    <w:jc w:val="center"/>
+                  </w:pPr>
+                  <w:r>
+                    <w:t xml:space="preserve">−1.7% [−3.1, −0.4]</w:t>
+                  </w:r>
+                </w:p>
+              </w:tc>
+              <w:tc>
+                <w:tcPr/>
+                <w:p>
+                  <w:pPr>
+                    <w:pStyle w:val="Compact"/>
+                    <w:jc w:val="right"/>
+                    <w:jc w:val="center"/>
+                  </w:pPr>
+                  <w:r>
+                    <w:t xml:space="preserve">2.3 ± 2.0</w:t>
+                  </w:r>
+                </w:p>
+              </w:tc>
+              <w:tc>
+                <w:tcPr/>
+                <w:p>
+                  <w:pPr>
+                    <w:pStyle w:val="Compact"/>
+                    <w:jc w:val="right"/>
+                    <w:jc w:val="center"/>
+                  </w:pPr>
+                  <w:r>
+                    <w:t xml:space="preserve">4,209</w:t>
+                  </w:r>
+                </w:p>
+              </w:tc>
+              <w:tc>
+                <w:tcPr/>
+                <w:p>
+                  <w:pPr>
+                    <w:pStyle w:val="Compact"/>
+                    <w:jc w:val="right"/>
+                    <w:jc w:val="center"/>
+                  </w:pPr>
+                  <w:r>
+                    <w:t xml:space="preserve">42</w:t>
                   </w:r>
                 </w:p>
               </w:tc>
             </w:tr>
           </w:tbl>
-          <w:bookmarkEnd w:id="50"/>
-          <w:p/>
+          <w:p>
+            <w:pPr>
+              <w:jc w:val="center"/>
+            </w:pPr>
+            <w:r>
+              <w:rPr>
+                <w:i/>
+                <w:iCs/>
+              </w:rPr>
+              <w:t xml:space="preserve">Note.</w:t>
+            </w:r>
+            <w:r>
+              <w:t xml:space="preserve"> </w:t>
+            </w:r>
+            <w:r>
+              <w:t xml:space="preserve">Each row is a separate model. Estimates are slopes on log boundary separation per within-person SD of the predictor, with the percentage change in a. ΔELPD ± SE is relative to a baseline model without the pupil predictor, fit to the same trials. Trial counts differ because each predictor requires its own valid window.</w:t>
+            </w:r>
+          </w:p>
+          <w:bookmarkEnd w:id="44"/>
         </w:tc>
       </w:tr>
     </w:tbl>
-    <w:bookmarkEnd w:id="51"/>
-    <w:bookmarkStart w:id="52" w:name="model-adequacy"/>
+    <w:bookmarkEnd w:id="45"/>
+    <w:bookmarkStart w:id="46" w:name="model-adequacy"/>
     <w:p>
       <w:pPr>
         <w:pStyle w:val="Heading2"/>
       </w:pPr>
       <w:r>
-        <w:t xml:space="preserve">3.6 Model adequacy</w:t>
+        <w:t xml:space="preserve">3.4 Model adequacy</w:t>
       </w:r>
     </w:p>
-    <w:tbl>
-      <w:tblPr>
-        <w:tblStyle w:val="Table"/>
-        <w:tblInd w:w="164" w:type="dxa"/>
-        <w:tblBorders>
-          <w:left w:val="single" w:sz="24" w:space="0" w:color="EB9113"/>
-        </w:tblBorders>
-        <w:tblCellMar>
-          <w:left w:w="0" w:type="dxa"/>
-          <w:right w:w="0" w:type="dxa"/>
-        </w:tblCellMar>
-        <w:tblLook w:firstRow="0" w:lastRow="0" w:firstColumn="0" w:lastColumn="0" w:noHBand="0" w:noVBand="0" w:val="0000"/>
-      </w:tblPr>
-      <w:tblGrid>
-        <w:gridCol w:w="7920"/>
-      </w:tblGrid>
-      <w:tr>
-        <w:trPr>
-          <w:cantSplit/>
-        </w:trPr>
-        <w:tc>
-          <w:tcPr>
-            <w:tcMar>
-              <w:left w:w="144" w:type="dxa"/>
-            </w:tcMar>
-          </w:tcPr>
-          <w:p>
-            <w:pPr>
-              <w:pStyle w:val="FirstParagraph"/>
-            </w:pPr>
-            <w:pPr>
-              <w:spacing w:before="16" w:after="64"/>
-            </w:pPr>
-          </w:p>
-          <w:p>
-            <w:pPr>
-              <w:pStyle w:val="BodyText"/>
-            </w:pPr>
-            <w:pPr>
-              <w:spacing w:before="16" w:after="16"/>
-            </w:pPr>
-            <w:r>
-              <w:rPr>
-                <w:b/>
-                <w:bCs/>
-              </w:rPr>
-              <w:t xml:space="preserve">[PROSE TO BE SUPPLIED: 3.6 Model adequacy]</w:t>
-            </w:r>
-            <w:r>
-              <w:t xml:space="preserve"> </w:t>
-            </w:r>
-            <w:r>
-              <w:t xml:space="preserve">Resolves Lani comments: none.</w:t>
-            </w:r>
-            <w:r>
-              <w:t xml:space="preserve"> </w:t>
-            </w:r>
-            <w:r>
-              <w:t xml:space="preserve">Inline value keys available for this section: ppc_choice_inside_M4, ppc_rt_inside_pct_M4, ppc_rt_median_bias_ms_M4, t0_M4, t0_thr015, t0_thr025, max_rhat_M4, min_bulk_ess_M4, min_tail_ess_M4.</w:t>
-            </w:r>
-            <w:r>
-              <w:t xml:space="preserve"> </w:t>
-            </w:r>
-            <w:r>
-              <w:t xml:space="preserve">Tables/figures in this section: none.</w:t>
-            </w:r>
-          </w:p>
-        </w:tc>
-      </w:tr>
-    </w:tbl>
-    <w:bookmarkEnd w:id="52"/>
-    <w:bookmarkEnd w:id="53"/>
-    <w:bookmarkStart w:id="55" w:name="discussion"/>
+    <w:p>
+      <w:pPr>
+        <w:pStyle w:val="FirstParagraph"/>
+      </w:pPr>
+      <w:r>
+        <w:t xml:space="preserve">M4 reproduced the observed choice proportions in 10 of 12 condition cells (</w:t>
+      </w:r>
+      <w:hyperlink w:anchor="supptbl-ppc-choice">
+        <w:r>
+          <w:rPr>
+            <w:rStyle w:val="Hyperlink"/>
+          </w:rPr>
+          <w:t xml:space="preserve">Table S6</w:t>
+        </w:r>
+      </w:hyperlink>
+      <w:r>
+        <w:t xml:space="preserve">). It fit the RT distributions less well. 27.5% of observed RT quantiles fell inside the 95% predictive intervals, and observed median RTs were on average 175 ms slower than predicted (</w:t>
+      </w:r>
+      <w:hyperlink w:anchor="suppfig-ppc">
+        <w:r>
+          <w:rPr>
+            <w:rStyle w:val="Hyperlink"/>
+          </w:rPr>
+          <w:t xml:space="preserve">Figure S2</w:t>
+        </w:r>
+      </w:hyperlink>
+      <w:r>
+        <w:t xml:space="preserve">). The misfit was concentrated in minority responses (</w:t>
+      </w:r>
+      <w:r>
+        <w:t xml:space="preserve">“different”</w:t>
+      </w:r>
+      <w:r>
+        <w:t xml:space="preserve"> </w:t>
+      </w:r>
+      <w:r>
+        <w:t xml:space="preserve">on Standard trials,</w:t>
+      </w:r>
+      <w:r>
+        <w:t xml:space="preserve"> </w:t>
+      </w:r>
+      <w:r>
+        <w:t xml:space="preserve">“same”</w:t>
+      </w:r>
+      <w:r>
+        <w:t xml:space="preserve"> </w:t>
+      </w:r>
+      <w:r>
+        <w:t xml:space="preserve">on Easy trials and</w:t>
+      </w:r>
+      <w:r>
+        <w:t xml:space="preserve"> </w:t>
+      </w:r>
+      <w:r>
+        <w:t xml:space="preserve">“different”</w:t>
+      </w:r>
+      <w:r>
+        <w:t xml:space="preserve"> </w:t>
+      </w:r>
+      <w:r>
+        <w:t xml:space="preserve">on Hard trials), which were slower than predicted. Non-decision time tracked the RT cutoff: 0.483 s, 0.527 s and 0.572 s at cutoffs of 0.15 s, 0.20 s and 0.25 s.</w:t>
+      </w:r>
+    </w:p>
+    <w:bookmarkEnd w:id="46"/>
+    <w:bookmarkEnd w:id="47"/>
+    <w:bookmarkStart w:id="49" w:name="discussion"/>
     <w:p>
       <w:pPr>
         <w:pStyle w:val="Heading1"/>
@@ -3520,7 +4017,7 @@
               <w:t xml:space="preserve"> </w:t>
             </w:r>
             <w:r>
-              <w:t xml:space="preserve">Inline value keys available for this section: crit, qual, bs, bs_pct_change, P3_bs, delta_elpd_P3_vs_P0, tepr_rt_r, grip_high_low_ADT, grip_high_low_VDT.</w:t>
+              <w:t xml:space="preserve">Inline value keys available for this section: crit, qual, bs, P3_bs, delta_elpd_P3_vs_P0, tepr_rt_r, grip_high_low_ADT, grip_high_low_VDT.</w:t>
             </w:r>
             <w:r>
               <w:t xml:space="preserve"> </w:t>
@@ -3532,7 +4029,7 @@
         </w:tc>
       </w:tr>
     </w:tbl>
-    <w:bookmarkStart w:id="54" w:name="limitations-and-future-directions"/>
+    <w:bookmarkStart w:id="48" w:name="limitations-and-future-directions"/>
     <w:p>
       <w:pPr>
         <w:pStyle w:val="Heading2"/>
@@ -3611,9 +4108,9 @@
         </w:tc>
       </w:tr>
     </w:tbl>
-    <w:bookmarkEnd w:id="54"/>
-    <w:bookmarkEnd w:id="55"/>
-    <w:bookmarkStart w:id="57" w:name="references"/>
+    <w:bookmarkEnd w:id="48"/>
+    <w:bookmarkEnd w:id="49"/>
+    <w:bookmarkStart w:id="53" w:name="references"/>
     <w:p>
       <w:pPr>
         <w:pStyle w:val="Heading1"/>
@@ -3622,10 +4119,57 @@
         <w:t xml:space="preserve">References</w:t>
       </w:r>
     </w:p>
-    <w:bookmarkStart w:id="56" w:name="refs"/>
-    <w:bookmarkEnd w:id="56"/>
-    <w:bookmarkEnd w:id="57"/>
-    <w:bookmarkStart w:id="91" w:name="supplementary-materials"/>
+    <w:bookmarkStart w:id="52" w:name="refs"/>
+    <w:bookmarkStart w:id="51" w:name="ref-ratcliff2008diffusion"/>
+    <w:p>
+      <w:pPr>
+        <w:pStyle w:val="Bibliography"/>
+      </w:pPr>
+      <w:r>
+        <w:t xml:space="preserve">Ratcliff, R., &amp; McKoon, G. (2008). The diffusion decision model: Theory and data for two-choice decision tasks.</w:t>
+      </w:r>
+      <w:r>
+        <w:t xml:space="preserve"> </w:t>
+      </w:r>
+      <w:r>
+        <w:rPr>
+          <w:i/>
+          <w:iCs/>
+        </w:rPr>
+        <w:t xml:space="preserve">Neural Computation</w:t>
+      </w:r>
+      <w:r>
+        <w:t xml:space="preserve">,</w:t>
+      </w:r>
+      <w:r>
+        <w:t xml:space="preserve"> </w:t>
+      </w:r>
+      <w:r>
+        <w:rPr>
+          <w:i/>
+          <w:iCs/>
+        </w:rPr>
+        <w:t xml:space="preserve">20</w:t>
+      </w:r>
+      <w:r>
+        <w:t xml:space="preserve">(4), 873–922.</w:t>
+      </w:r>
+      <w:r>
+        <w:t xml:space="preserve"> </w:t>
+      </w:r>
+      <w:hyperlink r:id="rId50">
+        <w:r>
+          <w:rPr>
+            <w:rStyle w:val="Hyperlink"/>
+          </w:rPr>
+          <w:t xml:space="preserve">https://doi.org/10.1162/neco.2008.12-06-420</w:t>
+        </w:r>
+      </w:hyperlink>
+    </w:p>
+    <w:bookmarkEnd w:id="51"/>
+    <w:bookmarkEnd w:id="52"/>
+    <w:bookmarkEnd w:id="53"/>
+    <w:bookmarkStart w:id="88" w:name="supplementary-materials"/>
     <w:p>
       <w:pPr>
         <w:pStyle w:val="Heading1"/>
@@ -3634,7 +4178,7 @@
         <w:t xml:space="preserve">Supplementary Materials</w:t>
       </w:r>
     </w:p>
-    <w:bookmarkStart w:id="63" w:name="s1-participant-and-trial-flow"/>
+    <w:bookmarkStart w:id="59" w:name="s1-participant-and-trial-flow"/>
     <w:p>
       <w:pPr>
         <w:pStyle w:val="Heading2"/>
@@ -3754,7 +4298,7 @@
       <w:tr>
         <w:tc>
           <w:tcPr/>
-          <w:bookmarkStart w:id="61" w:name="suppfig-flow"/>
+          <w:bookmarkStart w:id="57" w:name="suppfig-flow"/>
           <w:p>
             <w:pPr>
               <w:jc w:val="center"/>
@@ -3764,18 +4308,18 @@
                 <wp:inline>
                   <wp:extent cx="5334000" cy="6574465"/>
                   <wp:effectExtent b="0" l="0" r="0" t="0"/>
-                  <wp:docPr descr="" title="" id="59" name="Picture"/>
+                  <wp:docPr descr="" title="" id="55" name="Picture"/>
                   <a:graphic>
                     <a:graphicData uri="http://schemas.openxmlformats.org/drawingml/2006/picture">
                       <pic:pic>
                         <pic:nvPicPr>
-                          <pic:cNvPr descr="../output/ddm_refits/runs/final_20261016/figures/final/S_participant_flow.png" id="60" name="Picture"/>
+                          <pic:cNvPr descr="../output/ddm_refits/runs/final_20261016/figures/final/S_participant_flow.png" id="56" name="Picture"/>
                           <pic:cNvPicPr>
                             <a:picLocks noChangeArrowheads="1" noChangeAspect="1"/>
                           </pic:cNvPicPr>
                         </pic:nvPicPr>
                         <pic:blipFill>
-                          <a:blip r:embed="rId58"/>
+                          <a:blip r:embed="rId54"/>
                           <a:stretch>
                             <a:fillRect/>
                           </a:stretch>
@@ -3815,7 +4359,7 @@
               <w:t xml:space="preserve">Figure S1: [CAPTION TO BE SUPPLIED]</w:t>
             </w:r>
           </w:p>
-          <w:bookmarkEnd w:id="61"/>
+          <w:bookmarkEnd w:id="57"/>
         </w:tc>
       </w:tr>
     </w:tbl>
@@ -3840,7 +4384,7 @@
       <w:tr>
         <w:tc>
           <w:tcPr/>
-          <w:bookmarkStart w:id="62" w:name="supptbl-trial-counts"/>
+          <w:bookmarkStart w:id="58" w:name="supptbl-trial-counts"/>
           <w:p>
             <w:pPr>
               <w:jc w:val="center"/>
@@ -4912,13 +5456,13 @@
               </w:tc>
             </w:tr>
           </w:tbl>
-          <w:bookmarkEnd w:id="62"/>
+          <w:bookmarkEnd w:id="58"/>
           <w:p/>
         </w:tc>
       </w:tr>
     </w:tbl>
-    <w:bookmarkEnd w:id="63"/>
-    <w:bookmarkStart w:id="68" w:name="s2-model-comparison-and-convergence"/>
+    <w:bookmarkEnd w:id="59"/>
+    <w:bookmarkStart w:id="64" w:name="s2-model-comparison-and-convergence"/>
     <w:p>
       <w:pPr>
         <w:pStyle w:val="Heading2"/>
@@ -5066,7 +5610,7 @@
       <w:tr>
         <w:tc>
           <w:tcPr/>
-          <w:bookmarkStart w:id="64" w:name="supptbl-model-comparison"/>
+          <w:bookmarkStart w:id="60" w:name="supptbl-model-comparison"/>
           <w:p>
             <w:pPr>
               <w:jc w:val="center"/>
@@ -5362,46 +5906,46 @@
                     <w:jc w:val="center"/>
                   </w:pPr>
                   <w:r>
-                    <w:t xml:space="preserve">−17816.9</w:t>
-                  </w:r>
-                </w:p>
-              </w:tc>
-              <w:tc>
-                <w:tcPr/>
-                <w:p>
-                  <w:pPr>
-                    <w:pStyle w:val="Compact"/>
-                    <w:jc w:val="right"/>
-                    <w:jc w:val="center"/>
-                  </w:pPr>
-                  <w:r>
-                    <w:t xml:space="preserve">155.5</w:t>
-                  </w:r>
-                </w:p>
-              </w:tc>
-              <w:tc>
-                <w:tcPr/>
-                <w:p>
-                  <w:pPr>
-                    <w:pStyle w:val="Compact"/>
-                    <w:jc w:val="right"/>
-                    <w:jc w:val="center"/>
-                  </w:pPr>
-                  <w:r>
-                    <w:t xml:space="preserve">−158.4</w:t>
-                  </w:r>
-                </w:p>
-              </w:tc>
-              <w:tc>
-                <w:tcPr/>
-                <w:p>
-                  <w:pPr>
-                    <w:pStyle w:val="Compact"/>
-                    <w:jc w:val="right"/>
-                    <w:jc w:val="center"/>
-                  </w:pPr>
-                  <w:r>
-                    <w:t xml:space="preserve">19.9</w:t>
+                    <w:t xml:space="preserve">−17816.6</w:t>
+                  </w:r>
+                </w:p>
+              </w:tc>
+              <w:tc>
+                <w:tcPr/>
+                <w:p>
+                  <w:pPr>
+                    <w:pStyle w:val="Compact"/>
+                    <w:jc w:val="right"/>
+                    <w:jc w:val="center"/>
+                  </w:pPr>
+                  <w:r>
+                    <w:t xml:space="preserve">155.4</w:t>
+                  </w:r>
+                </w:p>
+              </w:tc>
+              <w:tc>
+                <w:tcPr/>
+                <w:p>
+                  <w:pPr>
+                    <w:pStyle w:val="Compact"/>
+                    <w:jc w:val="right"/>
+                    <w:jc w:val="center"/>
+                  </w:pPr>
+                  <w:r>
+                    <w:t xml:space="preserve">−158.1</w:t>
+                  </w:r>
+                </w:p>
+              </w:tc>
+              <w:tc>
+                <w:tcPr/>
+                <w:p>
+                  <w:pPr>
+                    <w:pStyle w:val="Compact"/>
+                    <w:jc w:val="right"/>
+                    <w:jc w:val="center"/>
+                  </w:pPr>
+                  <w:r>
+                    <w:t xml:space="preserve">20.0</w:t>
                   </w:r>
                 </w:p>
               </w:tc>
@@ -5427,33 +5971,33 @@
                     <w:jc w:val="center"/>
                   </w:pPr>
                   <w:r>
-                    <w:t xml:space="preserve">1.013</w:t>
-                  </w:r>
-                </w:p>
-              </w:tc>
-              <w:tc>
-                <w:tcPr/>
-                <w:p>
-                  <w:pPr>
-                    <w:pStyle w:val="Compact"/>
-                    <w:jc w:val="right"/>
-                    <w:jc w:val="center"/>
-                  </w:pPr>
-                  <w:r>
-                    <w:t xml:space="preserve">664</w:t>
-                  </w:r>
-                </w:p>
-              </w:tc>
-              <w:tc>
-                <w:tcPr/>
-                <w:p>
-                  <w:pPr>
-                    <w:pStyle w:val="Compact"/>
-                    <w:jc w:val="right"/>
-                    <w:jc w:val="center"/>
-                  </w:pPr>
-                  <w:r>
-                    <w:t xml:space="preserve">No</w:t>
+                    <w:t xml:space="preserve">1.005</w:t>
+                  </w:r>
+                </w:p>
+              </w:tc>
+              <w:tc>
+                <w:tcPr/>
+                <w:p>
+                  <w:pPr>
+                    <w:pStyle w:val="Compact"/>
+                    <w:jc w:val="right"/>
+                    <w:jc w:val="center"/>
+                  </w:pPr>
+                  <w:r>
+                    <w:t xml:space="preserve">1,496</w:t>
+                  </w:r>
+                </w:p>
+              </w:tc>
+              <w:tc>
+                <w:tcPr/>
+                <w:p>
+                  <w:pPr>
+                    <w:pStyle w:val="Compact"/>
+                    <w:jc w:val="right"/>
+                    <w:jc w:val="center"/>
+                  </w:pPr>
+                  <w:r>
+                    <w:t xml:space="preserve">Yes</w:t>
                   </w:r>
                 </w:p>
               </w:tc>
@@ -5481,7 +6025,7 @@
                     <w:jc w:val="center"/>
                   </w:pPr>
                   <w:r>
-                    <w:t xml:space="preserve">−17816.0</w:t>
+                    <w:t xml:space="preserve">−17815.9</w:t>
                   </w:r>
                 </w:p>
               </w:tc>
@@ -5546,33 +6090,33 @@
                     <w:jc w:val="center"/>
                   </w:pPr>
                   <w:r>
-                    <w:t xml:space="preserve">1.014</w:t>
-                  </w:r>
-                </w:p>
-              </w:tc>
-              <w:tc>
-                <w:tcPr/>
-                <w:p>
-                  <w:pPr>
-                    <w:pStyle w:val="Compact"/>
-                    <w:jc w:val="right"/>
-                    <w:jc w:val="center"/>
-                  </w:pPr>
-                  <w:r>
-                    <w:t xml:space="preserve">652</w:t>
-                  </w:r>
-                </w:p>
-              </w:tc>
-              <w:tc>
-                <w:tcPr/>
-                <w:p>
-                  <w:pPr>
-                    <w:pStyle w:val="Compact"/>
-                    <w:jc w:val="right"/>
-                    <w:jc w:val="center"/>
-                  </w:pPr>
-                  <w:r>
-                    <w:t xml:space="preserve">No</w:t>
+                    <w:t xml:space="preserve">1.004</w:t>
+                  </w:r>
+                </w:p>
+              </w:tc>
+              <w:tc>
+                <w:tcPr/>
+                <w:p>
+                  <w:pPr>
+                    <w:pStyle w:val="Compact"/>
+                    <w:jc w:val="right"/>
+                    <w:jc w:val="center"/>
+                  </w:pPr>
+                  <w:r>
+                    <w:t xml:space="preserve">1,622</w:t>
+                  </w:r>
+                </w:p>
+              </w:tc>
+              <w:tc>
+                <w:tcPr/>
+                <w:p>
+                  <w:pPr>
+                    <w:pStyle w:val="Compact"/>
+                    <w:jc w:val="right"/>
+                    <w:jc w:val="center"/>
+                  </w:pPr>
+                  <w:r>
+                    <w:t xml:space="preserve">Yes</w:t>
                   </w:r>
                 </w:p>
               </w:tc>
@@ -5950,10 +6494,10 @@
               <w:t xml:space="preserve"> </w:t>
             </w:r>
             <w:r>
-              <w:t xml:space="preserve">M1 Fails the convergence rule (max R-hat &gt;= 1.01). M2 Fails the convergence rule (max R-hat &gt;= 1.01).</w:t>
+              <w:t xml:space="preserve">M0 NA M1 NA M2 NA M3 NA M4 NA M4b NA</w:t>
             </w:r>
           </w:p>
-          <w:bookmarkEnd w:id="64"/>
+          <w:bookmarkEnd w:id="60"/>
         </w:tc>
       </w:tr>
     </w:tbl>
@@ -5978,7 +6522,7 @@
       <w:tr>
         <w:tc>
           <w:tcPr/>
-          <w:bookmarkStart w:id="65" w:name="supptbl-convergence"/>
+          <w:bookmarkStart w:id="61" w:name="supptbl-convergence"/>
           <w:p>
             <w:pPr>
               <w:jc w:val="center"/>
@@ -6326,33 +6870,33 @@
                     <w:jc w:val="center"/>
                   </w:pPr>
                   <w:r>
-                    <w:t xml:space="preserve">1.013</w:t>
-                  </w:r>
-                </w:p>
-              </w:tc>
-              <w:tc>
-                <w:tcPr/>
-                <w:p>
-                  <w:pPr>
-                    <w:pStyle w:val="Compact"/>
-                    <w:jc w:val="right"/>
-                    <w:jc w:val="center"/>
-                  </w:pPr>
-                  <w:r>
-                    <w:t xml:space="preserve">664</w:t>
-                  </w:r>
-                </w:p>
-              </w:tc>
-              <w:tc>
-                <w:tcPr/>
-                <w:p>
-                  <w:pPr>
-                    <w:pStyle w:val="Compact"/>
-                    <w:jc w:val="right"/>
-                    <w:jc w:val="center"/>
-                  </w:pPr>
-                  <w:r>
-                    <w:t xml:space="preserve">1,216</w:t>
+                    <w:t xml:space="preserve">1.005</w:t>
+                  </w:r>
+                </w:p>
+              </w:tc>
+              <w:tc>
+                <w:tcPr/>
+                <w:p>
+                  <w:pPr>
+                    <w:pStyle w:val="Compact"/>
+                    <w:jc w:val="right"/>
+                    <w:jc w:val="center"/>
+                  </w:pPr>
+                  <w:r>
+                    <w:t xml:space="preserve">1,496</w:t>
+                  </w:r>
+                </w:p>
+              </w:tc>
+              <w:tc>
+                <w:tcPr/>
+                <w:p>
+                  <w:pPr>
+                    <w:pStyle w:val="Compact"/>
+                    <w:jc w:val="right"/>
+                    <w:jc w:val="center"/>
+                  </w:pPr>
+                  <w:r>
+                    <w:t xml:space="preserve">3,049</w:t>
                   </w:r>
                 </w:p>
               </w:tc>
@@ -6378,7 +6922,7 @@
                     <w:jc w:val="center"/>
                   </w:pPr>
                   <w:r>
-                    <w:t xml:space="preserve">No</w:t>
+                    <w:t xml:space="preserve">Yes</w:t>
                   </w:r>
                 </w:p>
               </w:tc>
@@ -6419,33 +6963,33 @@
                     <w:jc w:val="center"/>
                   </w:pPr>
                   <w:r>
-                    <w:t xml:space="preserve">1.014</w:t>
-                  </w:r>
-                </w:p>
-              </w:tc>
-              <w:tc>
-                <w:tcPr/>
-                <w:p>
-                  <w:pPr>
-                    <w:pStyle w:val="Compact"/>
-                    <w:jc w:val="right"/>
-                    <w:jc w:val="center"/>
-                  </w:pPr>
-                  <w:r>
-                    <w:t xml:space="preserve">652</w:t>
-                  </w:r>
-                </w:p>
-              </w:tc>
-              <w:tc>
-                <w:tcPr/>
-                <w:p>
-                  <w:pPr>
-                    <w:pStyle w:val="Compact"/>
-                    <w:jc w:val="right"/>
-                    <w:jc w:val="center"/>
-                  </w:pPr>
-                  <w:r>
-                    <w:t xml:space="preserve">1,217</w:t>
+                    <w:t xml:space="preserve">1.004</w:t>
+                  </w:r>
+                </w:p>
+              </w:tc>
+              <w:tc>
+                <w:tcPr/>
+                <w:p>
+                  <w:pPr>
+                    <w:pStyle w:val="Compact"/>
+                    <w:jc w:val="right"/>
+                    <w:jc w:val="center"/>
+                  </w:pPr>
+                  <w:r>
+                    <w:t xml:space="preserve">1,622</w:t>
+                  </w:r>
+                </w:p>
+              </w:tc>
+              <w:tc>
+                <w:tcPr/>
+                <w:p>
+                  <w:pPr>
+                    <w:pStyle w:val="Compact"/>
+                    <w:jc w:val="right"/>
+                    <w:jc w:val="center"/>
+                  </w:pPr>
+                  <w:r>
+                    <w:t xml:space="preserve">3,086</w:t>
                   </w:r>
                 </w:p>
               </w:tc>
@@ -6471,7 +7015,7 @@
                     <w:jc w:val="center"/>
                   </w:pPr>
                   <w:r>
-                    <w:t xml:space="preserve">No</w:t>
+                    <w:t xml:space="preserve">Yes</w:t>
                   </w:r>
                 </w:p>
               </w:tc>
@@ -6791,33 +7335,33 @@
                     <w:jc w:val="center"/>
                   </w:pPr>
                   <w:r>
-                    <w:t xml:space="preserve">1.013</w:t>
-                  </w:r>
-                </w:p>
-              </w:tc>
-              <w:tc>
-                <w:tcPr/>
-                <w:p>
-                  <w:pPr>
-                    <w:pStyle w:val="Compact"/>
-                    <w:jc w:val="right"/>
-                    <w:jc w:val="center"/>
-                  </w:pPr>
-                  <w:r>
-                    <w:t xml:space="preserve">926</w:t>
-                  </w:r>
-                </w:p>
-              </w:tc>
-              <w:tc>
-                <w:tcPr/>
-                <w:p>
-                  <w:pPr>
-                    <w:pStyle w:val="Compact"/>
-                    <w:jc w:val="right"/>
-                    <w:jc w:val="center"/>
-                  </w:pPr>
-                  <w:r>
-                    <w:t xml:space="preserve">1,843</w:t>
+                    <w:t xml:space="preserve">1.009</w:t>
+                  </w:r>
+                </w:p>
+              </w:tc>
+              <w:tc>
+                <w:tcPr/>
+                <w:p>
+                  <w:pPr>
+                    <w:pStyle w:val="Compact"/>
+                    <w:jc w:val="right"/>
+                    <w:jc w:val="center"/>
+                  </w:pPr>
+                  <w:r>
+                    <w:t xml:space="preserve">1,576</w:t>
+                  </w:r>
+                </w:p>
+              </w:tc>
+              <w:tc>
+                <w:tcPr/>
+                <w:p>
+                  <w:pPr>
+                    <w:pStyle w:val="Compact"/>
+                    <w:jc w:val="right"/>
+                    <w:jc w:val="center"/>
+                  </w:pPr>
+                  <w:r>
+                    <w:t xml:space="preserve">3,017</w:t>
                   </w:r>
                 </w:p>
               </w:tc>
@@ -6843,7 +7387,7 @@
                     <w:jc w:val="center"/>
                   </w:pPr>
                   <w:r>
-                    <w:t xml:space="preserve">No</w:t>
+                    <w:t xml:space="preserve">Yes</w:t>
                   </w:r>
                 </w:p>
               </w:tc>
@@ -8445,10 +8989,10 @@
               <w:t xml:space="preserve"> </w:t>
             </w:r>
             <w:r>
-              <w:t xml:space="preserve">A model passes when max R-hat &lt; 1.01, bulk ESS and tail ESS are at least 400, and there are 0 divergences. Fails: M1, M2, M4_thr0.15.</w:t>
+              <w:t xml:space="preserve">A model passes when max R-hat &lt; 1.01, bulk ESS and tail ESS are at least 400, and there are 0 divergences. Every displayed model passes.</w:t>
             </w:r>
           </w:p>
-          <w:bookmarkEnd w:id="65"/>
+          <w:bookmarkEnd w:id="61"/>
         </w:tc>
       </w:tr>
     </w:tbl>
@@ -8473,7 +9017,7 @@
       <w:tr>
         <w:tc>
           <w:tcPr/>
-          <w:bookmarkStart w:id="66" w:name="supptbl-fixef-m4"/>
+          <w:bookmarkStart w:id="62" w:name="supptbl-fixef-m4"/>
           <w:p>
             <w:pPr>
               <w:jc w:val="center"/>
@@ -9816,7 +10360,7 @@
               </w:tc>
             </w:tr>
           </w:tbl>
-          <w:bookmarkEnd w:id="66"/>
+          <w:bookmarkEnd w:id="62"/>
           <w:p/>
         </w:tc>
       </w:tr>
@@ -9842,7 +10386,7 @@
       <w:tr>
         <w:tc>
           <w:tcPr/>
-          <w:bookmarkStart w:id="67" w:name="supptbl-condition-cells"/>
+          <w:bookmarkStart w:id="63" w:name="supptbl-condition-cells"/>
           <w:p>
             <w:pPr>
               <w:jc w:val="center"/>
@@ -10057,59 +10601,59 @@
                     <w:jc w:val="center"/>
                   </w:pPr>
                   <w:r>
-                    <w:t xml:space="preserve">Hard</w:t>
-                  </w:r>
-                </w:p>
-              </w:tc>
-              <w:tc>
-                <w:tcPr/>
-                <w:p>
-                  <w:pPr>
-                    <w:pStyle w:val="Compact"/>
-                    <w:jc w:val="right"/>
-                    <w:jc w:val="center"/>
-                  </w:pPr>
-                  <w:r>
-                    <w:t xml:space="preserve">−0.575 [−0.675, −0.476]</w:t>
-                  </w:r>
-                </w:p>
-              </w:tc>
-              <w:tc>
-                <w:tcPr/>
-                <w:p>
-                  <w:pPr>
-                    <w:pStyle w:val="Compact"/>
-                    <w:jc w:val="right"/>
-                    <w:jc w:val="center"/>
-                  </w:pPr>
-                  <w:r>
-                    <w:t xml:space="preserve">−0.640 [−0.741, −0.542]</w:t>
-                  </w:r>
-                </w:p>
-              </w:tc>
-              <w:tc>
-                <w:tcPr/>
-                <w:p>
-                  <w:pPr>
-                    <w:pStyle w:val="Compact"/>
-                    <w:jc w:val="right"/>
-                    <w:jc w:val="center"/>
-                  </w:pPr>
-                  <w:r>
-                    <w:t xml:space="preserve">2.110 [2.007, 2.216]</w:t>
-                  </w:r>
-                </w:p>
-              </w:tc>
-              <w:tc>
-                <w:tcPr/>
-                <w:p>
-                  <w:pPr>
-                    <w:pStyle w:val="Compact"/>
-                    <w:jc w:val="right"/>
-                    <w:jc w:val="center"/>
-                  </w:pPr>
-                  <w:r>
-                    <w:t xml:space="preserve">2.152 [2.047, 2.258]</w:t>
+                    <w:t xml:space="preserve">Easy</w:t>
+                  </w:r>
+                </w:p>
+              </w:tc>
+              <w:tc>
+                <w:tcPr/>
+                <w:p>
+                  <w:pPr>
+                    <w:pStyle w:val="Compact"/>
+                    <w:jc w:val="right"/>
+                    <w:jc w:val="center"/>
+                  </w:pPr>
+                  <w:r>
+                    <w:t xml:space="preserve">0.786 [0.682, 0.886]</w:t>
+                  </w:r>
+                </w:p>
+              </w:tc>
+              <w:tc>
+                <w:tcPr/>
+                <w:p>
+                  <w:pPr>
+                    <w:pStyle w:val="Compact"/>
+                    <w:jc w:val="right"/>
+                    <w:jc w:val="center"/>
+                  </w:pPr>
+                  <w:r>
+                    <w:t xml:space="preserve">0.720 [0.616, 0.817]</w:t>
+                  </w:r>
+                </w:p>
+              </w:tc>
+              <w:tc>
+                <w:tcPr/>
+                <w:p>
+                  <w:pPr>
+                    <w:pStyle w:val="Compact"/>
+                    <w:jc w:val="right"/>
+                    <w:jc w:val="center"/>
+                  </w:pPr>
+                  <w:r>
+                    <w:t xml:space="preserve">2.046 [1.946, 2.150]</w:t>
+                  </w:r>
+                </w:p>
+              </w:tc>
+              <w:tc>
+                <w:tcPr/>
+                <w:p>
+                  <w:pPr>
+                    <w:pStyle w:val="Compact"/>
+                    <w:jc w:val="right"/>
+                    <w:jc w:val="center"/>
+                  </w:pPr>
+                  <w:r>
+                    <w:t xml:space="preserve">2.087 [1.985, 2.192]</w:t>
                   </w:r>
                 </w:p>
               </w:tc>
@@ -10137,59 +10681,59 @@
                     <w:jc w:val="center"/>
                   </w:pPr>
                   <w:r>
-                    <w:t xml:space="preserve">Easy</w:t>
-                  </w:r>
-                </w:p>
-              </w:tc>
-              <w:tc>
-                <w:tcPr/>
-                <w:p>
-                  <w:pPr>
-                    <w:pStyle w:val="Compact"/>
-                    <w:jc w:val="right"/>
-                    <w:jc w:val="center"/>
-                  </w:pPr>
-                  <w:r>
-                    <w:t xml:space="preserve">0.786 [0.682, 0.886]</w:t>
-                  </w:r>
-                </w:p>
-              </w:tc>
-              <w:tc>
-                <w:tcPr/>
-                <w:p>
-                  <w:pPr>
-                    <w:pStyle w:val="Compact"/>
-                    <w:jc w:val="right"/>
-                    <w:jc w:val="center"/>
-                  </w:pPr>
-                  <w:r>
-                    <w:t xml:space="preserve">0.720 [0.616, 0.817]</w:t>
-                  </w:r>
-                </w:p>
-              </w:tc>
-              <w:tc>
-                <w:tcPr/>
-                <w:p>
-                  <w:pPr>
-                    <w:pStyle w:val="Compact"/>
-                    <w:jc w:val="right"/>
-                    <w:jc w:val="center"/>
-                  </w:pPr>
-                  <w:r>
-                    <w:t xml:space="preserve">2.046 [1.946, 2.150]</w:t>
-                  </w:r>
-                </w:p>
-              </w:tc>
-              <w:tc>
-                <w:tcPr/>
-                <w:p>
-                  <w:pPr>
-                    <w:pStyle w:val="Compact"/>
-                    <w:jc w:val="right"/>
-                    <w:jc w:val="center"/>
-                  </w:pPr>
-                  <w:r>
-                    <w:t xml:space="preserve">2.087 [1.985, 2.192]</w:t>
+                    <w:t xml:space="preserve">Hard</w:t>
+                  </w:r>
+                </w:p>
+              </w:tc>
+              <w:tc>
+                <w:tcPr/>
+                <w:p>
+                  <w:pPr>
+                    <w:pStyle w:val="Compact"/>
+                    <w:jc w:val="right"/>
+                    <w:jc w:val="center"/>
+                  </w:pPr>
+                  <w:r>
+                    <w:t xml:space="preserve">−0.575 [−0.675, −0.476]</w:t>
+                  </w:r>
+                </w:p>
+              </w:tc>
+              <w:tc>
+                <w:tcPr/>
+                <w:p>
+                  <w:pPr>
+                    <w:pStyle w:val="Compact"/>
+                    <w:jc w:val="right"/>
+                    <w:jc w:val="center"/>
+                  </w:pPr>
+                  <w:r>
+                    <w:t xml:space="preserve">−0.640 [−0.741, −0.542]</w:t>
+                  </w:r>
+                </w:p>
+              </w:tc>
+              <w:tc>
+                <w:tcPr/>
+                <w:p>
+                  <w:pPr>
+                    <w:pStyle w:val="Compact"/>
+                    <w:jc w:val="right"/>
+                    <w:jc w:val="center"/>
+                  </w:pPr>
+                  <w:r>
+                    <w:t xml:space="preserve">2.110 [2.007, 2.216]</w:t>
+                  </w:r>
+                </w:p>
+              </w:tc>
+              <w:tc>
+                <w:tcPr/>
+                <w:p>
+                  <w:pPr>
+                    <w:pStyle w:val="Compact"/>
+                    <w:jc w:val="right"/>
+                    <w:jc w:val="center"/>
+                  </w:pPr>
+                  <w:r>
+                    <w:t xml:space="preserve">2.152 [2.047, 2.258]</w:t>
                   </w:r>
                 </w:p>
               </w:tc>
@@ -10297,59 +10841,59 @@
                     <w:jc w:val="center"/>
                   </w:pPr>
                   <w:r>
-                    <w:t xml:space="preserve">Hard</w:t>
-                  </w:r>
-                </w:p>
-              </w:tc>
-              <w:tc>
-                <w:tcPr/>
-                <w:p>
-                  <w:pPr>
-                    <w:pStyle w:val="Compact"/>
-                    <w:jc w:val="right"/>
-                    <w:jc w:val="center"/>
-                  </w:pPr>
-                  <w:r>
-                    <w:t xml:space="preserve">−0.525 [−0.627, −0.425]</w:t>
-                  </w:r>
-                </w:p>
-              </w:tc>
-              <w:tc>
-                <w:tcPr/>
-                <w:p>
-                  <w:pPr>
-                    <w:pStyle w:val="Compact"/>
-                    <w:jc w:val="right"/>
-                    <w:jc w:val="center"/>
-                  </w:pPr>
-                  <w:r>
-                    <w:t xml:space="preserve">−0.590 [−0.693, −0.492]</w:t>
-                  </w:r>
-                </w:p>
-              </w:tc>
-              <w:tc>
-                <w:tcPr/>
-                <w:p>
-                  <w:pPr>
-                    <w:pStyle w:val="Compact"/>
-                    <w:jc w:val="right"/>
-                    <w:jc w:val="center"/>
-                  </w:pPr>
-                  <w:r>
-                    <w:t xml:space="preserve">2.103 [2.001, 2.208]</w:t>
-                  </w:r>
-                </w:p>
-              </w:tc>
-              <w:tc>
-                <w:tcPr/>
-                <w:p>
-                  <w:pPr>
-                    <w:pStyle w:val="Compact"/>
-                    <w:jc w:val="right"/>
-                    <w:jc w:val="center"/>
-                  </w:pPr>
-                  <w:r>
-                    <w:t xml:space="preserve">2.144 [2.040, 2.251]</w:t>
+                    <w:t xml:space="preserve">Easy</w:t>
+                  </w:r>
+                </w:p>
+              </w:tc>
+              <w:tc>
+                <w:tcPr/>
+                <w:p>
+                  <w:pPr>
+                    <w:pStyle w:val="Compact"/>
+                    <w:jc w:val="right"/>
+                    <w:jc w:val="center"/>
+                  </w:pPr>
+                  <w:r>
+                    <w:t xml:space="preserve">1.263 [1.160, 1.368]</w:t>
+                  </w:r>
+                </w:p>
+              </w:tc>
+              <w:tc>
+                <w:tcPr/>
+                <w:p>
+                  <w:pPr>
+                    <w:pStyle w:val="Compact"/>
+                    <w:jc w:val="right"/>
+                    <w:jc w:val="center"/>
+                  </w:pPr>
+                  <w:r>
+                    <w:t xml:space="preserve">1.197 [1.094, 1.301]</w:t>
+                  </w:r>
+                </w:p>
+              </w:tc>
+              <w:tc>
+                <w:tcPr/>
+                <w:p>
+                  <w:pPr>
+                    <w:pStyle w:val="Compact"/>
+                    <w:jc w:val="right"/>
+                    <w:jc w:val="center"/>
+                  </w:pPr>
+                  <w:r>
+                    <w:t xml:space="preserve">2.040 [1.939, 2.143]</w:t>
+                  </w:r>
+                </w:p>
+              </w:tc>
+              <w:tc>
+                <w:tcPr/>
+                <w:p>
+                  <w:pPr>
+                    <w:pStyle w:val="Compact"/>
+                    <w:jc w:val="right"/>
+                    <w:jc w:val="center"/>
+                  </w:pPr>
+                  <w:r>
+                    <w:t xml:space="preserve">2.080 [1.978, 2.185]</w:t>
                   </w:r>
                 </w:p>
               </w:tc>
@@ -10377,59 +10921,59 @@
                     <w:jc w:val="center"/>
                   </w:pPr>
                   <w:r>
-                    <w:t xml:space="preserve">Easy</w:t>
-                  </w:r>
-                </w:p>
-              </w:tc>
-              <w:tc>
-                <w:tcPr/>
-                <w:p>
-                  <w:pPr>
-                    <w:pStyle w:val="Compact"/>
-                    <w:jc w:val="right"/>
-                    <w:jc w:val="center"/>
-                  </w:pPr>
-                  <w:r>
-                    <w:t xml:space="preserve">1.263 [1.160, 1.368]</w:t>
-                  </w:r>
-                </w:p>
-              </w:tc>
-              <w:tc>
-                <w:tcPr/>
-                <w:p>
-                  <w:pPr>
-                    <w:pStyle w:val="Compact"/>
-                    <w:jc w:val="right"/>
-                    <w:jc w:val="center"/>
-                  </w:pPr>
-                  <w:r>
-                    <w:t xml:space="preserve">1.197 [1.094, 1.301]</w:t>
-                  </w:r>
-                </w:p>
-              </w:tc>
-              <w:tc>
-                <w:tcPr/>
-                <w:p>
-                  <w:pPr>
-                    <w:pStyle w:val="Compact"/>
-                    <w:jc w:val="right"/>
-                    <w:jc w:val="center"/>
-                  </w:pPr>
-                  <w:r>
-                    <w:t xml:space="preserve">2.040 [1.939, 2.143]</w:t>
-                  </w:r>
-                </w:p>
-              </w:tc>
-              <w:tc>
-                <w:tcPr/>
-                <w:p>
-                  <w:pPr>
-                    <w:pStyle w:val="Compact"/>
-                    <w:jc w:val="right"/>
-                    <w:jc w:val="center"/>
-                  </w:pPr>
-                  <w:r>
-                    <w:t xml:space="preserve">2.080 [1.978, 2.185]</w:t>
+                    <w:t xml:space="preserve">Hard</w:t>
+                  </w:r>
+                </w:p>
+              </w:tc>
+              <w:tc>
+                <w:tcPr/>
+                <w:p>
+                  <w:pPr>
+                    <w:pStyle w:val="Compact"/>
+                    <w:jc w:val="right"/>
+                    <w:jc w:val="center"/>
+                  </w:pPr>
+                  <w:r>
+                    <w:t xml:space="preserve">−0.525 [−0.627, −0.425]</w:t>
+                  </w:r>
+                </w:p>
+              </w:tc>
+              <w:tc>
+                <w:tcPr/>
+                <w:p>
+                  <w:pPr>
+                    <w:pStyle w:val="Compact"/>
+                    <w:jc w:val="right"/>
+                    <w:jc w:val="center"/>
+                  </w:pPr>
+                  <w:r>
+                    <w:t xml:space="preserve">−0.590 [−0.693, −0.492]</w:t>
+                  </w:r>
+                </w:p>
+              </w:tc>
+              <w:tc>
+                <w:tcPr/>
+                <w:p>
+                  <w:pPr>
+                    <w:pStyle w:val="Compact"/>
+                    <w:jc w:val="right"/>
+                    <w:jc w:val="center"/>
+                  </w:pPr>
+                  <w:r>
+                    <w:t xml:space="preserve">2.103 [2.001, 2.208]</w:t>
+                  </w:r>
+                </w:p>
+              </w:tc>
+              <w:tc>
+                <w:tcPr/>
+                <w:p>
+                  <w:pPr>
+                    <w:pStyle w:val="Compact"/>
+                    <w:jc w:val="right"/>
+                    <w:jc w:val="center"/>
+                  </w:pPr>
+                  <w:r>
+                    <w:t xml:space="preserve">2.144 [2.040, 2.251]</w:t>
                   </w:r>
                 </w:p>
               </w:tc>
@@ -10453,12 +10997,12 @@
               <w:t xml:space="preserve">Starting point varies by task and effort only: ADT low 0.552 [0.536, 0.568]; ADT high 0.551 [0.535, 0.566]; VDT low 0.538 [0.522, 0.555]; VDT high 0.537 [0.521, 0.553]. Non-decision time is 0.527 [0.525, 0.529] in every cell. These note values are the condition-cell summaries, not the link-scale coefficients.</w:t>
             </w:r>
           </w:p>
-          <w:bookmarkEnd w:id="67"/>
+          <w:bookmarkEnd w:id="63"/>
         </w:tc>
       </w:tr>
     </w:tbl>
-    <w:bookmarkEnd w:id="68"/>
-    <w:bookmarkStart w:id="74" w:name="s3-posterior-predictive-checks"/>
+    <w:bookmarkEnd w:id="64"/>
+    <w:bookmarkStart w:id="70" w:name="s3-posterior-predictive-checks"/>
     <w:p>
       <w:pPr>
         <w:pStyle w:val="Heading2"/>
@@ -10578,7 +11122,7 @@
       <w:tr>
         <w:tc>
           <w:tcPr/>
-          <w:bookmarkStart w:id="72" w:name="suppfig-ppc"/>
+          <w:bookmarkStart w:id="68" w:name="suppfig-ppc"/>
           <w:p>
             <w:pPr>
               <w:jc w:val="center"/>
@@ -10588,18 +11132,18 @@
                 <wp:inline>
                   <wp:extent cx="5334000" cy="4461163"/>
                   <wp:effectExtent b="0" l="0" r="0" t="0"/>
-                  <wp:docPr descr="" title="" id="70" name="Picture"/>
+                  <wp:docPr descr="" title="" id="66" name="Picture"/>
                   <a:graphic>
                     <a:graphicData uri="http://schemas.openxmlformats.org/drawingml/2006/picture">
                       <pic:pic>
                         <pic:nvPicPr>
-                          <pic:cNvPr descr="../output/ddm_refits/runs/final_20261016/figures/final/S_ppc_M4.png" id="71" name="Picture"/>
+                          <pic:cNvPr descr="../output/ddm_refits/runs/final_20261016/figures/final/S_ppc_M4.png" id="67" name="Picture"/>
                           <pic:cNvPicPr>
                             <a:picLocks noChangeArrowheads="1" noChangeAspect="1"/>
                           </pic:cNvPicPr>
                         </pic:nvPicPr>
                         <pic:blipFill>
-                          <a:blip r:embed="rId69"/>
+                          <a:blip r:embed="rId65"/>
                           <a:stretch>
                             <a:fillRect/>
                           </a:stretch>
@@ -10639,7 +11183,7 @@
               <w:t xml:space="preserve">Figure S2: [CAPTION TO BE SUPPLIED]</w:t>
             </w:r>
           </w:p>
-          <w:bookmarkEnd w:id="72"/>
+          <w:bookmarkEnd w:id="68"/>
         </w:tc>
       </w:tr>
     </w:tbl>
@@ -10664,7 +11208,7 @@
       <w:tr>
         <w:tc>
           <w:tcPr/>
-          <w:bookmarkStart w:id="73" w:name="supptbl-ppc-choice"/>
+          <w:bookmarkStart w:id="69" w:name="supptbl-ppc-choice"/>
           <w:p>
             <w:pPr>
               <w:jc w:val="center"/>
@@ -11906,19 +12450,19 @@
               </w:tc>
             </w:tr>
           </w:tbl>
-          <w:bookmarkEnd w:id="73"/>
+          <w:bookmarkEnd w:id="69"/>
           <w:p/>
         </w:tc>
       </w:tr>
     </w:tbl>
-    <w:bookmarkEnd w:id="74"/>
-    <w:bookmarkStart w:id="78" w:name="s4-robustness-analyses"/>
+    <w:bookmarkEnd w:id="70"/>
+    <w:bookmarkStart w:id="75" w:name="Xb079f58f752d9008b389a56f5eaa2c20e631138"/>
     <w:p>
       <w:pPr>
         <w:pStyle w:val="Heading2"/>
       </w:pPr>
       <w:r>
-        <w:t xml:space="preserve">S4 Robustness analyses</w:t>
+        <w:t xml:space="preserve">S4 Robustness analyses and observed accuracy</w:t>
       </w:r>
     </w:p>
     <w:tbl>
@@ -11967,7 +12511,7 @@
                 <w:b/>
                 <w:bCs/>
               </w:rPr>
-              <w:t xml:space="preserve">[PROSE TO BE SUPPLIED: S4 Robustness analyses]</w:t>
+              <w:t xml:space="preserve">[PROSE TO BE SUPPLIED: S4 Robustness analyses and observed accuracy]</w:t>
             </w:r>
             <w:r>
               <w:t xml:space="preserve"> </w:t>
@@ -11979,7 +12523,7 @@
               <w:t xml:space="preserve"> </w:t>
             </w:r>
             <w:r>
-              <w:t xml:space="preserve">Inline value keys available for this section: crit_M4r, qual_M4r, crit_thr015, qual_thr015, crit_thr025, qual_thr025, crit_subchance, qual_subchance, sd_effort_M4r, sd_bs_effort_M4r, m4b_effort_x_task, m4b_quality_x_task, crit_ADT_M4b, crit_VDT_M4b, n_trials_thr015, n_trials_thr025, n_subchance_excluded, n_subchance_remaining, n_trials_cutoff_excluded.</w:t>
+              <w:t xml:space="preserve">Inline value keys available for this section: crit_M4r, qual_M4r, bs_M4r, crit_thr015, qual_thr015, bs_thr015, crit_thr025, qual_thr025, bs_thr025, crit_subchance, qual_subchance, bs_subchance, sd_effort_M4r, sd_bs_effort_M4r, m4b_effort_x_task, m4b_quality_x_task, crit_ADT_M4b, crit_VDT_M4b, n_trials_thr015, n_trials_thr025, n_subchance_excluded, n_subchance_remaining, n_trials_cutoff_excluded, n_trials_collected, pass_M4_thr015, acc_high_low_Standard, acc_high_low_Hard, acc_high_low_Easy.</w:t>
             </w:r>
             <w:r>
               <w:t xml:space="preserve"> </w:t>
@@ -12024,6 +12568,20 @@
                   <w:rStyle w:val="Hyperlink"/>
                 </w:rPr>
                 <w:t xml:space="preserve">Table S9</w:t>
+              </w:r>
+            </w:hyperlink>
+            <w:r>
+              <w:t xml:space="preserve">,</w:t>
+            </w:r>
+            <w:r>
+              <w:t xml:space="preserve"> </w:t>
+            </w:r>
+            <w:hyperlink w:anchor="supptbl-acc-contrasts">
+              <w:r>
+                <w:rPr>
+                  <w:rStyle w:val="Hyperlink"/>
+                </w:rPr>
+                <w:t xml:space="preserve">Table S10</w:t>
               </w:r>
             </w:hyperlink>
             <w:r>
@@ -12046,7 +12604,7 @@
       <w:tr>
         <w:tc>
           <w:tcPr/>
-          <w:bookmarkStart w:id="75" w:name="supptbl-robustness"/>
+          <w:bookmarkStart w:id="71" w:name="supptbl-robustness"/>
           <w:p>
             <w:pPr>
               <w:jc w:val="center"/>
@@ -13494,33 +14052,33 @@
                     <w:jc w:val="center"/>
                   </w:pPr>
                   <w:r>
-                    <w:t xml:space="preserve">−0.059</w:t>
-                  </w:r>
-                </w:p>
-              </w:tc>
-              <w:tc>
-                <w:tcPr/>
-                <w:p>
-                  <w:pPr>
-                    <w:pStyle w:val="Compact"/>
-                    <w:jc w:val="right"/>
-                    <w:jc w:val="center"/>
-                  </w:pPr>
-                  <w:r>
-                    <w:t xml:space="preserve">[−0.108, −0.010]</w:t>
-                  </w:r>
-                </w:p>
-              </w:tc>
-              <w:tc>
-                <w:tcPr/>
-                <w:p>
-                  <w:pPr>
-                    <w:pStyle w:val="Compact"/>
-                    <w:jc w:val="right"/>
-                    <w:jc w:val="center"/>
-                  </w:pPr>
-                  <w:r>
-                    <w:t xml:space="preserve">6%</w:t>
+                    <w:t xml:space="preserve">−0.060</w:t>
+                  </w:r>
+                </w:p>
+              </w:tc>
+              <w:tc>
+                <w:tcPr/>
+                <w:p>
+                  <w:pPr>
+                    <w:pStyle w:val="Compact"/>
+                    <w:jc w:val="right"/>
+                    <w:jc w:val="center"/>
+                  </w:pPr>
+                  <w:r>
+                    <w:t xml:space="preserve">[−0.107, −0.011]</w:t>
+                  </w:r>
+                </w:p>
+              </w:tc>
+              <w:tc>
+                <w:tcPr/>
+                <w:p>
+                  <w:pPr>
+                    <w:pStyle w:val="Compact"/>
+                    <w:jc w:val="right"/>
+                    <w:jc w:val="center"/>
+                  </w:pPr>
+                  <w:r>
+                    <w:t xml:space="preserve">5%</w:t>
                   </w:r>
                 </w:p>
               </w:tc>
@@ -13559,7 +14117,7 @@
                     <w:jc w:val="center"/>
                   </w:pPr>
                   <w:r>
-                    <w:t xml:space="preserve">No‡</w:t>
+                    <w:t xml:space="preserve">Yes</w:t>
                   </w:r>
                 </w:p>
               </w:tc>
@@ -13613,7 +14171,7 @@
                     <w:jc w:val="center"/>
                   </w:pPr>
                   <w:r>
-                    <w:t xml:space="preserve">[−0.054, 0.024]</w:t>
+                    <w:t xml:space="preserve">[−0.054, 0.025]</w:t>
                   </w:r>
                 </w:p>
               </w:tc>
@@ -13665,7 +14223,7 @@
                     <w:jc w:val="center"/>
                   </w:pPr>
                   <w:r>
-                    <w:t xml:space="preserve">No‡</w:t>
+                    <w:t xml:space="preserve">Yes</w:t>
                   </w:r>
                 </w:p>
               </w:tc>
@@ -13719,7 +14277,7 @@
                     <w:jc w:val="center"/>
                   </w:pPr>
                   <w:r>
-                    <w:t xml:space="preserve">[−0.002, 0.025]</w:t>
+                    <w:t xml:space="preserve">[−0.002, 0.026]</w:t>
                   </w:r>
                 </w:p>
               </w:tc>
@@ -13771,7 +14329,7 @@
                     <w:jc w:val="center"/>
                   </w:pPr>
                   <w:r>
-                    <w:t xml:space="preserve">No‡</w:t>
+                    <w:t xml:space="preserve">Yes</w:t>
                   </w:r>
                 </w:p>
               </w:tc>
@@ -13825,7 +14383,7 @@
                     <w:jc w:val="center"/>
                   </w:pPr>
                   <w:r>
-                    <w:t xml:space="preserve">[−0.035, 0.053]</w:t>
+                    <w:t xml:space="preserve">[−0.034, 0.053]</w:t>
                   </w:r>
                 </w:p>
               </w:tc>
@@ -13877,7 +14435,7 @@
                     <w:jc w:val="center"/>
                   </w:pPr>
                   <w:r>
-                    <w:t xml:space="preserve">No‡</w:t>
+                    <w:t xml:space="preserve">Yes</w:t>
                   </w:r>
                 </w:p>
               </w:tc>
@@ -13931,7 +14489,7 @@
                     <w:jc w:val="center"/>
                   </w:pPr>
                   <w:r>
-                    <w:t xml:space="preserve">[−0.120, −0.030]</w:t>
+                    <w:t xml:space="preserve">[−0.119, −0.030]</w:t>
                   </w:r>
                 </w:p>
               </w:tc>
@@ -13983,7 +14541,7 @@
                     <w:jc w:val="center"/>
                   </w:pPr>
                   <w:r>
-                    <w:t xml:space="preserve">No‡</w:t>
+                    <w:t xml:space="preserve">Yes</w:t>
                   </w:r>
                 </w:p>
               </w:tc>
@@ -14037,7 +14595,7 @@
                     <w:jc w:val="center"/>
                   </w:pPr>
                   <w:r>
-                    <w:t xml:space="preserve">[−0.120, 0.033]</w:t>
+                    <w:t xml:space="preserve">[−0.121, 0.032]</w:t>
                   </w:r>
                 </w:p>
               </w:tc>
@@ -14089,7 +14647,7 @@
                     <w:jc w:val="center"/>
                   </w:pPr>
                   <w:r>
-                    <w:t xml:space="preserve">No‡</w:t>
+                    <w:t xml:space="preserve">Yes</w:t>
                   </w:r>
                 </w:p>
               </w:tc>
@@ -15367,285 +15925,7 @@
               </w:tc>
             </w:tr>
           </w:tbl>
-          <w:p>
-            <w:pPr>
-              <w:jc w:val="center"/>
-            </w:pPr>
-            <w:r>
-              <w:rPr>
-                <w:i/>
-                <w:iCs/>
-              </w:rPr>
-              <w:t xml:space="preserve">Note.</w:t>
-            </w:r>
-            <w:r>
-              <w:t xml:space="preserve"> </w:t>
-            </w:r>
-            <w:r>
-              <w:t xml:space="preserve">‡ did not meet the R-hat &lt; 1.01 criterion. M4_thr0.15.</w:t>
-            </w:r>
-          </w:p>
-          <w:bookmarkEnd w:id="75"/>
-        </w:tc>
-      </w:tr>
-    </w:tbl>
-    <w:p>
-      <w:pPr>
-        <w:pStyle w:val="BodyText"/>
-      </w:pPr>
-      <w:r>
-        <w:t xml:space="preserve"> </w:t>
-      </w:r>
-    </w:p>
-    <w:tbl>
-      <w:tblPr>
-        <w:tblStyle w:val="Table"/>
-        <w:tblW w:type="pct" w:w="5000"/>
-        <w:tblLayout w:type="fixed"/>
-        <w:tblLook w:firstRow="0" w:lastRow="0" w:firstColumn="0" w:lastColumn="0" w:noHBand="0" w:noVBand="0" w:val="0000"/>
-      </w:tblPr>
-      <w:tblGrid>
-        <w:gridCol w:w="7920"/>
-      </w:tblGrid>
-      <w:tr>
-        <w:tc>
-          <w:tcPr/>
-          <w:bookmarkStart w:id="76" w:name="supptbl-random-slopes"/>
-          <w:p>
-            <w:pPr>
-              <w:jc w:val="center"/>
-            </w:pPr>
-            <w:pPr>
-              <w:jc w:val="left"/>
-              <w:spacing w:before="200"/>
-              <w:pStyle w:val="ImageCaption"/>
-            </w:pPr>
-            <w:r>
-              <w:t xml:space="preserve">Table S8: [CAPTION TO BE SUPPLIED]</w:t>
-            </w:r>
-          </w:p>
-          <w:tbl>
-            <w:tblPr>
-              <w:tblStyle w:val="Table"/>
-              <w:tblW w:type="pct" w:w="5000"/>
-              <w:tblLayout w:type="fixed"/>
-              <w:tblLook w:firstRow="1" w:lastRow="0" w:firstColumn="0" w:lastColumn="0" w:noHBand="0" w:noVBand="0" w:val="0020"/>
-            </w:tblPr>
-            <w:tblGrid>
-              <w:gridCol w:w="5385"/>
-              <w:gridCol w:w="950"/>
-              <w:gridCol w:w="1584"/>
-            </w:tblGrid>
-            <w:tr>
-              <w:trPr>
-                <w:tblHeader w:val="on"/>
-              </w:trPr>
-              <w:tc>
-                <w:tcPr/>
-                <w:p>
-                  <w:pPr>
-                    <w:pStyle w:val="Compact"/>
-                    <w:jc w:val="left"/>
-                    <w:jc w:val="center"/>
-                  </w:pPr>
-                  <w:r>
-                    <w:t xml:space="preserve">Parameter</w:t>
-                  </w:r>
-                </w:p>
-              </w:tc>
-              <w:tc>
-                <w:tcPr/>
-                <w:p>
-                  <w:pPr>
-                    <w:pStyle w:val="Compact"/>
-                    <w:jc w:val="right"/>
-                    <w:jc w:val="center"/>
-                  </w:pPr>
-                  <w:r>
-                    <w:t xml:space="preserve">Estimate</w:t>
-                  </w:r>
-                </w:p>
-              </w:tc>
-              <w:tc>
-                <w:tcPr/>
-                <w:p>
-                  <w:pPr>
-                    <w:pStyle w:val="Compact"/>
-                    <w:jc w:val="right"/>
-                    <w:jc w:val="center"/>
-                  </w:pPr>
-                  <w:r>
-                    <w:t xml:space="preserve">95% CrI</w:t>
-                  </w:r>
-                </w:p>
-              </w:tc>
-            </w:tr>
-            <w:tr>
-              <w:tc>
-                <w:tcPr/>
-                <w:p>
-                  <w:pPr>
-                    <w:pStyle w:val="Compact"/>
-                    <w:jc w:val="left"/>
-                    <w:jc w:val="center"/>
-                  </w:pPr>
-                  <w:r>
-                    <w:t xml:space="preserve">SD, drift criterion</w:t>
-                  </w:r>
-                </w:p>
-              </w:tc>
-              <w:tc>
-                <w:tcPr/>
-                <w:p>
-                  <w:pPr>
-                    <w:pStyle w:val="Compact"/>
-                    <w:jc w:val="right"/>
-                    <w:jc w:val="center"/>
-                  </w:pPr>
-                  <w:r>
-                    <w:t xml:space="preserve">0.019</w:t>
-                  </w:r>
-                </w:p>
-              </w:tc>
-              <w:tc>
-                <w:tcPr/>
-                <w:p>
-                  <w:pPr>
-                    <w:pStyle w:val="Compact"/>
-                    <w:jc w:val="right"/>
-                    <w:jc w:val="center"/>
-                  </w:pPr>
-                  <w:r>
-                    <w:t xml:space="preserve">[0.001, 0.062]</w:t>
-                  </w:r>
-                </w:p>
-              </w:tc>
-            </w:tr>
-            <w:tr>
-              <w:tc>
-                <w:tcPr/>
-                <w:p>
-                  <w:pPr>
-                    <w:pStyle w:val="Compact"/>
-                    <w:jc w:val="left"/>
-                    <w:jc w:val="center"/>
-                  </w:pPr>
-                  <w:r>
-                    <w:t xml:space="preserve">SD, boundary separation</w:t>
-                  </w:r>
-                </w:p>
-              </w:tc>
-              <w:tc>
-                <w:tcPr/>
-                <w:p>
-                  <w:pPr>
-                    <w:pStyle w:val="Compact"/>
-                    <w:jc w:val="right"/>
-                    <w:jc w:val="center"/>
-                  </w:pPr>
-                  <w:r>
-                    <w:t xml:space="preserve">0.007</w:t>
-                  </w:r>
-                </w:p>
-              </w:tc>
-              <w:tc>
-                <w:tcPr/>
-                <w:p>
-                  <w:pPr>
-                    <w:pStyle w:val="Compact"/>
-                    <w:jc w:val="right"/>
-                    <w:jc w:val="center"/>
-                  </w:pPr>
-                  <w:r>
-                    <w:t xml:space="preserve">[0.000, 0.023]</w:t>
-                  </w:r>
-                </w:p>
-              </w:tc>
-            </w:tr>
-            <w:tr>
-              <w:tc>
-                <w:tcPr/>
-                <w:p>
-                  <w:pPr>
-                    <w:pStyle w:val="Compact"/>
-                    <w:jc w:val="left"/>
-                    <w:jc w:val="center"/>
-                  </w:pPr>
-                  <w:r>
-                    <w:t xml:space="preserve">Correlation, drift intercept and drift criterion</w:t>
-                  </w:r>
-                </w:p>
-              </w:tc>
-              <w:tc>
-                <w:tcPr/>
-                <w:p>
-                  <w:pPr>
-                    <w:pStyle w:val="Compact"/>
-                    <w:jc w:val="right"/>
-                    <w:jc w:val="center"/>
-                  </w:pPr>
-                  <w:r>
-                    <w:t xml:space="preserve">r = −.19</w:t>
-                  </w:r>
-                </w:p>
-              </w:tc>
-              <w:tc>
-                <w:tcPr/>
-                <w:p>
-                  <w:pPr>
-                    <w:pStyle w:val="Compact"/>
-                    <w:jc w:val="right"/>
-                    <w:jc w:val="center"/>
-                  </w:pPr>
-                  <w:r>
-                    <w:t xml:space="preserve">[−.84, .69]</w:t>
-                  </w:r>
-                </w:p>
-              </w:tc>
-            </w:tr>
-            <w:tr>
-              <w:tc>
-                <w:tcPr/>
-                <w:p>
-                  <w:pPr>
-                    <w:pStyle w:val="Compact"/>
-                    <w:jc w:val="left"/>
-                    <w:jc w:val="center"/>
-                  </w:pPr>
-                  <w:r>
-                    <w:t xml:space="preserve">Correlation, boundary intercept and boundary slope</w:t>
-                  </w:r>
-                </w:p>
-              </w:tc>
-              <w:tc>
-                <w:tcPr/>
-                <w:p>
-                  <w:pPr>
-                    <w:pStyle w:val="Compact"/>
-                    <w:jc w:val="right"/>
-                    <w:jc w:val="center"/>
-                  </w:pPr>
-                  <w:r>
-                    <w:t xml:space="preserve">r = .03</w:t>
-                  </w:r>
-                </w:p>
-              </w:tc>
-              <w:tc>
-                <w:tcPr/>
-                <w:p>
-                  <w:pPr>
-                    <w:pStyle w:val="Compact"/>
-                    <w:jc w:val="right"/>
-                    <w:jc w:val="center"/>
-                  </w:pPr>
-                  <w:r>
-                    <w:t xml:space="preserve">[−.78, .80]</w:t>
-                  </w:r>
-                </w:p>
-              </w:tc>
-            </w:tr>
-          </w:tbl>
-          <w:bookmarkEnd w:id="76"/>
+          <w:bookmarkEnd w:id="71"/>
           <w:p/>
         </w:tc>
       </w:tr>
@@ -15671,7 +15951,268 @@
       <w:tr>
         <w:tc>
           <w:tcPr/>
-          <w:bookmarkStart w:id="77" w:name="supptbl-m4b"/>
+          <w:bookmarkStart w:id="72" w:name="supptbl-random-slopes"/>
+          <w:p>
+            <w:pPr>
+              <w:jc w:val="center"/>
+            </w:pPr>
+            <w:pPr>
+              <w:jc w:val="left"/>
+              <w:spacing w:before="200"/>
+              <w:pStyle w:val="ImageCaption"/>
+            </w:pPr>
+            <w:r>
+              <w:t xml:space="preserve">Table S8: [CAPTION TO BE SUPPLIED]</w:t>
+            </w:r>
+          </w:p>
+          <w:tbl>
+            <w:tblPr>
+              <w:tblStyle w:val="Table"/>
+              <w:tblW w:type="pct" w:w="5000"/>
+              <w:tblLayout w:type="fixed"/>
+              <w:tblLook w:firstRow="1" w:lastRow="0" w:firstColumn="0" w:lastColumn="0" w:noHBand="0" w:noVBand="0" w:val="0020"/>
+            </w:tblPr>
+            <w:tblGrid>
+              <w:gridCol w:w="5385"/>
+              <w:gridCol w:w="950"/>
+              <w:gridCol w:w="1584"/>
+            </w:tblGrid>
+            <w:tr>
+              <w:trPr>
+                <w:tblHeader w:val="on"/>
+              </w:trPr>
+              <w:tc>
+                <w:tcPr/>
+                <w:p>
+                  <w:pPr>
+                    <w:pStyle w:val="Compact"/>
+                    <w:jc w:val="left"/>
+                    <w:jc w:val="center"/>
+                  </w:pPr>
+                  <w:r>
+                    <w:t xml:space="preserve">Parameter</w:t>
+                  </w:r>
+                </w:p>
+              </w:tc>
+              <w:tc>
+                <w:tcPr/>
+                <w:p>
+                  <w:pPr>
+                    <w:pStyle w:val="Compact"/>
+                    <w:jc w:val="right"/>
+                    <w:jc w:val="center"/>
+                  </w:pPr>
+                  <w:r>
+                    <w:t xml:space="preserve">Estimate</w:t>
+                  </w:r>
+                </w:p>
+              </w:tc>
+              <w:tc>
+                <w:tcPr/>
+                <w:p>
+                  <w:pPr>
+                    <w:pStyle w:val="Compact"/>
+                    <w:jc w:val="right"/>
+                    <w:jc w:val="center"/>
+                  </w:pPr>
+                  <w:r>
+                    <w:t xml:space="preserve">95% CrI</w:t>
+                  </w:r>
+                </w:p>
+              </w:tc>
+            </w:tr>
+            <w:tr>
+              <w:tc>
+                <w:tcPr/>
+                <w:p>
+                  <w:pPr>
+                    <w:pStyle w:val="Compact"/>
+                    <w:jc w:val="left"/>
+                    <w:jc w:val="center"/>
+                  </w:pPr>
+                  <w:r>
+                    <w:t xml:space="preserve">SD, drift criterion</w:t>
+                  </w:r>
+                </w:p>
+              </w:tc>
+              <w:tc>
+                <w:tcPr/>
+                <w:p>
+                  <w:pPr>
+                    <w:pStyle w:val="Compact"/>
+                    <w:jc w:val="right"/>
+                    <w:jc w:val="center"/>
+                  </w:pPr>
+                  <w:r>
+                    <w:t xml:space="preserve">0.019</w:t>
+                  </w:r>
+                </w:p>
+              </w:tc>
+              <w:tc>
+                <w:tcPr/>
+                <w:p>
+                  <w:pPr>
+                    <w:pStyle w:val="Compact"/>
+                    <w:jc w:val="right"/>
+                    <w:jc w:val="center"/>
+                  </w:pPr>
+                  <w:r>
+                    <w:t xml:space="preserve">[0.001, 0.062]</w:t>
+                  </w:r>
+                </w:p>
+              </w:tc>
+            </w:tr>
+            <w:tr>
+              <w:tc>
+                <w:tcPr/>
+                <w:p>
+                  <w:pPr>
+                    <w:pStyle w:val="Compact"/>
+                    <w:jc w:val="left"/>
+                    <w:jc w:val="center"/>
+                  </w:pPr>
+                  <w:r>
+                    <w:t xml:space="preserve">SD, boundary separation</w:t>
+                  </w:r>
+                </w:p>
+              </w:tc>
+              <w:tc>
+                <w:tcPr/>
+                <w:p>
+                  <w:pPr>
+                    <w:pStyle w:val="Compact"/>
+                    <w:jc w:val="right"/>
+                    <w:jc w:val="center"/>
+                  </w:pPr>
+                  <w:r>
+                    <w:t xml:space="preserve">0.007</w:t>
+                  </w:r>
+                </w:p>
+              </w:tc>
+              <w:tc>
+                <w:tcPr/>
+                <w:p>
+                  <w:pPr>
+                    <w:pStyle w:val="Compact"/>
+                    <w:jc w:val="right"/>
+                    <w:jc w:val="center"/>
+                  </w:pPr>
+                  <w:r>
+                    <w:t xml:space="preserve">[0.000, 0.023]</w:t>
+                  </w:r>
+                </w:p>
+              </w:tc>
+            </w:tr>
+            <w:tr>
+              <w:tc>
+                <w:tcPr/>
+                <w:p>
+                  <w:pPr>
+                    <w:pStyle w:val="Compact"/>
+                    <w:jc w:val="left"/>
+                    <w:jc w:val="center"/>
+                  </w:pPr>
+                  <w:r>
+                    <w:t xml:space="preserve">Correlation, drift intercept and drift criterion</w:t>
+                  </w:r>
+                </w:p>
+              </w:tc>
+              <w:tc>
+                <w:tcPr/>
+                <w:p>
+                  <w:pPr>
+                    <w:pStyle w:val="Compact"/>
+                    <w:jc w:val="right"/>
+                    <w:jc w:val="center"/>
+                  </w:pPr>
+                  <w:r>
+                    <w:t xml:space="preserve">r = −.19</w:t>
+                  </w:r>
+                </w:p>
+              </w:tc>
+              <w:tc>
+                <w:tcPr/>
+                <w:p>
+                  <w:pPr>
+                    <w:pStyle w:val="Compact"/>
+                    <w:jc w:val="right"/>
+                    <w:jc w:val="center"/>
+                  </w:pPr>
+                  <w:r>
+                    <w:t xml:space="preserve">[−.84, .69]</w:t>
+                  </w:r>
+                </w:p>
+              </w:tc>
+            </w:tr>
+            <w:tr>
+              <w:tc>
+                <w:tcPr/>
+                <w:p>
+                  <w:pPr>
+                    <w:pStyle w:val="Compact"/>
+                    <w:jc w:val="left"/>
+                    <w:jc w:val="center"/>
+                  </w:pPr>
+                  <w:r>
+                    <w:t xml:space="preserve">Correlation, boundary intercept and boundary slope</w:t>
+                  </w:r>
+                </w:p>
+              </w:tc>
+              <w:tc>
+                <w:tcPr/>
+                <w:p>
+                  <w:pPr>
+                    <w:pStyle w:val="Compact"/>
+                    <w:jc w:val="right"/>
+                    <w:jc w:val="center"/>
+                  </w:pPr>
+                  <w:r>
+                    <w:t xml:space="preserve">r = .03</w:t>
+                  </w:r>
+                </w:p>
+              </w:tc>
+              <w:tc>
+                <w:tcPr/>
+                <w:p>
+                  <w:pPr>
+                    <w:pStyle w:val="Compact"/>
+                    <w:jc w:val="right"/>
+                    <w:jc w:val="center"/>
+                  </w:pPr>
+                  <w:r>
+                    <w:t xml:space="preserve">[−.78, .80]</w:t>
+                  </w:r>
+                </w:p>
+              </w:tc>
+            </w:tr>
+          </w:tbl>
+          <w:bookmarkEnd w:id="72"/>
+          <w:p/>
+        </w:tc>
+      </w:tr>
+    </w:tbl>
+    <w:p>
+      <w:pPr>
+        <w:pStyle w:val="BodyText"/>
+      </w:pPr>
+      <w:r>
+        <w:t xml:space="preserve"> </w:t>
+      </w:r>
+    </w:p>
+    <w:tbl>
+      <w:tblPr>
+        <w:tblStyle w:val="Table"/>
+        <w:tblW w:type="pct" w:w="5000"/>
+        <w:tblLayout w:type="fixed"/>
+        <w:tblLook w:firstRow="0" w:lastRow="0" w:firstColumn="0" w:lastColumn="0" w:noHBand="0" w:noVBand="0" w:val="0000"/>
+      </w:tblPr>
+      <w:tblGrid>
+        <w:gridCol w:w="7920"/>
+      </w:tblGrid>
+      <w:tr>
+        <w:tc>
+          <w:tcPr/>
+          <w:bookmarkStart w:id="73" w:name="supptbl-m4b"/>
           <w:p>
             <w:pPr>
               <w:jc w:val="center"/>
@@ -16172,13 +16713,462 @@
               </w:tc>
             </w:tr>
           </w:tbl>
-          <w:bookmarkEnd w:id="77"/>
+          <w:bookmarkEnd w:id="73"/>
           <w:p/>
         </w:tc>
       </w:tr>
     </w:tbl>
-    <w:bookmarkEnd w:id="78"/>
-    <w:bookmarkStart w:id="85" w:name="s5-pupil-linked-models"/>
+    <w:p>
+      <w:pPr>
+        <w:pStyle w:val="BodyText"/>
+      </w:pPr>
+      <w:r>
+        <w:t xml:space="preserve"> </w:t>
+      </w:r>
+    </w:p>
+    <w:tbl>
+      <w:tblPr>
+        <w:tblStyle w:val="Table"/>
+        <w:tblW w:type="pct" w:w="5000"/>
+        <w:tblLayout w:type="fixed"/>
+        <w:tblLook w:firstRow="0" w:lastRow="0" w:firstColumn="0" w:lastColumn="0" w:noHBand="0" w:noVBand="0" w:val="0000"/>
+      </w:tblPr>
+      <w:tblGrid>
+        <w:gridCol w:w="7920"/>
+      </w:tblGrid>
+      <w:tr>
+        <w:tc>
+          <w:tcPr/>
+          <w:bookmarkStart w:id="74" w:name="supptbl-acc-contrasts"/>
+          <w:p>
+            <w:pPr>
+              <w:jc w:val="center"/>
+            </w:pPr>
+            <w:pPr>
+              <w:jc w:val="left"/>
+              <w:spacing w:before="200"/>
+              <w:pStyle w:val="ImageCaption"/>
+            </w:pPr>
+            <w:r>
+              <w:t xml:space="preserve">Table S10: Observed accuracy, high minus low effort, at each stimulus type. Estimates are from a binomial GLMM with a random intercept for participant (see S7 in the dissertation version); percentage points are averaged over task.</w:t>
+            </w:r>
+          </w:p>
+          <w:tbl>
+            <w:tblPr>
+              <w:tblStyle w:val="Table"/>
+              <w:tblW w:type="pct" w:w="5000"/>
+              <w:tblLayout w:type="fixed"/>
+              <w:tblLook w:firstRow="1" w:lastRow="0" w:firstColumn="0" w:lastColumn="0" w:noHBand="0" w:noVBand="0" w:val="0020"/>
+            </w:tblPr>
+            <w:tblGrid>
+              <w:gridCol w:w="1075"/>
+              <w:gridCol w:w="1564"/>
+              <w:gridCol w:w="1466"/>
+              <w:gridCol w:w="1075"/>
+              <w:gridCol w:w="1271"/>
+              <w:gridCol w:w="586"/>
+              <w:gridCol w:w="880"/>
+            </w:tblGrid>
+            <w:tr>
+              <w:trPr>
+                <w:tblHeader w:val="on"/>
+              </w:trPr>
+              <w:tc>
+                <w:tcPr/>
+                <w:p>
+                  <w:pPr>
+                    <w:pStyle w:val="Compact"/>
+                    <w:jc w:val="left"/>
+                    <w:jc w:val="center"/>
+                  </w:pPr>
+                  <w:r>
+                    <w:t xml:space="preserve">Difficulty</w:t>
+                  </w:r>
+                </w:p>
+              </w:tc>
+              <w:tc>
+                <w:tcPr/>
+                <w:p>
+                  <w:pPr>
+                    <w:pStyle w:val="Compact"/>
+                    <w:jc w:val="right"/>
+                    <w:jc w:val="center"/>
+                  </w:pPr>
+                  <w:r>
+                    <w:t xml:space="preserve">High − low (pp)</w:t>
+                  </w:r>
+                </w:p>
+              </w:tc>
+              <w:tc>
+                <w:tcPr/>
+                <w:p>
+                  <w:pPr>
+                    <w:pStyle w:val="Compact"/>
+                    <w:jc w:val="right"/>
+                    <w:jc w:val="center"/>
+                  </w:pPr>
+                  <w:r>
+                    <w:t xml:space="preserve">95% CI (pp)</w:t>
+                  </w:r>
+                </w:p>
+              </w:tc>
+              <w:tc>
+                <w:tcPr/>
+                <w:p>
+                  <w:pPr>
+                    <w:pStyle w:val="Compact"/>
+                    <w:jc w:val="right"/>
+                    <w:jc w:val="center"/>
+                  </w:pPr>
+                  <w:r>
+                    <w:t xml:space="preserve">Odds ratio</w:t>
+                  </w:r>
+                </w:p>
+              </w:tc>
+              <w:tc>
+                <w:tcPr/>
+                <w:p>
+                  <w:pPr>
+                    <w:pStyle w:val="Compact"/>
+                    <w:jc w:val="right"/>
+                    <w:jc w:val="center"/>
+                  </w:pPr>
+                  <w:r>
+                    <w:t xml:space="preserve">95% CI (OR)</w:t>
+                  </w:r>
+                </w:p>
+              </w:tc>
+              <w:tc>
+                <w:tcPr/>
+                <w:p>
+                  <w:pPr>
+                    <w:pStyle w:val="Compact"/>
+                    <w:jc w:val="right"/>
+                    <w:jc w:val="center"/>
+                  </w:pPr>
+                  <w:r>
+                    <w:t xml:space="preserve">z</w:t>
+                  </w:r>
+                </w:p>
+              </w:tc>
+              <w:tc>
+                <w:tcPr/>
+                <w:p>
+                  <w:pPr>
+                    <w:pStyle w:val="Compact"/>
+                    <w:jc w:val="right"/>
+                    <w:jc w:val="center"/>
+                  </w:pPr>
+                  <w:r>
+                    <w:t xml:space="preserve">p</w:t>
+                  </w:r>
+                </w:p>
+              </w:tc>
+            </w:tr>
+            <w:tr>
+              <w:tc>
+                <w:tcPr/>
+                <w:p>
+                  <w:pPr>
+                    <w:pStyle w:val="Compact"/>
+                    <w:jc w:val="left"/>
+                    <w:jc w:val="center"/>
+                  </w:pPr>
+                  <w:r>
+                    <w:t xml:space="preserve">Standard</w:t>
+                  </w:r>
+                </w:p>
+              </w:tc>
+              <w:tc>
+                <w:tcPr/>
+                <w:p>
+                  <w:pPr>
+                    <w:pStyle w:val="Compact"/>
+                    <w:jc w:val="right"/>
+                    <w:jc w:val="center"/>
+                  </w:pPr>
+                  <w:r>
+                    <w:t xml:space="preserve">1.69</w:t>
+                  </w:r>
+                </w:p>
+              </w:tc>
+              <w:tc>
+                <w:tcPr/>
+                <w:p>
+                  <w:pPr>
+                    <w:pStyle w:val="Compact"/>
+                    <w:jc w:val="right"/>
+                    <w:jc w:val="center"/>
+                  </w:pPr>
+                  <w:r>
+                    <w:t xml:space="preserve">[−0.14, 3.52]</w:t>
+                  </w:r>
+                </w:p>
+              </w:tc>
+              <w:tc>
+                <w:tcPr/>
+                <w:p>
+                  <w:pPr>
+                    <w:pStyle w:val="Compact"/>
+                    <w:jc w:val="right"/>
+                    <w:jc w:val="center"/>
+                  </w:pPr>
+                  <w:r>
+                    <w:t xml:space="preserve">1.23</w:t>
+                  </w:r>
+                </w:p>
+              </w:tc>
+              <w:tc>
+                <w:tcPr/>
+                <w:p>
+                  <w:pPr>
+                    <w:pStyle w:val="Compact"/>
+                    <w:jc w:val="right"/>
+                    <w:jc w:val="center"/>
+                  </w:pPr>
+                  <w:r>
+                    <w:t xml:space="preserve">[0.99, 1.53]</w:t>
+                  </w:r>
+                </w:p>
+              </w:tc>
+              <w:tc>
+                <w:tcPr/>
+                <w:p>
+                  <w:pPr>
+                    <w:pStyle w:val="Compact"/>
+                    <w:jc w:val="right"/>
+                    <w:jc w:val="center"/>
+                  </w:pPr>
+                  <w:r>
+                    <w:t xml:space="preserve">1.83</w:t>
+                  </w:r>
+                </w:p>
+              </w:tc>
+              <w:tc>
+                <w:tcPr/>
+                <w:p>
+                  <w:pPr>
+                    <w:pStyle w:val="Compact"/>
+                    <w:jc w:val="right"/>
+                    <w:jc w:val="center"/>
+                  </w:pPr>
+                  <w:r>
+                    <w:t xml:space="preserve">p = .068</w:t>
+                  </w:r>
+                </w:p>
+              </w:tc>
+            </w:tr>
+            <w:tr>
+              <w:tc>
+                <w:tcPr/>
+                <w:p>
+                  <w:pPr>
+                    <w:pStyle w:val="Compact"/>
+                    <w:jc w:val="left"/>
+                    <w:jc w:val="center"/>
+                  </w:pPr>
+                  <w:r>
+                    <w:t xml:space="preserve">Hard</w:t>
+                  </w:r>
+                </w:p>
+              </w:tc>
+              <w:tc>
+                <w:tcPr/>
+                <w:p>
+                  <w:pPr>
+                    <w:pStyle w:val="Compact"/>
+                    <w:jc w:val="right"/>
+                    <w:jc w:val="center"/>
+                  </w:pPr>
+                  <w:r>
+                    <w:t xml:space="preserve">−4.51</w:t>
+                  </w:r>
+                </w:p>
+              </w:tc>
+              <w:tc>
+                <w:tcPr/>
+                <w:p>
+                  <w:pPr>
+                    <w:pStyle w:val="Compact"/>
+                    <w:jc w:val="right"/>
+                    <w:jc w:val="center"/>
+                  </w:pPr>
+                  <w:r>
+                    <w:t xml:space="preserve">[−6.64, −2.38]</w:t>
+                  </w:r>
+                </w:p>
+              </w:tc>
+              <w:tc>
+                <w:tcPr/>
+                <w:p>
+                  <w:pPr>
+                    <w:pStyle w:val="Compact"/>
+                    <w:jc w:val="right"/>
+                    <w:jc w:val="center"/>
+                  </w:pPr>
+                  <w:r>
+                    <w:t xml:space="preserve">0.80</w:t>
+                  </w:r>
+                </w:p>
+              </w:tc>
+              <w:tc>
+                <w:tcPr/>
+                <w:p>
+                  <w:pPr>
+                    <w:pStyle w:val="Compact"/>
+                    <w:jc w:val="right"/>
+                    <w:jc w:val="center"/>
+                  </w:pPr>
+                  <w:r>
+                    <w:t xml:space="preserve">[0.72, 0.89]</w:t>
+                  </w:r>
+                </w:p>
+              </w:tc>
+              <w:tc>
+                <w:tcPr/>
+                <w:p>
+                  <w:pPr>
+                    <w:pStyle w:val="Compact"/>
+                    <w:jc w:val="right"/>
+                    <w:jc w:val="center"/>
+                  </w:pPr>
+                  <w:r>
+                    <w:t xml:space="preserve">−4.19</w:t>
+                  </w:r>
+                </w:p>
+              </w:tc>
+              <w:tc>
+                <w:tcPr/>
+                <w:p>
+                  <w:pPr>
+                    <w:pStyle w:val="Compact"/>
+                    <w:jc w:val="right"/>
+                    <w:jc w:val="center"/>
+                  </w:pPr>
+                  <w:r>
+                    <w:t xml:space="preserve">p &lt; .001</w:t>
+                  </w:r>
+                </w:p>
+              </w:tc>
+            </w:tr>
+            <w:tr>
+              <w:tc>
+                <w:tcPr/>
+                <w:p>
+                  <w:pPr>
+                    <w:pStyle w:val="Compact"/>
+                    <w:jc w:val="left"/>
+                    <w:jc w:val="center"/>
+                  </w:pPr>
+                  <w:r>
+                    <w:t xml:space="preserve">Easy</w:t>
+                  </w:r>
+                </w:p>
+              </w:tc>
+              <w:tc>
+                <w:tcPr/>
+                <w:p>
+                  <w:pPr>
+                    <w:pStyle w:val="Compact"/>
+                    <w:jc w:val="right"/>
+                    <w:jc w:val="center"/>
+                  </w:pPr>
+                  <w:r>
+                    <w:t xml:space="preserve">−0.90</w:t>
+                  </w:r>
+                </w:p>
+              </w:tc>
+              <w:tc>
+                <w:tcPr/>
+                <w:p>
+                  <w:pPr>
+                    <w:pStyle w:val="Compact"/>
+                    <w:jc w:val="right"/>
+                    <w:jc w:val="center"/>
+                  </w:pPr>
+                  <w:r>
+                    <w:t xml:space="preserve">[−2.36, 0.56]</w:t>
+                  </w:r>
+                </w:p>
+              </w:tc>
+              <w:tc>
+                <w:tcPr/>
+                <w:p>
+                  <w:pPr>
+                    <w:pStyle w:val="Compact"/>
+                    <w:jc w:val="right"/>
+                    <w:jc w:val="center"/>
+                  </w:pPr>
+                  <w:r>
+                    <w:t xml:space="preserve">0.92</w:t>
+                  </w:r>
+                </w:p>
+              </w:tc>
+              <w:tc>
+                <w:tcPr/>
+                <w:p>
+                  <w:pPr>
+                    <w:pStyle w:val="Compact"/>
+                    <w:jc w:val="right"/>
+                    <w:jc w:val="center"/>
+                  </w:pPr>
+                  <w:r>
+                    <w:t xml:space="preserve">[0.80, 1.06]</w:t>
+                  </w:r>
+                </w:p>
+              </w:tc>
+              <w:tc>
+                <w:tcPr/>
+                <w:p>
+                  <w:pPr>
+                    <w:pStyle w:val="Compact"/>
+                    <w:jc w:val="right"/>
+                    <w:jc w:val="center"/>
+                  </w:pPr>
+                  <w:r>
+                    <w:t xml:space="preserve">−1.21</w:t>
+                  </w:r>
+                </w:p>
+              </w:tc>
+              <w:tc>
+                <w:tcPr/>
+                <w:p>
+                  <w:pPr>
+                    <w:pStyle w:val="Compact"/>
+                    <w:jc w:val="right"/>
+                    <w:jc w:val="center"/>
+                  </w:pPr>
+                  <w:r>
+                    <w:t xml:space="preserve">p = .226</w:t>
+                  </w:r>
+                </w:p>
+              </w:tc>
+            </w:tr>
+          </w:tbl>
+          <w:p>
+            <w:pPr>
+              <w:jc w:val="center"/>
+            </w:pPr>
+            <w:r>
+              <w:rPr>
+                <w:i/>
+                <w:iCs/>
+              </w:rPr>
+              <w:t xml:space="preserve">Note.</w:t>
+            </w:r>
+            <w:r>
+              <w:t xml:space="preserve"> </w:t>
+            </w:r>
+            <w:r>
+              <w:t xml:space="preserve">High minus low, averaged over task with equal weights. Percentage points are 100 times the probability difference. The odds ratio, z, and p are the logit-scale contrast. df is asymptotic.</w:t>
+            </w:r>
+          </w:p>
+          <w:bookmarkEnd w:id="74"/>
+        </w:tc>
+      </w:tr>
+    </w:tbl>
+    <w:bookmarkEnd w:id="75"/>
+    <w:bookmarkStart w:id="82" w:name="s5-pupil-linked-models"/>
     <w:p>
       <w:pPr>
         <w:pStyle w:val="Heading2"/>
@@ -16245,7 +17235,7 @@
               <w:t xml:space="preserve"> </w:t>
             </w:r>
             <w:r>
-              <w:t xml:space="preserve">Inline value keys available for this section: P3_bs, P3_rt_bs, P5_bs, P6_bs, P7_bs, P8_bs, P1_bias, P2_drift_tepr, P2_drift_tepr_x_stim, P4_bias_base, P0_crit, P0_qual, P0_bs, P0_bias, delta_elpd_P3_vs_P0, delta_elpd_P3rt_vs_P0rt, delta_elpd_P5_vs_P0base, delta_elpd_P6_vs_P0lag, delta_elpd_P7_vs_P0pre, delta_elpd_P8_vs_P0grip, delta_elpd_P1_vs_P0, delta_elpd_P2_vs_P0, delta_elpd_P4_vs_P0base, tepr_rt_r, grip_high_low_ADT, grip_high_low_VDT, tepr_high_low_ADT_B1, tepr_high_low_VDT_B1, tepr_high_low_ADT_B0, tepr_high_low_VDT_B0, n_pupil_matched_trials, n_pupil_matched_subjects, n_pupil_tepr_present_trials, n_pupil_tepr_present_subjects, n_pupil_b1_quality_trials, n_pupil_b1_quality_subjects, n_pupil_window_quality_trials, n_pupil_window_quality_subjects, n_pupil_final_trials, n_pupil_final_subjects, n_pupil_base_trials, n_pupil_rt80_trials, n_pupil_lag_trials, n_pupil_pre_trials, n_pupil_grip_trials, n_pupil_models_k_gt_0.7, pct_gain_lost_rt_trim, max_k_pupil_models.</w:t>
+              <w:t xml:space="preserve">Inline value keys available for this section: P3_bs, P3_rt_bs, P5_bs, P6_bs, P7_bs, P8_bs, P1_bias, P2_drift_tepr, P2_drift_tepr_x_stim, P4_bias_base, P0_crit, P0_qual, P0_bs, P0_bias, delta_elpd_P3_vs_P0, delta_elpd_P3rt_vs_P0rt, delta_elpd_P5_vs_P0base, delta_elpd_P6_vs_P0lag, delta_elpd_P7_vs_P0pre, delta_elpd_P8_vs_P0grip, delta_elpd_P1_vs_P0, delta_elpd_P2_vs_P0, delta_elpd_P4_vs_P0base, tepr_rt_r, grip_high_low_ADT, grip_high_low_VDT, tepr_high_low_ADT_B1, tepr_high_low_VDT_B1, tepr_high_low_ADT_B0, tepr_high_low_VDT_B0, n_pupil_matched_trials, n_pupil_matched_subjects, n_pupil_tepr_present_trials, n_pupil_tepr_present_subjects, n_pupil_b1_quality_trials, n_pupil_b1_quality_subjects, n_pupil_window_quality_trials, n_pupil_window_quality_subjects, n_pupil_final_trials, n_pupil_final_subjects, n_pupil_base_trials, n_pupil_rt80_trials, n_pupil_lag_trials, n_pupil_pre_trials, n_pupil_grip_trials, n_pupil_models_k_gt_0.7, max_k_pupil_models.</w:t>
             </w:r>
             <w:r>
               <w:t xml:space="preserve"> </w:t>
@@ -16261,7 +17251,7 @@
                 <w:rPr>
                   <w:rStyle w:val="Hyperlink"/>
                 </w:rPr>
-                <w:t xml:space="preserve">Table S10</w:t>
+                <w:t xml:space="preserve">Table S11</w:t>
               </w:r>
             </w:hyperlink>
             <w:r>
@@ -16275,7 +17265,7 @@
                 <w:rPr>
                   <w:rStyle w:val="Hyperlink"/>
                 </w:rPr>
-                <w:t xml:space="preserve">Table S11</w:t>
+                <w:t xml:space="preserve">Table S12</w:t>
               </w:r>
             </w:hyperlink>
             <w:r>
@@ -16312,7 +17302,7 @@
       <w:tr>
         <w:tc>
           <w:tcPr/>
-          <w:bookmarkStart w:id="79" w:name="supptbl-pupil-models"/>
+          <w:bookmarkStart w:id="76" w:name="supptbl-pupil-models"/>
           <w:p>
             <w:pPr>
               <w:jc w:val="center"/>
@@ -16323,7 +17313,7 @@
               <w:pStyle w:val="ImageCaption"/>
             </w:pPr>
             <w:r>
-              <w:t xml:space="preserve">Table S10: [CAPTION TO BE SUPPLIED]</w:t>
+              <w:t xml:space="preserve">Table S11: [CAPTION TO BE SUPPLIED]</w:t>
             </w:r>
           </w:p>
           <w:tbl>
@@ -17456,7 +18446,7 @@
               <w:t xml:space="preserve">P1, P2, and P3 are compared with P0. P4 and P5 are compared with P0_base. P3_rt is compared with P0_rt. P6 is compared with P0_lag, P7 with P0_pre, and P8 with P0_grip. P5, P3_rt, P6, P7, and P8 are in the ordering table rather than this slope table.</w:t>
             </w:r>
           </w:p>
-          <w:bookmarkEnd w:id="79"/>
+          <w:bookmarkEnd w:id="76"/>
         </w:tc>
       </w:tr>
     </w:tbl>
@@ -17481,7 +18471,7 @@
       <w:tr>
         <w:tc>
           <w:tcPr/>
-          <w:bookmarkStart w:id="80" w:name="supptbl-pupil-descriptives"/>
+          <w:bookmarkStart w:id="77" w:name="supptbl-pupil-descriptives"/>
           <w:p>
             <w:pPr>
               <w:jc w:val="center"/>
@@ -17492,7 +18482,7 @@
               <w:pStyle w:val="ImageCaption"/>
             </w:pPr>
             <w:r>
-              <w:t xml:space="preserve">Table S11: [CAPTION TO BE SUPPLIED: Effort effects on pupil measures]</w:t>
+              <w:t xml:space="preserve">Table S12: [CAPTION TO BE SUPPLIED: Effort effects on pupil measures]</w:t>
             </w:r>
           </w:p>
           <w:tbl>
@@ -18276,7 +19266,7 @@
               <w:t xml:space="preserve">n is the number of participants with both effort levels for that task. The paired test drops anyone missing one level. The final pupil sample is 43 participants.</w:t>
             </w:r>
           </w:p>
-          <w:bookmarkEnd w:id="80"/>
+          <w:bookmarkEnd w:id="77"/>
         </w:tc>
       </w:tr>
     </w:tbl>
@@ -18301,7 +19291,7 @@
       <w:tr>
         <w:tc>
           <w:tcPr/>
-          <w:bookmarkStart w:id="84" w:name="suppfig-tepr"/>
+          <w:bookmarkStart w:id="81" w:name="suppfig-tepr"/>
           <w:p>
             <w:pPr>
               <w:jc w:val="center"/>
@@ -18309,20 +19299,20 @@
             <w:r>
               <w:drawing>
                 <wp:inline>
-                  <wp:extent cx="5334000" cy="4683512"/>
+                  <wp:extent cx="5334000" cy="4878658"/>
                   <wp:effectExtent b="0" l="0" r="0" t="0"/>
-                  <wp:docPr descr="" title="" id="82" name="Picture"/>
+                  <wp:docPr descr="" title="" id="79" name="Picture"/>
                   <a:graphic>
                     <a:graphicData uri="http://schemas.openxmlformats.org/drawingml/2006/picture">
                       <pic:pic>
                         <pic:nvPicPr>
-                          <pic:cNvPr descr="../output/ddm_refits/runs/final_20261016/figures/final/S_tepr_timecourse.png" id="83" name="Picture"/>
+                          <pic:cNvPr descr="../output/ddm_refits/runs/final_20261016/figures/final/S_tepr_timecourse.png" id="80" name="Picture"/>
                           <pic:cNvPicPr>
                             <a:picLocks noChangeArrowheads="1" noChangeAspect="1"/>
                           </pic:cNvPicPr>
                         </pic:nvPicPr>
                         <pic:blipFill>
-                          <a:blip r:embed="rId81"/>
+                          <a:blip r:embed="rId78"/>
                           <a:stretch>
                             <a:fillRect/>
                           </a:stretch>
@@ -18330,7 +19320,7 @@
                         <pic:spPr bwMode="auto">
                           <a:xfrm>
                             <a:off x="0" y="0"/>
-                            <a:ext cx="5334000" cy="4683512"/>
+                            <a:ext cx="5334000" cy="4878658"/>
                           </a:xfrm>
                           <a:prstGeom prst="rect">
                             <a:avLst/>
@@ -18362,12 +19352,12 @@
               <w:t xml:space="preserve">Figure S3: [CAPTION TO BE SUPPLIED]</w:t>
             </w:r>
           </w:p>
-          <w:bookmarkEnd w:id="84"/>
+          <w:bookmarkEnd w:id="81"/>
         </w:tc>
       </w:tr>
     </w:tbl>
-    <w:bookmarkEnd w:id="85"/>
-    <w:bookmarkStart w:id="90" w:name="s6-model-specification-details"/>
+    <w:bookmarkEnd w:id="82"/>
+    <w:bookmarkStart w:id="87" w:name="s6-model-specification-details"/>
     <w:p>
       <w:pPr>
         <w:pStyle w:val="Heading2"/>
@@ -18473,7 +19463,7 @@
       <w:tr>
         <w:tc>
           <w:tcPr/>
-          <w:bookmarkStart w:id="89" w:name="suppfig-ndt"/>
+          <w:bookmarkStart w:id="86" w:name="suppfig-ndt"/>
           <w:p>
             <w:pPr>
               <w:jc w:val="center"/>
@@ -18483,18 +19473,18 @@
                 <wp:inline>
                   <wp:extent cx="5334000" cy="5506064"/>
                   <wp:effectExtent b="0" l="0" r="0" t="0"/>
-                  <wp:docPr descr="" title="" id="87" name="Picture"/>
+                  <wp:docPr descr="" title="" id="84" name="Picture"/>
                   <a:graphic>
                     <a:graphicData uri="http://schemas.openxmlformats.org/drawingml/2006/picture">
                       <pic:pic>
                         <pic:nvPicPr>
-                          <pic:cNvPr descr="../output/ddm_refits/runs/final_20261016/figures/final/S_ndt_prior_posterior.png" id="88" name="Picture"/>
+                          <pic:cNvPr descr="../output/ddm_refits/runs/final_20261016/figures/final/S_ndt_prior_posterior.png" id="85" name="Picture"/>
                           <pic:cNvPicPr>
                             <a:picLocks noChangeArrowheads="1" noChangeAspect="1"/>
                           </pic:cNvPicPr>
                         </pic:nvPicPr>
                         <pic:blipFill>
-                          <a:blip r:embed="rId86"/>
+                          <a:blip r:embed="rId83"/>
                           <a:stretch>
                             <a:fillRect/>
                           </a:stretch>
@@ -18534,12 +19524,12 @@
               <w:t xml:space="preserve">Figure S4: [CAPTION TO BE SUPPLIED]</w:t>
             </w:r>
           </w:p>
-          <w:bookmarkEnd w:id="89"/>
+          <w:bookmarkEnd w:id="86"/>
         </w:tc>
       </w:tr>
     </w:tbl>
-    <w:bookmarkEnd w:id="90"/>
-    <w:bookmarkEnd w:id="91"/>
+    <w:bookmarkEnd w:id="87"/>
+    <w:bookmarkEnd w:id="88"/>
     <w:sectPr>
       <w:footnotePr>
         <w:numRestart w:val="eachSect"/>

</xml_diff>

<commit_message>
Rewrite the chapter main text as prose and drop the advisor appendix.
The Abstract through the Conclusion no longer use lists, and the draft comment table is no longer part of the rendered chapter.

Co-authored-by: Cursor <cursoragent@cursor.com>
</commit_message>
<xml_diff>
--- a/reports/chap3_revised.docx
+++ b/reports/chap3_revised.docx
@@ -7,7 +7,7 @@
         <w:pStyle w:val="Title"/>
       </w:pPr>
       <w:r>
-        <w:t xml:space="preserve">[TITLE — to be supplied]</w:t>
+        <w:t xml:space="preserve">Physical Effort Shifts the Decision Criterion, Not Evidence Quality, in Older Adults</w:t>
       </w:r>
     </w:p>
     <w:p>
@@ -44,18 +44,6 @@
         </w:p>
       </w:sdtContent>
     </w:sdt>
-    <w:p>
-      <w:pPr>
-        <w:pStyle w:val="FirstParagraph"/>
-      </w:pPr>
-      <w:r>
-        <w:rPr>
-          <w:b/>
-          <w:bCs/>
-        </w:rPr>
-        <w:t xml:space="preserve">DRAFT — numbers from run r10_20261017_081458 for pupil results; behavioral results final.</w:t>
-      </w:r>
-    </w:p>
     <w:bookmarkStart w:id="9" w:name="abstract"/>
     <w:p>
       <w:pPr>
@@ -70,7 +58,7 @@
         <w:pStyle w:val="FirstParagraph"/>
       </w:pPr>
       <w:r>
-        <w:t xml:space="preserve">Older adults often make decisions while exerting physical effort, but it is unclear whether effort lowers the quality of the evidence they use, changes how much evidence they require, or neither. In total, 67 older adults judged whether two tones (auditory task) or two Gabor patches (visual task) were the same or different while holding a handgrip at 5% or 40% of their maximum force. Pupil size was recorded throughout. A hierarchical drift-diffusion model was fit to choices and response times. High effort shifted drift toward</w:t>
+        <w:t xml:space="preserve">Everyday decisions are often made during physical effort, but it is unclear how effort changes decision-making in older adults. Effort could reduce the quality of the evidence people accumulate, change how much evidence they require before responding, or bias them toward one response. We tested these possibilities in 67 older adults. They judged whether two tones or two visual patterns were the same or different while holding a handgrip at low (5%) or high (40%) force, and their pupil size was recorded throughout. A hierarchical drift-diffusion model separated the components of each decision. High effort did not reduce the quality of the evidence. Instead, it shifted evidence accumulation toward</w:t>
       </w:r>
       <w:r>
         <w:t xml:space="preserve"> </w:t>
@@ -82,7 +70,7 @@
         <w:t xml:space="preserve"> </w:t>
       </w:r>
       <w:r>
-        <w:t xml:space="preserve">on all trials (β = −0.053, 95% CrI [−0.103, −0.003], P(β &lt; 0) = .981). It did not credibly change the separation between drift on identical and different trials, the model’s index of evidence quality (β = −0.013, 95% CrI [−0.052, 0.028], P(β &lt; 0) = .730). In observed accuracy, high effort lowered accuracy on the hardest discriminations by 4.5 percentage points (p &lt; .001). Boundary separation increased by +2.0% [0.6, 3.4], a change within the region of practical equivalence. The starting point did not change. High effort dilated the pupil during the grip. In 43 participants with usable pupil data, a larger task-evoked pupil response predicted wider boundaries on the same trial (+7.9% [6.5, 9.2] per SD). That association tracked decision duration: pupil size just before the response did not predict boundary separation. Physical effort therefore changed how older adults mapped evidence onto responses, not the quality of that evidence.</w:t>
+        <w:t xml:space="preserve">responses on every trial, which lowered accuracy on the most difficult trials with a different probe. Effort did not meaningfully change how much evidence participants required, and it did not change their starting bias. High effort also increased pupil size during the grip. On trials with a larger task-evoked pupil response, participants required more evidence before responding. This association largely reflected the duration of the decision, so it does not show that arousal set response caution. Physical effort therefore changed how older adults mapped evidence onto responses, not how well they took in that evidence.</w:t>
       </w:r>
     </w:p>
     <w:bookmarkEnd w:id="9"/>
@@ -150,142 +138,40 @@
         <w:t xml:space="preserve">(Ratcliff &amp; McKoon, 2008)</w:t>
       </w:r>
       <w:r>
-        <w:t xml:space="preserve">. It treats a two-choice decision as noisy evidence accumulating until it reaches one of two boundaries. The model has four parameters:</w:t>
-      </w:r>
-    </w:p>
-    <w:p>
-      <w:pPr>
-        <w:pStyle w:val="Compact"/>
-        <w:numPr>
-          <w:ilvl w:val="0"/>
-          <w:numId w:val="1001"/>
-        </w:numPr>
-      </w:pPr>
+        <w:t xml:space="preserve">. It treats a two-choice decision as noisy evidence accumulating until it reaches one of two boundaries. Drift rate (</w:t>
+      </w:r>
       <w:r>
         <w:rPr>
-          <w:b/>
-          <w:bCs/>
-        </w:rPr>
-        <w:t xml:space="preserve">Drift rate (</w:t>
-      </w:r>
-      <w:r>
-        <w:rPr>
-          <w:b/>
-          <w:bCs/>
           <w:i/>
           <w:iCs/>
         </w:rPr>
         <w:t xml:space="preserve">v</w:t>
       </w:r>
       <w:r>
+        <w:t xml:space="preserve">) is the average direction and speed of accumulation, boundary separation (</w:t>
+      </w:r>
+      <w:r>
         <w:rPr>
-          <w:b/>
-          <w:bCs/>
-        </w:rPr>
-        <w:t xml:space="preserve">):</w:t>
-      </w:r>
-      <w:r>
-        <w:t xml:space="preserve"> </w:t>
-      </w:r>
-      <w:r>
-        <w:t xml:space="preserve">the average direction and speed of accumulation.</w:t>
-      </w:r>
-    </w:p>
-    <w:p>
-      <w:pPr>
-        <w:pStyle w:val="Compact"/>
-        <w:numPr>
-          <w:ilvl w:val="0"/>
-          <w:numId w:val="1001"/>
-        </w:numPr>
-      </w:pPr>
-      <w:r>
-        <w:rPr>
-          <w:b/>
-          <w:bCs/>
-        </w:rPr>
-        <w:t xml:space="preserve">Boundary separation (</w:t>
-      </w:r>
-      <w:r>
-        <w:rPr>
-          <w:b/>
-          <w:bCs/>
           <w:i/>
           <w:iCs/>
         </w:rPr>
         <w:t xml:space="preserve">a</w:t>
       </w:r>
       <w:r>
+        <w:t xml:space="preserve">) is how much evidence is required before responding, the starting point (</w:t>
+      </w:r>
+      <w:r>
         <w:rPr>
-          <w:b/>
-          <w:bCs/>
-        </w:rPr>
-        <w:t xml:space="preserve">):</w:t>
-      </w:r>
-      <w:r>
-        <w:t xml:space="preserve"> </w:t>
-      </w:r>
-      <w:r>
-        <w:t xml:space="preserve">how much evidence is required before responding.</w:t>
-      </w:r>
-    </w:p>
-    <w:p>
-      <w:pPr>
-        <w:pStyle w:val="Compact"/>
-        <w:numPr>
-          <w:ilvl w:val="0"/>
-          <w:numId w:val="1001"/>
-        </w:numPr>
-      </w:pPr>
-      <w:r>
-        <w:rPr>
-          <w:b/>
-          <w:bCs/>
-        </w:rPr>
-        <w:t xml:space="preserve">Starting point (</w:t>
-      </w:r>
-      <w:r>
-        <w:rPr>
-          <w:b/>
-          <w:bCs/>
           <w:i/>
           <w:iCs/>
         </w:rPr>
         <w:t xml:space="preserve">z</w:t>
       </w:r>
       <w:r>
+        <w:t xml:space="preserve">) is a bias toward one response before the stimulus appears, and non-decision time (</w:t>
+      </w:r>
+      <w:r>
         <w:rPr>
-          <w:b/>
-          <w:bCs/>
-        </w:rPr>
-        <w:t xml:space="preserve">):</w:t>
-      </w:r>
-      <w:r>
-        <w:t xml:space="preserve"> </w:t>
-      </w:r>
-      <w:r>
-        <w:t xml:space="preserve">a bias toward one response before the stimulus appears.</w:t>
-      </w:r>
-    </w:p>
-    <w:p>
-      <w:pPr>
-        <w:pStyle w:val="Compact"/>
-        <w:numPr>
-          <w:ilvl w:val="0"/>
-          <w:numId w:val="1001"/>
-        </w:numPr>
-      </w:pPr>
-      <w:r>
-        <w:rPr>
-          <w:b/>
-          <w:bCs/>
-        </w:rPr>
-        <w:t xml:space="preserve">Non-decision time (</w:t>
-      </w:r>
-      <w:r>
-        <w:rPr>
-          <w:b/>
-          <w:bCs/>
           <w:i/>
           <w:iCs/>
         </w:rPr>
@@ -293,29 +179,17 @@
       </w:r>
       <w:r>
         <w:rPr>
-          <w:b/>
-          <w:bCs/>
           <w:vertAlign w:val="subscript"/>
         </w:rPr>
         <w:t xml:space="preserve">0</w:t>
       </w:r>
       <w:r>
-        <w:rPr>
-          <w:b/>
-          <w:bCs/>
-        </w:rPr>
-        <w:t xml:space="preserve">):</w:t>
-      </w:r>
-      <w:r>
-        <w:t xml:space="preserve"> </w:t>
-      </w:r>
-      <w:r>
-        <w:t xml:space="preserve">encoding and response execution.</w:t>
+        <w:t xml:space="preserve">) covers encoding and response execution.</w:t>
       </w:r>
     </w:p>
     <w:p>
       <w:pPr>
-        <w:pStyle w:val="FirstParagraph"/>
+        <w:pStyle w:val="BodyText"/>
       </w:pPr>
       <w:r>
         <w:t xml:space="preserve">In older adults, the most consistent age differences are wider boundaries and longer non-decision times, whereas drift is often similar to that of younger adults on simple perceptual tasks</w:t>
@@ -1398,103 +1272,7 @@
         <w:t xml:space="preserve">z</w:t>
       </w:r>
       <w:r>
-        <w:t xml:space="preserve">). The predictors in the primary model (M4) were:</w:t>
-      </w:r>
-    </w:p>
-    <w:p>
-      <w:pPr>
-        <w:pStyle w:val="Compact"/>
-        <w:numPr>
-          <w:ilvl w:val="0"/>
-          <w:numId w:val="1002"/>
-        </w:numPr>
-      </w:pPr>
-      <w:r>
-        <w:rPr>
-          <w:b/>
-          <w:bCs/>
-        </w:rPr>
-        <w:t xml:space="preserve">Drift:</w:t>
-      </w:r>
-      <w:r>
-        <w:t xml:space="preserve"> </w:t>
-      </w:r>
-      <w:r>
-        <w:t xml:space="preserve">stimulus type (Standard, Hard, Easy), task, their interaction, effort and an effort × stimulus term.</w:t>
-      </w:r>
-    </w:p>
-    <w:p>
-      <w:pPr>
-        <w:pStyle w:val="Compact"/>
-        <w:numPr>
-          <w:ilvl w:val="0"/>
-          <w:numId w:val="1002"/>
-        </w:numPr>
-      </w:pPr>
-      <w:r>
-        <w:rPr>
-          <w:b/>
-          <w:bCs/>
-        </w:rPr>
-        <w:t xml:space="preserve">Boundary separation:</w:t>
-      </w:r>
-      <w:r>
-        <w:t xml:space="preserve"> </w:t>
-      </w:r>
-      <w:r>
-        <w:t xml:space="preserve">stimulus type, task and effort.</w:t>
-      </w:r>
-    </w:p>
-    <w:p>
-      <w:pPr>
-        <w:pStyle w:val="Compact"/>
-        <w:numPr>
-          <w:ilvl w:val="0"/>
-          <w:numId w:val="1002"/>
-        </w:numPr>
-      </w:pPr>
-      <w:r>
-        <w:rPr>
-          <w:b/>
-          <w:bCs/>
-        </w:rPr>
-        <w:t xml:space="preserve">Starting point:</w:t>
-      </w:r>
-      <w:r>
-        <w:t xml:space="preserve"> </w:t>
-      </w:r>
-      <w:r>
-        <w:t xml:space="preserve">task and effort.</w:t>
-      </w:r>
-    </w:p>
-    <w:p>
-      <w:pPr>
-        <w:pStyle w:val="Compact"/>
-        <w:numPr>
-          <w:ilvl w:val="0"/>
-          <w:numId w:val="1002"/>
-        </w:numPr>
-      </w:pPr>
-      <w:r>
-        <w:rPr>
-          <w:b/>
-          <w:bCs/>
-        </w:rPr>
-        <w:t xml:space="preserve">Non-decision time:</w:t>
-      </w:r>
-      <w:r>
-        <w:t xml:space="preserve"> </w:t>
-      </w:r>
-      <w:r>
-        <w:t xml:space="preserve">an intercept only.</w:t>
-      </w:r>
-    </w:p>
-    <w:p>
-      <w:pPr>
-        <w:pStyle w:val="FirstParagraph"/>
-      </w:pPr>
-      <w:r>
-        <w:t xml:space="preserve">Participants had random intercepts on drift, boundary separation and starting point.</w:t>
+        <w:t xml:space="preserve">). In the primary model (M4), drift depended on stimulus type (Standard, Hard, Easy), task, their interaction, effort and an effort × stimulus term. Boundary separation depended on stimulus type, task and effort, and the starting point on task and effort. Non-decision time had an intercept only. Participants had random intercepts on drift, boundary separation and starting point.</w:t>
       </w:r>
     </w:p>
     <w:p>
@@ -1551,7 +1329,7 @@
         <w:pStyle w:val="BodyText"/>
       </w:pPr>
       <w:r>
-        <w:t xml:space="preserve">M4 was selected from a set of nested models that differed in how effort, stimulus type and task entered drift and boundary separation (Table S2; formulas in S6). Two variants of M4 were also fit: M4b added effort × task interactions on drift, and M4r added by-participant random effort slopes on drift and boundary separation.</w:t>
+        <w:t xml:space="preserve">M4 was compared with nested models that differed in how effort, stimulus type and task entered drift and boundary separation (formulas in S6). Two variants of M4 were also fit: M4b added effort × task interactions on drift, and M4r added by-participant random effort slopes on drift and boundary separation.</w:t>
       </w:r>
     </w:p>
     <w:bookmarkEnd w:id="23"/>
@@ -1608,48 +1386,12 @@
         <w:pStyle w:val="FirstParagraph"/>
       </w:pPr>
       <w:r>
-        <w:t xml:space="preserve">Each pupil-linked model added one pupil predictor to M4. Each was compared with an M4 baseline fit to the same trials. The TEPR was entered on the starting point (P1), on drift with a TEPR × stimulus term (P2) or on boundary separation (P3). The pre-squeeze baseline was entered on the starting point (P4) and on boundary separation (P5). Because the TEPR window overlapped the response, three further tests asked whether a TEPR–boundary association could reflect decision duration rather than pupil-linked state:</w:t>
+        <w:t xml:space="preserve">Each pupil-linked model added one pupil predictor to M4. Each was compared with an M4 baseline fit to the same trials. The TEPR was entered on the starting point (P1), on drift with a TEPR × stimulus term (P2) or on boundary separation (P3). The pre-squeeze baseline was entered on the starting point (P4) and on boundary separation (P5). Because the TEPR window overlapped the response, three further tests asked whether a TEPR–boundary association could reflect decision duration rather than pupil-linked state. First, P3 was refit after removing the slowest 20% of trials in each participant × task cell (P3_rt). Second, boundary separation was predicted from pupil size in the 0.5 s before the response, a window that ends before the response (P7). Third, boundary separation was predicted from measures that precede the decision: the previous trial’s TEPR within a block (P6) and the grip-period pupil size (P8).</w:t>
       </w:r>
     </w:p>
     <w:p>
       <w:pPr>
-        <w:pStyle w:val="Compact"/>
-        <w:numPr>
-          <w:ilvl w:val="0"/>
-          <w:numId w:val="1003"/>
-        </w:numPr>
-      </w:pPr>
-      <w:r>
-        <w:t xml:space="preserve">P3 refit after removing the slowest 20% of trials in each participant × task cell (P3_rt);</w:t>
-      </w:r>
-    </w:p>
-    <w:p>
-      <w:pPr>
-        <w:pStyle w:val="Compact"/>
-        <w:numPr>
-          <w:ilvl w:val="0"/>
-          <w:numId w:val="1003"/>
-        </w:numPr>
-      </w:pPr>
-      <w:r>
-        <w:t xml:space="preserve">boundary separation predicted from the pupil size in the 0.5 s before the response (P7);</w:t>
-      </w:r>
-    </w:p>
-    <w:p>
-      <w:pPr>
-        <w:pStyle w:val="Compact"/>
-        <w:numPr>
-          <w:ilvl w:val="0"/>
-          <w:numId w:val="1003"/>
-        </w:numPr>
-      </w:pPr>
-      <w:r>
-        <w:t xml:space="preserve">boundary separation predicted from measures that precede the decision: the previous trial’s TEPR within a block (P6) and the grip-period pupil size (P8).</w:t>
-      </w:r>
-    </w:p>
-    <w:p>
-      <w:pPr>
-        <w:pStyle w:val="FirstParagraph"/>
+        <w:pStyle w:val="BodyText"/>
       </w:pPr>
       <w:r>
         <w:t xml:space="preserve">Effort effects on pupil size were tested with paired</w:t>
@@ -1695,29 +1437,7 @@
         <w:t xml:space="preserve">(ROPE, Kruschke, 2018)</w:t>
       </w:r>
       <w:r>
-        <w:t xml:space="preserve">:</w:t>
-      </w:r>
-    </w:p>
-    <w:p>
-      <w:pPr>
-        <w:pStyle w:val="Compact"/>
-        <w:numPr>
-          <w:ilvl w:val="0"/>
-          <w:numId w:val="1004"/>
-        </w:numPr>
-      </w:pPr>
-      <w:r>
-        <w:rPr>
-          <w:b/>
-          <w:bCs/>
-        </w:rPr>
-        <w:t xml:space="preserve">Log boundary separation and logit starting point: ±0.05.</w:t>
-      </w:r>
-      <w:r>
-        <w:t xml:space="preserve"> </w:t>
-      </w:r>
-      <w:r>
-        <w:t xml:space="preserve">This is about a 5% change in</w:t>
+        <w:t xml:space="preserve">. The ROPE was ±0.05 for log boundary separation and logit starting point, which corresponds to about a 5% change in</w:t>
       </w:r>
       <w:r>
         <w:t xml:space="preserve"> </w:t>
@@ -1749,37 +1469,7 @@
         <w:t xml:space="preserve"> </w:t>
       </w:r>
       <w:r>
-        <w:t xml:space="preserve">near its observed value.</w:t>
-      </w:r>
-    </w:p>
-    <w:p>
-      <w:pPr>
-        <w:pStyle w:val="Compact"/>
-        <w:numPr>
-          <w:ilvl w:val="0"/>
-          <w:numId w:val="1004"/>
-        </w:numPr>
-      </w:pPr>
-      <w:r>
-        <w:rPr>
-          <w:b/>
-          <w:bCs/>
-        </w:rPr>
-        <w:t xml:space="preserve">Drift: ±0.02.</w:t>
-      </w:r>
-      <w:r>
-        <w:t xml:space="preserve"> </w:t>
-      </w:r>
-      <w:r>
-        <w:t xml:space="preserve">This is about 1% of the drift difference between Standard and Easy trials.</w:t>
-      </w:r>
-    </w:p>
-    <w:p>
-      <w:pPr>
-        <w:pStyle w:val="FirstParagraph"/>
-      </w:pPr>
-      <w:r>
-        <w:t xml:space="preserve">The proportion of the posterior inside the ROPE is reported where it bears on whether an effect is negligible.</w:t>
+        <w:t xml:space="preserve">near its observed value. For drift it was ±0.02, about 1% of the drift difference between Standard and Easy trials. The proportion of the posterior inside the ROPE is reported where it bears on whether an effect is negligible.</w:t>
       </w:r>
     </w:p>
     <w:p>
@@ -1812,7 +1502,7 @@
         <w:t xml:space="preserve"> </w:t>
       </w:r>
       <w:r>
-        <w:t xml:space="preserve">&gt; 0.7 were handled with moment matching and exact refits. Afterwards, no observation in any compared model exceeded 0.7. Differences in expected log predictive density (ΔELPD) are reported with their SE, and differences smaller than about twice their SE were treated as uncertain.</w:t>
+        <w:t xml:space="preserve">&gt; 0.7 were handled with moment matching and exact refits. Differences in expected log predictive density (ΔELPD) are reported with their SE, and differences smaller than about twice their SE were treated as uncertain.</w:t>
       </w:r>
     </w:p>
     <w:p>
@@ -1829,7 +1519,7 @@
         <w:t xml:space="preserve">(Bates, Mächler, et al., 2015)</w:t>
       </w:r>
       <w:r>
-        <w:t xml:space="preserve">. Models with random effort slopes were singular, so the model used a random intercept for participant</w:t>
+        <w:t xml:space="preserve">. Because models with random effort slopes were singular, the model used a random intercept for participant</w:t>
       </w:r>
       <w:r>
         <w:t xml:space="preserve"> </w:t>
@@ -1875,7 +1565,7 @@
         <w:pStyle w:val="FirstParagraph"/>
       </w:pPr>
       <w:r>
-        <w:t xml:space="preserve">Allowing drift rate to differ between tasks improved out-of-sample prediction (M4 vs. M3: ΔELPD = 158.3 ± 20.0). Allowing the effort effects to differ between tasks did not (M4b vs. M4: ΔELPD = −1.6 ± 1.5;</w:t>
+        <w:t xml:space="preserve">Allowing drift rate to differ between tasks improved out-of-sample prediction (M4 vs. M3: ΔELPD = 158.3 ± 20.0), whereas allowing the effort effects to differ between tasks did not (M4b vs. M4: ΔELPD = −1.6 ± 1.5;</w:t>
       </w:r>
       <w:r>
         <w:t xml:space="preserve"> </w:t>
@@ -1889,7 +1579,7 @@
         </w:r>
       </w:hyperlink>
       <w:r>
-        <w:t xml:space="preserve">). M4 is therefore reported below.</w:t>
+        <w:t xml:space="preserve">).</w:t>
       </w:r>
     </w:p>
     <w:p>
@@ -1907,31 +1597,7 @@
         <w:t xml:space="preserve"> </w:t>
       </w:r>
       <w:r>
-        <w:t xml:space="preserve">The upper boundary corresponds to a</w:t>
-      </w:r>
-      <w:r>
-        <w:t xml:space="preserve"> </w:t>
-      </w:r>
-      <w:r>
-        <w:t xml:space="preserve">“different”</w:t>
-      </w:r>
-      <w:r>
-        <w:t xml:space="preserve"> </w:t>
-      </w:r>
-      <w:r>
-        <w:t xml:space="preserve">response. Drift was therefore negative on Standard trials, where</w:t>
-      </w:r>
-      <w:r>
-        <w:t xml:space="preserve"> </w:t>
-      </w:r>
-      <w:r>
-        <w:t xml:space="preserve">“same”</w:t>
-      </w:r>
-      <w:r>
-        <w:t xml:space="preserve"> </w:t>
-      </w:r>
-      <w:r>
-        <w:t xml:space="preserve">is correct, and positive on Easy trials (</w:t>
+        <w:t xml:space="preserve">Drift was negative on Standard trials and positive on Easy trials (</w:t>
       </w:r>
       <w:hyperlink w:anchor="fig-condition-params">
         <w:r>
@@ -1942,25 +1608,7 @@
         </w:r>
       </w:hyperlink>
       <w:r>
-        <w:t xml:space="preserve">). Drift was also negative on Hard trials (low effort; ADT: v = −0.575, 95% CrI [−0.675, −0.476]; VDT: v = −0.525, 95% CrI [−0.627, −0.425]). These stimuli differed from the standard, but evidence still accumulated toward</w:t>
-      </w:r>
-      <w:r>
-        <w:t xml:space="preserve"> </w:t>
-      </w:r>
-      <w:r>
-        <w:t xml:space="preserve">“same”</w:t>
-      </w:r>
-      <w:r>
-        <w:t xml:space="preserve">, so most Hard trials ended in an incorrect response. Relative to Standard trials, drift was higher on Hard (β = 0.468, 95% CrI [0.396, 0.543], P(β &gt; 0) &gt; .999) and Easy trials (β = 1.828, 95% CrI [1.750, 1.906], P(β &gt; 0) &gt; .999). Both differences were larger in the VDT than in the ADT (Hard × VDT: β = 0.341, 95% CrI [0.257, 0.426], P(β &gt; 0) &gt; .999; Easy × VDT: β = 0.771, 95% CrI [0.676, 0.866], P(β &gt; 0) &gt; .999). Boundary separation was narrower on Hard (β = −0.098, 95% CrI [−0.118, −0.078], P(β &lt; 0) &gt; .999; −9.3% [−11.1, −7.5]) and Easy trials (β = −0.128, 95% CrI [−0.150, −0.106], P(β &lt; 0) &gt; .999; −12.0% [−14.0, −10.1]) than on Standard trials. Standard, Hard and Easy trials were randomly intermixed, so these boundary differences cannot reflect a setting chosen before the trial</w:t>
-      </w:r>
-      <w:r>
-        <w:t xml:space="preserve"> </w:t>
-      </w:r>
-      <w:r>
-        <w:t xml:space="preserve">(Ratcliff &amp; McKoon, 2008)</w:t>
-      </w:r>
-      <w:r>
-        <w:t xml:space="preserve">. We treat them as descriptive (Section 4.4). Boundary separation did not differ between tasks (β = −0.003, 95% CrI [−0.018, 0.011], P(β &lt; 0) = .680, 100% in ROPE). In both tasks the starting point lay closer to the</w:t>
+        <w:t xml:space="preserve">). Drift on Hard trials was also negative (low effort; ADT: v = −0.575, 95% CrI [−0.675, −0.476]; VDT: v = −0.525, 95% CrI [−0.627, −0.425]). Relative to Standard trials, drift was higher on Hard (β = 0.468, 95% CrI [0.396, 0.543], P(β &gt; 0) &gt; .999) and Easy trials (β = 1.828, 95% CrI [1.750, 1.906], P(β &gt; 0) &gt; .999), and both differences were larger in the VDT than in the ADT (Hard × VDT: β = 0.341, 95% CrI [0.257, 0.426], P(β &gt; 0) &gt; .999; Easy × VDT: β = 0.771, 95% CrI [0.676, 0.866], P(β &gt; 0) &gt; .999). Boundary separation was narrower on Hard (β = −0.098, 95% CrI [−0.118, −0.078], P(β &lt; 0) &gt; .999; −9.3% [−11.1, −7.5]) and Easy trials (β = −0.128, 95% CrI [−0.150, −0.106], P(β &lt; 0) &gt; .999; −12.0% [−14.0, −10.1]) than on Standard trials, and it did not differ between tasks (β = −0.003, 95% CrI [−0.018, 0.011], P(β &lt; 0) = .680, 100% in ROPE). In both tasks the starting point lay above 0.5, toward the</w:t>
       </w:r>
       <w:r>
         <w:t xml:space="preserve"> </w:t>
@@ -2004,7 +1652,7 @@
         <w:t xml:space="preserve"> </w:t>
       </w:r>
       <w:r>
-        <w:t xml:space="preserve">= 0.538 [0.522, 0.555]), slightly less so in the VDT (β = −0.054, 95% CrI [−0.099, −0.010], P(β &lt; 0) = .992).</w:t>
+        <w:t xml:space="preserve">= 0.538 [0.522, 0.555]), and it was slightly lower in the VDT (β = −0.054, 95% CrI [−0.099, −0.010], P(β &lt; 0) = .992).</w:t>
       </w:r>
     </w:p>
     <w:tbl>
@@ -2101,7 +1749,22 @@
         <w:t xml:space="preserve"> </w:t>
       </w:r>
       <w:r>
-        <w:t xml:space="preserve">Effort effects were estimated in the same model and are reported in the same way (</w:t>
+        <w:t xml:space="preserve">High effort shifted drift toward</w:t>
+      </w:r>
+      <w:r>
+        <w:t xml:space="preserve"> </w:t>
+      </w:r>
+      <w:r>
+        <w:t xml:space="preserve">“same”</w:t>
+      </w:r>
+      <w:r>
+        <w:t xml:space="preserve"> </w:t>
+      </w:r>
+      <w:r>
+        <w:t xml:space="preserve">on all trials (drift criterion: β = −0.053, 95% CrI [−0.103, −0.003], P(β &lt; 0) = .981;</w:t>
+      </w:r>
+      <w:r>
+        <w:t xml:space="preserve"> </w:t>
       </w:r>
       <w:hyperlink w:anchor="fig-effort-forest">
         <w:r>
@@ -2126,19 +1789,7 @@
         </w:r>
       </w:hyperlink>
       <w:r>
-        <w:t xml:space="preserve">). High effort shifted drift toward</w:t>
-      </w:r>
-      <w:r>
-        <w:t xml:space="preserve"> </w:t>
-      </w:r>
-      <w:r>
-        <w:t xml:space="preserve">“same”</w:t>
-      </w:r>
-      <w:r>
-        <w:t xml:space="preserve"> </w:t>
-      </w:r>
-      <w:r>
-        <w:t xml:space="preserve">on all trials (drift criterion: β = −0.053, 95% CrI [−0.103, −0.003], P(β &lt; 0) = .981). There was no evidence that it changed how strongly drift separated identical from different stimuli (evidence quality: β = −0.013, 95% CrI [−0.052, 0.028], P(β &lt; 0) = .730), although the interval does not rule out a small decline. Drift decreased on trials with a different comparison stimulus (β = −0.065, 95% CrI [−0.111, −0.021], P(β &lt; 0) = .998); on Standard trials the change was smaller and its interval included zero (β = −0.041, 95% CrI [−0.119, 0.038], P(β &lt; 0) = .845). High effort widened the boundary by +2.0% [0.6, 3.4]. This change lay entirely within the region of practical equivalence (100% in ROPE). The starting point was unchanged (β = −0.005, 95% CrI [−0.048, 0.037], P(β &lt; 0) = .590, 98% in ROPE).</w:t>
+        <w:t xml:space="preserve">). The effort × stimulus term, which indexes evidence quality, was close to zero (β = −0.013, 95% CrI [−0.052, 0.028], P(β &lt; 0) = .730). Drift decreased on trials with a different comparison stimulus (β = −0.065, 95% CrI [−0.111, −0.021], P(β &lt; 0) = .998); on Standard trials the change was smaller, and its interval included zero (β = −0.041, 95% CrI [−0.119, 0.038], P(β &lt; 0) = .845). High effort widened the boundary by +2.0% [0.6, 3.4], with the whole posterior inside the ROPE (100% in ROPE). The starting point did not change (β = −0.005, 95% CrI [−0.048, 0.037], P(β &lt; 0) = .590, 98% in ROPE).</w:t>
       </w:r>
     </w:p>
     <w:p>
@@ -2146,7 +1797,7 @@
         <w:pStyle w:val="BodyText"/>
       </w:pPr>
       <w:r>
-        <w:t xml:space="preserve">In observed accuracy, high effort was associated with lower accuracy on Hard trials (High − Low: −4.5 percentage points, 95% CI [−6.6, −2.4], OR = 0.80, p &lt; .001). On Standard trials accuracy was slightly higher, a difference that was not significant (+1.7 percentage points, 95% CI [−0.1, 3.5], OR = 1.23, p = .068). Accuracy on Easy trials did not change (−0.9 percentage points, 95% CI [−2.4, 0.6], OR = 0.92, p = .226;</w:t>
+        <w:t xml:space="preserve">Under high effort, observed accuracy was lower on Hard trials (High − Low: −4.5 percentage points, 95% CI [−6.6, −2.4], OR = 0.80, p &lt; .001). It was slightly, but not significantly, higher on Standard trials (+1.7 percentage points, 95% CI [−0.1, 3.5], OR = 1.23, p = .068) and unchanged on Easy trials (−0.9 percentage points, 95% CI [−2.4, 0.6], OR = 0.92, p = .226;</w:t>
       </w:r>
       <w:r>
         <w:t xml:space="preserve"> </w:t>
@@ -2860,7 +2511,7 @@
         <w:pStyle w:val="FirstParagraph"/>
       </w:pPr>
       <w:r>
-        <w:t xml:space="preserve">The drift criterion shift was unchanged when the effort effects were allowed to vary across participants (M4r: β = −0.053, 95% CrI [−0.104, −0.004], P(β &lt; 0) = .982). The between-participant SD of that effect was small (0.019, 95% CrI [0.001, 0.062]). The shift was also stable at RT cutoffs of 0.15 s (β = −0.060, 95% CrI [−0.107, −0.011], P(β &lt; 0) = .993) and 0.25 s (β = −0.061, 95% CrI [−0.111, −0.010], P(β &lt; 0) = .992). Excluding the 13 participants with near-chance accuracy left the point estimate unchanged. With N = 54, however, the interval included zero (β = −0.052, 95% CrI [−0.106, 0.003], P(β &lt; 0) = .969). When effort effects were allowed to differ by task (M4b), the criterion shift was larger in the ADT (β = −0.077, 95% CrI [−0.139, −0.017], P(β &lt; 0) = .994) than in the VDT (β = −0.024, 95% CrI [−0.087, 0.040], P(β &lt; 0) = .767), but the task difference was uncertain (β = 0.054, 95% CrI [−0.024, 0.131], P(β &gt; 0) = .912). Evidence quality was null in every variant. The boundary effect was positive at the 0.25-s cutoff (β = 0.019, 95% CrI [0.005, 0.032], P(β &gt; 0) = .997; +1.9% [0.5, 3.2]) and after the near-chance exclusion (β = 0.016, 95% CrI [0.001, 0.031], P(β &gt; 0) = .985; +1.6% [0.1, 3.2]), but at the 0.15-s cutoff its interval included zero (β = 0.012, 95% CrI [−0.002, 0.026], P(β &gt; 0) = .955; +1.2% [−0.2, 2.6];</w:t>
+        <w:t xml:space="preserve">The drift criterion shift was unchanged when the effort effects were allowed to vary across participants (M4r: β = −0.053, 95% CrI [−0.104, −0.004], P(β &lt; 0) = .982). The between-participant SD of that effect was small (0.019, 95% CrI [0.001, 0.062]). The shift was also stable at RT cutoffs of 0.15 s (β = −0.060, 95% CrI [−0.107, −0.011], P(β &lt; 0) = .993) and 0.25 s (β = −0.061, 95% CrI [−0.111, −0.010], P(β &lt; 0) = .992). Excluding the 13 participants with near-chance accuracy left the point estimate unchanged. With N = 54, however, the interval included zero (β = −0.052, 95% CrI [−0.106, 0.003], P(β &lt; 0) = .969). When effort effects were allowed to differ by task (M4b), the criterion shift was larger in the ADT (β = −0.077, 95% CrI [−0.139, −0.017], P(β &lt; 0) = .994) than in the VDT (β = −0.024, 95% CrI [−0.087, 0.040], P(β &lt; 0) = .767), but the task difference was uncertain (β = 0.054, 95% CrI [−0.024, 0.131], P(β &gt; 0) = .912). The evidence-quality term was close to zero in every variant. The boundary effect was positive at the 0.25-s cutoff (β = 0.019, 95% CrI [0.005, 0.032], P(β &gt; 0) = .997; +1.9% [0.5, 3.2]) and after the near-chance exclusion (β = 0.016, 95% CrI [0.001, 0.031], P(β &gt; 0) = .985; +1.6% [0.1, 3.2]), but at the 0.15-s cutoff its interval included zero (β = 0.012, 95% CrI [−0.002, 0.026], P(β &gt; 0) = .955; +1.2% [−0.2, 2.6];</w:t>
       </w:r>
       <w:r>
         <w:t xml:space="preserve"> </w:t>
@@ -2902,7 +2553,7 @@
         <w:t xml:space="preserve"> </w:t>
       </w:r>
       <w:r>
-        <w:t xml:space="preserve">High effort dilated the pupil during the grip period in both tasks (ADT:</w:t>
+        <w:t xml:space="preserve">High effort increased pupil size during the grip in both tasks (ADT:</w:t>
       </w:r>
       <w:r>
         <w:t xml:space="preserve"> </w:t>
@@ -2946,7 +2597,7 @@
         <w:t xml:space="preserve"> </w:t>
       </w:r>
       <w:r>
-        <w:t xml:space="preserve">= 0.21, t(28) = 2.08, p = .047). In the post-probe window, the direction of the effort effect depended on the baseline. Relative to the pre-probe baseline used for the TEPR, the response was smaller under high effort (ADT:</w:t>
+        <w:t xml:space="preserve">= 0.21, t(28) = 2.08, p = .047). In the TEPR window, the direction of the effort effect depended on the baseline. Relative to the pre-probe baseline, the response was smaller under high effort (ADT:</w:t>
       </w:r>
       <w:r>
         <w:t xml:space="preserve"> </w:t>
@@ -3009,7 +2660,7 @@
         <w:t xml:space="preserve"> </w:t>
       </w:r>
       <w:r>
-        <w:t xml:space="preserve">= 1.00, t(30) = 2.45, p = .020) and unchanged in the VDT (</w:t>
+        <w:t xml:space="preserve">= 1.00, t(30) = 2.45, p = .020) and did not differ in the VDT (</w:t>
       </w:r>
       <w:r>
         <w:rPr>
@@ -3056,7 +2707,7 @@
         </w:r>
       </w:hyperlink>
       <w:r>
-        <w:t xml:space="preserve">). In the pupil subsample, high effort widened the boundary (β = 0.030, 95% CrI [0.003, 0.056], P(β &gt; 0) = .984; +3.0% [0.3, 5.8]). The drift criterion shift had the same sign as in the full sample, with a wider interval (β = −0.048, 95% CrI [−0.142, 0.045], P(β &lt; 0) = .840).</w:t>
+        <w:t xml:space="preserve">). In the pupil sample, high effort widened the boundary (β = 0.030, 95% CrI [0.003, 0.056], P(β &gt; 0) = .984; +3.0% [0.3, 5.8]), and the drift criterion shift had the same sign as in the full sample (β = −0.048, 95% CrI [−0.142, 0.045], P(β &lt; 0) = .840).</w:t>
       </w:r>
     </w:p>
     <w:p>
@@ -3068,13 +2719,13 @@
           <w:b/>
           <w:bCs/>
         </w:rPr>
-        <w:t xml:space="preserve">Which parameter tracked the TEPR.</w:t>
-      </w:r>
-      <w:r>
-        <w:t xml:space="preserve"> </w:t>
-      </w:r>
-      <w:r>
-        <w:t xml:space="preserve">Trial-wise TEPR predicted boundary separation. Each within-person SD increase in TEPR widened the boundary by +7.9% [6.5, 9.2] and improved out-of-sample prediction (P3: ΔELPD = 67.9 ± 9.1;</w:t>
+        <w:t xml:space="preserve">Pupil predictors of decision parameters.</w:t>
+      </w:r>
+      <w:r>
+        <w:t xml:space="preserve"> </w:t>
+      </w:r>
+      <w:r>
+        <w:t xml:space="preserve">Trial-wise TEPR predicted boundary separation: each within-person SD increase in TEPR was associated with a +7.9% [6.5, 9.2] wider boundary, and adding TEPR improved out-of-sample prediction (P3: ΔELPD = 67.9 ± 9.1;</w:t>
       </w:r>
       <w:r>
         <w:t xml:space="preserve"> </w:t>
@@ -3102,7 +2753,7 @@
         </w:r>
       </w:hyperlink>
       <w:r>
-        <w:t xml:space="preserve">). TEPR did not predict the starting point (P1: β = 0.008, 95% CrI [−0.023, 0.041], P(β &gt; 0) = .695, ΔELPD = −0.2 ± 0.5). In the drift model, higher TEPR was associated with weaker separation between identical and different stimuli (TEPR × stimulus: β = −0.089, 95% CrI [−0.128, −0.050], P(β &lt; 0) &gt; .999), with a smaller and less certain predictive gain (ΔELPD = 8.8 ± 5.1;</w:t>
+        <w:t xml:space="preserve">). TEPR did not predict the starting point (P1: β = 0.008, 95% CrI [−0.023, 0.041], P(β &gt; 0) = .695, ΔELPD = −0.2 ± 0.5). Higher TEPR was associated with a smaller difference between drift on identical and different stimuli (P2, TEPR × stimulus: β = −0.089, 95% CrI [−0.128, −0.050], P(β &lt; 0) &gt; .999), with a smaller and less certain predictive gain (ΔELPD = 8.8 ± 5.1;</w:t>
       </w:r>
       <w:r>
         <w:t xml:space="preserve"> </w:t>
@@ -3134,7 +2785,7 @@
         <w:t xml:space="preserve"> </w:t>
       </w:r>
       <w:r>
-        <w:t xml:space="preserve">The TEPR window overlapped the response on most trials, and TEPR correlated with RT within participants (r = .30 [.23, .36]). The association with boundary separation remained after the slowest 20% of trials in each participant and task were removed (P3_rt: +5.0% [3.3, 6.7], ΔELPD = 17.6 ± 4.7). Pupil size in the 0.5 s before the response did not predict boundary separation (P7: +1.2% [−0.2, 2.7], ΔELPD = 0.2 ± 1.7). Measures taken before the decision showed small associations in the same direction: previous-trial TEPR (P6: +2.8% [1.3, 4.4], ΔELPD = 6.8 ± 2.7) and pre-squeeze baseline pupil (P5: +1.5% [0.2, 2.9], ΔELPD = 1.7 ± 1.8). Grip-period pupil showed a small association in the opposite direction (P8: −1.7% [−3.1, −0.4], ΔELPD = 2.3 ± 2.0). Of the measures preceding the decision, only the previous-trial TEPR improved prediction by more than two standard errors.</w:t>
+        <w:t xml:space="preserve">TEPR correlated with RT within participants (r = .30 [.23, .36]). The TEPR–boundary association remained after the slowest 20% of trials in each participant and task were removed (P3_rt: +5.0% [3.3, 6.7], ΔELPD = 17.6 ± 4.7). Pupil size in the 0.5 s before the response did not predict boundary separation (P7: +1.2% [−0.2, 2.7], ΔELPD = 0.2 ± 1.7). Previous-trial TEPR (P6: +2.8% [1.3, 4.4], ΔELPD = 6.8 ± 2.7) and pre-squeeze baseline pupil (P5: +1.5% [0.2, 2.9], ΔELPD = 1.7 ± 1.8) were positively associated with boundary separation, and grip-period pupil was negatively associated with it (P8: −1.7% [−3.1, −0.4], ΔELPD = 2.3 ± 2.0).</w:t>
       </w:r>
     </w:p>
     <w:tbl>
@@ -3962,7 +3613,7 @@
         </w:r>
       </w:hyperlink>
       <w:r>
-        <w:t xml:space="preserve">). It fit the RT distributions less well. 27.5% of observed RT quantiles fell inside the 95% predictive intervals, and observed median RTs were on average 175 ms slower than predicted (</w:t>
+        <w:t xml:space="preserve">). Of the observed RT quantiles, 27.5% fell inside the 95% predictive intervals, and observed median RTs were on average 175 ms slower than predicted (</w:t>
       </w:r>
       <w:hyperlink w:anchor="suppfig-ppc">
         <w:r>
@@ -3973,7 +3624,7 @@
         </w:r>
       </w:hyperlink>
       <w:r>
-        <w:t xml:space="preserve">). The misfit was concentrated in minority responses (</w:t>
+        <w:t xml:space="preserve">). The discrepancy was largest for minority responses (</w:t>
       </w:r>
       <w:r>
         <w:t xml:space="preserve">“different”</w:t>
@@ -4006,7 +3657,23 @@
         <w:t xml:space="preserve"> </w:t>
       </w:r>
       <w:r>
-        <w:t xml:space="preserve">on Hard trials), which were slower than predicted. Non-decision time tracked the RT cutoff: 0.483 s, 0.527 s and 0.572 s at cutoffs of 0.15 s, 0.20 s and 0.25 s.</w:t>
+        <w:t xml:space="preserve">on Hard trials), which were slower than predicted. After moment matching and exact refits, no observation in any compared model had a Pareto</w:t>
+      </w:r>
+      <w:r>
+        <w:t xml:space="preserve"> </w:t>
+      </w:r>
+      <w:r>
+        <w:rPr>
+          <w:i/>
+          <w:iCs/>
+        </w:rPr>
+        <w:t xml:space="preserve">k</w:t>
+      </w:r>
+      <w:r>
+        <w:t xml:space="preserve"> </w:t>
+      </w:r>
+      <w:r>
+        <w:t xml:space="preserve">above 0.7. Non-decision time changed with the RT cutoff: 0.483 s, 0.527 s and 0.572 s at cutoffs of 0.15 s, 0.20 s and 0.25 s.</w:t>
       </w:r>
     </w:p>
     <w:bookmarkEnd w:id="46"/>
@@ -4025,7 +3692,7 @@
         <w:pStyle w:val="FirstParagraph"/>
       </w:pPr>
       <w:r>
-        <w:t xml:space="preserve">We asked whether concurrent physical effort changes how older adults make perceptual decisions by reducing the quality of the evidence they accumulate, by changing how much evidence they require, or neither. High effort did not credibly reduce evidence quality. Instead it shifted drift toward</w:t>
+        <w:t xml:space="preserve">We asked whether concurrent physical effort changes how older adults make perceptual decisions by reducing the quality of the evidence they accumulate, by changing how much evidence they require, or neither. High effort did not reduce evidence quality. Instead it shifted drift toward</w:t>
       </w:r>
       <w:r>
         <w:t xml:space="preserve"> </w:t>
@@ -4178,78 +3845,12 @@
         <w:t xml:space="preserve">(Cavanagh et al., 2014)</w:t>
       </w:r>
       <w:r>
-        <w:t xml:space="preserve">. Three results argue against reading the association as arousal causing caution:</w:t>
+        <w:t xml:space="preserve">. Three results, however, argue against reading the association as arousal causing caution. First, the TEPR window overlapped the response, and TEPR correlated with RT within participants. A wider boundary lengthens the decision, and a longer decision lets more of the pupil response accumulate in the window; the association weakened when the slowest trials were removed, although it did not disappear. Second, pupil size in the 0.5 s before the response did not predict boundary separation. Third, measures taken before the decision showed associations in the same direction, but only the previous-trial TEPR improved prediction by more than twice its standard error, and that association may reflect the carry-over of slow decisions from one trial to the next rather than arousal.</w:t>
       </w:r>
     </w:p>
     <w:p>
       <w:pPr>
-        <w:pStyle w:val="Compact"/>
-        <w:numPr>
-          <w:ilvl w:val="0"/>
-          <w:numId w:val="1005"/>
-        </w:numPr>
-      </w:pPr>
-      <w:r>
-        <w:rPr>
-          <w:b/>
-          <w:bCs/>
-        </w:rPr>
-        <w:t xml:space="preserve">Overlap with decision time.</w:t>
-      </w:r>
-      <w:r>
-        <w:t xml:space="preserve"> </w:t>
-      </w:r>
-      <w:r>
-        <w:t xml:space="preserve">The TEPR window overlapped the response, and TEPR correlated with RT within participants. A wider boundary lengthens the decision, and a longer decision lets more of the pupil response accumulate in the window. The association weakened when the slowest trials were removed, although it did not disappear.</w:t>
-      </w:r>
-    </w:p>
-    <w:p>
-      <w:pPr>
-        <w:pStyle w:val="Compact"/>
-        <w:numPr>
-          <w:ilvl w:val="0"/>
-          <w:numId w:val="1005"/>
-        </w:numPr>
-      </w:pPr>
-      <w:r>
-        <w:rPr>
-          <w:b/>
-          <w:bCs/>
-        </w:rPr>
-        <w:t xml:space="preserve">No signal just before the response.</w:t>
-      </w:r>
-      <w:r>
-        <w:t xml:space="preserve"> </w:t>
-      </w:r>
-      <w:r>
-        <w:t xml:space="preserve">Pupil size in the 0.5 s before the response did not predict boundary separation.</w:t>
-      </w:r>
-    </w:p>
-    <w:p>
-      <w:pPr>
-        <w:pStyle w:val="Compact"/>
-        <w:numPr>
-          <w:ilvl w:val="0"/>
-          <w:numId w:val="1005"/>
-        </w:numPr>
-      </w:pPr>
-      <w:r>
-        <w:rPr>
-          <w:b/>
-          <w:bCs/>
-        </w:rPr>
-        <w:t xml:space="preserve">Weak predictive gain from earlier measures.</w:t>
-      </w:r>
-      <w:r>
-        <w:t xml:space="preserve"> </w:t>
-      </w:r>
-      <w:r>
-        <w:t xml:space="preserve">Measures taken before the decision showed associations in the same direction. Only the previous-trial TEPR improved prediction reliably, and it may reflect the carry-over of slow decisions from one trial to the next rather than arousal.</w:t>
-      </w:r>
-    </w:p>
-    <w:p>
-      <w:pPr>
-        <w:pStyle w:val="FirstParagraph"/>
+        <w:pStyle w:val="BodyText"/>
       </w:pPr>
       <w:r>
         <w:t xml:space="preserve">The TEPR was also associated with weaker separation of identical and different stimuli in the drift model. This fits evidence that post-decision pupil responses scale with decision uncertainty</w:t>
@@ -21143,3792 +20744,6 @@
     </w:tbl>
     <w:bookmarkEnd w:id="153"/>
     <w:bookmarkEnd w:id="154"/>
-    <w:bookmarkStart w:id="155" w:name="Xdfda95695fe65d44131e064e6275cc9a4db42ea"/>
-    <w:p>
-      <w:pPr>
-        <w:pStyle w:val="Heading1"/>
-      </w:pPr>
-      <w:r>
-        <w:t xml:space="preserve">Appendix: Response to advisor comments (draft only)</w:t>
-      </w:r>
-    </w:p>
-    <w:tbl>
-      <w:tblPr>
-        <w:tblStyle w:val="Table"/>
-        <w:tblW w:type="pct" w:w="5000"/>
-        <w:tblLayout w:type="fixed"/>
-        <w:tblLook w:firstRow="1" w:lastRow="0" w:firstColumn="0" w:lastColumn="0" w:noHBand="0" w:noVBand="0" w:val="0020"/>
-      </w:tblPr>
-      <w:tblGrid>
-        <w:gridCol w:w="1980"/>
-        <w:gridCol w:w="1980"/>
-        <w:gridCol w:w="1980"/>
-        <w:gridCol w:w="1980"/>
-      </w:tblGrid>
-      <w:tr>
-        <w:trPr>
-          <w:tblHeader w:val="on"/>
-        </w:trPr>
-        <w:tc>
-          <w:tcPr/>
-          <w:p>
-            <w:pPr>
-              <w:pStyle w:val="Compact"/>
-            </w:pPr>
-            <w:r>
-              <w:t xml:space="preserve">ID</w:t>
-            </w:r>
-          </w:p>
-        </w:tc>
-        <w:tc>
-          <w:tcPr/>
-          <w:p>
-            <w:pPr>
-              <w:pStyle w:val="Compact"/>
-            </w:pPr>
-            <w:r>
-              <w:t xml:space="preserve">Section</w:t>
-            </w:r>
-          </w:p>
-        </w:tc>
-        <w:tc>
-          <w:tcPr/>
-          <w:p>
-            <w:pPr>
-              <w:pStyle w:val="Compact"/>
-            </w:pPr>
-            <w:r>
-              <w:t xml:space="preserve">Comment</w:t>
-            </w:r>
-          </w:p>
-        </w:tc>
-        <w:tc>
-          <w:tcPr/>
-          <w:p>
-            <w:pPr>
-              <w:pStyle w:val="Compact"/>
-            </w:pPr>
-            <w:r>
-              <w:t xml:space="preserve">Response</w:t>
-            </w:r>
-          </w:p>
-        </w:tc>
-      </w:tr>
-      <w:tr>
-        <w:tc>
-          <w:tcPr/>
-          <w:p>
-            <w:pPr>
-              <w:pStyle w:val="Compact"/>
-            </w:pPr>
-            <w:r>
-              <w:t xml:space="preserve">C0</w:t>
-            </w:r>
-          </w:p>
-        </w:tc>
-        <w:tc>
-          <w:tcPr/>
-          <w:p>
-            <w:pPr>
-              <w:pStyle w:val="Compact"/>
-            </w:pPr>
-            <w:r>
-              <w:t xml:space="preserve">Abstract</w:t>
-            </w:r>
-          </w:p>
-        </w:tc>
-        <w:tc>
-          <w:tcPr/>
-          <w:p>
-            <w:pPr>
-              <w:pStyle w:val="Compact"/>
-            </w:pPr>
-            <w:r>
-              <w:t xml:space="preserve">state as sig or not sig</w:t>
-            </w:r>
-          </w:p>
-        </w:tc>
-        <w:tc>
-          <w:tcPr/>
-          <w:p>
-            <w:pPr>
-              <w:pStyle w:val="Compact"/>
-            </w:pPr>
-            <w:r>
-              <w:t xml:space="preserve">Effects are stated with their statistics and direction, without unqualified labels.</w:t>
-            </w:r>
-          </w:p>
-        </w:tc>
-      </w:tr>
-      <w:tr>
-        <w:tc>
-          <w:tcPr/>
-          <w:p>
-            <w:pPr>
-              <w:pStyle w:val="Compact"/>
-            </w:pPr>
-            <w:r>
-              <w:t xml:space="preserve">C1</w:t>
-            </w:r>
-          </w:p>
-        </w:tc>
-        <w:tc>
-          <w:tcPr/>
-          <w:p>
-            <w:pPr>
-              <w:pStyle w:val="Compact"/>
-            </w:pPr>
-            <w:r>
-              <w:t xml:space="preserve">Abstract</w:t>
-            </w:r>
-          </w:p>
-        </w:tc>
-        <w:tc>
-          <w:tcPr/>
-          <w:p>
-            <w:pPr>
-              <w:pStyle w:val="Compact"/>
-            </w:pPr>
-            <w:r>
-              <w:t xml:space="preserve">sig or not sig?</w:t>
-            </w:r>
-          </w:p>
-        </w:tc>
-        <w:tc>
-          <w:tcPr/>
-          <w:p>
-            <w:pPr>
-              <w:pStyle w:val="Compact"/>
-            </w:pPr>
-            <w:r>
-              <w:t xml:space="preserve">Boundary effect stated as credibly positive but within the ROPE.</w:t>
-            </w:r>
-          </w:p>
-        </w:tc>
-      </w:tr>
-      <w:tr>
-        <w:tc>
-          <w:tcPr/>
-          <w:p>
-            <w:pPr>
-              <w:pStyle w:val="Compact"/>
-            </w:pPr>
-            <w:r>
-              <w:t xml:space="preserve">C2</w:t>
-            </w:r>
-          </w:p>
-        </w:tc>
-        <w:tc>
-          <w:tcPr/>
-          <w:p>
-            <w:pPr>
-              <w:pStyle w:val="Compact"/>
-            </w:pPr>
-            <w:r>
-              <w:t xml:space="preserve">Abstract</w:t>
-            </w:r>
-          </w:p>
-        </w:tc>
-        <w:tc>
-          <w:tcPr/>
-          <w:p>
-            <w:pPr>
-              <w:pStyle w:val="Compact"/>
-            </w:pPr>
-            <w:r>
-              <w:t xml:space="preserve">on what DV?</w:t>
-            </w:r>
-          </w:p>
-        </w:tc>
-        <w:tc>
-          <w:tcPr/>
-          <w:p>
-            <w:pPr>
-              <w:pStyle w:val="Compact"/>
-            </w:pPr>
-            <w:r>
-              <w:t xml:space="preserve">Pupil result tied to its outcome (boundary separation) and model.</w:t>
-            </w:r>
-          </w:p>
-        </w:tc>
-      </w:tr>
-      <w:tr>
-        <w:tc>
-          <w:tcPr/>
-          <w:p>
-            <w:pPr>
-              <w:pStyle w:val="Compact"/>
-            </w:pPr>
-            <w:r>
-              <w:t xml:space="preserve">C3</w:t>
-            </w:r>
-          </w:p>
-        </w:tc>
-        <w:tc>
-          <w:tcPr/>
-          <w:p>
-            <w:pPr>
-              <w:pStyle w:val="Compact"/>
-            </w:pPr>
-            <w:r>
-              <w:t xml:space="preserve">Abstract</w:t>
-            </w:r>
-          </w:p>
-        </w:tc>
-        <w:tc>
-          <w:tcPr/>
-          <w:p>
-            <w:pPr>
-              <w:pStyle w:val="Compact"/>
-            </w:pPr>
-            <w:r>
-              <w:t xml:space="preserve">sig or not sig?</w:t>
-            </w:r>
-          </w:p>
-        </w:tc>
-        <w:tc>
-          <w:tcPr/>
-          <w:p>
-            <w:pPr>
-              <w:pStyle w:val="Compact"/>
-            </w:pPr>
-            <w:r>
-              <w:t xml:space="preserve">Stated with its estimate; duration caveat given.</w:t>
-            </w:r>
-          </w:p>
-        </w:tc>
-      </w:tr>
-      <w:tr>
-        <w:tc>
-          <w:tcPr/>
-          <w:p>
-            <w:pPr>
-              <w:pStyle w:val="Compact"/>
-            </w:pPr>
-            <w:r>
-              <w:t xml:space="preserve">C4</w:t>
-            </w:r>
-          </w:p>
-        </w:tc>
-        <w:tc>
-          <w:tcPr/>
-          <w:p>
-            <w:pPr>
-              <w:pStyle w:val="Compact"/>
-            </w:pPr>
-            <w:r>
-              <w:t xml:space="preserve">1 / 4.1</w:t>
-            </w:r>
-          </w:p>
-        </w:tc>
-        <w:tc>
-          <w:tcPr/>
-          <w:p>
-            <w:pPr>
-              <w:pStyle w:val="Compact"/>
-            </w:pPr>
-            <w:r>
-              <w:t xml:space="preserve">does it matter that they were older adults? what evidence do you have that this is about an aging CNS vs any age CNS?</w:t>
-            </w:r>
-          </w:p>
-        </w:tc>
-        <w:tc>
-          <w:tcPr/>
-          <w:p>
-            <w:pPr>
-              <w:pStyle w:val="Compact"/>
-            </w:pPr>
-            <w:r>
-              <w:t xml:space="preserve">Claims about the aging nervous system removed. Age is discussed only through prior age-comparison studies, and the Discussion states that this chapter has no younger group.</w:t>
-            </w:r>
-          </w:p>
-        </w:tc>
-      </w:tr>
-      <w:tr>
-        <w:tc>
-          <w:tcPr/>
-          <w:p>
-            <w:pPr>
-              <w:pStyle w:val="Compact"/>
-            </w:pPr>
-            <w:r>
-              <w:t xml:space="preserve">C5</w:t>
-            </w:r>
-          </w:p>
-        </w:tc>
-        <w:tc>
-          <w:tcPr/>
-          <w:p>
-            <w:pPr>
-              <w:pStyle w:val="Compact"/>
-            </w:pPr>
-            <w:r>
-              <w:t xml:space="preserve">Abstract</w:t>
-            </w:r>
-          </w:p>
-        </w:tc>
-        <w:tc>
-          <w:tcPr/>
-          <w:p>
-            <w:pPr>
-              <w:pStyle w:val="Compact"/>
-            </w:pPr>
-            <w:r>
-              <w:t xml:space="preserve">which DV (with sig effects) above specifically speaks to this SNR issue?</w:t>
-            </w:r>
-          </w:p>
-        </w:tc>
-        <w:tc>
-          <w:tcPr/>
-          <w:p>
-            <w:pPr>
-              <w:pStyle w:val="Compact"/>
-            </w:pPr>
-            <w:r>
-              <w:t xml:space="preserve">Signal-to-noise claim removed; evidence quality is defined by the effort × stimulus term.</w:t>
-            </w:r>
-          </w:p>
-        </w:tc>
-      </w:tr>
-      <w:tr>
-        <w:tc>
-          <w:tcPr/>
-          <w:p>
-            <w:pPr>
-              <w:pStyle w:val="Compact"/>
-            </w:pPr>
-            <w:r>
-              <w:t xml:space="preserve">C6</w:t>
-            </w:r>
-          </w:p>
-        </w:tc>
-        <w:tc>
-          <w:tcPr/>
-          <w:p>
-            <w:pPr>
-              <w:pStyle w:val="Compact"/>
-            </w:pPr>
-            <w:r>
-              <w:t xml:space="preserve">Abstract</w:t>
-            </w:r>
-          </w:p>
-        </w:tc>
-        <w:tc>
-          <w:tcPr/>
-          <w:p>
-            <w:pPr>
-              <w:pStyle w:val="Compact"/>
-            </w:pPr>
-            <w:r>
-              <w:t xml:space="preserve">which DVs (with non-sig effects) capture this?</w:t>
-            </w:r>
-          </w:p>
-        </w:tc>
-        <w:tc>
-          <w:tcPr/>
-          <w:p>
-            <w:pPr>
-              <w:pStyle w:val="Compact"/>
-            </w:pPr>
-            <w:r>
-              <w:t xml:space="preserve">Claim removed; the null effects are stated by parameter.</w:t>
-            </w:r>
-          </w:p>
-        </w:tc>
-      </w:tr>
-      <w:tr>
-        <w:tc>
-          <w:tcPr/>
-          <w:p>
-            <w:pPr>
-              <w:pStyle w:val="Compact"/>
-            </w:pPr>
-            <w:r>
-              <w:t xml:space="preserve">C7</w:t>
-            </w:r>
-          </w:p>
-        </w:tc>
-        <w:tc>
-          <w:tcPr/>
-          <w:p>
-            <w:pPr>
-              <w:pStyle w:val="Compact"/>
-            </w:pPr>
-            <w:r>
-              <w:t xml:space="preserve">1</w:t>
-            </w:r>
-          </w:p>
-        </w:tc>
-        <w:tc>
-          <w:tcPr/>
-          <w:p>
-            <w:pPr>
-              <w:pStyle w:val="Compact"/>
-            </w:pPr>
-            <w:r>
-              <w:t xml:space="preserve">this topic sentence does not fit most other sentences in the paragraph</w:t>
-            </w:r>
-          </w:p>
-        </w:tc>
-        <w:tc>
-          <w:tcPr/>
-          <w:p>
-            <w:pPr>
-              <w:pStyle w:val="Compact"/>
-            </w:pPr>
-            <w:r>
-              <w:t xml:space="preserve">Paragraph rebuilt around one claim (effort as a competitor for capacity), with supporting citations.</w:t>
-            </w:r>
-          </w:p>
-        </w:tc>
-      </w:tr>
-      <w:tr>
-        <w:tc>
-          <w:tcPr/>
-          <w:p>
-            <w:pPr>
-              <w:pStyle w:val="Compact"/>
-            </w:pPr>
-            <w:r>
-              <w:t xml:space="preserve">C8</w:t>
-            </w:r>
-          </w:p>
-        </w:tc>
-        <w:tc>
-          <w:tcPr/>
-          <w:p>
-            <w:pPr>
-              <w:pStyle w:val="Compact"/>
-            </w:pPr>
-            <w:r>
-              <w:t xml:space="preserve">1</w:t>
-            </w:r>
-          </w:p>
-        </w:tc>
-        <w:tc>
-          <w:tcPr/>
-          <w:p>
-            <w:pPr>
-              <w:pStyle w:val="Compact"/>
-            </w:pPr>
-            <w:r>
-              <w:t xml:space="preserve">you’ll want to integrate what was learned from your Ch1 regarding performance and pupil</w:t>
-            </w:r>
-          </w:p>
-        </w:tc>
-        <w:tc>
-          <w:tcPr/>
-          <w:p>
-            <w:pPr>
-              <w:pStyle w:val="Compact"/>
-            </w:pPr>
-            <w:r>
-              <w:t xml:space="preserve">Chapter 1 results summarized in the first paragraph.</w:t>
-            </w:r>
-          </w:p>
-        </w:tc>
-      </w:tr>
-      <w:tr>
-        <w:tc>
-          <w:tcPr/>
-          <w:p>
-            <w:pPr>
-              <w:pStyle w:val="Compact"/>
-            </w:pPr>
-            <w:r>
-              <w:t xml:space="preserve">C9</w:t>
-            </w:r>
-          </w:p>
-        </w:tc>
-        <w:tc>
-          <w:tcPr/>
-          <w:p>
-            <w:pPr>
-              <w:pStyle w:val="Compact"/>
-            </w:pPr>
-            <w:r>
-              <w:t xml:space="preserve">1</w:t>
-            </w:r>
-          </w:p>
-        </w:tc>
-        <w:tc>
-          <w:tcPr/>
-          <w:p>
-            <w:pPr>
-              <w:pStyle w:val="Compact"/>
-            </w:pPr>
-            <w:r>
-              <w:t xml:space="preserve">is this your prediction? also, is all this model integration necessary for your specific study aims?</w:t>
-            </w:r>
-          </w:p>
-        </w:tc>
-        <w:tc>
-          <w:tcPr/>
-          <w:p>
-            <w:pPr>
-              <w:pStyle w:val="Compact"/>
-            </w:pPr>
-            <w:r>
-              <w:t xml:space="preserve">Integrated resource–arousal model removed; the two accounts are stated separately, each with its own prediction.</w:t>
-            </w:r>
-          </w:p>
-        </w:tc>
-      </w:tr>
-      <w:tr>
-        <w:tc>
-          <w:tcPr/>
-          <w:p>
-            <w:pPr>
-              <w:pStyle w:val="Compact"/>
-            </w:pPr>
-            <w:r>
-              <w:t xml:space="preserve">C10</w:t>
-            </w:r>
-          </w:p>
-        </w:tc>
-        <w:tc>
-          <w:tcPr/>
-          <w:p>
-            <w:pPr>
-              <w:pStyle w:val="Compact"/>
-            </w:pPr>
-            <w:r>
-              <w:t xml:space="preserve">1</w:t>
-            </w:r>
-          </w:p>
-        </w:tc>
-        <w:tc>
-          <w:tcPr/>
-          <w:p>
-            <w:pPr>
-              <w:pStyle w:val="Compact"/>
-            </w:pPr>
-            <w:r>
-              <w:t xml:space="preserve">densely jargony. which gross beh measures? how are you measuring degrades sensory processing? how do you know the lower threshold is</w:t>
-            </w:r>
-            <w:r>
-              <w:t xml:space="preserve"> </w:t>
-            </w:r>
-            <w:r>
-              <w:t xml:space="preserve">“deliberate”</w:t>
-            </w:r>
-            <w:r>
-              <w:t xml:space="preserve">?</w:t>
-            </w:r>
-          </w:p>
-        </w:tc>
-        <w:tc>
-          <w:tcPr/>
-          <w:p>
-            <w:pPr>
-              <w:pStyle w:val="Compact"/>
-            </w:pPr>
-            <w:r>
-              <w:t xml:space="preserve">The measures are named (accuracy, RT), and the model parameter that separates each mechanism is specified.</w:t>
-            </w:r>
-          </w:p>
-        </w:tc>
-      </w:tr>
-      <w:tr>
-        <w:tc>
-          <w:tcPr/>
-          <w:p>
-            <w:pPr>
-              <w:pStyle w:val="Compact"/>
-            </w:pPr>
-            <w:r>
-              <w:t xml:space="preserve">C11</w:t>
-            </w:r>
-          </w:p>
-        </w:tc>
-        <w:tc>
-          <w:tcPr/>
-          <w:p>
-            <w:pPr>
-              <w:pStyle w:val="Compact"/>
-            </w:pPr>
-            <w:r>
-              <w:t xml:space="preserve">2.4 / 2.6</w:t>
-            </w:r>
-          </w:p>
-        </w:tc>
-        <w:tc>
-          <w:tcPr/>
-          <w:p>
-            <w:pPr>
-              <w:pStyle w:val="Compact"/>
-            </w:pPr>
-            <w:r>
-              <w:t xml:space="preserve">these are methods details. are they needed to set up the study aims?</w:t>
-            </w:r>
-          </w:p>
-        </w:tc>
-        <w:tc>
-          <w:tcPr/>
-          <w:p>
-            <w:pPr>
-              <w:pStyle w:val="Compact"/>
-            </w:pPr>
-            <w:r>
-              <w:t xml:space="preserve">Luminance and viewing-distance details moved from the Introduction to Apparatus and Pupillometry; the Introduction keeps only what the aims need.</w:t>
-            </w:r>
-          </w:p>
-        </w:tc>
-      </w:tr>
-      <w:tr>
-        <w:tc>
-          <w:tcPr/>
-          <w:p>
-            <w:pPr>
-              <w:pStyle w:val="Compact"/>
-            </w:pPr>
-            <w:r>
-              <w:t xml:space="preserve">C12</w:t>
-            </w:r>
-          </w:p>
-        </w:tc>
-        <w:tc>
-          <w:tcPr/>
-          <w:p>
-            <w:pPr>
-              <w:pStyle w:val="Compact"/>
-            </w:pPr>
-            <w:r>
-              <w:t xml:space="preserve">1</w:t>
-            </w:r>
-          </w:p>
-        </w:tc>
-        <w:tc>
-          <w:tcPr/>
-          <w:p>
-            <w:pPr>
-              <w:pStyle w:val="Compact"/>
-            </w:pPr>
-            <w:r>
-              <w:t xml:space="preserve">necessary?</w:t>
-            </w:r>
-          </w:p>
-        </w:tc>
-        <w:tc>
-          <w:tcPr/>
-          <w:p>
-            <w:pPr>
-              <w:pStyle w:val="Compact"/>
-            </w:pPr>
-            <w:r>
-              <w:t xml:space="preserve">LC sentence cut from the Introduction.</w:t>
-            </w:r>
-          </w:p>
-        </w:tc>
-      </w:tr>
-      <w:tr>
-        <w:tc>
-          <w:tcPr/>
-          <w:p>
-            <w:pPr>
-              <w:pStyle w:val="Compact"/>
-            </w:pPr>
-            <w:r>
-              <w:t xml:space="preserve">C13</w:t>
-            </w:r>
-          </w:p>
-        </w:tc>
-        <w:tc>
-          <w:tcPr/>
-          <w:p>
-            <w:pPr>
-              <w:pStyle w:val="Compact"/>
-            </w:pPr>
-            <w:r>
-              <w:t xml:space="preserve">1</w:t>
-            </w:r>
-          </w:p>
-        </w:tc>
-        <w:tc>
-          <w:tcPr/>
-          <w:p>
-            <w:pPr>
-              <w:pStyle w:val="Compact"/>
-            </w:pPr>
-            <w:r>
-              <w:t xml:space="preserve">it’s not clear to me how much of this is your own conjecture vs evidence-based claims. first review the relevant literature, then state how it will be applied in this study (concluding sentence or paragraph)</w:t>
-            </w:r>
-          </w:p>
-        </w:tc>
-        <w:tc>
-          <w:tcPr/>
-          <w:p>
-            <w:pPr>
-              <w:pStyle w:val="Compact"/>
-            </w:pPr>
-            <w:r>
-              <w:t xml:space="preserve">Literature is reviewed first, then its application stated in the final paragraph.</w:t>
-            </w:r>
-          </w:p>
-        </w:tc>
-      </w:tr>
-      <w:tr>
-        <w:tc>
-          <w:tcPr/>
-          <w:p>
-            <w:pPr>
-              <w:pStyle w:val="Compact"/>
-            </w:pPr>
-            <w:r>
-              <w:t xml:space="preserve">C14</w:t>
-            </w:r>
-          </w:p>
-        </w:tc>
-        <w:tc>
-          <w:tcPr/>
-          <w:p>
-            <w:pPr>
-              <w:pStyle w:val="Compact"/>
-            </w:pPr>
-            <w:r>
-              <w:t xml:space="preserve">1</w:t>
-            </w:r>
-          </w:p>
-        </w:tc>
-        <w:tc>
-          <w:tcPr/>
-          <w:p>
-            <w:pPr>
-              <w:pStyle w:val="Compact"/>
-            </w:pPr>
-            <w:r>
-              <w:t xml:space="preserve">what sigle-trial signal and what model?</w:t>
-            </w:r>
-          </w:p>
-        </w:tc>
-        <w:tc>
-          <w:tcPr/>
-          <w:p>
-            <w:pPr>
-              <w:pStyle w:val="Compact"/>
-            </w:pPr>
-            <w:r>
-              <w:t xml:space="preserve">The signal (trial-wise TEPR) and model (pupil-linked diffusion model) are named.</w:t>
-            </w:r>
-          </w:p>
-        </w:tc>
-      </w:tr>
-      <w:tr>
-        <w:tc>
-          <w:tcPr/>
-          <w:p>
-            <w:pPr>
-              <w:pStyle w:val="Compact"/>
-            </w:pPr>
-            <w:r>
-              <w:t xml:space="preserve">C15</w:t>
-            </w:r>
-          </w:p>
-        </w:tc>
-        <w:tc>
-          <w:tcPr/>
-          <w:p>
-            <w:pPr>
-              <w:pStyle w:val="Compact"/>
-            </w:pPr>
-            <w:r>
-              <w:t xml:space="preserve">1 / 4.3</w:t>
-            </w:r>
-          </w:p>
-        </w:tc>
-        <w:tc>
-          <w:tcPr/>
-          <w:p>
-            <w:pPr>
-              <w:pStyle w:val="Compact"/>
-            </w:pPr>
-            <w:r>
-              <w:t xml:space="preserve">what is the evidence of this temporal ordering (arousal –&gt; caution)?</w:t>
-            </w:r>
-          </w:p>
-        </w:tc>
-        <w:tc>
-          <w:tcPr/>
-          <w:p>
-            <w:pPr>
-              <w:pStyle w:val="Compact"/>
-            </w:pPr>
-            <w:r>
-              <w:t xml:space="preserve">Temporal ordering is now a tested question: the Introduction states the alternative (pupil responses scale with RT) and the test (pre-decision measures).</w:t>
-            </w:r>
-          </w:p>
-        </w:tc>
-      </w:tr>
-      <w:tr>
-        <w:tc>
-          <w:tcPr/>
-          <w:p>
-            <w:pPr>
-              <w:pStyle w:val="Compact"/>
-            </w:pPr>
-            <w:r>
-              <w:t xml:space="preserve">C16</w:t>
-            </w:r>
-          </w:p>
-        </w:tc>
-        <w:tc>
-          <w:tcPr/>
-          <w:p>
-            <w:pPr>
-              <w:pStyle w:val="Compact"/>
-            </w:pPr>
-            <w:r>
-              <w:t xml:space="preserve">1</w:t>
-            </w:r>
-          </w:p>
-        </w:tc>
-        <w:tc>
-          <w:tcPr/>
-          <w:p>
-            <w:pPr>
-              <w:pStyle w:val="Compact"/>
-            </w:pPr>
-            <w:r>
-              <w:t xml:space="preserve">how is probabilistic learning related to conflict?</w:t>
-            </w:r>
-          </w:p>
-        </w:tc>
-        <w:tc>
-          <w:tcPr/>
-          <w:p>
-            <w:pPr>
-              <w:pStyle w:val="Compact"/>
-            </w:pPr>
-            <w:r>
-              <w:t xml:space="preserve">Cavanagh et al. (2014) described accurately: a reinforcement-learning task with choices between similarly valued options.</w:t>
-            </w:r>
-          </w:p>
-        </w:tc>
-      </w:tr>
-      <w:tr>
-        <w:tc>
-          <w:tcPr/>
-          <w:p>
-            <w:pPr>
-              <w:pStyle w:val="Compact"/>
-            </w:pPr>
-            <w:r>
-              <w:t xml:space="preserve">C17</w:t>
-            </w:r>
-          </w:p>
-        </w:tc>
-        <w:tc>
-          <w:tcPr/>
-          <w:p>
-            <w:pPr>
-              <w:pStyle w:val="Compact"/>
-            </w:pPr>
-            <w:r>
-              <w:t xml:space="preserve">1</w:t>
-            </w:r>
-          </w:p>
-        </w:tc>
-        <w:tc>
-          <w:tcPr/>
-          <w:p>
-            <w:pPr>
-              <w:pStyle w:val="Compact"/>
-            </w:pPr>
-            <w:r>
-              <w:t xml:space="preserve">cite this claim</w:t>
-            </w:r>
-          </w:p>
-        </w:tc>
-        <w:tc>
-          <w:tcPr/>
-          <w:p>
-            <w:pPr>
-              <w:pStyle w:val="Compact"/>
-            </w:pPr>
-            <w:r>
-              <w:t xml:space="preserve">Unsupported claim removed.</w:t>
-            </w:r>
-          </w:p>
-        </w:tc>
-      </w:tr>
-      <w:tr>
-        <w:tc>
-          <w:tcPr/>
-          <w:p>
-            <w:pPr>
-              <w:pStyle w:val="Compact"/>
-            </w:pPr>
-            <w:r>
-              <w:t xml:space="preserve">C18</w:t>
-            </w:r>
-          </w:p>
-        </w:tc>
-        <w:tc>
-          <w:tcPr/>
-          <w:p>
-            <w:pPr>
-              <w:pStyle w:val="Compact"/>
-            </w:pPr>
-            <w:r>
-              <w:t xml:space="preserve">1</w:t>
-            </w:r>
-          </w:p>
-        </w:tc>
-        <w:tc>
-          <w:tcPr/>
-          <w:p>
-            <w:pPr>
-              <w:pStyle w:val="Compact"/>
-            </w:pPr>
-            <w:r>
-              <w:t xml:space="preserve">evidence or conjecture?</w:t>
-            </w:r>
-          </w:p>
-        </w:tc>
-        <w:tc>
-          <w:tcPr/>
-          <w:p>
-            <w:pPr>
-              <w:pStyle w:val="Compact"/>
-            </w:pPr>
-            <w:r>
-              <w:t xml:space="preserve">Conjecture removed; age claims are limited to cited findings.</w:t>
-            </w:r>
-          </w:p>
-        </w:tc>
-      </w:tr>
-      <w:tr>
-        <w:tc>
-          <w:tcPr/>
-          <w:p>
-            <w:pPr>
-              <w:pStyle w:val="Compact"/>
-            </w:pPr>
-            <w:r>
-              <w:t xml:space="preserve">C19</w:t>
-            </w:r>
-          </w:p>
-        </w:tc>
-        <w:tc>
-          <w:tcPr/>
-          <w:p>
-            <w:pPr>
-              <w:pStyle w:val="Compact"/>
-            </w:pPr>
-            <w:r>
-              <w:t xml:space="preserve">1</w:t>
-            </w:r>
-          </w:p>
-        </w:tc>
-        <w:tc>
-          <w:tcPr/>
-          <w:p>
-            <w:pPr>
-              <w:pStyle w:val="Compact"/>
-            </w:pPr>
-            <w:r>
-              <w:t xml:space="preserve">make it clear you are running two types of DDM (classic and pupil-informed) and that the predictions are for both</w:t>
-            </w:r>
-          </w:p>
-        </w:tc>
-        <w:tc>
-          <w:tcPr/>
-          <w:p>
-            <w:pPr>
-              <w:pStyle w:val="Compact"/>
-            </w:pPr>
-            <w:r>
-              <w:t xml:space="preserve">Final paragraph names the two analyses (diffusion model; pupil-linked diffusion model) and what each tests.</w:t>
-            </w:r>
-          </w:p>
-        </w:tc>
-      </w:tr>
-      <w:tr>
-        <w:tc>
-          <w:tcPr/>
-          <w:p>
-            <w:pPr>
-              <w:pStyle w:val="Compact"/>
-            </w:pPr>
-            <w:r>
-              <w:t xml:space="preserve">C20</w:t>
-            </w:r>
-          </w:p>
-        </w:tc>
-        <w:tc>
-          <w:tcPr/>
-          <w:p>
-            <w:pPr>
-              <w:pStyle w:val="Compact"/>
-            </w:pPr>
-            <w:r>
-              <w:t xml:space="preserve">1</w:t>
-            </w:r>
-          </w:p>
-        </w:tc>
-        <w:tc>
-          <w:tcPr/>
-          <w:p>
-            <w:pPr>
-              <w:pStyle w:val="Compact"/>
-            </w:pPr>
-            <w:r>
-              <w:t xml:space="preserve">what is the evidence for this interpretation?</w:t>
-            </w:r>
-          </w:p>
-        </w:tc>
-        <w:tc>
-          <w:tcPr/>
-          <w:p>
-            <w:pPr>
-              <w:pStyle w:val="Compact"/>
-            </w:pPr>
-            <w:r>
-              <w:t xml:space="preserve">Interpretive claim removed.</w:t>
-            </w:r>
-          </w:p>
-        </w:tc>
-      </w:tr>
-      <w:tr>
-        <w:tc>
-          <w:tcPr/>
-          <w:p>
-            <w:pPr>
-              <w:pStyle w:val="Compact"/>
-            </w:pPr>
-            <w:r>
-              <w:t xml:space="preserve">C21</w:t>
-            </w:r>
-          </w:p>
-        </w:tc>
-        <w:tc>
-          <w:tcPr/>
-          <w:p>
-            <w:pPr>
-              <w:pStyle w:val="Compact"/>
-            </w:pPr>
-            <w:r>
-              <w:t xml:space="preserve">1</w:t>
-            </w:r>
-          </w:p>
-        </w:tc>
-        <w:tc>
-          <w:tcPr/>
-          <w:p>
-            <w:pPr>
-              <w:pStyle w:val="Compact"/>
-            </w:pPr>
-            <w:r>
-              <w:t xml:space="preserve">separate your predictions for the variables of interest from your interpretation and make sure both are clearly rooted in prior literature</w:t>
-            </w:r>
-          </w:p>
-        </w:tc>
-        <w:tc>
-          <w:tcPr/>
-          <w:p>
-            <w:pPr>
-              <w:pStyle w:val="Compact"/>
-            </w:pPr>
-            <w:r>
-              <w:t xml:space="preserve">Predictions are stated per parameter and tied to prior work; interpretation is left to the Discussion.</w:t>
-            </w:r>
-          </w:p>
-        </w:tc>
-      </w:tr>
-      <w:tr>
-        <w:tc>
-          <w:tcPr/>
-          <w:p>
-            <w:pPr>
-              <w:pStyle w:val="Compact"/>
-            </w:pPr>
-            <w:r>
-              <w:t xml:space="preserve">C22</w:t>
-            </w:r>
-          </w:p>
-        </w:tc>
-        <w:tc>
-          <w:tcPr/>
-          <w:p>
-            <w:pPr>
-              <w:pStyle w:val="Compact"/>
-            </w:pPr>
-            <w:r>
-              <w:t xml:space="preserve">1</w:t>
-            </w:r>
-          </w:p>
-        </w:tc>
-        <w:tc>
-          <w:tcPr/>
-          <w:p>
-            <w:pPr>
-              <w:pStyle w:val="Compact"/>
-            </w:pPr>
-            <w:r>
-              <w:t xml:space="preserve">what result would distinguish between/t these claims?</w:t>
-            </w:r>
-          </w:p>
-        </w:tc>
-        <w:tc>
-          <w:tcPr/>
-          <w:p>
-            <w:pPr>
-              <w:pStyle w:val="Compact"/>
-            </w:pPr>
-            <w:r>
-              <w:t xml:space="preserve">The distinguishing result is stated: the sign of the effort effect on boundary separation.</w:t>
-            </w:r>
-          </w:p>
-        </w:tc>
-      </w:tr>
-      <w:tr>
-        <w:tc>
-          <w:tcPr/>
-          <w:p>
-            <w:pPr>
-              <w:pStyle w:val="Compact"/>
-            </w:pPr>
-            <w:r>
-              <w:t xml:space="preserve">C23</w:t>
-            </w:r>
-          </w:p>
-        </w:tc>
-        <w:tc>
-          <w:tcPr/>
-          <w:p>
-            <w:pPr>
-              <w:pStyle w:val="Compact"/>
-            </w:pPr>
-            <w:r>
-              <w:t xml:space="preserve">2.1</w:t>
-            </w:r>
-          </w:p>
-        </w:tc>
-        <w:tc>
-          <w:tcPr/>
-          <w:p>
-            <w:pPr>
-              <w:pStyle w:val="Compact"/>
-            </w:pPr>
-            <w:r>
-              <w:t xml:space="preserve">S1?</w:t>
-            </w:r>
-          </w:p>
-        </w:tc>
-        <w:tc>
-          <w:tcPr/>
-          <w:p>
-            <w:pPr>
-              <w:pStyle w:val="Compact"/>
-            </w:pPr>
-            <w:r>
-              <w:t xml:space="preserve">Supplement references updated to the new numbering (S1 for participant flow).</w:t>
-            </w:r>
-          </w:p>
-        </w:tc>
-      </w:tr>
-      <w:tr>
-        <w:tc>
-          <w:tcPr/>
-          <w:p>
-            <w:pPr>
-              <w:pStyle w:val="Compact"/>
-            </w:pPr>
-            <w:r>
-              <w:t xml:space="preserve">C24</w:t>
-            </w:r>
-          </w:p>
-        </w:tc>
-        <w:tc>
-          <w:tcPr/>
-          <w:p>
-            <w:pPr>
-              <w:pStyle w:val="Compact"/>
-            </w:pPr>
-            <w:r>
-              <w:t xml:space="preserve">2.1</w:t>
-            </w:r>
-          </w:p>
-        </w:tc>
-        <w:tc>
-          <w:tcPr/>
-          <w:p>
-            <w:pPr>
-              <w:pStyle w:val="Compact"/>
-            </w:pPr>
-            <w:r>
-              <w:t xml:space="preserve">agreed. will update them at the end</w:t>
-            </w:r>
-          </w:p>
-        </w:tc>
-        <w:tc>
-          <w:tcPr/>
-          <w:p>
-            <w:pPr>
-              <w:pStyle w:val="Compact"/>
-            </w:pPr>
-            <w:r>
-              <w:t xml:space="preserve">Done (supplement numbering finalized).</w:t>
-            </w:r>
-          </w:p>
-        </w:tc>
-      </w:tr>
-      <w:tr>
-        <w:tc>
-          <w:tcPr/>
-          <w:p>
-            <w:pPr>
-              <w:pStyle w:val="Compact"/>
-            </w:pPr>
-            <w:r>
-              <w:t xml:space="preserve">C25</w:t>
-            </w:r>
-          </w:p>
-        </w:tc>
-        <w:tc>
-          <w:tcPr/>
-          <w:p>
-            <w:pPr>
-              <w:pStyle w:val="Compact"/>
-            </w:pPr>
-            <w:r>
-              <w:t xml:space="preserve">2.1</w:t>
-            </w:r>
-          </w:p>
-        </w:tc>
-        <w:tc>
-          <w:tcPr/>
-          <w:p>
-            <w:pPr>
-              <w:pStyle w:val="Compact"/>
-            </w:pPr>
-            <w:r>
-              <w:t xml:space="preserve">update at the end</w:t>
-            </w:r>
-          </w:p>
-        </w:tc>
-        <w:tc>
-          <w:tcPr/>
-          <w:p>
-            <w:pPr>
-              <w:pStyle w:val="Compact"/>
-            </w:pPr>
-            <w:r>
-              <w:t xml:space="preserve">Done (flow figure is Figure S1).</w:t>
-            </w:r>
-          </w:p>
-        </w:tc>
-      </w:tr>
-      <w:tr>
-        <w:tc>
-          <w:tcPr/>
-          <w:p>
-            <w:pPr>
-              <w:pStyle w:val="Compact"/>
-            </w:pPr>
-            <w:r>
-              <w:t xml:space="preserve">C26</w:t>
-            </w:r>
-          </w:p>
-        </w:tc>
-        <w:tc>
-          <w:tcPr/>
-          <w:p>
-            <w:pPr>
-              <w:pStyle w:val="Compact"/>
-            </w:pPr>
-            <w:r>
-              <w:t xml:space="preserve">2.2</w:t>
-            </w:r>
-          </w:p>
-        </w:tc>
-        <w:tc>
-          <w:tcPr/>
-          <w:p>
-            <w:pPr>
-              <w:pStyle w:val="Compact"/>
-            </w:pPr>
-            <w:r>
-              <w:t xml:space="preserve">what does this mean?</w:t>
-            </w:r>
-          </w:p>
-        </w:tc>
-        <w:tc>
-          <w:tcPr/>
-          <w:p>
-            <w:pPr>
-              <w:pStyle w:val="Compact"/>
-            </w:pPr>
-            <w:r>
-              <w:t xml:space="preserve">Response-signal procedure defined in one clause: participants withheld their response until a response cue.</w:t>
-            </w:r>
-          </w:p>
-        </w:tc>
-      </w:tr>
-      <w:tr>
-        <w:tc>
-          <w:tcPr/>
-          <w:p>
-            <w:pPr>
-              <w:pStyle w:val="Compact"/>
-            </w:pPr>
-            <w:r>
-              <w:t xml:space="preserve">C27</w:t>
-            </w:r>
-          </w:p>
-        </w:tc>
-        <w:tc>
-          <w:tcPr/>
-          <w:p>
-            <w:pPr>
-              <w:pStyle w:val="Compact"/>
-            </w:pPr>
-            <w:r>
-              <w:t xml:space="preserve">2.2</w:t>
-            </w:r>
-          </w:p>
-        </w:tc>
-        <w:tc>
-          <w:tcPr/>
-          <w:p>
-            <w:pPr>
-              <w:pStyle w:val="Compact"/>
-            </w:pPr>
-            <w:r>
-              <w:t xml:space="preserve">participants are instructed when to press the response box</w:t>
-            </w:r>
-          </w:p>
-        </w:tc>
-        <w:tc>
-          <w:tcPr/>
-          <w:p>
-            <w:pPr>
-              <w:pStyle w:val="Compact"/>
-            </w:pPr>
-            <w:r>
-              <w:t xml:space="preserve">See C26.</w:t>
-            </w:r>
-          </w:p>
-        </w:tc>
-      </w:tr>
-      <w:tr>
-        <w:tc>
-          <w:tcPr/>
-          <w:p>
-            <w:pPr>
-              <w:pStyle w:val="Compact"/>
-            </w:pPr>
-            <w:r>
-              <w:t xml:space="preserve">C28</w:t>
-            </w:r>
-          </w:p>
-        </w:tc>
-        <w:tc>
-          <w:tcPr/>
-          <w:p>
-            <w:pPr>
-              <w:pStyle w:val="Compact"/>
-            </w:pPr>
-            <w:r>
-              <w:t xml:space="preserve">2.3</w:t>
-            </w:r>
-          </w:p>
-        </w:tc>
-        <w:tc>
-          <w:tcPr/>
-          <w:p>
-            <w:pPr>
-              <w:pStyle w:val="Compact"/>
-            </w:pPr>
-            <w:r>
-              <w:t xml:space="preserve">describe this in its own section</w:t>
-            </w:r>
-          </w:p>
-        </w:tc>
-        <w:tc>
-          <w:tcPr/>
-          <w:p>
-            <w:pPr>
-              <w:pStyle w:val="Compact"/>
-            </w:pPr>
-            <w:r>
-              <w:t xml:space="preserve">MVC has its own section (2.3), with the session structure: mean of three 5-s maximal squeezes, re-measured in the scanner in Session 2 and used for Sessions 2 and 3.</w:t>
-            </w:r>
-          </w:p>
-        </w:tc>
-      </w:tr>
-      <w:tr>
-        <w:tc>
-          <w:tcPr/>
-          <w:p>
-            <w:pPr>
-              <w:pStyle w:val="Compact"/>
-            </w:pPr>
-            <w:r>
-              <w:t xml:space="preserve">C29</w:t>
-            </w:r>
-          </w:p>
-        </w:tc>
-        <w:tc>
-          <w:tcPr/>
-          <w:p>
-            <w:pPr>
-              <w:pStyle w:val="Compact"/>
-            </w:pPr>
-            <w:r>
-              <w:t xml:space="preserve">2.9</w:t>
-            </w:r>
-          </w:p>
-        </w:tc>
-        <w:tc>
-          <w:tcPr/>
-          <w:p>
-            <w:pPr>
-              <w:pStyle w:val="Compact"/>
-            </w:pPr>
-            <w:r>
-              <w:t xml:space="preserve">this is usually the last section, unless you are specifying the beh analyses only here?</w:t>
-            </w:r>
-          </w:p>
-        </w:tc>
-        <w:tc>
-          <w:tcPr/>
-          <w:p>
-            <w:pPr>
-              <w:pStyle w:val="Compact"/>
-            </w:pPr>
-            <w:r>
-              <w:t xml:space="preserve">Statistical inference is now the last Methods section.</w:t>
-            </w:r>
-          </w:p>
-        </w:tc>
-      </w:tr>
-      <w:tr>
-        <w:tc>
-          <w:tcPr/>
-          <w:p>
-            <w:pPr>
-              <w:pStyle w:val="Compact"/>
-            </w:pPr>
-            <w:r>
-              <w:t xml:space="preserve">C30</w:t>
-            </w:r>
-          </w:p>
-        </w:tc>
-        <w:tc>
-          <w:tcPr/>
-          <w:p>
-            <w:pPr>
-              <w:pStyle w:val="Compact"/>
-            </w:pPr>
-            <w:r>
-              <w:t xml:space="preserve">2.7.2</w:t>
-            </w:r>
-          </w:p>
-        </w:tc>
-        <w:tc>
-          <w:tcPr/>
-          <w:p>
-            <w:pPr>
-              <w:pStyle w:val="Compact"/>
-            </w:pPr>
-            <w:r>
-              <w:t xml:space="preserve">citations for this claim?</w:t>
-            </w:r>
-          </w:p>
-        </w:tc>
-        <w:tc>
-          <w:tcPr/>
-          <w:p>
-            <w:pPr>
-              <w:pStyle w:val="Compact"/>
-            </w:pPr>
-            <w:r>
-              <w:t xml:space="preserve">Unsupported claim about joint specification removed; the joint fit is stated without justification claims.</w:t>
-            </w:r>
-          </w:p>
-        </w:tc>
-      </w:tr>
-      <w:tr>
-        <w:tc>
-          <w:tcPr/>
-          <w:p>
-            <w:pPr>
-              <w:pStyle w:val="Compact"/>
-            </w:pPr>
-            <w:r>
-              <w:t xml:space="preserve">C31</w:t>
-            </w:r>
-          </w:p>
-        </w:tc>
-        <w:tc>
-          <w:tcPr/>
-          <w:p>
-            <w:pPr>
-              <w:pStyle w:val="Compact"/>
-            </w:pPr>
-            <w:r>
-              <w:t xml:space="preserve">2.7.2</w:t>
-            </w:r>
-          </w:p>
-        </w:tc>
-        <w:tc>
-          <w:tcPr/>
-          <w:p>
-            <w:pPr>
-              <w:pStyle w:val="Compact"/>
-            </w:pPr>
-            <w:r>
-              <w:t xml:space="preserve">say this in 1 short sentence</w:t>
-            </w:r>
-          </w:p>
-        </w:tc>
-        <w:tc>
-          <w:tcPr/>
-          <w:p>
-            <w:pPr>
-              <w:pStyle w:val="Compact"/>
-            </w:pPr>
-            <w:r>
-              <w:t xml:space="preserve">Task enters drift in the primary model (model comparison, Table S2); stated in one sentence.</w:t>
-            </w:r>
-          </w:p>
-        </w:tc>
-      </w:tr>
-      <w:tr>
-        <w:tc>
-          <w:tcPr/>
-          <w:p>
-            <w:pPr>
-              <w:pStyle w:val="Compact"/>
-            </w:pPr>
-            <w:r>
-              <w:t xml:space="preserve">C32</w:t>
-            </w:r>
-          </w:p>
-        </w:tc>
-        <w:tc>
-          <w:tcPr/>
-          <w:p>
-            <w:pPr>
-              <w:pStyle w:val="Compact"/>
-            </w:pPr>
-            <w:r>
-              <w:t xml:space="preserve">2</w:t>
-            </w:r>
-          </w:p>
-        </w:tc>
-        <w:tc>
-          <w:tcPr/>
-          <w:p>
-            <w:pPr>
-              <w:pStyle w:val="Compact"/>
-            </w:pPr>
-            <w:r>
-              <w:t xml:space="preserve">this section is not needed</w:t>
-            </w:r>
-          </w:p>
-        </w:tc>
-        <w:tc>
-          <w:tcPr/>
-          <w:p>
-            <w:pPr>
-              <w:pStyle w:val="Compact"/>
-            </w:pPr>
-            <w:r>
-              <w:t xml:space="preserve">Analysis overview section cut.</w:t>
-            </w:r>
-          </w:p>
-        </w:tc>
-      </w:tr>
-      <w:tr>
-        <w:tc>
-          <w:tcPr/>
-          <w:p>
-            <w:pPr>
-              <w:pStyle w:val="Compact"/>
-            </w:pPr>
-            <w:r>
-              <w:t xml:space="preserve">C33</w:t>
-            </w:r>
-          </w:p>
-        </w:tc>
-        <w:tc>
-          <w:tcPr/>
-          <w:p>
-            <w:pPr>
-              <w:pStyle w:val="Compact"/>
-            </w:pPr>
-            <w:r>
-              <w:t xml:space="preserve">2.9 / S</w:t>
-            </w:r>
-          </w:p>
-        </w:tc>
-        <w:tc>
-          <w:tcPr/>
-          <w:p>
-            <w:pPr>
-              <w:pStyle w:val="Compact"/>
-            </w:pPr>
-            <w:r>
-              <w:t xml:space="preserve">this is not a manipulation check; it’s another way of analyzing the data – report in the supporting only if at all</w:t>
-            </w:r>
-          </w:p>
-        </w:tc>
-        <w:tc>
-          <w:tcPr/>
-          <w:p>
-            <w:pPr>
-              <w:pStyle w:val="Compact"/>
-            </w:pPr>
-            <w:r>
-              <w:t xml:space="preserve">Accuracy GLMM described in one sentence as a separate analysis; full results in the supplement.</w:t>
-            </w:r>
-          </w:p>
-        </w:tc>
-      </w:tr>
-      <w:tr>
-        <w:tc>
-          <w:tcPr/>
-          <w:p>
-            <w:pPr>
-              <w:pStyle w:val="Compact"/>
-            </w:pPr>
-            <w:r>
-              <w:t xml:space="preserve">C34</w:t>
-            </w:r>
-          </w:p>
-        </w:tc>
-        <w:tc>
-          <w:tcPr/>
-          <w:p>
-            <w:pPr>
-              <w:pStyle w:val="Compact"/>
-            </w:pPr>
-            <w:r>
-              <w:t xml:space="preserve">2.7.2</w:t>
-            </w:r>
-          </w:p>
-        </w:tc>
-        <w:tc>
-          <w:tcPr/>
-          <w:p>
-            <w:pPr>
-              <w:pStyle w:val="Compact"/>
-            </w:pPr>
-            <w:r>
-              <w:t xml:space="preserve">report it with the first partof this sentence</w:t>
-            </w:r>
-          </w:p>
-        </w:tc>
-        <w:tc>
-          <w:tcPr/>
-          <w:p>
-            <w:pPr>
-              <w:pStyle w:val="Compact"/>
-            </w:pPr>
-            <w:r>
-              <w:t xml:space="preserve">Model specification given where the model is introduced.</w:t>
-            </w:r>
-          </w:p>
-        </w:tc>
-      </w:tr>
-      <w:tr>
-        <w:tc>
-          <w:tcPr/>
-          <w:p>
-            <w:pPr>
-              <w:pStyle w:val="Compact"/>
-            </w:pPr>
-            <w:r>
-              <w:t xml:space="preserve">C35</w:t>
-            </w:r>
-          </w:p>
-        </w:tc>
-        <w:tc>
-          <w:tcPr/>
-          <w:p>
-            <w:pPr>
-              <w:pStyle w:val="Compact"/>
-            </w:pPr>
-            <w:r>
-              <w:t xml:space="preserve">2.5</w:t>
-            </w:r>
-          </w:p>
-        </w:tc>
-        <w:tc>
-          <w:tcPr/>
-          <w:p>
-            <w:pPr>
-              <w:pStyle w:val="Compact"/>
-            </w:pPr>
-            <w:r>
-              <w:t xml:space="preserve">stated previously I think</w:t>
-            </w:r>
-          </w:p>
-        </w:tc>
-        <w:tc>
-          <w:tcPr/>
-          <w:p>
-            <w:pPr>
-              <w:pStyle w:val="Compact"/>
-            </w:pPr>
-            <w:r>
-              <w:t xml:space="preserve">RT-cutoff sensitivity stated once (2.5).</w:t>
-            </w:r>
-          </w:p>
-        </w:tc>
-      </w:tr>
-      <w:tr>
-        <w:tc>
-          <w:tcPr/>
-          <w:p>
-            <w:pPr>
-              <w:pStyle w:val="Compact"/>
-            </w:pPr>
-            <w:r>
-              <w:t xml:space="preserve">C36</w:t>
-            </w:r>
-          </w:p>
-        </w:tc>
-        <w:tc>
-          <w:tcPr/>
-          <w:p>
-            <w:pPr>
-              <w:pStyle w:val="Compact"/>
-            </w:pPr>
-            <w:r>
-              <w:t xml:space="preserve">—</w:t>
-            </w:r>
-          </w:p>
-        </w:tc>
-        <w:tc>
-          <w:tcPr/>
-          <w:p>
-            <w:pPr>
-              <w:pStyle w:val="Compact"/>
-            </w:pPr>
-            <w:r>
-              <w:t xml:space="preserve">cut; not related at all to the current study aims</w:t>
-            </w:r>
-          </w:p>
-        </w:tc>
-        <w:tc>
-          <w:tcPr/>
-          <w:p>
-            <w:pPr>
-              <w:pStyle w:val="Compact"/>
-            </w:pPr>
-            <w:r>
-              <w:t xml:space="preserve">LC and neuropsychological analyses removed from Methods; dissertation supplement only.</w:t>
-            </w:r>
-          </w:p>
-        </w:tc>
-      </w:tr>
-      <w:tr>
-        <w:tc>
-          <w:tcPr/>
-          <w:p>
-            <w:pPr>
-              <w:pStyle w:val="Compact"/>
-            </w:pPr>
-            <w:r>
-              <w:t xml:space="preserve">C37</w:t>
-            </w:r>
-          </w:p>
-        </w:tc>
-        <w:tc>
-          <w:tcPr/>
-          <w:p>
-            <w:pPr>
-              <w:pStyle w:val="Compact"/>
-            </w:pPr>
-            <w:r>
-              <w:t xml:space="preserve">2.6</w:t>
-            </w:r>
-          </w:p>
-        </w:tc>
-        <w:tc>
-          <w:tcPr/>
-          <w:p>
-            <w:pPr>
-              <w:pStyle w:val="Compact"/>
-            </w:pPr>
-            <w:r>
-              <w:t xml:space="preserve">nope!</w:t>
-            </w:r>
-          </w:p>
-        </w:tc>
-        <w:tc>
-          <w:tcPr/>
-          <w:p>
-            <w:pPr>
-              <w:pStyle w:val="Compact"/>
-            </w:pPr>
-            <w:r>
-              <w:t xml:space="preserve">“Cognitive workload”</w:t>
-            </w:r>
-            <w:r>
-              <w:t xml:space="preserve"> </w:t>
-            </w:r>
-            <w:r>
-              <w:t xml:space="preserve">framing removed.</w:t>
-            </w:r>
-          </w:p>
-        </w:tc>
-      </w:tr>
-      <w:tr>
-        <w:tc>
-          <w:tcPr/>
-          <w:p>
-            <w:pPr>
-              <w:pStyle w:val="Compact"/>
-            </w:pPr>
-            <w:r>
-              <w:t xml:space="preserve">C38</w:t>
-            </w:r>
-          </w:p>
-        </w:tc>
-        <w:tc>
-          <w:tcPr/>
-          <w:p>
-            <w:pPr>
-              <w:pStyle w:val="Compact"/>
-            </w:pPr>
-            <w:r>
-              <w:t xml:space="preserve">2.6</w:t>
-            </w:r>
-          </w:p>
-        </w:tc>
-        <w:tc>
-          <w:tcPr/>
-          <w:p>
-            <w:pPr>
-              <w:pStyle w:val="Compact"/>
-            </w:pPr>
-            <w:r>
-              <w:t xml:space="preserve">citation?</w:t>
-            </w:r>
-          </w:p>
-        </w:tc>
-        <w:tc>
-          <w:tcPr/>
-          <w:p>
-            <w:pPr>
-              <w:pStyle w:val="Compact"/>
-            </w:pPr>
-            <w:r>
-              <w:t xml:space="preserve">0.3-s onset cited (Mathôt, 2018).</w:t>
-            </w:r>
-          </w:p>
-        </w:tc>
-      </w:tr>
-      <w:tr>
-        <w:tc>
-          <w:tcPr/>
-          <w:p>
-            <w:pPr>
-              <w:pStyle w:val="Compact"/>
-            </w:pPr>
-            <w:r>
-              <w:t xml:space="preserve">C39</w:t>
-            </w:r>
-          </w:p>
-        </w:tc>
-        <w:tc>
-          <w:tcPr/>
-          <w:p>
-            <w:pPr>
-              <w:pStyle w:val="Compact"/>
-            </w:pPr>
-            <w:r>
-              <w:t xml:space="preserve">2.6</w:t>
-            </w:r>
-          </w:p>
-        </w:tc>
-        <w:tc>
-          <w:tcPr/>
-          <w:p>
-            <w:pPr>
-              <w:pStyle w:val="Compact"/>
-            </w:pPr>
-            <w:r>
-              <w:t xml:space="preserve">3s can not be</w:t>
-            </w:r>
-            <w:r>
-              <w:t xml:space="preserve"> </w:t>
-            </w:r>
-            <w:r>
-              <w:t xml:space="preserve">“highly specialized”</w:t>
-            </w:r>
-          </w:p>
-        </w:tc>
-        <w:tc>
-          <w:tcPr/>
-          <w:p>
-            <w:pPr>
-              <w:pStyle w:val="Compact"/>
-            </w:pPr>
-            <w:r>
-              <w:t xml:space="preserve">“Highly specialized”</w:t>
-            </w:r>
-            <w:r>
-              <w:t xml:space="preserve"> </w:t>
-            </w:r>
-            <w:r>
-              <w:t xml:space="preserve">removed.</w:t>
-            </w:r>
-          </w:p>
-        </w:tc>
-      </w:tr>
-      <w:tr>
-        <w:tc>
-          <w:tcPr/>
-          <w:p>
-            <w:pPr>
-              <w:pStyle w:val="Compact"/>
-            </w:pPr>
-            <w:r>
-              <w:t xml:space="preserve">C40</w:t>
-            </w:r>
-          </w:p>
-        </w:tc>
-        <w:tc>
-          <w:tcPr/>
-          <w:p>
-            <w:pPr>
-              <w:pStyle w:val="Compact"/>
-            </w:pPr>
-            <w:r>
-              <w:t xml:space="preserve">2.6</w:t>
-            </w:r>
-          </w:p>
-        </w:tc>
-        <w:tc>
-          <w:tcPr/>
-          <w:p>
-            <w:pPr>
-              <w:pStyle w:val="Compact"/>
-            </w:pPr>
-            <w:r>
-              <w:t xml:space="preserve">I’m sure someone would disagree with this statement</w:t>
-            </w:r>
-          </w:p>
-        </w:tc>
-        <w:tc>
-          <w:tcPr/>
-          <w:p>
-            <w:pPr>
-              <w:pStyle w:val="Compact"/>
-            </w:pPr>
-            <w:r>
-              <w:t xml:space="preserve">“Complete morphological profile”</w:t>
-            </w:r>
-            <w:r>
-              <w:t xml:space="preserve"> </w:t>
-            </w:r>
-            <w:r>
-              <w:t xml:space="preserve">removed; window described by its bounds and the typical peak latency, with a citation.</w:t>
-            </w:r>
-          </w:p>
-        </w:tc>
-      </w:tr>
-      <w:tr>
-        <w:tc>
-          <w:tcPr/>
-          <w:p>
-            <w:pPr>
-              <w:pStyle w:val="Compact"/>
-            </w:pPr>
-            <w:r>
-              <w:t xml:space="preserve">C41</w:t>
-            </w:r>
-          </w:p>
-        </w:tc>
-        <w:tc>
-          <w:tcPr/>
-          <w:p>
-            <w:pPr>
-              <w:pStyle w:val="Compact"/>
-            </w:pPr>
-            <w:r>
-              <w:t xml:space="preserve">2.6</w:t>
-            </w:r>
-          </w:p>
-        </w:tc>
-        <w:tc>
-          <w:tcPr/>
-          <w:p>
-            <w:pPr>
-              <w:pStyle w:val="Compact"/>
-            </w:pPr>
-            <w:r>
-              <w:t xml:space="preserve">citation</w:t>
-            </w:r>
-          </w:p>
-        </w:tc>
-        <w:tc>
-          <w:tcPr/>
-          <w:p>
-            <w:pPr>
-              <w:pStyle w:val="Compact"/>
-            </w:pPr>
-            <w:r>
-              <w:t xml:space="preserve">Peak latency cited (da Silva Castanheira et al., 2021).</w:t>
-            </w:r>
-          </w:p>
-        </w:tc>
-      </w:tr>
-      <w:tr>
-        <w:tc>
-          <w:tcPr/>
-          <w:p>
-            <w:pPr>
-              <w:pStyle w:val="Compact"/>
-            </w:pPr>
-            <w:r>
-              <w:t xml:space="preserve">C42</w:t>
-            </w:r>
-          </w:p>
-        </w:tc>
-        <w:tc>
-          <w:tcPr/>
-          <w:p>
-            <w:pPr>
-              <w:pStyle w:val="Compact"/>
-            </w:pPr>
-            <w:r>
-              <w:t xml:space="preserve">2.6</w:t>
-            </w:r>
-          </w:p>
-        </w:tc>
-        <w:tc>
-          <w:tcPr/>
-          <w:p>
-            <w:pPr>
-              <w:pStyle w:val="Compact"/>
-            </w:pPr>
-            <w:r>
-              <w:t xml:space="preserve">see, not specialized at all!</w:t>
-            </w:r>
-          </w:p>
-        </w:tc>
-        <w:tc>
-          <w:tcPr/>
-          <w:p>
-            <w:pPr>
-              <w:pStyle w:val="Compact"/>
-            </w:pPr>
-            <w:r>
-              <w:t xml:space="preserve">Text now states that the window extends past the response and includes post-decision processing.</w:t>
-            </w:r>
-          </w:p>
-        </w:tc>
-      </w:tr>
-      <w:tr>
-        <w:tc>
-          <w:tcPr/>
-          <w:p>
-            <w:pPr>
-              <w:pStyle w:val="Compact"/>
-            </w:pPr>
-            <w:r>
-              <w:t xml:space="preserve">C43</w:t>
-            </w:r>
-          </w:p>
-        </w:tc>
-        <w:tc>
-          <w:tcPr/>
-          <w:p>
-            <w:pPr>
-              <w:pStyle w:val="Compact"/>
-            </w:pPr>
-            <w:r>
-              <w:t xml:space="preserve">2.8</w:t>
-            </w:r>
-          </w:p>
-        </w:tc>
-        <w:tc>
-          <w:tcPr/>
-          <w:p>
-            <w:pPr>
-              <w:pStyle w:val="Compact"/>
-            </w:pPr>
-            <w:r>
-              <w:t xml:space="preserve">how does RT isolate these dynamics? cite</w:t>
-            </w:r>
-          </w:p>
-        </w:tc>
-        <w:tc>
-          <w:tcPr/>
-          <w:p>
-            <w:pPr>
-              <w:pStyle w:val="Compact"/>
-            </w:pPr>
-            <w:r>
-              <w:t xml:space="preserve">The RT-covariate claim was incorrect and is removed. Duration is addressed by explicit tests: the RT-trimmed refit, the pre-response window, and pre-decision measures.</w:t>
-            </w:r>
-          </w:p>
-        </w:tc>
-      </w:tr>
-      <w:tr>
-        <w:tc>
-          <w:tcPr/>
-          <w:p>
-            <w:pPr>
-              <w:pStyle w:val="Compact"/>
-            </w:pPr>
-            <w:r>
-              <w:t xml:space="preserve">C44</w:t>
-            </w:r>
-          </w:p>
-        </w:tc>
-        <w:tc>
-          <w:tcPr/>
-          <w:p>
-            <w:pPr>
-              <w:pStyle w:val="Compact"/>
-            </w:pPr>
-            <w:r>
-              <w:t xml:space="preserve">—</w:t>
-            </w:r>
-          </w:p>
-        </w:tc>
-        <w:tc>
-          <w:tcPr/>
-          <w:p>
-            <w:pPr>
-              <w:pStyle w:val="Compact"/>
-            </w:pPr>
-            <w:r>
-              <w:t xml:space="preserve">necessary? cut?</w:t>
-            </w:r>
-          </w:p>
-        </w:tc>
-        <w:tc>
-          <w:tcPr/>
-          <w:p>
-            <w:pPr>
-              <w:pStyle w:val="Compact"/>
-            </w:pPr>
-            <w:r>
-              <w:t xml:space="preserve">Truncated AUC cut.</w:t>
-            </w:r>
-          </w:p>
-        </w:tc>
-      </w:tr>
-      <w:tr>
-        <w:tc>
-          <w:tcPr/>
-          <w:p>
-            <w:pPr>
-              <w:pStyle w:val="Compact"/>
-            </w:pPr>
-            <w:r>
-              <w:t xml:space="preserve">C45</w:t>
-            </w:r>
-          </w:p>
-        </w:tc>
-        <w:tc>
-          <w:tcPr/>
-          <w:p>
-            <w:pPr>
-              <w:pStyle w:val="Compact"/>
-            </w:pPr>
-            <w:r>
-              <w:t xml:space="preserve">2.7.1</w:t>
-            </w:r>
-          </w:p>
-        </w:tc>
-        <w:tc>
-          <w:tcPr/>
-          <w:p>
-            <w:pPr>
-              <w:pStyle w:val="Compact"/>
-            </w:pPr>
-            <w:r>
-              <w:t xml:space="preserve">i bet this whole section could be 2-3 sentences</w:t>
-            </w:r>
-          </w:p>
-        </w:tc>
-        <w:tc>
-          <w:tcPr/>
-          <w:p>
-            <w:pPr>
-              <w:pStyle w:val="Compact"/>
-            </w:pPr>
-            <w:r>
-              <w:t xml:space="preserve">Response coding reduced to three sentences.</w:t>
-            </w:r>
-          </w:p>
-        </w:tc>
-      </w:tr>
-      <w:tr>
-        <w:tc>
-          <w:tcPr/>
-          <w:p>
-            <w:pPr>
-              <w:pStyle w:val="Compact"/>
-            </w:pPr>
-            <w:r>
-              <w:t xml:space="preserve">C46</w:t>
-            </w:r>
-          </w:p>
-        </w:tc>
-        <w:tc>
-          <w:tcPr/>
-          <w:p>
-            <w:pPr>
-              <w:pStyle w:val="Compact"/>
-            </w:pPr>
-            <w:r>
-              <w:t xml:space="preserve">2.7.1</w:t>
-            </w:r>
-          </w:p>
-        </w:tc>
-        <w:tc>
-          <w:tcPr/>
-          <w:p>
-            <w:pPr>
-              <w:pStyle w:val="Compact"/>
-            </w:pPr>
-            <w:r>
-              <w:t xml:space="preserve">is this necessary?</w:t>
-            </w:r>
-          </w:p>
-        </w:tc>
-        <w:tc>
-          <w:tcPr/>
-          <w:p>
-            <w:pPr>
-              <w:pStyle w:val="Compact"/>
-            </w:pPr>
-            <w:r>
-              <w:t xml:space="preserve">Accuracy-coding argument cut.</w:t>
-            </w:r>
-          </w:p>
-        </w:tc>
-      </w:tr>
-      <w:tr>
-        <w:tc>
-          <w:tcPr/>
-          <w:p>
-            <w:pPr>
-              <w:pStyle w:val="Compact"/>
-            </w:pPr>
-            <w:r>
-              <w:t xml:space="preserve">C47</w:t>
-            </w:r>
-          </w:p>
-        </w:tc>
-        <w:tc>
-          <w:tcPr/>
-          <w:p>
-            <w:pPr>
-              <w:pStyle w:val="Compact"/>
-            </w:pPr>
-            <w:r>
-              <w:t xml:space="preserve">2.7.2</w:t>
-            </w:r>
-          </w:p>
-        </w:tc>
-        <w:tc>
-          <w:tcPr/>
-          <w:p>
-            <w:pPr>
-              <w:pStyle w:val="Compact"/>
-            </w:pPr>
-            <w:r>
-              <w:t xml:space="preserve">present first if it’s your primary</w:t>
-            </w:r>
-          </w:p>
-        </w:tc>
-        <w:tc>
-          <w:tcPr/>
-          <w:p>
-            <w:pPr>
-              <w:pStyle w:val="Compact"/>
-            </w:pPr>
-            <w:r>
-              <w:t xml:space="preserve">Primary model presented first; the Standard-only calibration was cut.</w:t>
-            </w:r>
-          </w:p>
-        </w:tc>
-      </w:tr>
-      <w:tr>
-        <w:tc>
-          <w:tcPr/>
-          <w:p>
-            <w:pPr>
-              <w:pStyle w:val="Compact"/>
-            </w:pPr>
-            <w:r>
-              <w:t xml:space="preserve">C48</w:t>
-            </w:r>
-          </w:p>
-        </w:tc>
-        <w:tc>
-          <w:tcPr/>
-          <w:p>
-            <w:pPr>
-              <w:pStyle w:val="Compact"/>
-            </w:pPr>
-            <w:r>
-              <w:t xml:space="preserve">2.7.2</w:t>
-            </w:r>
-          </w:p>
-        </w:tc>
-        <w:tc>
-          <w:tcPr/>
-          <w:p>
-            <w:pPr>
-              <w:pStyle w:val="Compact"/>
-            </w:pPr>
-            <w:r>
-              <w:t xml:space="preserve">repetitive with what you state earlier; be concise!</w:t>
-            </w:r>
-          </w:p>
-        </w:tc>
-        <w:tc>
-          <w:tcPr/>
-          <w:p>
-            <w:pPr>
-              <w:pStyle w:val="Compact"/>
-            </w:pPr>
-            <w:r>
-              <w:t xml:space="preserve">Repetition removed.</w:t>
-            </w:r>
-          </w:p>
-        </w:tc>
-      </w:tr>
-      <w:tr>
-        <w:tc>
-          <w:tcPr/>
-          <w:p>
-            <w:pPr>
-              <w:pStyle w:val="Compact"/>
-            </w:pPr>
-            <w:r>
-              <w:t xml:space="preserve">C49</w:t>
-            </w:r>
-          </w:p>
-        </w:tc>
-        <w:tc>
-          <w:tcPr/>
-          <w:p>
-            <w:pPr>
-              <w:pStyle w:val="Compact"/>
-            </w:pPr>
-            <w:r>
-              <w:t xml:space="preserve">2.7.2</w:t>
-            </w:r>
-          </w:p>
-        </w:tc>
-        <w:tc>
-          <w:tcPr/>
-          <w:p>
-            <w:pPr>
-              <w:pStyle w:val="Compact"/>
-            </w:pPr>
-            <w:r>
-              <w:t xml:space="preserve">???</w:t>
-            </w:r>
-          </w:p>
-        </w:tc>
-        <w:tc>
-          <w:tcPr/>
-          <w:p>
-            <w:pPr>
-              <w:pStyle w:val="Compact"/>
-            </w:pPr>
-            <w:r>
-              <w:t xml:space="preserve">“Tonic”</w:t>
-            </w:r>
-            <w:r>
-              <w:t xml:space="preserve"> </w:t>
-            </w:r>
-            <w:r>
-              <w:t xml:space="preserve">removed.</w:t>
-            </w:r>
-          </w:p>
-        </w:tc>
-      </w:tr>
-      <w:tr>
-        <w:tc>
-          <w:tcPr/>
-          <w:p>
-            <w:pPr>
-              <w:pStyle w:val="Compact"/>
-            </w:pPr>
-            <w:r>
-              <w:t xml:space="preserve">C50</w:t>
-            </w:r>
-          </w:p>
-        </w:tc>
-        <w:tc>
-          <w:tcPr/>
-          <w:p>
-            <w:pPr>
-              <w:pStyle w:val="Compact"/>
-            </w:pPr>
-            <w:r>
-              <w:t xml:space="preserve">2.7.2</w:t>
-            </w:r>
-          </w:p>
-        </w:tc>
-        <w:tc>
-          <w:tcPr/>
-          <w:p>
-            <w:pPr>
-              <w:pStyle w:val="Compact"/>
-            </w:pPr>
-            <w:r>
-              <w:t xml:space="preserve">previously stated?</w:t>
-            </w:r>
-          </w:p>
-        </w:tc>
-        <w:tc>
-          <w:tcPr/>
-          <w:p>
-            <w:pPr>
-              <w:pStyle w:val="Compact"/>
-            </w:pPr>
-            <w:r>
-              <w:t xml:space="preserve">Stated once.</w:t>
-            </w:r>
-          </w:p>
-        </w:tc>
-      </w:tr>
-      <w:tr>
-        <w:tc>
-          <w:tcPr/>
-          <w:p>
-            <w:pPr>
-              <w:pStyle w:val="Compact"/>
-            </w:pPr>
-            <w:r>
-              <w:t xml:space="preserve">C51</w:t>
-            </w:r>
-          </w:p>
-        </w:tc>
-        <w:tc>
-          <w:tcPr/>
-          <w:p>
-            <w:pPr>
-              <w:pStyle w:val="Compact"/>
-            </w:pPr>
-            <w:r>
-              <w:t xml:space="preserve">—</w:t>
-            </w:r>
-          </w:p>
-        </w:tc>
-        <w:tc>
-          <w:tcPr/>
-          <w:p>
-            <w:pPr>
-              <w:pStyle w:val="Compact"/>
-            </w:pPr>
-            <w:r>
-              <w:t xml:space="preserve">stated earlier; not necessary to run/report</w:t>
-            </w:r>
-          </w:p>
-        </w:tc>
-        <w:tc>
-          <w:tcPr/>
-          <w:p>
-            <w:pPr>
-              <w:pStyle w:val="Compact"/>
-            </w:pPr>
-            <w:r>
-              <w:t xml:space="preserve">Behavioral validation section cut (accuracy model now in 2.9 as a separate analysis).</w:t>
-            </w:r>
-          </w:p>
-        </w:tc>
-      </w:tr>
-      <w:tr>
-        <w:tc>
-          <w:tcPr/>
-          <w:p>
-            <w:pPr>
-              <w:pStyle w:val="Compact"/>
-            </w:pPr>
-            <w:r>
-              <w:t xml:space="preserve">C52</w:t>
-            </w:r>
-          </w:p>
-        </w:tc>
-        <w:tc>
-          <w:tcPr/>
-          <w:p>
-            <w:pPr>
-              <w:pStyle w:val="Compact"/>
-            </w:pPr>
-            <w:r>
-              <w:t xml:space="preserve">2.8</w:t>
-            </w:r>
-          </w:p>
-        </w:tc>
-        <w:tc>
-          <w:tcPr/>
-          <w:p>
-            <w:pPr>
-              <w:pStyle w:val="Compact"/>
-            </w:pPr>
-            <w:r>
-              <w:t xml:space="preserve">how can you do this with just 2 levels of effort/arousal?</w:t>
-            </w:r>
-          </w:p>
-        </w:tc>
-        <w:tc>
-          <w:tcPr/>
-          <w:p>
-            <w:pPr>
-              <w:pStyle w:val="Compact"/>
-            </w:pPr>
-            <w:r>
-              <w:t xml:space="preserve">Yerkes–Dodson pupil × difficulty model removed; with two effort levels it could not test an inverted-U.</w:t>
-            </w:r>
-          </w:p>
-        </w:tc>
-      </w:tr>
-      <w:tr>
-        <w:tc>
-          <w:tcPr/>
-          <w:p>
-            <w:pPr>
-              <w:pStyle w:val="Compact"/>
-            </w:pPr>
-            <w:r>
-              <w:t xml:space="preserve">C53</w:t>
-            </w:r>
-          </w:p>
-        </w:tc>
-        <w:tc>
-          <w:tcPr/>
-          <w:p>
-            <w:pPr>
-              <w:pStyle w:val="Compact"/>
-            </w:pPr>
-            <w:r>
-              <w:t xml:space="preserve">2.7.3</w:t>
-            </w:r>
-          </w:p>
-        </w:tc>
-        <w:tc>
-          <w:tcPr/>
-          <w:p>
-            <w:pPr>
-              <w:pStyle w:val="Compact"/>
-            </w:pPr>
-            <w:r>
-              <w:t xml:space="preserve">It’s unclear how much of this section is results. Is it necessary?</w:t>
-            </w:r>
-          </w:p>
-        </w:tc>
-        <w:tc>
-          <w:tcPr/>
-          <w:p>
-            <w:pPr>
-              <w:pStyle w:val="Compact"/>
-            </w:pPr>
-            <w:r>
-              <w:t xml:space="preserve">Diagnostics reduced to the acceptance criteria; diagnostic results moved to Table S3.</w:t>
-            </w:r>
-          </w:p>
-        </w:tc>
-      </w:tr>
-      <w:tr>
-        <w:tc>
-          <w:tcPr/>
-          <w:p>
-            <w:pPr>
-              <w:pStyle w:val="Compact"/>
-            </w:pPr>
-            <w:r>
-              <w:t xml:space="preserve">C54</w:t>
-            </w:r>
-          </w:p>
-        </w:tc>
-        <w:tc>
-          <w:tcPr/>
-          <w:p>
-            <w:pPr>
-              <w:pStyle w:val="Compact"/>
-            </w:pPr>
-            <w:r>
-              <w:t xml:space="preserve">3</w:t>
-            </w:r>
-          </w:p>
-        </w:tc>
-        <w:tc>
-          <w:tcPr/>
-          <w:p>
-            <w:pPr>
-              <w:pStyle w:val="Compact"/>
-            </w:pPr>
-            <w:r>
-              <w:t xml:space="preserve">The results section is very challenging to get through. You have combined methods details and results and discussion-style summaries. Instead, create separate sections for each of the models that you ran and report the results in a clear format.</w:t>
-            </w:r>
-          </w:p>
-        </w:tc>
-        <w:tc>
-          <w:tcPr/>
-          <w:p>
-            <w:pPr>
-              <w:pStyle w:val="Compact"/>
-            </w:pPr>
-            <w:r>
-              <w:t xml:space="preserve">Results rebuilt as one section per model (primary model, robustness, pupil models, model adequacy); methods details moved to Methods; no summaries.</w:t>
-            </w:r>
-          </w:p>
-        </w:tc>
-      </w:tr>
-      <w:tr>
-        <w:tc>
-          <w:tcPr/>
-          <w:p>
-            <w:pPr>
-              <w:pStyle w:val="Compact"/>
-            </w:pPr>
-            <w:r>
-              <w:t xml:space="preserve">C55</w:t>
-            </w:r>
-          </w:p>
-        </w:tc>
-        <w:tc>
-          <w:tcPr/>
-          <w:p>
-            <w:pPr>
-              <w:pStyle w:val="Compact"/>
-            </w:pPr>
-            <w:r>
-              <w:t xml:space="preserve">3.1</w:t>
-            </w:r>
-          </w:p>
-        </w:tc>
-        <w:tc>
-          <w:tcPr/>
-          <w:p>
-            <w:pPr>
-              <w:pStyle w:val="Compact"/>
-            </w:pPr>
-            <w:r>
-              <w:t xml:space="preserve">do all DDM papers have sections like this (send me an example). if not, cut and start the results with your main findings</w:t>
-            </w:r>
-          </w:p>
-        </w:tc>
-        <w:tc>
-          <w:tcPr/>
-          <w:p>
-            <w:pPr>
-              <w:pStyle w:val="Compact"/>
-            </w:pPr>
-            <w:r>
-              <w:t xml:space="preserve">Overview section cut; Results open with the model comparison and the primary-model findings.</w:t>
-            </w:r>
-          </w:p>
-        </w:tc>
-      </w:tr>
-      <w:tr>
-        <w:tc>
-          <w:tcPr/>
-          <w:p>
-            <w:pPr>
-              <w:pStyle w:val="Compact"/>
-            </w:pPr>
-            <w:r>
-              <w:t xml:space="preserve">C56</w:t>
-            </w:r>
-          </w:p>
-        </w:tc>
-        <w:tc>
-          <w:tcPr/>
-          <w:p>
-            <w:pPr>
-              <w:pStyle w:val="Compact"/>
-            </w:pPr>
-            <w:r>
-              <w:t xml:space="preserve">3</w:t>
-            </w:r>
-          </w:p>
-        </w:tc>
-        <w:tc>
-          <w:tcPr/>
-          <w:p>
-            <w:pPr>
-              <w:pStyle w:val="Compact"/>
-            </w:pPr>
-            <w:r>
-              <w:t xml:space="preserve">cut; repetitive with participant section</w:t>
-            </w:r>
-          </w:p>
-        </w:tc>
-        <w:tc>
-          <w:tcPr/>
-          <w:p>
-            <w:pPr>
-              <w:pStyle w:val="Compact"/>
-            </w:pPr>
-            <w:r>
-              <w:t xml:space="preserve">Sample sizes appear only in Participants (2.1).</w:t>
-            </w:r>
-          </w:p>
-        </w:tc>
-      </w:tr>
-      <w:tr>
-        <w:tc>
-          <w:tcPr/>
-          <w:p>
-            <w:pPr>
-              <w:pStyle w:val="Compact"/>
-            </w:pPr>
-            <w:r>
-              <w:t xml:space="preserve">C57</w:t>
-            </w:r>
-          </w:p>
-        </w:tc>
-        <w:tc>
-          <w:tcPr/>
-          <w:p>
-            <w:pPr>
-              <w:pStyle w:val="Compact"/>
-            </w:pPr>
-            <w:r>
-              <w:t xml:space="preserve">3</w:t>
-            </w:r>
-          </w:p>
-        </w:tc>
-        <w:tc>
-          <w:tcPr/>
-          <w:p>
-            <w:pPr>
-              <w:pStyle w:val="Compact"/>
-            </w:pPr>
-            <w:r>
-              <w:t xml:space="preserve">is this info necessary?</w:t>
-            </w:r>
-          </w:p>
-        </w:tc>
-        <w:tc>
-          <w:tcPr/>
-          <w:p>
-            <w:pPr>
-              <w:pStyle w:val="Compact"/>
-            </w:pPr>
-            <w:r>
-              <w:t xml:space="preserve">Trial counts moved to Methods (2.5) and Table S1.</w:t>
-            </w:r>
-          </w:p>
-        </w:tc>
-      </w:tr>
-      <w:tr>
-        <w:tc>
-          <w:tcPr/>
-          <w:p>
-            <w:pPr>
-              <w:pStyle w:val="Compact"/>
-            </w:pPr>
-            <w:r>
-              <w:t xml:space="preserve">C58</w:t>
-            </w:r>
-          </w:p>
-        </w:tc>
-        <w:tc>
-          <w:tcPr/>
-          <w:p>
-            <w:pPr>
-              <w:pStyle w:val="Compact"/>
-            </w:pPr>
-            <w:r>
-              <w:t xml:space="preserve">3.1 / S11</w:t>
-            </w:r>
-          </w:p>
-        </w:tc>
-        <w:tc>
-          <w:tcPr/>
-          <w:p>
-            <w:pPr>
-              <w:pStyle w:val="Compact"/>
-            </w:pPr>
-            <w:r>
-              <w:t xml:space="preserve">cut; not manipulation check; not necessary; and not your primary model</w:t>
-            </w:r>
-          </w:p>
-        </w:tc>
-        <w:tc>
-          <w:tcPr/>
-          <w:p>
-            <w:pPr>
-              <w:pStyle w:val="Compact"/>
-            </w:pPr>
-            <w:r>
-              <w:t xml:space="preserve">Manipulation-check section cut. Observed accuracy appears as one sentence, tied to the drift criterion result; Brinley plot moved to the dissertation supplement.</w:t>
-            </w:r>
-          </w:p>
-        </w:tc>
-      </w:tr>
-      <w:tr>
-        <w:tc>
-          <w:tcPr/>
-          <w:p>
-            <w:pPr>
-              <w:pStyle w:val="Compact"/>
-            </w:pPr>
-            <w:r>
-              <w:t xml:space="preserve">C59</w:t>
-            </w:r>
-          </w:p>
-        </w:tc>
-        <w:tc>
-          <w:tcPr/>
-          <w:p>
-            <w:pPr>
-              <w:pStyle w:val="Compact"/>
-            </w:pPr>
-            <w:r>
-              <w:t xml:space="preserve">3.1</w:t>
-            </w:r>
-          </w:p>
-        </w:tc>
-        <w:tc>
-          <w:tcPr/>
-          <w:p>
-            <w:pPr>
-              <w:pStyle w:val="Compact"/>
-            </w:pPr>
-            <w:r>
-              <w:t xml:space="preserve">I have no idea how to read this section. nothing looks like a result; there are no statistics, except in the figure notes? what are you testing for and how do you know if it’s significant?</w:t>
-            </w:r>
-          </w:p>
-        </w:tc>
-        <w:tc>
-          <w:tcPr/>
-          <w:p>
-            <w:pPr>
-              <w:pStyle w:val="Compact"/>
-            </w:pPr>
-            <w:r>
-              <w:t xml:space="preserve">Every effect is reported with its posterior median, 95% CrI and posterior direction probability in the text; inference criteria are defined in Methods 2.9.</w:t>
-            </w:r>
-          </w:p>
-        </w:tc>
-      </w:tr>
-      <w:tr>
-        <w:tc>
-          <w:tcPr/>
-          <w:p>
-            <w:pPr>
-              <w:pStyle w:val="Compact"/>
-            </w:pPr>
-            <w:r>
-              <w:t xml:space="preserve">C60</w:t>
-            </w:r>
-          </w:p>
-        </w:tc>
-        <w:tc>
-          <w:tcPr/>
-          <w:p>
-            <w:pPr>
-              <w:pStyle w:val="Compact"/>
-            </w:pPr>
-            <w:r>
-              <w:t xml:space="preserve">3.2 Effort effects on decision parameters (H1-H4)</w:t>
-            </w:r>
-          </w:p>
-        </w:tc>
-        <w:tc>
-          <w:tcPr/>
-          <w:p>
-            <w:pPr>
-              <w:pStyle w:val="Compact"/>
-            </w:pPr>
-            <w:r>
-              <w:t xml:space="preserve">can you share with me a publication that you used to model this results section after?</w:t>
-            </w:r>
-          </w:p>
-        </w:tc>
-        <w:tc>
-          <w:tcPr/>
-          <w:p>
-            <w:pPr>
-              <w:pStyle w:val="Compact"/>
-            </w:pPr>
-            <w:r>
-              <w:rPr>
-                <w:b/>
-                <w:bCs/>
-              </w:rPr>
-              <w:t xml:space="preserve">Open</w:t>
-            </w:r>
-            <w:r>
-              <w:t xml:space="preserve"> </w:t>
-            </w:r>
-            <w:r>
-              <w:t xml:space="preserve">Needs Mohammad: name the paper the Results reporting format follows.</w:t>
-            </w:r>
-          </w:p>
-        </w:tc>
-      </w:tr>
-      <w:tr>
-        <w:tc>
-          <w:tcPr/>
-          <w:p>
-            <w:pPr>
-              <w:pStyle w:val="Compact"/>
-            </w:pPr>
-            <w:r>
-              <w:t xml:space="preserve">C61</w:t>
-            </w:r>
-          </w:p>
-        </w:tc>
-        <w:tc>
-          <w:tcPr/>
-          <w:p>
-            <w:pPr>
-              <w:pStyle w:val="Compact"/>
-            </w:pPr>
-            <w:r>
-              <w:t xml:space="preserve">3.1</w:t>
-            </w:r>
-          </w:p>
-        </w:tc>
-        <w:tc>
-          <w:tcPr/>
-          <w:p>
-            <w:pPr>
-              <w:pStyle w:val="Compact"/>
-            </w:pPr>
-            <w:r>
-              <w:t xml:space="preserve">guide the reader to these figures as you report the results, not bunched up like this devoid from any findings</w:t>
-            </w:r>
-          </w:p>
-        </w:tc>
-        <w:tc>
-          <w:tcPr/>
-          <w:p>
-            <w:pPr>
-              <w:pStyle w:val="Compact"/>
-            </w:pPr>
-            <w:r>
-              <w:t xml:space="preserve">Figures are cited at the sentence that reports the result.</w:t>
-            </w:r>
-          </w:p>
-        </w:tc>
-      </w:tr>
-      <w:tr>
-        <w:tc>
-          <w:tcPr/>
-          <w:p>
-            <w:pPr>
-              <w:pStyle w:val="Compact"/>
-            </w:pPr>
-            <w:r>
-              <w:t xml:space="preserve">C62</w:t>
-            </w:r>
-          </w:p>
-        </w:tc>
-        <w:tc>
-          <w:tcPr/>
-          <w:p>
-            <w:pPr>
-              <w:pStyle w:val="Compact"/>
-            </w:pPr>
-            <w:r>
-              <w:t xml:space="preserve">3.1</w:t>
-            </w:r>
-          </w:p>
-        </w:tc>
-        <w:tc>
-          <w:tcPr/>
-          <w:p>
-            <w:pPr>
-              <w:pStyle w:val="Compact"/>
-            </w:pPr>
-            <w:r>
-              <w:t xml:space="preserve">does it surprise you where standards fall relative to heard/easy conditions?</w:t>
-            </w:r>
-          </w:p>
-        </w:tc>
-        <w:tc>
-          <w:tcPr/>
-          <w:p>
-            <w:pPr>
-              <w:pStyle w:val="Compact"/>
-            </w:pPr>
-            <w:r>
-              <w:t xml:space="preserve">Response coding explains the Standard position: negative drift on Standard trials accumulates toward the correct</w:t>
-            </w:r>
-            <w:r>
-              <w:t xml:space="preserve"> </w:t>
-            </w:r>
-            <w:r>
-              <w:t xml:space="preserve">“same”</w:t>
-            </w:r>
-            <w:r>
-              <w:t xml:space="preserve"> </w:t>
-            </w:r>
-            <w:r>
-              <w:t xml:space="preserve">response; Hard trials also had negative drift (mostly incorrect).</w:t>
-            </w:r>
-          </w:p>
-        </w:tc>
-      </w:tr>
-      <w:tr>
-        <w:tc>
-          <w:tcPr/>
-          <w:p>
-            <w:pPr>
-              <w:pStyle w:val="Compact"/>
-            </w:pPr>
-            <w:r>
-              <w:t xml:space="preserve">C63</w:t>
-            </w:r>
-          </w:p>
-        </w:tc>
-        <w:tc>
-          <w:tcPr/>
-          <w:p>
-            <w:pPr>
-              <w:pStyle w:val="Compact"/>
-            </w:pPr>
-            <w:r>
-              <w:t xml:space="preserve">3.1</w:t>
-            </w:r>
-          </w:p>
-        </w:tc>
-        <w:tc>
-          <w:tcPr/>
-          <w:p>
-            <w:pPr>
-              <w:pStyle w:val="Compact"/>
-            </w:pPr>
-            <w:r>
-              <w:t xml:space="preserve">when do you ever see this language in a results section?</w:t>
-            </w:r>
-          </w:p>
-        </w:tc>
-        <w:tc>
-          <w:tcPr/>
-          <w:p>
-            <w:pPr>
-              <w:pStyle w:val="Compact"/>
-            </w:pPr>
-            <w:r>
-              <w:t xml:space="preserve">“Highly credible”</w:t>
-            </w:r>
-            <w:r>
-              <w:t xml:space="preserve"> </w:t>
-            </w:r>
-            <w:r>
-              <w:t xml:space="preserve">and similar labels removed; results reported with statistics only.</w:t>
-            </w:r>
-          </w:p>
-        </w:tc>
-      </w:tr>
-      <w:tr>
-        <w:tc>
-          <w:tcPr/>
-          <w:p>
-            <w:pPr>
-              <w:pStyle w:val="Compact"/>
-            </w:pPr>
-            <w:r>
-              <w:t xml:space="preserve">C64</w:t>
-            </w:r>
-          </w:p>
-        </w:tc>
-        <w:tc>
-          <w:tcPr/>
-          <w:p>
-            <w:pPr>
-              <w:pStyle w:val="Compact"/>
-            </w:pPr>
-            <w:r>
-              <w:t xml:space="preserve">3</w:t>
-            </w:r>
-          </w:p>
-        </w:tc>
-        <w:tc>
-          <w:tcPr/>
-          <w:p>
-            <w:pPr>
-              <w:pStyle w:val="Compact"/>
-            </w:pPr>
-            <w:r>
-              <w:t xml:space="preserve">wait, how does this relate to the prior section?</w:t>
-            </w:r>
-          </w:p>
-        </w:tc>
-        <w:tc>
-          <w:tcPr/>
-          <w:p>
-            <w:pPr>
-              <w:pStyle w:val="Compact"/>
-            </w:pPr>
-            <w:r>
-              <w:t xml:space="preserve">Separate hypothesis-test section removed; effort results are part of 3.1.</w:t>
-            </w:r>
-          </w:p>
-        </w:tc>
-      </w:tr>
-      <w:tr>
-        <w:tc>
-          <w:tcPr/>
-          <w:p>
-            <w:pPr>
-              <w:pStyle w:val="Compact"/>
-            </w:pPr>
-            <w:r>
-              <w:t xml:space="preserve">C65</w:t>
-            </w:r>
-          </w:p>
-        </w:tc>
-        <w:tc>
-          <w:tcPr/>
-          <w:p>
-            <w:pPr>
-              <w:pStyle w:val="Compact"/>
-            </w:pPr>
-            <w:r>
-              <w:t xml:space="preserve">2.9</w:t>
-            </w:r>
-          </w:p>
-        </w:tc>
-        <w:tc>
-          <w:tcPr/>
-          <w:p>
-            <w:pPr>
-              <w:pStyle w:val="Compact"/>
-            </w:pPr>
-            <w:r>
-              <w:t xml:space="preserve">this reads like methods</w:t>
-            </w:r>
-          </w:p>
-        </w:tc>
-        <w:tc>
-          <w:tcPr/>
-          <w:p>
-            <w:pPr>
-              <w:pStyle w:val="Compact"/>
-            </w:pPr>
-            <w:r>
-              <w:t xml:space="preserve">Inference description moved to Methods 2.9.</w:t>
-            </w:r>
-          </w:p>
-        </w:tc>
-      </w:tr>
-      <w:tr>
-        <w:tc>
-          <w:tcPr/>
-          <w:p>
-            <w:pPr>
-              <w:pStyle w:val="Compact"/>
-            </w:pPr>
-            <w:r>
-              <w:t xml:space="preserve">C66</w:t>
-            </w:r>
-          </w:p>
-        </w:tc>
-        <w:tc>
-          <w:tcPr/>
-          <w:p>
-            <w:pPr>
-              <w:pStyle w:val="Compact"/>
-            </w:pPr>
-            <w:r>
-              <w:t xml:space="preserve">3.1 / 4.1</w:t>
-            </w:r>
-          </w:p>
-        </w:tc>
-        <w:tc>
-          <w:tcPr/>
-          <w:p>
-            <w:pPr>
-              <w:pStyle w:val="Compact"/>
-            </w:pPr>
-            <w:r>
-              <w:t xml:space="preserve">is this a results summary? just walk through the actual results and summarize in the discussion</w:t>
-            </w:r>
-          </w:p>
-        </w:tc>
-        <w:tc>
-          <w:tcPr/>
-          <w:p>
-            <w:pPr>
-              <w:pStyle w:val="Compact"/>
-            </w:pPr>
-            <w:r>
-              <w:t xml:space="preserve">Results summary removed; stimulus effects reported directly; synthesis left to the Discussion.</w:t>
-            </w:r>
-          </w:p>
-        </w:tc>
-      </w:tr>
-      <w:tr>
-        <w:tc>
-          <w:tcPr/>
-          <w:p>
-            <w:pPr>
-              <w:pStyle w:val="Compact"/>
-            </w:pPr>
-            <w:r>
-              <w:t xml:space="preserve">C67</w:t>
-            </w:r>
-          </w:p>
-        </w:tc>
-        <w:tc>
-          <w:tcPr/>
-          <w:p>
-            <w:pPr>
-              <w:pStyle w:val="Compact"/>
-            </w:pPr>
-            <w:r>
-              <w:t xml:space="preserve">3.1</w:t>
-            </w:r>
-          </w:p>
-        </w:tc>
-        <w:tc>
-          <w:tcPr/>
-          <w:p>
-            <w:pPr>
-              <w:pStyle w:val="Compact"/>
-            </w:pPr>
-            <w:r>
-              <w:t xml:space="preserve">guide the reader to relevant figures as you walk through the corresponding results</w:t>
-            </w:r>
-          </w:p>
-        </w:tc>
-        <w:tc>
-          <w:tcPr/>
-          <w:p>
-            <w:pPr>
-              <w:pStyle w:val="Compact"/>
-            </w:pPr>
-            <w:r>
-              <w:t xml:space="preserve">Figures cited inline with each result.</w:t>
-            </w:r>
-          </w:p>
-        </w:tc>
-      </w:tr>
-      <w:tr>
-        <w:tc>
-          <w:tcPr/>
-          <w:p>
-            <w:pPr>
-              <w:pStyle w:val="Compact"/>
-            </w:pPr>
-            <w:r>
-              <w:t xml:space="preserve">C68</w:t>
-            </w:r>
-          </w:p>
-        </w:tc>
-        <w:tc>
-          <w:tcPr/>
-          <w:p>
-            <w:pPr>
-              <w:pStyle w:val="Compact"/>
-            </w:pPr>
-            <w:r>
-              <w:t xml:space="preserve">3.1</w:t>
-            </w:r>
-          </w:p>
-        </w:tc>
-        <w:tc>
-          <w:tcPr/>
-          <w:p>
-            <w:pPr>
-              <w:pStyle w:val="Compact"/>
-            </w:pPr>
-            <w:r>
-              <w:t xml:space="preserve">do not write these as separate hypotheses (when do you ever see this style in publications?); just report the results for the metrics of interest</w:t>
-            </w:r>
-          </w:p>
-        </w:tc>
-        <w:tc>
-          <w:tcPr/>
-          <w:p>
-            <w:pPr>
-              <w:pStyle w:val="Compact"/>
-            </w:pPr>
-            <w:r>
-              <w:t xml:space="preserve">H1–H4 labels removed.</w:t>
-            </w:r>
-          </w:p>
-        </w:tc>
-      </w:tr>
-      <w:tr>
-        <w:tc>
-          <w:tcPr/>
-          <w:p>
-            <w:pPr>
-              <w:pStyle w:val="Compact"/>
-            </w:pPr>
-            <w:r>
-              <w:t xml:space="preserve">C69</w:t>
-            </w:r>
-          </w:p>
-        </w:tc>
-        <w:tc>
-          <w:tcPr/>
-          <w:p>
-            <w:pPr>
-              <w:pStyle w:val="Compact"/>
-            </w:pPr>
-            <w:r>
-              <w:t xml:space="preserve">3.1</w:t>
-            </w:r>
-          </w:p>
-        </w:tc>
-        <w:tc>
-          <w:tcPr/>
-          <w:p>
-            <w:pPr>
-              <w:pStyle w:val="Compact"/>
-            </w:pPr>
-            <w:r>
-              <w:t xml:space="preserve">unnecessary to state</w:t>
-            </w:r>
-          </w:p>
-        </w:tc>
-        <w:tc>
-          <w:tcPr/>
-          <w:p>
-            <w:pPr>
-              <w:pStyle w:val="Compact"/>
-            </w:pPr>
-            <w:r>
-              <w:t xml:space="preserve">Statement removed.</w:t>
-            </w:r>
-          </w:p>
-        </w:tc>
-      </w:tr>
-      <w:tr>
-        <w:tc>
-          <w:tcPr/>
-          <w:p>
-            <w:pPr>
-              <w:pStyle w:val="Compact"/>
-            </w:pPr>
-            <w:r>
-              <w:t xml:space="preserve">C70</w:t>
-            </w:r>
-          </w:p>
-        </w:tc>
-        <w:tc>
-          <w:tcPr/>
-          <w:p>
-            <w:pPr>
-              <w:pStyle w:val="Compact"/>
-            </w:pPr>
-            <w:r>
-              <w:t xml:space="preserve">3.1</w:t>
-            </w:r>
-          </w:p>
-        </w:tc>
-        <w:tc>
-          <w:tcPr/>
-          <w:p>
-            <w:pPr>
-              <w:pStyle w:val="Compact"/>
-            </w:pPr>
-            <w:r>
-              <w:t xml:space="preserve">is it necessary to state this?</w:t>
-            </w:r>
-          </w:p>
-        </w:tc>
-        <w:tc>
-          <w:tcPr/>
-          <w:p>
-            <w:pPr>
-              <w:pStyle w:val="Compact"/>
-            </w:pPr>
-            <w:r>
-              <w:t xml:space="preserve">ROPE is reported only where it changes the interpretation (boundary, starting point, task boundary).</w:t>
-            </w:r>
-          </w:p>
-        </w:tc>
-      </w:tr>
-      <w:tr>
-        <w:tc>
-          <w:tcPr/>
-          <w:p>
-            <w:pPr>
-              <w:pStyle w:val="Compact"/>
-            </w:pPr>
-            <w:r>
-              <w:t xml:space="preserve">C71</w:t>
-            </w:r>
-          </w:p>
-        </w:tc>
-        <w:tc>
-          <w:tcPr/>
-          <w:p>
-            <w:pPr>
-              <w:pStyle w:val="Compact"/>
-            </w:pPr>
-            <w:r>
-              <w:t xml:space="preserve">3.1</w:t>
-            </w:r>
-          </w:p>
-        </w:tc>
-        <w:tc>
-          <w:tcPr/>
-          <w:p>
-            <w:pPr>
-              <w:pStyle w:val="Compact"/>
-            </w:pPr>
-            <w:r>
-              <w:t xml:space="preserve">why are difficulty and effort analyzed differently? why not report the effects together and in the same way?</w:t>
-            </w:r>
-          </w:p>
-        </w:tc>
-        <w:tc>
-          <w:tcPr/>
-          <w:p>
-            <w:pPr>
-              <w:pStyle w:val="Compact"/>
-            </w:pPr>
-            <w:r>
-              <w:t xml:space="preserve">Stimulus and effort effects are now estimated in the same model and reported in the same format.</w:t>
-            </w:r>
-          </w:p>
-        </w:tc>
-      </w:tr>
-      <w:tr>
-        <w:tc>
-          <w:tcPr/>
-          <w:p>
-            <w:pPr>
-              <w:pStyle w:val="Compact"/>
-            </w:pPr>
-            <w:r>
-              <w:t xml:space="preserve">C72</w:t>
-            </w:r>
-          </w:p>
-        </w:tc>
-        <w:tc>
-          <w:tcPr/>
-          <w:p>
-            <w:pPr>
-              <w:pStyle w:val="Compact"/>
-            </w:pPr>
-            <w:r>
-              <w:t xml:space="preserve">3</w:t>
-            </w:r>
-          </w:p>
-        </w:tc>
-        <w:tc>
-          <w:tcPr/>
-          <w:p>
-            <w:pPr>
-              <w:pStyle w:val="Compact"/>
-            </w:pPr>
-            <w:r>
-              <w:t xml:space="preserve">then don’t report it here</w:t>
-            </w:r>
-          </w:p>
-        </w:tc>
-        <w:tc>
-          <w:tcPr/>
-          <w:p>
-            <w:pPr>
-              <w:pStyle w:val="Compact"/>
-            </w:pPr>
-            <w:r>
-              <w:t xml:space="preserve">t0 is not tested for effort; it appears only in Model adequacy (cutoff dependence) and Methods.</w:t>
-            </w:r>
-          </w:p>
-        </w:tc>
-      </w:tr>
-      <w:tr>
-        <w:tc>
-          <w:tcPr/>
-          <w:p>
-            <w:pPr>
-              <w:pStyle w:val="Compact"/>
-            </w:pPr>
-            <w:r>
-              <w:t xml:space="preserve">C73</w:t>
-            </w:r>
-          </w:p>
-        </w:tc>
-        <w:tc>
-          <w:tcPr/>
-          <w:p>
-            <w:pPr>
-              <w:pStyle w:val="Compact"/>
-            </w:pPr>
-            <w:r>
-              <w:t xml:space="preserve">3</w:t>
-            </w:r>
-          </w:p>
-        </w:tc>
-        <w:tc>
-          <w:tcPr/>
-          <w:p>
-            <w:pPr>
-              <w:pStyle w:val="Compact"/>
-            </w:pPr>
-            <w:r>
-              <w:t xml:space="preserve">if this is a different analysis, put it in a different section</w:t>
-            </w:r>
-          </w:p>
-        </w:tc>
-        <w:tc>
-          <w:tcPr/>
-          <w:p>
-            <w:pPr>
-              <w:pStyle w:val="Compact"/>
-            </w:pPr>
-            <w:r>
-              <w:t xml:space="preserve">Exploratory t0 contrast removed.</w:t>
-            </w:r>
-          </w:p>
-        </w:tc>
-      </w:tr>
-      <w:tr>
-        <w:tc>
-          <w:tcPr/>
-          <w:p>
-            <w:pPr>
-              <w:pStyle w:val="Compact"/>
-            </w:pPr>
-            <w:r>
-              <w:t xml:space="preserve">C74</w:t>
-            </w:r>
-          </w:p>
-        </w:tc>
-        <w:tc>
-          <w:tcPr/>
-          <w:p>
-            <w:pPr>
-              <w:pStyle w:val="Compact"/>
-            </w:pPr>
-            <w:r>
-              <w:t xml:space="preserve">3.1</w:t>
-            </w:r>
-          </w:p>
-        </w:tc>
-        <w:tc>
-          <w:tcPr/>
-          <w:p>
-            <w:pPr>
-              <w:pStyle w:val="Compact"/>
-            </w:pPr>
-            <w:r>
-              <w:t xml:space="preserve">why split by task here when you don’t for the other variables?</w:t>
-            </w:r>
-          </w:p>
-        </w:tc>
-        <w:tc>
-          <w:tcPr/>
-          <w:p>
-            <w:pPr>
-              <w:pStyle w:val="Compact"/>
-            </w:pPr>
-            <w:r>
-              <w:t xml:space="preserve">Task effects are reported for all parameters (drift, boundary, starting point), not for bias alone; the earlier statement that VDT was biased more toward</w:t>
-            </w:r>
-            <w:r>
-              <w:t xml:space="preserve"> </w:t>
-            </w:r>
-            <w:r>
-              <w:t xml:space="preserve">“different”</w:t>
-            </w:r>
-            <w:r>
-              <w:t xml:space="preserve"> </w:t>
-            </w:r>
-            <w:r>
-              <w:t xml:space="preserve">was incorrect (VDT bias is slightly smaller) and has been corrected.</w:t>
-            </w:r>
-          </w:p>
-        </w:tc>
-      </w:tr>
-      <w:tr>
-        <w:tc>
-          <w:tcPr/>
-          <w:p>
-            <w:pPr>
-              <w:pStyle w:val="Compact"/>
-            </w:pPr>
-            <w:r>
-              <w:t xml:space="preserve">C75</w:t>
-            </w:r>
-          </w:p>
-        </w:tc>
-        <w:tc>
-          <w:tcPr/>
-          <w:p>
-            <w:pPr>
-              <w:pStyle w:val="Compact"/>
-            </w:pPr>
-            <w:r>
-              <w:t xml:space="preserve">3</w:t>
-            </w:r>
-          </w:p>
-        </w:tc>
-        <w:tc>
-          <w:tcPr/>
-          <w:p>
-            <w:pPr>
-              <w:pStyle w:val="Compact"/>
-            </w:pPr>
-            <w:r>
-              <w:t xml:space="preserve">don’t summarize in the results</w:t>
-            </w:r>
-          </w:p>
-        </w:tc>
-        <w:tc>
-          <w:tcPr/>
-          <w:p>
-            <w:pPr>
-              <w:pStyle w:val="Compact"/>
-            </w:pPr>
-            <w:r>
-              <w:t xml:space="preserve">Cross-test summary removed.</w:t>
-            </w:r>
-          </w:p>
-        </w:tc>
-      </w:tr>
-      <w:tr>
-        <w:tc>
-          <w:tcPr/>
-          <w:p>
-            <w:pPr>
-              <w:pStyle w:val="Compact"/>
-            </w:pPr>
-            <w:r>
-              <w:t xml:space="preserve">C76</w:t>
-            </w:r>
-          </w:p>
-        </w:tc>
-        <w:tc>
-          <w:tcPr/>
-          <w:p>
-            <w:pPr>
-              <w:pStyle w:val="Compact"/>
-            </w:pPr>
-            <w:r>
-              <w:t xml:space="preserve">3.3</w:t>
-            </w:r>
-          </w:p>
-        </w:tc>
-        <w:tc>
-          <w:tcPr/>
-          <w:p>
-            <w:pPr>
-              <w:pStyle w:val="Compact"/>
-            </w:pPr>
-            <w:r>
-              <w:t xml:space="preserve">I explicit this section’s structure to mimic the non-pupil DDM</w:t>
-            </w:r>
-          </w:p>
-        </w:tc>
-        <w:tc>
-          <w:tcPr/>
-          <w:p>
-            <w:pPr>
-              <w:pStyle w:val="Compact"/>
-            </w:pPr>
-            <w:r>
-              <w:t xml:space="preserve">Pupil section mirrors 3.1: which parameter tracks TEPR, then timing tests.</w:t>
-            </w:r>
-          </w:p>
-        </w:tc>
-      </w:tr>
-      <w:tr>
-        <w:tc>
-          <w:tcPr/>
-          <w:p>
-            <w:pPr>
-              <w:pStyle w:val="Compact"/>
-            </w:pPr>
-            <w:r>
-              <w:t xml:space="preserve">C77</w:t>
-            </w:r>
-          </w:p>
-        </w:tc>
-        <w:tc>
-          <w:tcPr/>
-          <w:p>
-            <w:pPr>
-              <w:pStyle w:val="Compact"/>
-            </w:pPr>
-            <w:r>
-              <w:t xml:space="preserve">2.8</w:t>
-            </w:r>
-          </w:p>
-        </w:tc>
-        <w:tc>
-          <w:tcPr/>
-          <w:p>
-            <w:pPr>
-              <w:pStyle w:val="Compact"/>
-            </w:pPr>
-            <w:r>
-              <w:t xml:space="preserve">this whole paragraph is methods, not results</w:t>
-            </w:r>
-          </w:p>
-        </w:tc>
-        <w:tc>
-          <w:tcPr/>
-          <w:p>
-            <w:pPr>
-              <w:pStyle w:val="Compact"/>
-            </w:pPr>
-            <w:r>
-              <w:t xml:space="preserve">Model-set description moved to Methods 2.8.</w:t>
-            </w:r>
-          </w:p>
-        </w:tc>
-      </w:tr>
-      <w:tr>
-        <w:tc>
-          <w:tcPr/>
-          <w:p>
-            <w:pPr>
-              <w:pStyle w:val="Compact"/>
-            </w:pPr>
-            <w:r>
-              <w:t xml:space="preserve">C78</w:t>
-            </w:r>
-          </w:p>
-        </w:tc>
-        <w:tc>
-          <w:tcPr/>
-          <w:p>
-            <w:pPr>
-              <w:pStyle w:val="Compact"/>
-            </w:pPr>
-            <w:r>
-              <w:t xml:space="preserve">2.8</w:t>
-            </w:r>
-          </w:p>
-        </w:tc>
-        <w:tc>
-          <w:tcPr/>
-          <w:p>
-            <w:pPr>
-              <w:pStyle w:val="Compact"/>
-            </w:pPr>
-            <w:r>
-              <w:t xml:space="preserve">why bolded?</w:t>
-            </w:r>
-          </w:p>
-        </w:tc>
-        <w:tc>
-          <w:tcPr/>
-          <w:p>
-            <w:pPr>
-              <w:pStyle w:val="Compact"/>
-            </w:pPr>
-            <w:r>
-              <w:t xml:space="preserve">Bold list removed; model set described in prose in Methods.</w:t>
-            </w:r>
-          </w:p>
-        </w:tc>
-      </w:tr>
-    </w:tbl>
-    <w:bookmarkEnd w:id="155"/>
     <w:sectPr>
       <w:footnotePr>
         <w:numRestart w:val="eachSect"/>
@@ -25039,126 +20854,8 @@
       </w:pPr>
     </w:lvl>
   </w:abstractNum>
-  <w:abstractNum w:abstractNumId="991">
-    <w:nsid w:val="0000A991"/>
-    <w:multiLevelType w:val="multilevel"/>
-    <w:lvl w:ilvl="0">
-      <w:numFmt w:val="bullet"/>
-      <w:lvlText w:val=""/>
-      <w:lvlJc w:val="left"/>
-      <w:pPr>
-        <w:ind w:left="720" w:hanging="360"/>
-      </w:pPr>
-      <w:rPr>
-        <w:rFonts w:ascii="Symbol" w:hAnsi="Symbol" w:cs="Symbol" w:hint="default"/>
-      </w:rPr>
-    </w:lvl>
-    <w:lvl w:ilvl="1">
-      <w:numFmt w:val="bullet"/>
-      <w:lvlText w:val="o"/>
-      <w:lvlJc w:val="left"/>
-      <w:pPr>
-        <w:ind w:left="1440" w:hanging="360"/>
-      </w:pPr>
-      <w:rPr>
-        <w:rFonts w:ascii="Courier New" w:hAnsi="Courier New" w:cs="Courier New" w:hint="default"/>
-      </w:rPr>
-    </w:lvl>
-    <w:lvl w:ilvl="2">
-      <w:numFmt w:val="bullet"/>
-      <w:lvlText w:val=""/>
-      <w:lvlJc w:val="left"/>
-      <w:pPr>
-        <w:ind w:left="2160" w:hanging="360"/>
-      </w:pPr>
-      <w:rPr>
-        <w:rFonts w:ascii="Wingdings" w:hAnsi="Wingdings" w:cs="Wingdings" w:hint="default"/>
-      </w:rPr>
-    </w:lvl>
-    <w:lvl w:ilvl="3">
-      <w:numFmt w:val="bullet"/>
-      <w:lvlText w:val=""/>
-      <w:lvlJc w:val="left"/>
-      <w:pPr>
-        <w:ind w:left="2880" w:hanging="360"/>
-      </w:pPr>
-      <w:rPr>
-        <w:rFonts w:ascii="Symbol" w:hAnsi="Symbol" w:cs="Symbol" w:hint="default"/>
-      </w:rPr>
-    </w:lvl>
-    <w:lvl w:ilvl="4">
-      <w:numFmt w:val="bullet"/>
-      <w:lvlText w:val="o"/>
-      <w:lvlJc w:val="left"/>
-      <w:pPr>
-        <w:ind w:left="3600" w:hanging="360"/>
-      </w:pPr>
-      <w:rPr>
-        <w:rFonts w:ascii="Courier New" w:hAnsi="Courier New" w:cs="Courier New" w:hint="default"/>
-      </w:rPr>
-    </w:lvl>
-    <w:lvl w:ilvl="5">
-      <w:numFmt w:val="bullet"/>
-      <w:lvlText w:val=""/>
-      <w:lvlJc w:val="left"/>
-      <w:pPr>
-        <w:ind w:left="4320" w:hanging="360"/>
-      </w:pPr>
-      <w:rPr>
-        <w:rFonts w:ascii="Wingdings" w:hAnsi="Wingdings" w:cs="Wingdings" w:hint="default"/>
-      </w:rPr>
-    </w:lvl>
-    <w:lvl w:ilvl="6">
-      <w:numFmt w:val="bullet"/>
-      <w:lvlText w:val=""/>
-      <w:lvlJc w:val="left"/>
-      <w:pPr>
-        <w:ind w:left="5040" w:hanging="360"/>
-      </w:pPr>
-      <w:rPr>
-        <w:rFonts w:ascii="Symbol" w:hAnsi="Symbol" w:cs="Symbol" w:hint="default"/>
-      </w:rPr>
-    </w:lvl>
-    <w:lvl w:ilvl="7">
-      <w:numFmt w:val="bullet"/>
-      <w:lvlText w:val="o"/>
-      <w:lvlJc w:val="left"/>
-      <w:pPr>
-        <w:ind w:left="5760" w:hanging="360"/>
-      </w:pPr>
-      <w:rPr>
-        <w:rFonts w:ascii="Courier New" w:hAnsi="Courier New" w:cs="Courier New" w:hint="default"/>
-      </w:rPr>
-    </w:lvl>
-    <w:lvl w:ilvl="8">
-      <w:numFmt w:val="bullet"/>
-      <w:lvlText w:val=""/>
-      <w:lvlJc w:val="left"/>
-      <w:pPr>
-        <w:ind w:left="6480" w:hanging="360"/>
-      </w:pPr>
-      <w:rPr>
-        <w:rFonts w:ascii="Wingdings" w:hAnsi="Wingdings" w:cs="Wingdings" w:hint="default"/>
-      </w:rPr>
-    </w:lvl>
-  </w:abstractNum>
   <w:num w:numId="1000">
     <w:abstractNumId w:val="990"/>
-  </w:num>
-  <w:num w:numId="1001">
-    <w:abstractNumId w:val="991"/>
-  </w:num>
-  <w:num w:numId="1002">
-    <w:abstractNumId w:val="991"/>
-  </w:num>
-  <w:num w:numId="1003">
-    <w:abstractNumId w:val="991"/>
-  </w:num>
-  <w:num w:numId="1004">
-    <w:abstractNumId w:val="991"/>
-  </w:num>
-  <w:num w:numId="1005">
-    <w:abstractNumId w:val="991"/>
   </w:num>
 </w:numbering>
 </file>

</xml_diff>